<commit_message>
feat: restore Upload stock for bulk Excel and one-by-one intake
Rename Data Import back to Upload stock with clear Supplier bill, Excel, and one-phone paths, and let shop managers, goods intake, and stock uploaders use both ways.

Co-authored-by: Cursor <cursoragent@cursor.com>
</commit_message>
<xml_diff>
--- a/docs/Abu-Twins-Shop-System-User-Guide.docx
+++ b/docs/Abu-Twins-Shop-System-User-Guide.docx
@@ -459,7 +459,7 @@
                 <w:sz w:val="20"/>
                 <w:szCs w:val="20"/>
               </w:rPr>
-              <w:t xml:space="preserve">1.21</w:t>
+              <w:t xml:space="preserve">1.22</w:t>
             </w:r>
           </w:p>
         </w:tc>
@@ -533,7 +533,7 @@
                 <w:sz w:val="20"/>
                 <w:szCs w:val="20"/>
               </w:rPr>
-              <w:t xml:space="preserve">Updated: Swap Deal, clearer Profit list, cashier money owed, simpler intake</w:t>
+              <w:t xml:space="preserve">Updated: Upload stock works both ways, many at once and one by one</w:t>
             </w:r>
           </w:p>
         </w:tc>
@@ -883,6 +883,25 @@
           <w:szCs w:val="22"/>
         </w:rPr>
         <w:t xml:space="preserve">This release also makes everyday words clearer for the till. Trade-In and Exchange is now Swap Deal on the left menu. Profit shows each phone with its storage and condition, the cost price, and a button to extract the list. Cashiers can open Money in and out and Customers and money owed so they can follow people who bought on credit. When you put a phone on the shelf, How the phone looks uses Brand new, Uk, OPENBOX, Faulty, and Non Active, you can add a new supplier on the spot, and battery health is no longer asked.</w:t>
+      </w:r>
+    </w:p>
+    <w:p>
+      <w:pPr>
+        <w:spacing w:after="160" w:before="0" w:line="276"/>
+        <w:jc w:val="left"/>
+      </w:pPr>
+      <w:r>
+        <w:rPr>
+          <w:rFonts w:ascii="Calibri" w:cs="Calibri" w:eastAsia="Calibri" w:hAnsi="Calibri"/>
+          <w:b w:val="false"/>
+          <w:bCs w:val="false"/>
+          <w:i w:val="false"/>
+          <w:iCs w:val="false"/>
+          <w:color w:val="000000"/>
+          <w:sz w:val="22"/>
+          <w:szCs w:val="22"/>
+        </w:rPr>
+        <w:t xml:space="preserve">Upload stock is easy to find again. The left menu says Upload stock, not Data Import. You can load many phones at once from Excel, or add phones one after another on a supplier bill, or put one phone on the shelf with no bill. Shop managers, goods intake, and the stock uploader can use both ways.</w:t>
       </w:r>
     </w:p>
     <w:p>
@@ -8028,7 +8047,7 @@
                 <w:sz w:val="20"/>
                 <w:szCs w:val="20"/>
               </w:rPr>
-              <w:t xml:space="preserve">Run one shop. Sell, receive, transfer, approve shop work. Sees only that shop. Does not add items or change prices.</w:t>
+              <w:t xml:space="preserve">Run one shop. Sell, receive, upload stock, transfer, approve shop work. Sees only that shop. Does not add items or change prices.</w:t>
             </w:r>
           </w:p>
         </w:tc>
@@ -8144,7 +8163,7 @@
                 <w:sz w:val="20"/>
                 <w:szCs w:val="20"/>
               </w:rPr>
-              <w:t xml:space="preserve">Book goods before they arrive. Receive phones. Send goods to a shop.</w:t>
+              <w:t xml:space="preserve">Book goods before they arrive. Receive phones. Upload stock one by one or many from Excel. Send goods to a shop.</w:t>
             </w:r>
           </w:p>
         </w:tc>
@@ -8260,7 +8279,7 @@
                 <w:sz w:val="20"/>
                 <w:szCs w:val="20"/>
               </w:rPr>
-              <w:t xml:space="preserve">Start an upload bill with a supplier, add units by hand or upload the opening stock Excel. Each load gets a PO. Nothing else. No selling, no posting cash, no approving.</w:t>
+              <w:t xml:space="preserve">Upload stock on a supplier bill, one phone at a time, or many from Excel. Add item names. No selling, no posting cash, no approving.</w:t>
             </w:r>
           </w:p>
         </w:tc>
@@ -8700,7 +8719,7 @@
                 <w:sz w:val="21"/>
                 <w:szCs w:val="21"/>
               </w:rPr>
-              <w:t xml:space="preserve">Adding an item to the list, and changing a price, has moved to the Stock uploader and Super Admin.</w:t>
+              <w:t xml:space="preserve">Adding an item to the list, and changing a price, stays with the Stock uploader and Super Admin.</w:t>
             </w:r>
           </w:p>
           <w:p>
@@ -8719,7 +8738,7 @@
                 <w:sz w:val="21"/>
                 <w:szCs w:val="21"/>
               </w:rPr>
-              <w:t xml:space="preserve">This is on purpose. When each shop could add its own items, one phone ended up on the system under three names, and no report could add them up.</w:t>
+              <w:t xml:space="preserve">Shop managers and goods intake can now open Upload stock: Supplier bill, Many at once (Excel), and One phone at a time.</w:t>
             </w:r>
           </w:p>
           <w:p>
@@ -8757,7 +8776,7 @@
                 <w:sz w:val="21"/>
                 <w:szCs w:val="21"/>
               </w:rPr>
-              <w:t xml:space="preserve">If your shop needs a new item on the list, send it to whoever holds the Stock uploader login.</w:t>
+              <w:t xml:space="preserve">If your shop needs a new item name on the list, send it to whoever holds the Stock uploader login.</w:t>
             </w:r>
           </w:p>
         </w:tc>
@@ -27375,7 +27394,7 @@
           <w:sz w:val="26"/>
           <w:szCs w:val="26"/>
         </w:rPr>
-        <w:t xml:space="preserve">10.39 Upload stock. Supplier bill, one item, or many from Excel</w:t>
+        <w:t xml:space="preserve">10.39 Upload stock. Many at once, or one after another</w:t>
       </w:r>
     </w:p>
     <w:p>
@@ -27413,7 +27432,7 @@
           <w:sz w:val="22"/>
           <w:szCs w:val="22"/>
         </w:rPr>
-        <w:t xml:space="preserve">Upload stock puts what is on the shelf into the system and creates a real Goods from supplier bill. First, staff start an upload bill: shop, supplier, and paid or not paid. That bill gets a unique PO number and a running submission value from cost. Add one item to the shelf then books each IMEI, serial, or piece count under that same PO until the bill is closed. The Abu Twins opening stock Excel still loads a full shop at once: pick shop, supplier, and payment status, then upload PHONES, ACCESSORIES, SCREEN, and LAPTOPS. Unpaid bills show on Finance as still owed. Older four-step sheet uploads sit under Advanced.</w:t>
+        <w:t xml:space="preserve">Upload stock is how phones get onto the shelf. There are three clear doors. Supplier bill lets you add phones one after another, or many lines on one bill, with the supplier and paid or not paid. Many at once (Excel) puts a whole shop on the system from one file. One phone at a time is for a single phone in your hand with no bill. Unpaid bills show as money we still owe.</w:t>
       </w:r>
     </w:p>
     <w:p>
@@ -27451,7 +27470,7 @@
           <w:sz w:val="22"/>
           <w:szCs w:val="22"/>
         </w:rPr>
-        <w:t xml:space="preserve">Accountants and auditors need to know who supplied the stock, what it cost, whether it was paid, and which PO to open. Loading phones without that trail leaves money and goods unlinked. One session bill keeps a carton together. Excel still saves the big opening count.</w:t>
+        <w:t xml:space="preserve">Staff were looking for Upload stock and could not find Data Import. They also needed both bulk Excel and one-by-one intake. Small shops need shop managers and goods intake to use both ways, not only the Stock uploader login.</w:t>
       </w:r>
     </w:p>
     <w:p>
@@ -27489,7 +27508,7 @@
           <w:sz w:val="22"/>
           <w:szCs w:val="22"/>
         </w:rPr>
-        <w:t xml:space="preserve">Challenge receives part of a Dubai carton. The uploader starts an upload bill for that supplier, marks it not paid yet, and scans three iPhone 17 Pro Max units under the same PO. Finance shows the submission value as still owed. That evening, Bodija uploads its full opening stock Excel with the same supplier marked paid. A new PO appears on Goods from supplier as Loaded on Upload stock. Sell now works on real shelf units the next morning.</w:t>
+        <w:t xml:space="preserve">Challenge receives part of a Dubai carton. Goods intake opens Upload stock, picks Supplier bill, marks it not paid yet, and scans three iPhone units one after another under the same PO. That evening, Bodija opens Many at once (Excel) and loads the full shop sheet. Sell now works on real shelf units the next morning.</w:t>
       </w:r>
     </w:p>
     <w:p>
@@ -27539,7 +27558,7 @@
           <w:sz w:val="22"/>
           <w:szCs w:val="22"/>
         </w:rPr>
-        <w:t xml:space="preserve">Sign in as uploader@abutwins.com or Super Admin.</w:t>
+        <w:t xml:space="preserve">Sign in as uploader@abutwins.com, vault@abutwins.com, manager@abutwins.com, or Super Admin.</w:t>
       </w:r>
     </w:p>
     <w:p>
@@ -27570,7 +27589,7 @@
           <w:sz w:val="22"/>
           <w:szCs w:val="22"/>
         </w:rPr>
-        <w:t xml:space="preserve">Open Upload stock from the left menu, under Stock.</w:t>
+        <w:t xml:space="preserve">Open Upload stock from the left menu.</w:t>
       </w:r>
     </w:p>
     <w:p>
@@ -27601,7 +27620,7 @@
           <w:sz w:val="22"/>
           <w:szCs w:val="22"/>
         </w:rPr>
-        <w:t xml:space="preserve">Start an upload bill: pick the shop, the supplier, and whether it is paid.</w:t>
+        <w:t xml:space="preserve">Read the three cards: Supplier bill, Many at once (Excel), and One phone at a time.</w:t>
       </w:r>
     </w:p>
     <w:p>
@@ -27632,7 +27651,7 @@
           <w:sz w:val="22"/>
           <w:szCs w:val="22"/>
         </w:rPr>
-        <w:t xml:space="preserve">Add each unit: pick or add the item name, scan or type the IMEI, serial, or piece count, then save. Confirm the fields clear and the bill value grows.</w:t>
+        <w:t xml:space="preserve">On Supplier bill: pick the shop, the supplier, and whether it is paid. Add each IMEI or many lines, then save.</w:t>
       </w:r>
     </w:p>
     <w:p>
@@ -27663,7 +27682,7 @@
           <w:sz w:val="22"/>
           <w:szCs w:val="22"/>
         </w:rPr>
-        <w:t xml:space="preserve">Close the bill when that carton is finished, or leave it open to add more.</w:t>
+        <w:t xml:space="preserve">On Many at once (Excel): pick shop, supplier, and paid or not paid, then upload the PHONES / ACCESSORIES / SCREEN / LAPTOPS file.</w:t>
       </w:r>
     </w:p>
     <w:p>
@@ -27694,7 +27713,7 @@
           <w:sz w:val="22"/>
           <w:szCs w:val="22"/>
         </w:rPr>
-        <w:t xml:space="preserve">For a full shop load, scroll to Abu Twins opening stock Excel, pick shop, supplier, and paid or not paid, then upload the file.</w:t>
+        <w:t xml:space="preserve">On One phone at a time: scan one IMEI already in your hand with no bill.</w:t>
       </w:r>
     </w:p>
     <w:p>
@@ -27725,7 +27744,7 @@
           <w:sz w:val="22"/>
           <w:szCs w:val="22"/>
         </w:rPr>
-        <w:t xml:space="preserve">Open Goods from supplier and Finance. Confirm the PO, submission value, and owed amount.</w:t>
+        <w:t xml:space="preserve">Open Goods from supplier and confirm the PO for bill and Excel loads.</w:t>
       </w:r>
     </w:p>
     <w:p>
@@ -27767,7 +27786,7 @@
           <w:sz w:val="22"/>
           <w:szCs w:val="22"/>
         </w:rPr>
-        <w:t xml:space="preserve">An open upload bill shows the PO number, supplier, submission value, and paid or not paid.</w:t>
+        <w:t xml:space="preserve">The left menu says Upload stock, not Data Import.</w:t>
       </w:r>
     </w:p>
     <w:p>
@@ -27790,7 +27809,7 @@
           <w:sz w:val="22"/>
           <w:szCs w:val="22"/>
         </w:rPr>
-        <w:t xml:space="preserve">A phone with an IMEI books In shop, links to the PO, and raises the shelf count by one.</w:t>
+        <w:t xml:space="preserve">Shop manager, goods intake, and stock uploader can open Upload stock and One phone at a time.</w:t>
       </w:r>
     </w:p>
     <w:p>
@@ -27813,7 +27832,7 @@
           <w:sz w:val="22"/>
           <w:szCs w:val="22"/>
         </w:rPr>
-        <w:t xml:space="preserve">A cord with no number raises the piece count and the bill value by cost times quantity.</w:t>
+        <w:t xml:space="preserve">A phone with an IMEI books In shop and raises the shelf count by one.</w:t>
       </w:r>
     </w:p>
     <w:p>
@@ -27859,7 +27878,7 @@
           <w:sz w:val="22"/>
           <w:szCs w:val="22"/>
         </w:rPr>
-        <w:t xml:space="preserve">Goods from supplier labels upload bills as Loaded on Upload stock.</w:t>
+        <w:t xml:space="preserve">A good opening stock file creates its own PO and books stock for that shop.</w:t>
       </w:r>
     </w:p>
     <w:p>
@@ -27882,7 +27901,7 @@
           <w:sz w:val="22"/>
           <w:szCs w:val="22"/>
         </w:rPr>
-        <w:t xml:space="preserve">A good opening stock file creates its own PO and books stock for that shop.</w:t>
+        <w:t xml:space="preserve">A file with a bad line loads nothing and names the tab and line to fix.</w:t>
       </w:r>
     </w:p>
     <w:p>
@@ -27905,7 +27924,7 @@
           <w:sz w:val="22"/>
           <w:szCs w:val="22"/>
         </w:rPr>
-        <w:t xml:space="preserve">A file with a bad line loads nothing and names the tab and line to fix.</w:t>
+        <w:t xml:space="preserve">After the first Excel load for a shop, new cartons use Supplier bill, not Excel again.</w:t>
       </w:r>
     </w:p>
     <w:p>
@@ -27924,7 +27943,7 @@
           <w:sz w:val="26"/>
           <w:szCs w:val="26"/>
         </w:rPr>
-        <w:t xml:space="preserve">10.40 Stock uploader. A job that only loads data</w:t>
+        <w:t xml:space="preserve">10.40 Stock uploader. A job that loads data</w:t>
       </w:r>
     </w:p>
     <w:p>
@@ -27962,7 +27981,7 @@
           <w:sz w:val="22"/>
           <w:szCs w:val="22"/>
         </w:rPr>
-        <w:t xml:space="preserve">A job whose whole purpose is putting stock and item names into the system. It sees Upload stock, the item list, Goods from supplier (to open the PO it created), the phone list, and shop stock. It cannot sell, cannot open money pages to post payments, cannot approve anything, and cannot add staff.</w:t>
+        <w:t xml:space="preserve">A job whose main purpose is putting stock and item names into the system. It sees Upload stock, One phone at a time, the item list, Goods from supplier (to open the PO it created), the phone list, and shop stock. It cannot sell, cannot open money pages to post payments, cannot approve anything, and cannot add staff. Shop managers and goods intake can also upload stock now, because the shops are small.</w:t>
       </w:r>
     </w:p>
     <w:p>
@@ -28000,7 +28019,7 @@
           <w:sz w:val="22"/>
           <w:szCs w:val="22"/>
         </w:rPr>
-        <w:t xml:space="preserve">Loading the shops is powerful work and it is usually done by whoever is helping to set the system up, sometimes from outside the shop. That person needs no ability to sell or to move cash. Giving them one narrow job means the door they hold opens one room.</w:t>
+        <w:t xml:space="preserve">Loading the shops is powerful work. The Stock uploader login stays narrow so an outside helper cannot sell or move cash. Shop people who receive cartons must still be able to put phones on the shelf without borrowing that login.</w:t>
       </w:r>
     </w:p>
     <w:p>
@@ -28038,7 +28057,7 @@
           <w:sz w:val="22"/>
           <w:szCs w:val="22"/>
         </w:rPr>
-        <w:t xml:space="preserve">Techvaults is helping Abu Twins load the three shops. They are given the Stock uploader login. They start upload bills, load Excel files, and open each PO to check the submission value. At no point can they open Money in and out to pay a supplier, ring up a sale, or see what a customer owes.</w:t>
+        <w:t xml:space="preserve">Techvaults helps Abu Twins load the three shops with the Stock uploader login. Later the Challenge manager receives a new carton and opens Upload stock on their own login to scan the phones one after another.</w:t>
       </w:r>
     </w:p>
     <w:p>
@@ -28119,7 +28138,7 @@
           <w:sz w:val="22"/>
           <w:szCs w:val="22"/>
         </w:rPr>
-        <w:t xml:space="preserve">Look at the left menu and note how short it is.</w:t>
+        <w:t xml:space="preserve">Open Upload stock and One phone at a time. Confirm both work.</w:t>
       </w:r>
     </w:p>
     <w:p>
@@ -28212,7 +28231,7 @@
           <w:sz w:val="22"/>
           <w:szCs w:val="22"/>
         </w:rPr>
-        <w:t xml:space="preserve">Open Goods from supplier and find a bill marked Loaded on Upload stock.</w:t>
+        <w:t xml:space="preserve">Sign in as manager@abutwins.com and open Upload stock.</w:t>
       </w:r>
     </w:p>
     <w:p>
@@ -28243,38 +28262,7 @@
           <w:sz w:val="22"/>
           <w:szCs w:val="22"/>
         </w:rPr>
-        <w:t xml:space="preserve">Sign in as manager@abutwins.com and try to open Upload stock.</w:t>
-      </w:r>
-    </w:p>
-    <w:p>
-      <w:pPr>
-        <w:spacing w:after="80" w:line="276"/>
-      </w:pPr>
-      <w:r>
-        <w:rPr>
-          <w:rFonts w:ascii="Calibri" w:cs="Calibri" w:eastAsia="Calibri" w:hAnsi="Calibri"/>
-          <w:b/>
-          <w:bCs/>
-          <w:i w:val="false"/>
-          <w:iCs w:val="false"/>
-          <w:color w:val="000000"/>
-          <w:sz w:val="22"/>
-          <w:szCs w:val="22"/>
-        </w:rPr>
-        <w:t xml:space="preserve">7. </w:t>
-      </w:r>
-      <w:r>
-        <w:rPr>
-          <w:rFonts w:ascii="Calibri" w:cs="Calibri" w:eastAsia="Calibri" w:hAnsi="Calibri"/>
-          <w:b w:val="false"/>
-          <w:bCs w:val="false"/>
-          <w:i w:val="false"/>
-          <w:iCs w:val="false"/>
-          <w:color w:val="000000"/>
-          <w:sz w:val="22"/>
-          <w:szCs w:val="22"/>
-        </w:rPr>
-        <w:t xml:space="preserve">Sign in as admin@abutwins.com and open Who did what.</w:t>
+        <w:t xml:space="preserve">Sign in as vault@abutwins.com and open Many at once (Excel).</w:t>
       </w:r>
     </w:p>
     <w:p>
@@ -28316,7 +28304,7 @@
           <w:sz w:val="22"/>
           <w:szCs w:val="22"/>
         </w:rPr>
-        <w:t xml:space="preserve">The uploader is sent back to Home from any page outside its job.</w:t>
+        <w:t xml:space="preserve">The uploader is sent back to Home from money and sales pages.</w:t>
       </w:r>
     </w:p>
     <w:p>
@@ -28339,7 +28327,7 @@
           <w:sz w:val="22"/>
           <w:szCs w:val="22"/>
         </w:rPr>
-        <w:t xml:space="preserve">A shop manager cannot open Upload stock at all.</w:t>
+        <w:t xml:space="preserve">A shop manager and goods intake can open Upload stock.</w:t>
       </w:r>
     </w:p>
     <w:p>
@@ -28385,30 +28373,7 @@
           <w:sz w:val="22"/>
           <w:szCs w:val="22"/>
         </w:rPr>
-        <w:t xml:space="preserve">The CEO can see every figure in the business but does not load data. That is the uploader's job.</w:t>
-      </w:r>
-    </w:p>
-    <w:p>
-      <w:pPr>
-        <w:pStyle w:val="ListParagraph"/>
-        <w:numPr>
-          <w:ilvl w:val="0"/>
-          <w:numId w:val="2"/>
-        </w:numPr>
-        <w:spacing w:after="80" w:line="276"/>
-      </w:pPr>
-      <w:r>
-        <w:rPr>
-          <w:rFonts w:ascii="Calibri" w:cs="Calibri" w:eastAsia="Calibri" w:hAnsi="Calibri"/>
-          <w:b w:val="false"/>
-          <w:bCs w:val="false"/>
-          <w:i w:val="false"/>
-          <w:iCs w:val="false"/>
-          <w:color w:val="000000"/>
-          <w:sz w:val="22"/>
-          <w:szCs w:val="22"/>
-        </w:rPr>
-        <w:t xml:space="preserve">Every refused attempt is written into Who did what as a high-risk line, with the job that tried it.</w:t>
+        <w:t xml:space="preserve">The CEO watches the business. Loading stock is for the uploader, goods intake, shop manager, and Super Admin.</w:t>
       </w:r>
     </w:p>
     <w:p>
@@ -41691,6 +41656,312 @@
           </w:p>
         </w:tc>
       </w:tr>
+      <w:tr>
+        <w:trPr>
+          <w:trHeight w:val="320" w:hRule="atLeast"/>
+        </w:trPr>
+        <w:tc>
+          <w:tcPr>
+            <w:tcW w:type="dxa" w:w="600"/>
+            <w:tcBorders>
+              <w:top w:val="single" w:color="000000" w:sz="8"/>
+              <w:left w:val="single" w:color="000000" w:sz="8"/>
+              <w:bottom w:val="single" w:color="000000" w:sz="8"/>
+              <w:right w:val="single" w:color="000000" w:sz="8"/>
+            </w:tcBorders>
+            <w:shd w:fill="F7F7F7" w:color="F7F7F7" w:val="clear"/>
+            <w:tcMar>
+              <w:top w:type="dxa" w:w="60"/>
+              <w:left w:type="dxa" w:w="80"/>
+              <w:bottom w:type="dxa" w:w="60"/>
+              <w:right w:type="dxa" w:w="80"/>
+            </w:tcMar>
+            <w:vAlign w:val="center"/>
+          </w:tcPr>
+          <w:p>
+            <w:pPr>
+              <w:jc w:val="left"/>
+            </w:pPr>
+            <w:r>
+              <w:rPr>
+                <w:rFonts w:ascii="Calibri" w:cs="Calibri" w:eastAsia="Calibri" w:hAnsi="Calibri"/>
+                <w:b w:val="false"/>
+                <w:bCs w:val="false"/>
+                <w:i w:val="false"/>
+                <w:iCs w:val="false"/>
+                <w:color w:val="000000"/>
+                <w:sz w:val="20"/>
+                <w:szCs w:val="20"/>
+              </w:rPr>
+              <w:t xml:space="preserve">46</w:t>
+            </w:r>
+          </w:p>
+        </w:tc>
+        <w:tc>
+          <w:tcPr>
+            <w:tcW w:type="dxa" w:w="2800"/>
+            <w:tcBorders>
+              <w:top w:val="single" w:color="000000" w:sz="8"/>
+              <w:left w:val="single" w:color="000000" w:sz="8"/>
+              <w:bottom w:val="single" w:color="000000" w:sz="8"/>
+              <w:right w:val="single" w:color="000000" w:sz="8"/>
+            </w:tcBorders>
+            <w:shd w:fill="F7F7F7" w:color="F7F7F7" w:val="clear"/>
+            <w:tcMar>
+              <w:top w:type="dxa" w:w="60"/>
+              <w:left w:type="dxa" w:w="80"/>
+              <w:bottom w:type="dxa" w:w="60"/>
+              <w:right w:type="dxa" w:w="80"/>
+            </w:tcMar>
+            <w:vAlign w:val="center"/>
+          </w:tcPr>
+          <w:p>
+            <w:pPr>
+              <w:jc w:val="left"/>
+            </w:pPr>
+            <w:r>
+              <w:rPr>
+                <w:rFonts w:ascii="Calibri" w:cs="Calibri" w:eastAsia="Calibri" w:hAnsi="Calibri"/>
+                <w:b w:val="false"/>
+                <w:bCs w:val="false"/>
+                <w:i w:val="false"/>
+                <w:iCs w:val="false"/>
+                <w:color w:val="000000"/>
+                <w:sz w:val="20"/>
+                <w:szCs w:val="20"/>
+              </w:rPr>
+              <w:t xml:space="preserve">Upload stock many at once</w:t>
+            </w:r>
+          </w:p>
+        </w:tc>
+        <w:tc>
+          <w:tcPr>
+            <w:tcW w:type="dxa" w:w="2600"/>
+            <w:tcBorders>
+              <w:top w:val="single" w:color="000000" w:sz="8"/>
+              <w:left w:val="single" w:color="000000" w:sz="8"/>
+              <w:bottom w:val="single" w:color="000000" w:sz="8"/>
+              <w:right w:val="single" w:color="000000" w:sz="8"/>
+            </w:tcBorders>
+            <w:shd w:fill="F7F7F7" w:color="F7F7F7" w:val="clear"/>
+            <w:tcMar>
+              <w:top w:type="dxa" w:w="60"/>
+              <w:left w:type="dxa" w:w="80"/>
+              <w:bottom w:type="dxa" w:w="60"/>
+              <w:right w:type="dxa" w:w="80"/>
+            </w:tcMar>
+            <w:vAlign w:val="center"/>
+          </w:tcPr>
+          <w:p>
+            <w:pPr>
+              <w:jc w:val="left"/>
+            </w:pPr>
+            <w:r>
+              <w:rPr>
+                <w:rFonts w:ascii="Calibri" w:cs="Calibri" w:eastAsia="Calibri" w:hAnsi="Calibri"/>
+                <w:b w:val="false"/>
+                <w:bCs w:val="false"/>
+                <w:i w:val="false"/>
+                <w:iCs w:val="false"/>
+                <w:color w:val="000000"/>
+                <w:sz w:val="20"/>
+                <w:szCs w:val="20"/>
+              </w:rPr>
+              <w:t xml:space="preserve">uploader@abutwins.com or manager@abutwins.com</w:t>
+            </w:r>
+          </w:p>
+        </w:tc>
+        <w:tc>
+          <w:tcPr>
+            <w:tcW w:type="dxa" w:w="3360"/>
+            <w:tcBorders>
+              <w:top w:val="single" w:color="000000" w:sz="8"/>
+              <w:left w:val="single" w:color="000000" w:sz="8"/>
+              <w:bottom w:val="single" w:color="000000" w:sz="8"/>
+              <w:right w:val="single" w:color="000000" w:sz="8"/>
+            </w:tcBorders>
+            <w:shd w:fill="F7F7F7" w:color="F7F7F7" w:val="clear"/>
+            <w:tcMar>
+              <w:top w:type="dxa" w:w="60"/>
+              <w:left w:type="dxa" w:w="80"/>
+              <w:bottom w:type="dxa" w:w="60"/>
+              <w:right w:type="dxa" w:w="80"/>
+            </w:tcMar>
+            <w:vAlign w:val="center"/>
+          </w:tcPr>
+          <w:p>
+            <w:pPr>
+              <w:jc w:val="left"/>
+            </w:pPr>
+            <w:r>
+              <w:rPr>
+                <w:rFonts w:ascii="Calibri" w:cs="Calibri" w:eastAsia="Calibri" w:hAnsi="Calibri"/>
+                <w:b w:val="false"/>
+                <w:bCs w:val="false"/>
+                <w:i w:val="false"/>
+                <w:iCs w:val="false"/>
+                <w:color w:val="000000"/>
+                <w:sz w:val="20"/>
+                <w:szCs w:val="20"/>
+              </w:rPr>
+              <w:t xml:space="preserve">Many at once (Excel) loads a shop sheet. A bad line loads nothing and names the fix.</w:t>
+            </w:r>
+          </w:p>
+        </w:tc>
+      </w:tr>
+      <w:tr>
+        <w:trPr>
+          <w:trHeight w:val="320" w:hRule="atLeast"/>
+        </w:trPr>
+        <w:tc>
+          <w:tcPr>
+            <w:tcW w:type="dxa" w:w="600"/>
+            <w:tcBorders>
+              <w:top w:val="single" w:color="000000" w:sz="8"/>
+              <w:left w:val="single" w:color="000000" w:sz="8"/>
+              <w:bottom w:val="single" w:color="000000" w:sz="8"/>
+              <w:right w:val="single" w:color="000000" w:sz="8"/>
+            </w:tcBorders>
+            <w:shd w:fill="FFFFFF" w:color="FFFFFF" w:val="clear"/>
+            <w:tcMar>
+              <w:top w:type="dxa" w:w="60"/>
+              <w:left w:type="dxa" w:w="80"/>
+              <w:bottom w:type="dxa" w:w="60"/>
+              <w:right w:type="dxa" w:w="80"/>
+            </w:tcMar>
+            <w:vAlign w:val="center"/>
+          </w:tcPr>
+          <w:p>
+            <w:pPr>
+              <w:jc w:val="left"/>
+            </w:pPr>
+            <w:r>
+              <w:rPr>
+                <w:rFonts w:ascii="Calibri" w:cs="Calibri" w:eastAsia="Calibri" w:hAnsi="Calibri"/>
+                <w:b w:val="false"/>
+                <w:bCs w:val="false"/>
+                <w:i w:val="false"/>
+                <w:iCs w:val="false"/>
+                <w:color w:val="000000"/>
+                <w:sz w:val="20"/>
+                <w:szCs w:val="20"/>
+              </w:rPr>
+              <w:t xml:space="preserve">47</w:t>
+            </w:r>
+          </w:p>
+        </w:tc>
+        <w:tc>
+          <w:tcPr>
+            <w:tcW w:type="dxa" w:w="2800"/>
+            <w:tcBorders>
+              <w:top w:val="single" w:color="000000" w:sz="8"/>
+              <w:left w:val="single" w:color="000000" w:sz="8"/>
+              <w:bottom w:val="single" w:color="000000" w:sz="8"/>
+              <w:right w:val="single" w:color="000000" w:sz="8"/>
+            </w:tcBorders>
+            <w:shd w:fill="FFFFFF" w:color="FFFFFF" w:val="clear"/>
+            <w:tcMar>
+              <w:top w:type="dxa" w:w="60"/>
+              <w:left w:type="dxa" w:w="80"/>
+              <w:bottom w:type="dxa" w:w="60"/>
+              <w:right w:type="dxa" w:w="80"/>
+            </w:tcMar>
+            <w:vAlign w:val="center"/>
+          </w:tcPr>
+          <w:p>
+            <w:pPr>
+              <w:jc w:val="left"/>
+            </w:pPr>
+            <w:r>
+              <w:rPr>
+                <w:rFonts w:ascii="Calibri" w:cs="Calibri" w:eastAsia="Calibri" w:hAnsi="Calibri"/>
+                <w:b w:val="false"/>
+                <w:bCs w:val="false"/>
+                <w:i w:val="false"/>
+                <w:iCs w:val="false"/>
+                <w:color w:val="000000"/>
+                <w:sz w:val="20"/>
+                <w:szCs w:val="20"/>
+              </w:rPr>
+              <w:t xml:space="preserve">Upload stock one after another</w:t>
+            </w:r>
+          </w:p>
+        </w:tc>
+        <w:tc>
+          <w:tcPr>
+            <w:tcW w:type="dxa" w:w="2600"/>
+            <w:tcBorders>
+              <w:top w:val="single" w:color="000000" w:sz="8"/>
+              <w:left w:val="single" w:color="000000" w:sz="8"/>
+              <w:bottom w:val="single" w:color="000000" w:sz="8"/>
+              <w:right w:val="single" w:color="000000" w:sz="8"/>
+            </w:tcBorders>
+            <w:shd w:fill="FFFFFF" w:color="FFFFFF" w:val="clear"/>
+            <w:tcMar>
+              <w:top w:type="dxa" w:w="60"/>
+              <w:left w:type="dxa" w:w="80"/>
+              <w:bottom w:type="dxa" w:w="60"/>
+              <w:right w:type="dxa" w:w="80"/>
+            </w:tcMar>
+            <w:vAlign w:val="center"/>
+          </w:tcPr>
+          <w:p>
+            <w:pPr>
+              <w:jc w:val="left"/>
+            </w:pPr>
+            <w:r>
+              <w:rPr>
+                <w:rFonts w:ascii="Calibri" w:cs="Calibri" w:eastAsia="Calibri" w:hAnsi="Calibri"/>
+                <w:b w:val="false"/>
+                <w:bCs w:val="false"/>
+                <w:i w:val="false"/>
+                <w:iCs w:val="false"/>
+                <w:color w:val="000000"/>
+                <w:sz w:val="20"/>
+                <w:szCs w:val="20"/>
+              </w:rPr>
+              <w:t xml:space="preserve">vault@abutwins.com or manager@abutwins.com</w:t>
+            </w:r>
+          </w:p>
+        </w:tc>
+        <w:tc>
+          <w:tcPr>
+            <w:tcW w:type="dxa" w:w="3360"/>
+            <w:tcBorders>
+              <w:top w:val="single" w:color="000000" w:sz="8"/>
+              <w:left w:val="single" w:color="000000" w:sz="8"/>
+              <w:bottom w:val="single" w:color="000000" w:sz="8"/>
+              <w:right w:val="single" w:color="000000" w:sz="8"/>
+            </w:tcBorders>
+            <w:shd w:fill="FFFFFF" w:color="FFFFFF" w:val="clear"/>
+            <w:tcMar>
+              <w:top w:type="dxa" w:w="60"/>
+              <w:left w:type="dxa" w:w="80"/>
+              <w:bottom w:type="dxa" w:w="60"/>
+              <w:right w:type="dxa" w:w="80"/>
+            </w:tcMar>
+            <w:vAlign w:val="center"/>
+          </w:tcPr>
+          <w:p>
+            <w:pPr>
+              <w:jc w:val="left"/>
+            </w:pPr>
+            <w:r>
+              <w:rPr>
+                <w:rFonts w:ascii="Calibri" w:cs="Calibri" w:eastAsia="Calibri" w:hAnsi="Calibri"/>
+                <w:b w:val="false"/>
+                <w:bCs w:val="false"/>
+                <w:i w:val="false"/>
+                <w:iCs w:val="false"/>
+                <w:color w:val="000000"/>
+                <w:sz w:val="20"/>
+                <w:szCs w:val="20"/>
+              </w:rPr>
+              <w:t xml:space="preserve">Supplier bill accepts one IMEI after another. One phone at a time also works with no bill.</w:t>
+            </w:r>
+          </w:p>
+        </w:tc>
+      </w:tr>
     </w:tbl>
     <w:p>
       <w:pPr>
@@ -43261,6 +43532,25 @@
           <w:szCs w:val="22"/>
         </w:rPr>
         <w:t xml:space="preserve">Version 1.21 uses simpler shop words and fixes the till feedback. Trade-In and Exchange is now Swap Deal. Profit shows storage, condition, and cost price on each sold phone, with Extract this list. Cashiers can open Money in and out and Customers and money owed to follow credit sales and write shop expenses. Stock intake How the phone looks uses Brand new, Uk, OPENBOX, Faulty, and Non Active, Add new supplier is on the form, and battery health is removed. Back and the section tabs are easier to see.</w:t>
+      </w:r>
+    </w:p>
+    <w:p>
+      <w:pPr>
+        <w:spacing w:after="160" w:before="0" w:line="276"/>
+        <w:jc w:val="left"/>
+      </w:pPr>
+      <w:r>
+        <w:rPr>
+          <w:rFonts w:ascii="Calibri" w:cs="Calibri" w:eastAsia="Calibri" w:hAnsi="Calibri"/>
+          <w:b w:val="false"/>
+          <w:bCs w:val="false"/>
+          <w:i w:val="false"/>
+          <w:iCs w:val="false"/>
+          <w:color w:val="000000"/>
+          <w:sz w:val="22"/>
+          <w:szCs w:val="22"/>
+        </w:rPr>
+        <w:t xml:space="preserve">Version 1.22 puts Upload stock back in plain words. The left menu says Upload stock again. Staff can load many phones at once from Excel, add phones one after another on a supplier bill, or put one phone on the shelf with no bill. Shop managers, goods intake, and the stock uploader can use both ways.</w:t>
       </w:r>
     </w:p>
     <w:p>

</xml_diff>

<commit_message>
feat: optional cash remit on day close, accountant oversight views, opening-stock categories
Require till count only when cash was received; let accountant/auditor see every shop page without floor mutations; and add category filters on opening stock for split counting.

Co-authored-by: Cursor <cursoragent@cursor.com>
</commit_message>
<xml_diff>
--- a/docs/Abu-Twins-Shop-System-User-Guide.docx
+++ b/docs/Abu-Twins-Shop-System-User-Guide.docx
@@ -459,7 +459,7 @@
                 <w:sz w:val="20"/>
                 <w:szCs w:val="20"/>
               </w:rPr>
-              <w:t xml:space="preserve">1.22</w:t>
+              <w:t xml:space="preserve">1.24</w:t>
             </w:r>
           </w:p>
         </w:tc>
@@ -533,7 +533,7 @@
                 <w:sz w:val="20"/>
                 <w:szCs w:val="20"/>
               </w:rPr>
-              <w:t xml:space="preserve">Updated: Upload stock works both ways, many at once and one by one</w:t>
+              <w:t xml:space="preserve">Updated: optional cash remit on Close the day, accountant can see every page</w:t>
             </w:r>
           </w:p>
         </w:tc>
@@ -902,6 +902,44 @@
           <w:szCs w:val="22"/>
         </w:rPr>
         <w:t xml:space="preserve">Upload stock is easy to find again. The left menu says Upload stock, not Data Import. You can load many phones at once from Excel, or add phones one after another on a supplier bill, or put one phone on the shelf with no bill. Shop managers, goods intake, and the stock uploader can use both ways.</w:t>
+      </w:r>
+    </w:p>
+    <w:p>
+      <w:pPr>
+        <w:spacing w:after="160" w:before="0" w:line="276"/>
+        <w:jc w:val="left"/>
+      </w:pPr>
+      <w:r>
+        <w:rPr>
+          <w:rFonts w:ascii="Calibri" w:cs="Calibri" w:eastAsia="Calibri" w:hAnsi="Calibri"/>
+          <w:b w:val="false"/>
+          <w:bCs w:val="false"/>
+          <w:i w:val="false"/>
+          <w:iCs w:val="false"/>
+          <w:color w:val="000000"/>
+          <w:sz w:val="22"/>
+          <w:szCs w:val="22"/>
+        </w:rPr>
+        <w:t xml:space="preserve">Correct and close opening stock now shows each item's category. You can tap Phones, Accessories, Screen, or Laptop so different people can count different groups at the same time.</w:t>
+      </w:r>
+    </w:p>
+    <w:p>
+      <w:pPr>
+        <w:spacing w:after="160" w:before="0" w:line="276"/>
+        <w:jc w:val="left"/>
+      </w:pPr>
+      <w:r>
+        <w:rPr>
+          <w:rFonts w:ascii="Calibri" w:cs="Calibri" w:eastAsia="Calibri" w:hAnsi="Calibri"/>
+          <w:b w:val="false"/>
+          <w:bCs w:val="false"/>
+          <w:i w:val="false"/>
+          <w:iCs w:val="false"/>
+          <w:color w:val="000000"/>
+          <w:sz w:val="22"/>
+          <w:szCs w:val="22"/>
+        </w:rPr>
+        <w:t xml:space="preserve">Close the day is more flexible for shops that sell mostly by transfer and POS. Cash remittance is required only when cash came into the till. Transfer and POS days still close so Sell now can open the next day, but with no till count. The Financial Accountant and records checker can open every shop page to oversee the business. They can post money. They cannot sell, open repairs, load stock, approve shop work, or change Who can see what.</w:t>
       </w:r>
     </w:p>
     <w:p>
@@ -4338,7 +4376,7 @@
                 <w:sz w:val="20"/>
                 <w:szCs w:val="20"/>
               </w:rPr>
-              <w:t xml:space="preserve">Count the cash in the drawer against cash sales for that business day.</w:t>
+              <w:t xml:space="preserve">Finish every past day that had sales. Count cash only when cash came in.</w:t>
             </w:r>
           </w:p>
         </w:tc>
@@ -7815,7 +7853,7 @@
                 <w:sz w:val="20"/>
                 <w:szCs w:val="20"/>
               </w:rPr>
-              <w:t xml:space="preserve">Look at records. Check the books. Approve some requests. Does not sell.</w:t>
+              <w:t xml:space="preserve">See every shop page. Check the books. Post money. Cannot sell, open repairs, load stock, or change Who can see what.</w:t>
             </w:r>
           </w:p>
         </w:tc>
@@ -7931,7 +7969,7 @@
                 <w:sz w:val="20"/>
                 <w:szCs w:val="20"/>
               </w:rPr>
-              <w:t xml:space="preserve">See sales and money. Check the books. Record pay-outs. See every shop.</w:t>
+              <w:t xml:space="preserve">See every shop page. Check the books. Record pay-outs. Cannot sell, open repairs, load stock, or change Who can see what.</w:t>
             </w:r>
           </w:p>
         </w:tc>
@@ -18355,7 +18393,7 @@
           <w:sz w:val="26"/>
           <w:szCs w:val="26"/>
         </w:rPr>
-        <w:t xml:space="preserve">10.18 Money in &amp; out</w:t>
+        <w:t xml:space="preserve">10.17b Correct &amp; close opening stock</w:t>
       </w:r>
     </w:p>
     <w:p>
@@ -18393,7 +18431,7 @@
           <w:sz w:val="22"/>
           <w:szCs w:val="22"/>
         </w:rPr>
-        <w:t xml:space="preserve">This page lists money that moved: collections, pay-outs, and the difference. It also lists people who still owe us and what Abu Twins still owes suppliers. Cashiers can open it to follow credit sales. From here you can open Close the day to count the till.</w:t>
+        <w:t xml:space="preserve">After a shop is loaded from Excel, Correct and close opening stock is where you count what is really on the shelf. Each line shows its category. Tap Phones, Accessories, Screen, or Laptop to show only that group, so you can give phones to one person and accessories to another. When the count is right, the CEO or main admin closes it. Closed opening stock cannot change.</w:t>
       </w:r>
     </w:p>
     <w:p>
@@ -18431,7 +18469,7 @@
           <w:sz w:val="22"/>
           <w:szCs w:val="22"/>
         </w:rPr>
-        <w:t xml:space="preserve">Sales pages show goods. This page shows naira. In a small shop the till person also needs to see who still owes payment.</w:t>
+        <w:t xml:space="preserve">A long list of every item is hard to count as one job. Categories let the boss split the work and finish faster.</w:t>
       </w:r>
     </w:p>
     <w:p>
@@ -18469,7 +18507,7 @@
           <w:sz w:val="22"/>
           <w:szCs w:val="22"/>
         </w:rPr>
-        <w:t xml:space="preserve">The Iwo Road cashier opens Money in &amp; out after lunch. People who still owe us shows three names. They call each one. Later the accountant checks Money in against the transfer alerts.</w:t>
+        <w:t xml:space="preserve">Iwo Road has thousands of opening lines. The manager taps Phones and gives that list to Folake. They tap Accessories for Ibrahim, Screen for Ngozi, and Laptop for Segun. Each person counts their group. The CEO closes the shop when every group matches.</w:t>
       </w:r>
     </w:p>
     <w:p>
@@ -18519,7 +18557,7 @@
           <w:sz w:val="22"/>
           <w:szCs w:val="22"/>
         </w:rPr>
-        <w:t xml:space="preserve">Sign in as cashier, accountant, or CEO.</w:t>
+        <w:t xml:space="preserve">Open Correct &amp; close opening stock.</w:t>
       </w:r>
     </w:p>
     <w:p>
@@ -18550,7 +18588,7 @@
           <w:sz w:val="22"/>
           <w:szCs w:val="22"/>
         </w:rPr>
-        <w:t xml:space="preserve">Click Money in &amp; out.</w:t>
+        <w:t xml:space="preserve">Pick the shop that is Still open.</w:t>
       </w:r>
     </w:p>
     <w:p>
@@ -18581,7 +18619,7 @@
           <w:sz w:val="22"/>
           <w:szCs w:val="22"/>
         </w:rPr>
-        <w:t xml:space="preserve">Read Money in, Money out, and Difference.</w:t>
+        <w:t xml:space="preserve">Tap Phones, Accessories, Screen, or Laptop under Count by category.</w:t>
       </w:r>
     </w:p>
     <w:p>
@@ -18612,7 +18650,7 @@
           <w:sz w:val="22"/>
           <w:szCs w:val="22"/>
         </w:rPr>
-        <w:t xml:space="preserve">Read People who still owe us.</w:t>
+        <w:t xml:space="preserve">Download the count sheet if people will count on paper.</w:t>
       </w:r>
     </w:p>
     <w:p>
@@ -18643,7 +18681,38 @@
           <w:sz w:val="22"/>
           <w:szCs w:val="22"/>
         </w:rPr>
-        <w:t xml:space="preserve">Read the list of movements.</w:t>
+        <w:t xml:space="preserve">Correct any wrong counts or prices, then save.</w:t>
+      </w:r>
+    </w:p>
+    <w:p>
+      <w:pPr>
+        <w:spacing w:after="80" w:line="276"/>
+      </w:pPr>
+      <w:r>
+        <w:rPr>
+          <w:rFonts w:ascii="Calibri" w:cs="Calibri" w:eastAsia="Calibri" w:hAnsi="Calibri"/>
+          <w:b/>
+          <w:bCs/>
+          <w:i w:val="false"/>
+          <w:iCs w:val="false"/>
+          <w:color w:val="000000"/>
+          <w:sz w:val="22"/>
+          <w:szCs w:val="22"/>
+        </w:rPr>
+        <w:t xml:space="preserve">6. </w:t>
+      </w:r>
+      <w:r>
+        <w:rPr>
+          <w:rFonts w:ascii="Calibri" w:cs="Calibri" w:eastAsia="Calibri" w:hAnsi="Calibri"/>
+          <w:b w:val="false"/>
+          <w:bCs w:val="false"/>
+          <w:i w:val="false"/>
+          <w:iCs w:val="false"/>
+          <w:color w:val="000000"/>
+          <w:sz w:val="22"/>
+          <w:szCs w:val="22"/>
+        </w:rPr>
+        <w:t xml:space="preserve">When the shelf matches, the CEO or main admin clicks Close opening stock.</w:t>
       </w:r>
     </w:p>
     <w:p>
@@ -18685,7 +18754,7 @@
           <w:sz w:val="22"/>
           <w:szCs w:val="22"/>
         </w:rPr>
-        <w:t xml:space="preserve">A cashier can open Money in &amp; out.</w:t>
+        <w:t xml:space="preserve">Each row shows a Category column.</w:t>
       </w:r>
     </w:p>
     <w:p>
@@ -18708,7 +18777,7 @@
           <w:sz w:val="22"/>
           <w:szCs w:val="22"/>
         </w:rPr>
-        <w:t xml:space="preserve">People who still owe us shows credit balances.</w:t>
+        <w:t xml:space="preserve">Tapping a category shortens the list to that group.</w:t>
       </w:r>
     </w:p>
     <w:p>
@@ -18731,7 +18800,7 @@
           <w:sz w:val="22"/>
           <w:szCs w:val="22"/>
         </w:rPr>
-        <w:t xml:space="preserve">A finished cash sale appears as money in.</w:t>
+        <w:t xml:space="preserve">The Excel count sheet still has a CATEGORY column.</w:t>
       </w:r>
     </w:p>
     <w:p>
@@ -18754,7 +18823,333 @@
           <w:sz w:val="22"/>
           <w:szCs w:val="22"/>
         </w:rPr>
-        <w:t xml:space="preserve">An approved expense that was paid appears as money out.</w:t>
+        <w:t xml:space="preserve">After close, the list cannot be edited.</w:t>
+      </w:r>
+    </w:p>
+    <w:p>
+      <w:pPr>
+        <w:pStyle w:val="Heading2"/>
+        <w:spacing w:after="120" w:before="280"/>
+      </w:pPr>
+      <w:r>
+        <w:rPr>
+          <w:rFonts w:ascii="Calibri" w:cs="Calibri" w:eastAsia="Calibri" w:hAnsi="Calibri"/>
+          <w:b/>
+          <w:bCs/>
+          <w:i w:val="false"/>
+          <w:iCs w:val="false"/>
+          <w:color w:val="000000"/>
+          <w:sz w:val="26"/>
+          <w:szCs w:val="26"/>
+        </w:rPr>
+        <w:t xml:space="preserve">10.18 Money in &amp; out</w:t>
+      </w:r>
+    </w:p>
+    <w:p>
+      <w:pPr>
+        <w:pStyle w:val="Heading3"/>
+        <w:spacing w:after="80" w:before="200"/>
+      </w:pPr>
+      <w:r>
+        <w:rPr>
+          <w:rFonts w:ascii="Calibri" w:cs="Calibri" w:eastAsia="Calibri" w:hAnsi="Calibri"/>
+          <w:b/>
+          <w:bCs/>
+          <w:i w:val="false"/>
+          <w:iCs w:val="false"/>
+          <w:color w:val="000000"/>
+          <w:sz w:val="24"/>
+          <w:szCs w:val="24"/>
+        </w:rPr>
+        <w:t xml:space="preserve">What this page is</w:t>
+      </w:r>
+    </w:p>
+    <w:p>
+      <w:pPr>
+        <w:spacing w:after="160" w:before="0" w:line="276"/>
+        <w:jc w:val="left"/>
+      </w:pPr>
+      <w:r>
+        <w:rPr>
+          <w:rFonts w:ascii="Calibri" w:cs="Calibri" w:eastAsia="Calibri" w:hAnsi="Calibri"/>
+          <w:b w:val="false"/>
+          <w:bCs w:val="false"/>
+          <w:i w:val="false"/>
+          <w:iCs w:val="false"/>
+          <w:color w:val="000000"/>
+          <w:sz w:val="22"/>
+          <w:szCs w:val="22"/>
+        </w:rPr>
+        <w:t xml:space="preserve">This page lists money that moved: collections, pay-outs, and the difference. It also lists people who still owe us and what Abu Twins still owes suppliers. Cashiers can open it to follow credit sales. From here you can open Close the day to count the till.</w:t>
+      </w:r>
+    </w:p>
+    <w:p>
+      <w:pPr>
+        <w:pStyle w:val="Heading3"/>
+        <w:spacing w:after="80" w:before="200"/>
+      </w:pPr>
+      <w:r>
+        <w:rPr>
+          <w:rFonts w:ascii="Calibri" w:cs="Calibri" w:eastAsia="Calibri" w:hAnsi="Calibri"/>
+          <w:b/>
+          <w:bCs/>
+          <w:i w:val="false"/>
+          <w:iCs w:val="false"/>
+          <w:color w:val="000000"/>
+          <w:sz w:val="24"/>
+          <w:szCs w:val="24"/>
+        </w:rPr>
+        <w:t xml:space="preserve">Why it is here</w:t>
+      </w:r>
+    </w:p>
+    <w:p>
+      <w:pPr>
+        <w:spacing w:after="160" w:before="0" w:line="276"/>
+        <w:jc w:val="left"/>
+      </w:pPr>
+      <w:r>
+        <w:rPr>
+          <w:rFonts w:ascii="Calibri" w:cs="Calibri" w:eastAsia="Calibri" w:hAnsi="Calibri"/>
+          <w:b w:val="false"/>
+          <w:bCs w:val="false"/>
+          <w:i w:val="false"/>
+          <w:iCs w:val="false"/>
+          <w:color w:val="000000"/>
+          <w:sz w:val="22"/>
+          <w:szCs w:val="22"/>
+        </w:rPr>
+        <w:t xml:space="preserve">Sales pages show goods. This page shows naira. In a small shop the till person also needs to see who still owes payment.</w:t>
+      </w:r>
+    </w:p>
+    <w:p>
+      <w:pPr>
+        <w:pStyle w:val="Heading3"/>
+        <w:spacing w:after="80" w:before="200"/>
+      </w:pPr>
+      <w:r>
+        <w:rPr>
+          <w:rFonts w:ascii="Calibri" w:cs="Calibri" w:eastAsia="Calibri" w:hAnsi="Calibri"/>
+          <w:b/>
+          <w:bCs/>
+          <w:i w:val="false"/>
+          <w:iCs w:val="false"/>
+          <w:color w:val="000000"/>
+          <w:sz w:val="24"/>
+          <w:szCs w:val="24"/>
+        </w:rPr>
+        <w:t xml:space="preserve">A real shop story</w:t>
+      </w:r>
+    </w:p>
+    <w:p>
+      <w:pPr>
+        <w:spacing w:after="160" w:before="0" w:line="276"/>
+        <w:jc w:val="left"/>
+      </w:pPr>
+      <w:r>
+        <w:rPr>
+          <w:rFonts w:ascii="Calibri" w:cs="Calibri" w:eastAsia="Calibri" w:hAnsi="Calibri"/>
+          <w:b w:val="false"/>
+          <w:bCs w:val="false"/>
+          <w:i w:val="false"/>
+          <w:iCs w:val="false"/>
+          <w:color w:val="000000"/>
+          <w:sz w:val="22"/>
+          <w:szCs w:val="22"/>
+        </w:rPr>
+        <w:t xml:space="preserve">The Iwo Road cashier opens Money in &amp; out after lunch. People who still owe us shows three names. They call each one. Later the accountant checks Money in against the transfer alerts.</w:t>
+      </w:r>
+    </w:p>
+    <w:p>
+      <w:pPr>
+        <w:pStyle w:val="Heading3"/>
+        <w:spacing w:after="80" w:before="200"/>
+      </w:pPr>
+      <w:r>
+        <w:rPr>
+          <w:rFonts w:ascii="Calibri" w:cs="Calibri" w:eastAsia="Calibri" w:hAnsi="Calibri"/>
+          <w:b/>
+          <w:bCs/>
+          <w:i w:val="false"/>
+          <w:iCs w:val="false"/>
+          <w:color w:val="000000"/>
+          <w:sz w:val="24"/>
+          <w:szCs w:val="24"/>
+        </w:rPr>
+        <w:t xml:space="preserve">How to try it</w:t>
+      </w:r>
+    </w:p>
+    <w:p>
+      <w:pPr>
+        <w:spacing w:after="80" w:line="276"/>
+      </w:pPr>
+      <w:r>
+        <w:rPr>
+          <w:rFonts w:ascii="Calibri" w:cs="Calibri" w:eastAsia="Calibri" w:hAnsi="Calibri"/>
+          <w:b/>
+          <w:bCs/>
+          <w:i w:val="false"/>
+          <w:iCs w:val="false"/>
+          <w:color w:val="000000"/>
+          <w:sz w:val="22"/>
+          <w:szCs w:val="22"/>
+        </w:rPr>
+        <w:t xml:space="preserve">1. </w:t>
+      </w:r>
+      <w:r>
+        <w:rPr>
+          <w:rFonts w:ascii="Calibri" w:cs="Calibri" w:eastAsia="Calibri" w:hAnsi="Calibri"/>
+          <w:b w:val="false"/>
+          <w:bCs w:val="false"/>
+          <w:i w:val="false"/>
+          <w:iCs w:val="false"/>
+          <w:color w:val="000000"/>
+          <w:sz w:val="22"/>
+          <w:szCs w:val="22"/>
+        </w:rPr>
+        <w:t xml:space="preserve">Sign in as cashier, accountant, or CEO.</w:t>
+      </w:r>
+    </w:p>
+    <w:p>
+      <w:pPr>
+        <w:spacing w:after="80" w:line="276"/>
+      </w:pPr>
+      <w:r>
+        <w:rPr>
+          <w:rFonts w:ascii="Calibri" w:cs="Calibri" w:eastAsia="Calibri" w:hAnsi="Calibri"/>
+          <w:b/>
+          <w:bCs/>
+          <w:i w:val="false"/>
+          <w:iCs w:val="false"/>
+          <w:color w:val="000000"/>
+          <w:sz w:val="22"/>
+          <w:szCs w:val="22"/>
+        </w:rPr>
+        <w:t xml:space="preserve">2. </w:t>
+      </w:r>
+      <w:r>
+        <w:rPr>
+          <w:rFonts w:ascii="Calibri" w:cs="Calibri" w:eastAsia="Calibri" w:hAnsi="Calibri"/>
+          <w:b w:val="false"/>
+          <w:bCs w:val="false"/>
+          <w:i w:val="false"/>
+          <w:iCs w:val="false"/>
+          <w:color w:val="000000"/>
+          <w:sz w:val="22"/>
+          <w:szCs w:val="22"/>
+        </w:rPr>
+        <w:t xml:space="preserve">Click Money in &amp; out.</w:t>
+      </w:r>
+    </w:p>
+    <w:p>
+      <w:pPr>
+        <w:spacing w:after="80" w:line="276"/>
+      </w:pPr>
+      <w:r>
+        <w:rPr>
+          <w:rFonts w:ascii="Calibri" w:cs="Calibri" w:eastAsia="Calibri" w:hAnsi="Calibri"/>
+          <w:b/>
+          <w:bCs/>
+          <w:i w:val="false"/>
+          <w:iCs w:val="false"/>
+          <w:color w:val="000000"/>
+          <w:sz w:val="22"/>
+          <w:szCs w:val="22"/>
+        </w:rPr>
+        <w:t xml:space="preserve">3. </w:t>
+      </w:r>
+      <w:r>
+        <w:rPr>
+          <w:rFonts w:ascii="Calibri" w:cs="Calibri" w:eastAsia="Calibri" w:hAnsi="Calibri"/>
+          <w:b w:val="false"/>
+          <w:bCs w:val="false"/>
+          <w:i w:val="false"/>
+          <w:iCs w:val="false"/>
+          <w:color w:val="000000"/>
+          <w:sz w:val="22"/>
+          <w:szCs w:val="22"/>
+        </w:rPr>
+        <w:t xml:space="preserve">Read Money in, Money out, and Difference.</w:t>
+      </w:r>
+    </w:p>
+    <w:p>
+      <w:pPr>
+        <w:spacing w:after="80" w:line="276"/>
+      </w:pPr>
+      <w:r>
+        <w:rPr>
+          <w:rFonts w:ascii="Calibri" w:cs="Calibri" w:eastAsia="Calibri" w:hAnsi="Calibri"/>
+          <w:b/>
+          <w:bCs/>
+          <w:i w:val="false"/>
+          <w:iCs w:val="false"/>
+          <w:color w:val="000000"/>
+          <w:sz w:val="22"/>
+          <w:szCs w:val="22"/>
+        </w:rPr>
+        <w:t xml:space="preserve">4. </w:t>
+      </w:r>
+      <w:r>
+        <w:rPr>
+          <w:rFonts w:ascii="Calibri" w:cs="Calibri" w:eastAsia="Calibri" w:hAnsi="Calibri"/>
+          <w:b w:val="false"/>
+          <w:bCs w:val="false"/>
+          <w:i w:val="false"/>
+          <w:iCs w:val="false"/>
+          <w:color w:val="000000"/>
+          <w:sz w:val="22"/>
+          <w:szCs w:val="22"/>
+        </w:rPr>
+        <w:t xml:space="preserve">Read People who still owe us.</w:t>
+      </w:r>
+    </w:p>
+    <w:p>
+      <w:pPr>
+        <w:spacing w:after="80" w:line="276"/>
+      </w:pPr>
+      <w:r>
+        <w:rPr>
+          <w:rFonts w:ascii="Calibri" w:cs="Calibri" w:eastAsia="Calibri" w:hAnsi="Calibri"/>
+          <w:b/>
+          <w:bCs/>
+          <w:i w:val="false"/>
+          <w:iCs w:val="false"/>
+          <w:color w:val="000000"/>
+          <w:sz w:val="22"/>
+          <w:szCs w:val="22"/>
+        </w:rPr>
+        <w:t xml:space="preserve">5. </w:t>
+      </w:r>
+      <w:r>
+        <w:rPr>
+          <w:rFonts w:ascii="Calibri" w:cs="Calibri" w:eastAsia="Calibri" w:hAnsi="Calibri"/>
+          <w:b w:val="false"/>
+          <w:bCs w:val="false"/>
+          <w:i w:val="false"/>
+          <w:iCs w:val="false"/>
+          <w:color w:val="000000"/>
+          <w:sz w:val="22"/>
+          <w:szCs w:val="22"/>
+        </w:rPr>
+        <w:t xml:space="preserve">Read the list of movements.</w:t>
+      </w:r>
+    </w:p>
+    <w:p>
+      <w:pPr>
+        <w:pStyle w:val="Heading3"/>
+        <w:spacing w:after="80" w:before="200"/>
+      </w:pPr>
+      <w:r>
+        <w:rPr>
+          <w:rFonts w:ascii="Calibri" w:cs="Calibri" w:eastAsia="Calibri" w:hAnsi="Calibri"/>
+          <w:b/>
+          <w:bCs/>
+          <w:i w:val="false"/>
+          <w:iCs w:val="false"/>
+          <w:color w:val="000000"/>
+          <w:sz w:val="24"/>
+          <w:szCs w:val="24"/>
+        </w:rPr>
+        <w:t xml:space="preserve">What you should see</w:t>
       </w:r>
     </w:p>
     <w:p>
@@ -18777,7 +19172,7 @@
           <w:sz w:val="22"/>
           <w:szCs w:val="22"/>
         </w:rPr>
-        <w:t xml:space="preserve">Figures are in naira.</w:t>
+        <w:t xml:space="preserve">A cashier can open Money in &amp; out.</w:t>
       </w:r>
     </w:p>
     <w:p>
@@ -18800,395 +19195,7 @@
           <w:sz w:val="22"/>
           <w:szCs w:val="22"/>
         </w:rPr>
-        <w:t xml:space="preserve">A link says Close the day and export cash count.</w:t>
-      </w:r>
-    </w:p>
-    <w:p>
-      <w:pPr>
-        <w:pStyle w:val="Heading2"/>
-        <w:spacing w:after="120" w:before="280"/>
-      </w:pPr>
-      <w:r>
-        <w:rPr>
-          <w:rFonts w:ascii="Calibri" w:cs="Calibri" w:eastAsia="Calibri" w:hAnsi="Calibri"/>
-          <w:b/>
-          <w:bCs/>
-          <w:i w:val="false"/>
-          <w:iCs w:val="false"/>
-          <w:color w:val="000000"/>
-          <w:sz w:val="26"/>
-          <w:szCs w:val="26"/>
-        </w:rPr>
-        <w:t xml:space="preserve">10.19 Close the day</w:t>
-      </w:r>
-    </w:p>
-    <w:p>
-      <w:pPr>
-        <w:pStyle w:val="Heading3"/>
-        <w:spacing w:after="80" w:before="200"/>
-      </w:pPr>
-      <w:r>
-        <w:rPr>
-          <w:rFonts w:ascii="Calibri" w:cs="Calibri" w:eastAsia="Calibri" w:hAnsi="Calibri"/>
-          <w:b/>
-          <w:bCs/>
-          <w:i w:val="false"/>
-          <w:iCs w:val="false"/>
-          <w:color w:val="000000"/>
-          <w:sz w:val="24"/>
-          <w:szCs w:val="24"/>
-        </w:rPr>
-        <w:t xml:space="preserve">What this page is</w:t>
-      </w:r>
-    </w:p>
-    <w:p>
-      <w:pPr>
-        <w:spacing w:after="160" w:before="0" w:line="276"/>
-        <w:jc w:val="left"/>
-      </w:pPr>
-      <w:r>
-        <w:rPr>
-          <w:rFonts w:ascii="Calibri" w:cs="Calibri" w:eastAsia="Calibri" w:hAnsi="Calibri"/>
-          <w:b w:val="false"/>
-          <w:bCs w:val="false"/>
-          <w:i w:val="false"/>
-          <w:iCs w:val="false"/>
-          <w:color w:val="000000"/>
-          <w:sz w:val="22"/>
-          <w:szCs w:val="22"/>
-        </w:rPr>
-        <w:t xml:space="preserve">Close the day is the till count. You pick the business day (Lagos time), see cash expected from cash sales that day, plus transfer, POS, and credit totals, then type the cash you counted. The system stores the difference. Sell now stays locked until every older day that had completed sales is closed. The page opens on the oldest unclosed day. Cashiers and sales people can close the day even if they cannot see the full Money in &amp; out page.</w:t>
-      </w:r>
-    </w:p>
-    <w:p>
-      <w:pPr>
-        <w:pStyle w:val="Heading3"/>
-        <w:spacing w:after="80" w:before="200"/>
-      </w:pPr>
-      <w:r>
-        <w:rPr>
-          <w:rFonts w:ascii="Calibri" w:cs="Calibri" w:eastAsia="Calibri" w:hAnsi="Calibri"/>
-          <w:b/>
-          <w:bCs/>
-          <w:i w:val="false"/>
-          <w:iCs w:val="false"/>
-          <w:color w:val="000000"/>
-          <w:sz w:val="24"/>
-          <w:szCs w:val="24"/>
-        </w:rPr>
-        <w:t xml:space="preserve">Why it is here</w:t>
-      </w:r>
-    </w:p>
-    <w:p>
-      <w:pPr>
-        <w:spacing w:after="160" w:before="0" w:line="276"/>
-        <w:jc w:val="left"/>
-      </w:pPr>
-      <w:r>
-        <w:rPr>
-          <w:rFonts w:ascii="Calibri" w:cs="Calibri" w:eastAsia="Calibri" w:hAnsi="Calibri"/>
-          <w:b w:val="false"/>
-          <w:bCs w:val="false"/>
-          <w:i w:val="false"/>
-          <w:iCs w:val="false"/>
-          <w:color w:val="000000"/>
-          <w:sz w:val="22"/>
-          <w:szCs w:val="22"/>
-        </w:rPr>
-        <w:t xml:space="preserve">If staff keep selling after a day with no count, yesterday’s cash can leave and today’s invoices still look busy. A close writes a name, a time, a shop, expected cash, counted cash, and the shortfall or leftover. That is the only way the drawer is allowed to start a new day of live sales.</w:t>
-      </w:r>
-    </w:p>
-    <w:p>
-      <w:pPr>
-        <w:pStyle w:val="Heading3"/>
-        <w:spacing w:after="80" w:before="200"/>
-      </w:pPr>
-      <w:r>
-        <w:rPr>
-          <w:rFonts w:ascii="Calibri" w:cs="Calibri" w:eastAsia="Calibri" w:hAnsi="Calibri"/>
-          <w:b/>
-          <w:bCs/>
-          <w:i w:val="false"/>
-          <w:iCs w:val="false"/>
-          <w:color w:val="000000"/>
-          <w:sz w:val="24"/>
-          <w:szCs w:val="24"/>
-        </w:rPr>
-        <w:t xml:space="preserve">A real shop story</w:t>
-      </w:r>
-    </w:p>
-    <w:p>
-      <w:pPr>
-        <w:spacing w:after="160" w:before="0" w:line="276"/>
-        <w:jc w:val="left"/>
-      </w:pPr>
-      <w:r>
-        <w:rPr>
-          <w:rFonts w:ascii="Calibri" w:cs="Calibri" w:eastAsia="Calibri" w:hAnsi="Calibri"/>
-          <w:b w:val="false"/>
-          <w:bCs w:val="false"/>
-          <w:i w:val="false"/>
-          <w:iCs w:val="false"/>
-          <w:color w:val="000000"/>
-          <w:sz w:val="22"/>
-          <w:szCs w:val="22"/>
-        </w:rPr>
-        <w:t xml:space="preserve">Sunday at Iwo Road had eight cash sales. Nobody counted. Monday morning Sell now is locked. The cashier opens Close the day. The red list shows 6 September. Cash expected is on the card. They count the drawer, type that number, and add a short note if a note is short. They click Close this day. If another old day is still open, the page jumps there. When the list is empty, Sell now works again.</w:t>
-      </w:r>
-    </w:p>
-    <w:p>
-      <w:pPr>
-        <w:pStyle w:val="Heading3"/>
-        <w:spacing w:after="80" w:before="200"/>
-      </w:pPr>
-      <w:r>
-        <w:rPr>
-          <w:rFonts w:ascii="Calibri" w:cs="Calibri" w:eastAsia="Calibri" w:hAnsi="Calibri"/>
-          <w:b/>
-          <w:bCs/>
-          <w:i w:val="false"/>
-          <w:iCs w:val="false"/>
-          <w:color w:val="000000"/>
-          <w:sz w:val="24"/>
-          <w:szCs w:val="24"/>
-        </w:rPr>
-        <w:t xml:space="preserve">How to try it</w:t>
-      </w:r>
-    </w:p>
-    <w:p>
-      <w:pPr>
-        <w:spacing w:after="80" w:line="276"/>
-      </w:pPr>
-      <w:r>
-        <w:rPr>
-          <w:rFonts w:ascii="Calibri" w:cs="Calibri" w:eastAsia="Calibri" w:hAnsi="Calibri"/>
-          <w:b/>
-          <w:bCs/>
-          <w:i w:val="false"/>
-          <w:iCs w:val="false"/>
-          <w:color w:val="000000"/>
-          <w:sz w:val="22"/>
-          <w:szCs w:val="22"/>
-        </w:rPr>
-        <w:t xml:space="preserve">1. </w:t>
-      </w:r>
-      <w:r>
-        <w:rPr>
-          <w:rFonts w:ascii="Calibri" w:cs="Calibri" w:eastAsia="Calibri" w:hAnsi="Calibri"/>
-          <w:b w:val="false"/>
-          <w:bCs w:val="false"/>
-          <w:i w:val="false"/>
-          <w:iCs w:val="false"/>
-          <w:color w:val="000000"/>
-          <w:sz w:val="22"/>
-          <w:szCs w:val="22"/>
-        </w:rPr>
-        <w:t xml:space="preserve">Sign in as cashier, sales person, shop manager, accountant, CEO, or Super Admin.</w:t>
-      </w:r>
-    </w:p>
-    <w:p>
-      <w:pPr>
-        <w:spacing w:after="80" w:line="276"/>
-      </w:pPr>
-      <w:r>
-        <w:rPr>
-          <w:rFonts w:ascii="Calibri" w:cs="Calibri" w:eastAsia="Calibri" w:hAnsi="Calibri"/>
-          <w:b/>
-          <w:bCs/>
-          <w:i w:val="false"/>
-          <w:iCs w:val="false"/>
-          <w:color w:val="000000"/>
-          <w:sz w:val="22"/>
-          <w:szCs w:val="22"/>
-        </w:rPr>
-        <w:t xml:space="preserve">2. </w:t>
-      </w:r>
-      <w:r>
-        <w:rPr>
-          <w:rFonts w:ascii="Calibri" w:cs="Calibri" w:eastAsia="Calibri" w:hAnsi="Calibri"/>
-          <w:b w:val="false"/>
-          <w:bCs w:val="false"/>
-          <w:i w:val="false"/>
-          <w:iCs w:val="false"/>
-          <w:color w:val="000000"/>
-          <w:sz w:val="22"/>
-          <w:szCs w:val="22"/>
-        </w:rPr>
-        <w:t xml:space="preserve">Click Close the day on the left, or follow the lock on Sell now, or click the Home task.</w:t>
-      </w:r>
-    </w:p>
-    <w:p>
-      <w:pPr>
-        <w:spacing w:after="80" w:line="276"/>
-      </w:pPr>
-      <w:r>
-        <w:rPr>
-          <w:rFonts w:ascii="Calibri" w:cs="Calibri" w:eastAsia="Calibri" w:hAnsi="Calibri"/>
-          <w:b/>
-          <w:bCs/>
-          <w:i w:val="false"/>
-          <w:iCs w:val="false"/>
-          <w:color w:val="000000"/>
-          <w:sz w:val="22"/>
-          <w:szCs w:val="22"/>
-        </w:rPr>
-        <w:t xml:space="preserve">3. </w:t>
-      </w:r>
-      <w:r>
-        <w:rPr>
-          <w:rFonts w:ascii="Calibri" w:cs="Calibri" w:eastAsia="Calibri" w:hAnsi="Calibri"/>
-          <w:b w:val="false"/>
-          <w:bCs w:val="false"/>
-          <w:i w:val="false"/>
-          <w:iCs w:val="false"/>
-          <w:color w:val="000000"/>
-          <w:sz w:val="22"/>
-          <w:szCs w:val="22"/>
-        </w:rPr>
-        <w:t xml:space="preserve">Confirm the date at the top is the unclosed day, not today, if yesterday still needs a count.</w:t>
-      </w:r>
-    </w:p>
-    <w:p>
-      <w:pPr>
-        <w:spacing w:after="80" w:line="276"/>
-      </w:pPr>
-      <w:r>
-        <w:rPr>
-          <w:rFonts w:ascii="Calibri" w:cs="Calibri" w:eastAsia="Calibri" w:hAnsi="Calibri"/>
-          <w:b/>
-          <w:bCs/>
-          <w:i w:val="false"/>
-          <w:iCs w:val="false"/>
-          <w:color w:val="000000"/>
-          <w:sz w:val="22"/>
-          <w:szCs w:val="22"/>
-        </w:rPr>
-        <w:t xml:space="preserve">4. </w:t>
-      </w:r>
-      <w:r>
-        <w:rPr>
-          <w:rFonts w:ascii="Calibri" w:cs="Calibri" w:eastAsia="Calibri" w:hAnsi="Calibri"/>
-          <w:b w:val="false"/>
-          <w:bCs w:val="false"/>
-          <w:i w:val="false"/>
-          <w:iCs w:val="false"/>
-          <w:color w:val="000000"/>
-          <w:sz w:val="22"/>
-          <w:szCs w:val="22"/>
-        </w:rPr>
-        <w:t xml:space="preserve">Read Cash expected, Transfers, POS, and Sales this day.</w:t>
-      </w:r>
-    </w:p>
-    <w:p>
-      <w:pPr>
-        <w:spacing w:after="80" w:line="276"/>
-      </w:pPr>
-      <w:r>
-        <w:rPr>
-          <w:rFonts w:ascii="Calibri" w:cs="Calibri" w:eastAsia="Calibri" w:hAnsi="Calibri"/>
-          <w:b/>
-          <w:bCs/>
-          <w:i w:val="false"/>
-          <w:iCs w:val="false"/>
-          <w:color w:val="000000"/>
-          <w:sz w:val="22"/>
-          <w:szCs w:val="22"/>
-        </w:rPr>
-        <w:t xml:space="preserve">5. </w:t>
-      </w:r>
-      <w:r>
-        <w:rPr>
-          <w:rFonts w:ascii="Calibri" w:cs="Calibri" w:eastAsia="Calibri" w:hAnsi="Calibri"/>
-          <w:b w:val="false"/>
-          <w:bCs w:val="false"/>
-          <w:i w:val="false"/>
-          <w:iCs w:val="false"/>
-          <w:color w:val="000000"/>
-          <w:sz w:val="22"/>
-          <w:szCs w:val="22"/>
-        </w:rPr>
-        <w:t xml:space="preserve">Count the physical cash. Type that number. Add a short note for shortfall or leftover.</w:t>
-      </w:r>
-    </w:p>
-    <w:p>
-      <w:pPr>
-        <w:spacing w:after="80" w:line="276"/>
-      </w:pPr>
-      <w:r>
-        <w:rPr>
-          <w:rFonts w:ascii="Calibri" w:cs="Calibri" w:eastAsia="Calibri" w:hAnsi="Calibri"/>
-          <w:b/>
-          <w:bCs/>
-          <w:i w:val="false"/>
-          <w:iCs w:val="false"/>
-          <w:color w:val="000000"/>
-          <w:sz w:val="22"/>
-          <w:szCs w:val="22"/>
-        </w:rPr>
-        <w:t xml:space="preserve">6. </w:t>
-      </w:r>
-      <w:r>
-        <w:rPr>
-          <w:rFonts w:ascii="Calibri" w:cs="Calibri" w:eastAsia="Calibri" w:hAnsi="Calibri"/>
-          <w:b w:val="false"/>
-          <w:bCs w:val="false"/>
-          <w:i w:val="false"/>
-          <w:iCs w:val="false"/>
-          <w:color w:val="000000"/>
-          <w:sz w:val="22"/>
-          <w:szCs w:val="22"/>
-        </w:rPr>
-        <w:t xml:space="preserve">Click Close this day.</w:t>
-      </w:r>
-    </w:p>
-    <w:p>
-      <w:pPr>
-        <w:spacing w:after="80" w:line="276"/>
-      </w:pPr>
-      <w:r>
-        <w:rPr>
-          <w:rFonts w:ascii="Calibri" w:cs="Calibri" w:eastAsia="Calibri" w:hAnsi="Calibri"/>
-          <w:b/>
-          <w:bCs/>
-          <w:i w:val="false"/>
-          <w:iCs w:val="false"/>
-          <w:color w:val="000000"/>
-          <w:sz w:val="22"/>
-          <w:szCs w:val="22"/>
-        </w:rPr>
-        <w:t xml:space="preserve">7. </w:t>
-      </w:r>
-      <w:r>
-        <w:rPr>
-          <w:rFonts w:ascii="Calibri" w:cs="Calibri" w:eastAsia="Calibri" w:hAnsi="Calibri"/>
-          <w:b w:val="false"/>
-          <w:bCs w:val="false"/>
-          <w:i w:val="false"/>
-          <w:iCs w:val="false"/>
-          <w:color w:val="000000"/>
-          <w:sz w:val="22"/>
-          <w:szCs w:val="22"/>
-        </w:rPr>
-        <w:t xml:space="preserve">If another date is still listed, close that one too. Then open Sell now.</w:t>
-      </w:r>
-    </w:p>
-    <w:p>
-      <w:pPr>
-        <w:pStyle w:val="Heading3"/>
-        <w:spacing w:after="80" w:before="200"/>
-      </w:pPr>
-      <w:r>
-        <w:rPr>
-          <w:rFonts w:ascii="Calibri" w:cs="Calibri" w:eastAsia="Calibri" w:hAnsi="Calibri"/>
-          <w:b/>
-          <w:bCs/>
-          <w:i w:val="false"/>
-          <w:iCs w:val="false"/>
-          <w:color w:val="000000"/>
-          <w:sz w:val="24"/>
-          <w:szCs w:val="24"/>
-        </w:rPr>
-        <w:t xml:space="preserve">What you should see</w:t>
+        <w:t xml:space="preserve">People who still owe us shows credit balances.</w:t>
       </w:r>
     </w:p>
     <w:p>
@@ -19211,7 +19218,7 @@
           <w:sz w:val="22"/>
           <w:szCs w:val="22"/>
         </w:rPr>
-        <w:t xml:space="preserve">Unclosed days appear as buttons. The day you are counting is marked.</w:t>
+        <w:t xml:space="preserve">A finished cash sale appears as money in.</w:t>
       </w:r>
     </w:p>
     <w:p>
@@ -19234,7 +19241,7 @@
           <w:sz w:val="22"/>
           <w:szCs w:val="22"/>
         </w:rPr>
-        <w:t xml:space="preserve">Cash expected is only cash sales for that business day, not every sale you ever made.</w:t>
+        <w:t xml:space="preserve">An approved expense that was paid appears as money out.</w:t>
       </w:r>
     </w:p>
     <w:p>
@@ -19257,7 +19264,7 @@
           <w:sz w:val="22"/>
           <w:szCs w:val="22"/>
         </w:rPr>
-        <w:t xml:space="preserve">You cannot close the same shop day twice.</w:t>
+        <w:t xml:space="preserve">Figures are in naira.</w:t>
       </w:r>
     </w:p>
     <w:p>
@@ -19280,7 +19287,487 @@
           <w:sz w:val="22"/>
           <w:szCs w:val="22"/>
         </w:rPr>
-        <w:t xml:space="preserve">After the last unclosed day is closed, Sell now lets you complete a new live sale.</w:t>
+        <w:t xml:space="preserve">A link says Close the day and export cash count.</w:t>
+      </w:r>
+    </w:p>
+    <w:p>
+      <w:pPr>
+        <w:pStyle w:val="Heading2"/>
+        <w:spacing w:after="120" w:before="280"/>
+      </w:pPr>
+      <w:r>
+        <w:rPr>
+          <w:rFonts w:ascii="Calibri" w:cs="Calibri" w:eastAsia="Calibri" w:hAnsi="Calibri"/>
+          <w:b/>
+          <w:bCs/>
+          <w:i w:val="false"/>
+          <w:iCs w:val="false"/>
+          <w:color w:val="000000"/>
+          <w:sz w:val="26"/>
+          <w:szCs w:val="26"/>
+        </w:rPr>
+        <w:t xml:space="preserve">10.19 Close the day</w:t>
+      </w:r>
+    </w:p>
+    <w:p>
+      <w:pPr>
+        <w:pStyle w:val="Heading3"/>
+        <w:spacing w:after="80" w:before="200"/>
+      </w:pPr>
+      <w:r>
+        <w:rPr>
+          <w:rFonts w:ascii="Calibri" w:cs="Calibri" w:eastAsia="Calibri" w:hAnsi="Calibri"/>
+          <w:b/>
+          <w:bCs/>
+          <w:i w:val="false"/>
+          <w:iCs w:val="false"/>
+          <w:color w:val="000000"/>
+          <w:sz w:val="24"/>
+          <w:szCs w:val="24"/>
+        </w:rPr>
+        <w:t xml:space="preserve">What this page is</w:t>
+      </w:r>
+    </w:p>
+    <w:p>
+      <w:pPr>
+        <w:spacing w:after="160" w:before="0" w:line="276"/>
+        <w:jc w:val="left"/>
+      </w:pPr>
+      <w:r>
+        <w:rPr>
+          <w:rFonts w:ascii="Calibri" w:cs="Calibri" w:eastAsia="Calibri" w:hAnsi="Calibri"/>
+          <w:b w:val="false"/>
+          <w:bCs w:val="false"/>
+          <w:i w:val="false"/>
+          <w:iCs w:val="false"/>
+          <w:color w:val="000000"/>
+          <w:sz w:val="22"/>
+          <w:szCs w:val="22"/>
+        </w:rPr>
+        <w:t xml:space="preserve">Close the day finishes every past Lagos day that had sales, so Sell now can open. You see total sales, cash expected, transfer, POS, and credit left unpaid. If cash came into the till, count it and type cash remitted. If cash expected is zero, click Close the day with no till count. Sell now stays locked until every older day with sales is closed.</w:t>
+      </w:r>
+    </w:p>
+    <w:p>
+      <w:pPr>
+        <w:pStyle w:val="Heading3"/>
+        <w:spacing w:after="80" w:before="200"/>
+      </w:pPr>
+      <w:r>
+        <w:rPr>
+          <w:rFonts w:ascii="Calibri" w:cs="Calibri" w:eastAsia="Calibri" w:hAnsi="Calibri"/>
+          <w:b/>
+          <w:bCs/>
+          <w:i w:val="false"/>
+          <w:iCs w:val="false"/>
+          <w:color w:val="000000"/>
+          <w:sz w:val="24"/>
+          <w:szCs w:val="24"/>
+        </w:rPr>
+        <w:t xml:space="preserve">Why it is here</w:t>
+      </w:r>
+    </w:p>
+    <w:p>
+      <w:pPr>
+        <w:spacing w:after="160" w:before="0" w:line="276"/>
+        <w:jc w:val="left"/>
+      </w:pPr>
+      <w:r>
+        <w:rPr>
+          <w:rFonts w:ascii="Calibri" w:cs="Calibri" w:eastAsia="Calibri" w:hAnsi="Calibri"/>
+          <w:b w:val="false"/>
+          <w:bCs w:val="false"/>
+          <w:i w:val="false"/>
+          <w:iCs w:val="false"/>
+          <w:color w:val="000000"/>
+          <w:sz w:val="22"/>
+          <w:szCs w:val="22"/>
+        </w:rPr>
+        <w:t xml:space="preserve">Abu Twins often sells by transfer and POS for a whole week with no cash. Those days still need a close so tomorrow's sales are not locked, but staff should not be forced to invent a cash count.</w:t>
+      </w:r>
+    </w:p>
+    <w:p>
+      <w:pPr>
+        <w:pStyle w:val="Heading3"/>
+        <w:spacing w:after="80" w:before="200"/>
+      </w:pPr>
+      <w:r>
+        <w:rPr>
+          <w:rFonts w:ascii="Calibri" w:cs="Calibri" w:eastAsia="Calibri" w:hAnsi="Calibri"/>
+          <w:b/>
+          <w:bCs/>
+          <w:i w:val="false"/>
+          <w:iCs w:val="false"/>
+          <w:color w:val="000000"/>
+          <w:sz w:val="24"/>
+          <w:szCs w:val="24"/>
+        </w:rPr>
+        <w:t xml:space="preserve">A real shop story</w:t>
+      </w:r>
+    </w:p>
+    <w:p>
+      <w:pPr>
+        <w:spacing w:after="160" w:before="0" w:line="276"/>
+        <w:jc w:val="left"/>
+      </w:pPr>
+      <w:r>
+        <w:rPr>
+          <w:rFonts w:ascii="Calibri" w:cs="Calibri" w:eastAsia="Calibri" w:hAnsi="Calibri"/>
+          <w:b w:val="false"/>
+          <w:bCs w:val="false"/>
+          <w:i w:val="false"/>
+          <w:iCs w:val="false"/>
+          <w:color w:val="000000"/>
+          <w:sz w:val="22"/>
+          <w:szCs w:val="22"/>
+        </w:rPr>
+        <w:t xml:space="preserve">Monday at Iwo Road had only transfer and POS. Cash expected is ₦0. The cashier opens Close the day, reads the totals, and clicks Close the day. No till count. Sell now opens Tuesday. On Friday a buyer pays cash. Cash expected is ₦50,000. That day needs a till count before close.</w:t>
+      </w:r>
+    </w:p>
+    <w:p>
+      <w:pPr>
+        <w:pStyle w:val="Heading3"/>
+        <w:spacing w:after="80" w:before="200"/>
+      </w:pPr>
+      <w:r>
+        <w:rPr>
+          <w:rFonts w:ascii="Calibri" w:cs="Calibri" w:eastAsia="Calibri" w:hAnsi="Calibri"/>
+          <w:b/>
+          <w:bCs/>
+          <w:i w:val="false"/>
+          <w:iCs w:val="false"/>
+          <w:color w:val="000000"/>
+          <w:sz w:val="24"/>
+          <w:szCs w:val="24"/>
+        </w:rPr>
+        <w:t xml:space="preserve">How to try it</w:t>
+      </w:r>
+    </w:p>
+    <w:p>
+      <w:pPr>
+        <w:spacing w:after="80" w:line="276"/>
+      </w:pPr>
+      <w:r>
+        <w:rPr>
+          <w:rFonts w:ascii="Calibri" w:cs="Calibri" w:eastAsia="Calibri" w:hAnsi="Calibri"/>
+          <w:b/>
+          <w:bCs/>
+          <w:i w:val="false"/>
+          <w:iCs w:val="false"/>
+          <w:color w:val="000000"/>
+          <w:sz w:val="22"/>
+          <w:szCs w:val="22"/>
+        </w:rPr>
+        <w:t xml:space="preserve">1. </w:t>
+      </w:r>
+      <w:r>
+        <w:rPr>
+          <w:rFonts w:ascii="Calibri" w:cs="Calibri" w:eastAsia="Calibri" w:hAnsi="Calibri"/>
+          <w:b w:val="false"/>
+          <w:bCs w:val="false"/>
+          <w:i w:val="false"/>
+          <w:iCs w:val="false"/>
+          <w:color w:val="000000"/>
+          <w:sz w:val="22"/>
+          <w:szCs w:val="22"/>
+        </w:rPr>
+        <w:t xml:space="preserve">Sign in as cashier, sales person, shop manager, accountant, CEO, or Super Admin.</w:t>
+      </w:r>
+    </w:p>
+    <w:p>
+      <w:pPr>
+        <w:spacing w:after="80" w:line="276"/>
+      </w:pPr>
+      <w:r>
+        <w:rPr>
+          <w:rFonts w:ascii="Calibri" w:cs="Calibri" w:eastAsia="Calibri" w:hAnsi="Calibri"/>
+          <w:b/>
+          <w:bCs/>
+          <w:i w:val="false"/>
+          <w:iCs w:val="false"/>
+          <w:color w:val="000000"/>
+          <w:sz w:val="22"/>
+          <w:szCs w:val="22"/>
+        </w:rPr>
+        <w:t xml:space="preserve">2. </w:t>
+      </w:r>
+      <w:r>
+        <w:rPr>
+          <w:rFonts w:ascii="Calibri" w:cs="Calibri" w:eastAsia="Calibri" w:hAnsi="Calibri"/>
+          <w:b w:val="false"/>
+          <w:bCs w:val="false"/>
+          <w:i w:val="false"/>
+          <w:iCs w:val="false"/>
+          <w:color w:val="000000"/>
+          <w:sz w:val="22"/>
+          <w:szCs w:val="22"/>
+        </w:rPr>
+        <w:t xml:space="preserve">Click Close the day on the left, or follow the lock on Sell now, or click the Home task.</w:t>
+      </w:r>
+    </w:p>
+    <w:p>
+      <w:pPr>
+        <w:spacing w:after="80" w:line="276"/>
+      </w:pPr>
+      <w:r>
+        <w:rPr>
+          <w:rFonts w:ascii="Calibri" w:cs="Calibri" w:eastAsia="Calibri" w:hAnsi="Calibri"/>
+          <w:b/>
+          <w:bCs/>
+          <w:i w:val="false"/>
+          <w:iCs w:val="false"/>
+          <w:color w:val="000000"/>
+          <w:sz w:val="22"/>
+          <w:szCs w:val="22"/>
+        </w:rPr>
+        <w:t xml:space="preserve">3. </w:t>
+      </w:r>
+      <w:r>
+        <w:rPr>
+          <w:rFonts w:ascii="Calibri" w:cs="Calibri" w:eastAsia="Calibri" w:hAnsi="Calibri"/>
+          <w:b w:val="false"/>
+          <w:bCs w:val="false"/>
+          <w:i w:val="false"/>
+          <w:iCs w:val="false"/>
+          <w:color w:val="000000"/>
+          <w:sz w:val="22"/>
+          <w:szCs w:val="22"/>
+        </w:rPr>
+        <w:t xml:space="preserve">Confirm the date at the top is the unclosed day, not today, if yesterday still needs a close.</w:t>
+      </w:r>
+    </w:p>
+    <w:p>
+      <w:pPr>
+        <w:spacing w:after="80" w:line="276"/>
+      </w:pPr>
+      <w:r>
+        <w:rPr>
+          <w:rFonts w:ascii="Calibri" w:cs="Calibri" w:eastAsia="Calibri" w:hAnsi="Calibri"/>
+          <w:b/>
+          <w:bCs/>
+          <w:i w:val="false"/>
+          <w:iCs w:val="false"/>
+          <w:color w:val="000000"/>
+          <w:sz w:val="22"/>
+          <w:szCs w:val="22"/>
+        </w:rPr>
+        <w:t xml:space="preserve">4. </w:t>
+      </w:r>
+      <w:r>
+        <w:rPr>
+          <w:rFonts w:ascii="Calibri" w:cs="Calibri" w:eastAsia="Calibri" w:hAnsi="Calibri"/>
+          <w:b w:val="false"/>
+          <w:bCs w:val="false"/>
+          <w:i w:val="false"/>
+          <w:iCs w:val="false"/>
+          <w:color w:val="000000"/>
+          <w:sz w:val="22"/>
+          <w:szCs w:val="22"/>
+        </w:rPr>
+        <w:t xml:space="preserve">Read Cash expected, Transfers, POS, and Sales this day.</w:t>
+      </w:r>
+    </w:p>
+    <w:p>
+      <w:pPr>
+        <w:spacing w:after="80" w:line="276"/>
+      </w:pPr>
+      <w:r>
+        <w:rPr>
+          <w:rFonts w:ascii="Calibri" w:cs="Calibri" w:eastAsia="Calibri" w:hAnsi="Calibri"/>
+          <w:b/>
+          <w:bCs/>
+          <w:i w:val="false"/>
+          <w:iCs w:val="false"/>
+          <w:color w:val="000000"/>
+          <w:sz w:val="22"/>
+          <w:szCs w:val="22"/>
+        </w:rPr>
+        <w:t xml:space="preserve">5. </w:t>
+      </w:r>
+      <w:r>
+        <w:rPr>
+          <w:rFonts w:ascii="Calibri" w:cs="Calibri" w:eastAsia="Calibri" w:hAnsi="Calibri"/>
+          <w:b w:val="false"/>
+          <w:bCs w:val="false"/>
+          <w:i w:val="false"/>
+          <w:iCs w:val="false"/>
+          <w:color w:val="000000"/>
+          <w:sz w:val="22"/>
+          <w:szCs w:val="22"/>
+        </w:rPr>
+        <w:t xml:space="preserve">If cash expected is more than zero, count the physical cash, type that number, and add a short note if needed.</w:t>
+      </w:r>
+    </w:p>
+    <w:p>
+      <w:pPr>
+        <w:spacing w:after="80" w:line="276"/>
+      </w:pPr>
+      <w:r>
+        <w:rPr>
+          <w:rFonts w:ascii="Calibri" w:cs="Calibri" w:eastAsia="Calibri" w:hAnsi="Calibri"/>
+          <w:b/>
+          <w:bCs/>
+          <w:i w:val="false"/>
+          <w:iCs w:val="false"/>
+          <w:color w:val="000000"/>
+          <w:sz w:val="22"/>
+          <w:szCs w:val="22"/>
+        </w:rPr>
+        <w:t xml:space="preserve">6. </w:t>
+      </w:r>
+      <w:r>
+        <w:rPr>
+          <w:rFonts w:ascii="Calibri" w:cs="Calibri" w:eastAsia="Calibri" w:hAnsi="Calibri"/>
+          <w:b w:val="false"/>
+          <w:bCs w:val="false"/>
+          <w:i w:val="false"/>
+          <w:iCs w:val="false"/>
+          <w:color w:val="000000"/>
+          <w:sz w:val="22"/>
+          <w:szCs w:val="22"/>
+        </w:rPr>
+        <w:t xml:space="preserve">If cash expected is zero, leave the till count alone and click Close the day.</w:t>
+      </w:r>
+    </w:p>
+    <w:p>
+      <w:pPr>
+        <w:spacing w:after="80" w:line="276"/>
+      </w:pPr>
+      <w:r>
+        <w:rPr>
+          <w:rFonts w:ascii="Calibri" w:cs="Calibri" w:eastAsia="Calibri" w:hAnsi="Calibri"/>
+          <w:b/>
+          <w:bCs/>
+          <w:i w:val="false"/>
+          <w:iCs w:val="false"/>
+          <w:color w:val="000000"/>
+          <w:sz w:val="22"/>
+          <w:szCs w:val="22"/>
+        </w:rPr>
+        <w:t xml:space="preserve">7. </w:t>
+      </w:r>
+      <w:r>
+        <w:rPr>
+          <w:rFonts w:ascii="Calibri" w:cs="Calibri" w:eastAsia="Calibri" w:hAnsi="Calibri"/>
+          <w:b w:val="false"/>
+          <w:bCs w:val="false"/>
+          <w:i w:val="false"/>
+          <w:iCs w:val="false"/>
+          <w:color w:val="000000"/>
+          <w:sz w:val="22"/>
+          <w:szCs w:val="22"/>
+        </w:rPr>
+        <w:t xml:space="preserve">If another date is still listed, close that one too. Then open Sell now.</w:t>
+      </w:r>
+    </w:p>
+    <w:p>
+      <w:pPr>
+        <w:pStyle w:val="Heading3"/>
+        <w:spacing w:after="80" w:before="200"/>
+      </w:pPr>
+      <w:r>
+        <w:rPr>
+          <w:rFonts w:ascii="Calibri" w:cs="Calibri" w:eastAsia="Calibri" w:hAnsi="Calibri"/>
+          <w:b/>
+          <w:bCs/>
+          <w:i w:val="false"/>
+          <w:iCs w:val="false"/>
+          <w:color w:val="000000"/>
+          <w:sz w:val="24"/>
+          <w:szCs w:val="24"/>
+        </w:rPr>
+        <w:t xml:space="preserve">What you should see</w:t>
+      </w:r>
+    </w:p>
+    <w:p>
+      <w:pPr>
+        <w:pStyle w:val="ListParagraph"/>
+        <w:numPr>
+          <w:ilvl w:val="0"/>
+          <w:numId w:val="2"/>
+        </w:numPr>
+        <w:spacing w:after="80" w:line="276"/>
+      </w:pPr>
+      <w:r>
+        <w:rPr>
+          <w:rFonts w:ascii="Calibri" w:cs="Calibri" w:eastAsia="Calibri" w:hAnsi="Calibri"/>
+          <w:b w:val="false"/>
+          <w:bCs w:val="false"/>
+          <w:i w:val="false"/>
+          <w:iCs w:val="false"/>
+          <w:color w:val="000000"/>
+          <w:sz w:val="22"/>
+          <w:szCs w:val="22"/>
+        </w:rPr>
+        <w:t xml:space="preserve">A day with only transfer and POS closes with cash remitted ₦0.</w:t>
+      </w:r>
+    </w:p>
+    <w:p>
+      <w:pPr>
+        <w:pStyle w:val="ListParagraph"/>
+        <w:numPr>
+          <w:ilvl w:val="0"/>
+          <w:numId w:val="2"/>
+        </w:numPr>
+        <w:spacing w:after="80" w:line="276"/>
+      </w:pPr>
+      <w:r>
+        <w:rPr>
+          <w:rFonts w:ascii="Calibri" w:cs="Calibri" w:eastAsia="Calibri" w:hAnsi="Calibri"/>
+          <w:b w:val="false"/>
+          <w:bCs w:val="false"/>
+          <w:i w:val="false"/>
+          <w:iCs w:val="false"/>
+          <w:color w:val="000000"/>
+          <w:sz w:val="22"/>
+          <w:szCs w:val="22"/>
+        </w:rPr>
+        <w:t xml:space="preserve">A day with cash sales requires cash remitted before close.</w:t>
+      </w:r>
+    </w:p>
+    <w:p>
+      <w:pPr>
+        <w:pStyle w:val="ListParagraph"/>
+        <w:numPr>
+          <w:ilvl w:val="0"/>
+          <w:numId w:val="2"/>
+        </w:numPr>
+        <w:spacing w:after="80" w:line="276"/>
+      </w:pPr>
+      <w:r>
+        <w:rPr>
+          <w:rFonts w:ascii="Calibri" w:cs="Calibri" w:eastAsia="Calibri" w:hAnsi="Calibri"/>
+          <w:b w:val="false"/>
+          <w:bCs w:val="false"/>
+          <w:i w:val="false"/>
+          <w:iCs w:val="false"/>
+          <w:color w:val="000000"/>
+          <w:sz w:val="22"/>
+          <w:szCs w:val="22"/>
+        </w:rPr>
+        <w:t xml:space="preserve">After every old day with sales is closed, Sell now works again.</w:t>
+      </w:r>
+    </w:p>
+    <w:p>
+      <w:pPr>
+        <w:pStyle w:val="ListParagraph"/>
+        <w:numPr>
+          <w:ilvl w:val="0"/>
+          <w:numId w:val="2"/>
+        </w:numPr>
+        <w:spacing w:after="80" w:line="276"/>
+      </w:pPr>
+      <w:r>
+        <w:rPr>
+          <w:rFonts w:ascii="Calibri" w:cs="Calibri" w:eastAsia="Calibri" w:hAnsi="Calibri"/>
+          <w:b w:val="false"/>
+          <w:bCs w:val="false"/>
+          <w:i w:val="false"/>
+          <w:iCs w:val="false"/>
+          <w:color w:val="000000"/>
+          <w:sz w:val="22"/>
+          <w:szCs w:val="22"/>
+        </w:rPr>
+        <w:t xml:space="preserve">Closing does not change any invoice.</w:t>
       </w:r>
     </w:p>
     <w:p>
@@ -41962,6 +42449,465 @@
           </w:p>
         </w:tc>
       </w:tr>
+      <w:tr>
+        <w:trPr>
+          <w:trHeight w:val="320" w:hRule="atLeast"/>
+        </w:trPr>
+        <w:tc>
+          <w:tcPr>
+            <w:tcW w:type="dxa" w:w="600"/>
+            <w:tcBorders>
+              <w:top w:val="single" w:color="000000" w:sz="8"/>
+              <w:left w:val="single" w:color="000000" w:sz="8"/>
+              <w:bottom w:val="single" w:color="000000" w:sz="8"/>
+              <w:right w:val="single" w:color="000000" w:sz="8"/>
+            </w:tcBorders>
+            <w:shd w:fill="F7F7F7" w:color="F7F7F7" w:val="clear"/>
+            <w:tcMar>
+              <w:top w:type="dxa" w:w="60"/>
+              <w:left w:type="dxa" w:w="80"/>
+              <w:bottom w:type="dxa" w:w="60"/>
+              <w:right w:type="dxa" w:w="80"/>
+            </w:tcMar>
+            <w:vAlign w:val="center"/>
+          </w:tcPr>
+          <w:p>
+            <w:pPr>
+              <w:jc w:val="left"/>
+            </w:pPr>
+            <w:r>
+              <w:rPr>
+                <w:rFonts w:ascii="Calibri" w:cs="Calibri" w:eastAsia="Calibri" w:hAnsi="Calibri"/>
+                <w:b w:val="false"/>
+                <w:bCs w:val="false"/>
+                <w:i w:val="false"/>
+                <w:iCs w:val="false"/>
+                <w:color w:val="000000"/>
+                <w:sz w:val="20"/>
+                <w:szCs w:val="20"/>
+              </w:rPr>
+              <w:t xml:space="preserve">48</w:t>
+            </w:r>
+          </w:p>
+        </w:tc>
+        <w:tc>
+          <w:tcPr>
+            <w:tcW w:type="dxa" w:w="2800"/>
+            <w:tcBorders>
+              <w:top w:val="single" w:color="000000" w:sz="8"/>
+              <w:left w:val="single" w:color="000000" w:sz="8"/>
+              <w:bottom w:val="single" w:color="000000" w:sz="8"/>
+              <w:right w:val="single" w:color="000000" w:sz="8"/>
+            </w:tcBorders>
+            <w:shd w:fill="F7F7F7" w:color="F7F7F7" w:val="clear"/>
+            <w:tcMar>
+              <w:top w:type="dxa" w:w="60"/>
+              <w:left w:type="dxa" w:w="80"/>
+              <w:bottom w:type="dxa" w:w="60"/>
+              <w:right w:type="dxa" w:w="80"/>
+            </w:tcMar>
+            <w:vAlign w:val="center"/>
+          </w:tcPr>
+          <w:p>
+            <w:pPr>
+              <w:jc w:val="left"/>
+            </w:pPr>
+            <w:r>
+              <w:rPr>
+                <w:rFonts w:ascii="Calibri" w:cs="Calibri" w:eastAsia="Calibri" w:hAnsi="Calibri"/>
+                <w:b w:val="false"/>
+                <w:bCs w:val="false"/>
+                <w:i w:val="false"/>
+                <w:iCs w:val="false"/>
+                <w:color w:val="000000"/>
+                <w:sz w:val="20"/>
+                <w:szCs w:val="20"/>
+              </w:rPr>
+              <w:t xml:space="preserve">Opening stock categories for split counting</w:t>
+            </w:r>
+          </w:p>
+        </w:tc>
+        <w:tc>
+          <w:tcPr>
+            <w:tcW w:type="dxa" w:w="2600"/>
+            <w:tcBorders>
+              <w:top w:val="single" w:color="000000" w:sz="8"/>
+              <w:left w:val="single" w:color="000000" w:sz="8"/>
+              <w:bottom w:val="single" w:color="000000" w:sz="8"/>
+              <w:right w:val="single" w:color="000000" w:sz="8"/>
+            </w:tcBorders>
+            <w:shd w:fill="F7F7F7" w:color="F7F7F7" w:val="clear"/>
+            <w:tcMar>
+              <w:top w:type="dxa" w:w="60"/>
+              <w:left w:type="dxa" w:w="80"/>
+              <w:bottom w:type="dxa" w:w="60"/>
+              <w:right w:type="dxa" w:w="80"/>
+            </w:tcMar>
+            <w:vAlign w:val="center"/>
+          </w:tcPr>
+          <w:p>
+            <w:pPr>
+              <w:jc w:val="left"/>
+            </w:pPr>
+            <w:r>
+              <w:rPr>
+                <w:rFonts w:ascii="Calibri" w:cs="Calibri" w:eastAsia="Calibri" w:hAnsi="Calibri"/>
+                <w:b w:val="false"/>
+                <w:bCs w:val="false"/>
+                <w:i w:val="false"/>
+                <w:iCs w:val="false"/>
+                <w:color w:val="000000"/>
+                <w:sz w:val="20"/>
+                <w:szCs w:val="20"/>
+              </w:rPr>
+              <w:t xml:space="preserve">ceo@abutwins.com or manager@abutwins.com</w:t>
+            </w:r>
+          </w:p>
+        </w:tc>
+        <w:tc>
+          <w:tcPr>
+            <w:tcW w:type="dxa" w:w="3360"/>
+            <w:tcBorders>
+              <w:top w:val="single" w:color="000000" w:sz="8"/>
+              <w:left w:val="single" w:color="000000" w:sz="8"/>
+              <w:bottom w:val="single" w:color="000000" w:sz="8"/>
+              <w:right w:val="single" w:color="000000" w:sz="8"/>
+            </w:tcBorders>
+            <w:shd w:fill="F7F7F7" w:color="F7F7F7" w:val="clear"/>
+            <w:tcMar>
+              <w:top w:type="dxa" w:w="60"/>
+              <w:left w:type="dxa" w:w="80"/>
+              <w:bottom w:type="dxa" w:w="60"/>
+              <w:right w:type="dxa" w:w="80"/>
+            </w:tcMar>
+            <w:vAlign w:val="center"/>
+          </w:tcPr>
+          <w:p>
+            <w:pPr>
+              <w:jc w:val="left"/>
+            </w:pPr>
+            <w:r>
+              <w:rPr>
+                <w:rFonts w:ascii="Calibri" w:cs="Calibri" w:eastAsia="Calibri" w:hAnsi="Calibri"/>
+                <w:b w:val="false"/>
+                <w:bCs w:val="false"/>
+                <w:i w:val="false"/>
+                <w:iCs w:val="false"/>
+                <w:color w:val="000000"/>
+                <w:sz w:val="20"/>
+                <w:szCs w:val="20"/>
+              </w:rPr>
+              <w:t xml:space="preserve">Correct &amp; close opening stock shows Category. Tap Phones, Accessories, Screen, or Laptop to shorten the list.</w:t>
+            </w:r>
+          </w:p>
+        </w:tc>
+      </w:tr>
+      <w:tr>
+        <w:trPr>
+          <w:trHeight w:val="320" w:hRule="atLeast"/>
+        </w:trPr>
+        <w:tc>
+          <w:tcPr>
+            <w:tcW w:type="dxa" w:w="600"/>
+            <w:tcBorders>
+              <w:top w:val="single" w:color="000000" w:sz="8"/>
+              <w:left w:val="single" w:color="000000" w:sz="8"/>
+              <w:bottom w:val="single" w:color="000000" w:sz="8"/>
+              <w:right w:val="single" w:color="000000" w:sz="8"/>
+            </w:tcBorders>
+            <w:shd w:fill="FFFFFF" w:color="FFFFFF" w:val="clear"/>
+            <w:tcMar>
+              <w:top w:type="dxa" w:w="60"/>
+              <w:left w:type="dxa" w:w="80"/>
+              <w:bottom w:type="dxa" w:w="60"/>
+              <w:right w:type="dxa" w:w="80"/>
+            </w:tcMar>
+            <w:vAlign w:val="center"/>
+          </w:tcPr>
+          <w:p>
+            <w:pPr>
+              <w:jc w:val="left"/>
+            </w:pPr>
+            <w:r>
+              <w:rPr>
+                <w:rFonts w:ascii="Calibri" w:cs="Calibri" w:eastAsia="Calibri" w:hAnsi="Calibri"/>
+                <w:b w:val="false"/>
+                <w:bCs w:val="false"/>
+                <w:i w:val="false"/>
+                <w:iCs w:val="false"/>
+                <w:color w:val="000000"/>
+                <w:sz w:val="20"/>
+                <w:szCs w:val="20"/>
+              </w:rPr>
+              <w:t xml:space="preserve">49</w:t>
+            </w:r>
+          </w:p>
+        </w:tc>
+        <w:tc>
+          <w:tcPr>
+            <w:tcW w:type="dxa" w:w="2800"/>
+            <w:tcBorders>
+              <w:top w:val="single" w:color="000000" w:sz="8"/>
+              <w:left w:val="single" w:color="000000" w:sz="8"/>
+              <w:bottom w:val="single" w:color="000000" w:sz="8"/>
+              <w:right w:val="single" w:color="000000" w:sz="8"/>
+            </w:tcBorders>
+            <w:shd w:fill="FFFFFF" w:color="FFFFFF" w:val="clear"/>
+            <w:tcMar>
+              <w:top w:type="dxa" w:w="60"/>
+              <w:left w:type="dxa" w:w="80"/>
+              <w:bottom w:type="dxa" w:w="60"/>
+              <w:right w:type="dxa" w:w="80"/>
+            </w:tcMar>
+            <w:vAlign w:val="center"/>
+          </w:tcPr>
+          <w:p>
+            <w:pPr>
+              <w:jc w:val="left"/>
+            </w:pPr>
+            <w:r>
+              <w:rPr>
+                <w:rFonts w:ascii="Calibri" w:cs="Calibri" w:eastAsia="Calibri" w:hAnsi="Calibri"/>
+                <w:b w:val="false"/>
+                <w:bCs w:val="false"/>
+                <w:i w:val="false"/>
+                <w:iCs w:val="false"/>
+                <w:color w:val="000000"/>
+                <w:sz w:val="20"/>
+                <w:szCs w:val="20"/>
+              </w:rPr>
+              <w:t xml:space="preserve">Close transfer-only day with no cash count</w:t>
+            </w:r>
+          </w:p>
+        </w:tc>
+        <w:tc>
+          <w:tcPr>
+            <w:tcW w:type="dxa" w:w="2600"/>
+            <w:tcBorders>
+              <w:top w:val="single" w:color="000000" w:sz="8"/>
+              <w:left w:val="single" w:color="000000" w:sz="8"/>
+              <w:bottom w:val="single" w:color="000000" w:sz="8"/>
+              <w:right w:val="single" w:color="000000" w:sz="8"/>
+            </w:tcBorders>
+            <w:shd w:fill="FFFFFF" w:color="FFFFFF" w:val="clear"/>
+            <w:tcMar>
+              <w:top w:type="dxa" w:w="60"/>
+              <w:left w:type="dxa" w:w="80"/>
+              <w:bottom w:type="dxa" w:w="60"/>
+              <w:right w:type="dxa" w:w="80"/>
+            </w:tcMar>
+            <w:vAlign w:val="center"/>
+          </w:tcPr>
+          <w:p>
+            <w:pPr>
+              <w:jc w:val="left"/>
+            </w:pPr>
+            <w:r>
+              <w:rPr>
+                <w:rFonts w:ascii="Calibri" w:cs="Calibri" w:eastAsia="Calibri" w:hAnsi="Calibri"/>
+                <w:b w:val="false"/>
+                <w:bCs w:val="false"/>
+                <w:i w:val="false"/>
+                <w:iCs w:val="false"/>
+                <w:color w:val="000000"/>
+                <w:sz w:val="20"/>
+                <w:szCs w:val="20"/>
+              </w:rPr>
+              <w:t xml:space="preserve">cashier@abutwins.com</w:t>
+            </w:r>
+          </w:p>
+        </w:tc>
+        <w:tc>
+          <w:tcPr>
+            <w:tcW w:type="dxa" w:w="3360"/>
+            <w:tcBorders>
+              <w:top w:val="single" w:color="000000" w:sz="8"/>
+              <w:left w:val="single" w:color="000000" w:sz="8"/>
+              <w:bottom w:val="single" w:color="000000" w:sz="8"/>
+              <w:right w:val="single" w:color="000000" w:sz="8"/>
+            </w:tcBorders>
+            <w:shd w:fill="FFFFFF" w:color="FFFFFF" w:val="clear"/>
+            <w:tcMar>
+              <w:top w:type="dxa" w:w="60"/>
+              <w:left w:type="dxa" w:w="80"/>
+              <w:bottom w:type="dxa" w:w="60"/>
+              <w:right w:type="dxa" w:w="80"/>
+            </w:tcMar>
+            <w:vAlign w:val="center"/>
+          </w:tcPr>
+          <w:p>
+            <w:pPr>
+              <w:jc w:val="left"/>
+            </w:pPr>
+            <w:r>
+              <w:rPr>
+                <w:rFonts w:ascii="Calibri" w:cs="Calibri" w:eastAsia="Calibri" w:hAnsi="Calibri"/>
+                <w:b w:val="false"/>
+                <w:bCs w:val="false"/>
+                <w:i w:val="false"/>
+                <w:iCs w:val="false"/>
+                <w:color w:val="000000"/>
+                <w:sz w:val="20"/>
+                <w:szCs w:val="20"/>
+              </w:rPr>
+              <w:t xml:space="preserve">Cash expected ₦0. Close the day works with no till count. Sell now opens next day.</w:t>
+            </w:r>
+          </w:p>
+        </w:tc>
+      </w:tr>
+      <w:tr>
+        <w:trPr>
+          <w:trHeight w:val="320" w:hRule="atLeast"/>
+        </w:trPr>
+        <w:tc>
+          <w:tcPr>
+            <w:tcW w:type="dxa" w:w="600"/>
+            <w:tcBorders>
+              <w:top w:val="single" w:color="000000" w:sz="8"/>
+              <w:left w:val="single" w:color="000000" w:sz="8"/>
+              <w:bottom w:val="single" w:color="000000" w:sz="8"/>
+              <w:right w:val="single" w:color="000000" w:sz="8"/>
+            </w:tcBorders>
+            <w:shd w:fill="F7F7F7" w:color="F7F7F7" w:val="clear"/>
+            <w:tcMar>
+              <w:top w:type="dxa" w:w="60"/>
+              <w:left w:type="dxa" w:w="80"/>
+              <w:bottom w:type="dxa" w:w="60"/>
+              <w:right w:type="dxa" w:w="80"/>
+            </w:tcMar>
+            <w:vAlign w:val="center"/>
+          </w:tcPr>
+          <w:p>
+            <w:pPr>
+              <w:jc w:val="left"/>
+            </w:pPr>
+            <w:r>
+              <w:rPr>
+                <w:rFonts w:ascii="Calibri" w:cs="Calibri" w:eastAsia="Calibri" w:hAnsi="Calibri"/>
+                <w:b w:val="false"/>
+                <w:bCs w:val="false"/>
+                <w:i w:val="false"/>
+                <w:iCs w:val="false"/>
+                <w:color w:val="000000"/>
+                <w:sz w:val="20"/>
+                <w:szCs w:val="20"/>
+              </w:rPr>
+              <w:t xml:space="preserve">50</w:t>
+            </w:r>
+          </w:p>
+        </w:tc>
+        <w:tc>
+          <w:tcPr>
+            <w:tcW w:type="dxa" w:w="2800"/>
+            <w:tcBorders>
+              <w:top w:val="single" w:color="000000" w:sz="8"/>
+              <w:left w:val="single" w:color="000000" w:sz="8"/>
+              <w:bottom w:val="single" w:color="000000" w:sz="8"/>
+              <w:right w:val="single" w:color="000000" w:sz="8"/>
+            </w:tcBorders>
+            <w:shd w:fill="F7F7F7" w:color="F7F7F7" w:val="clear"/>
+            <w:tcMar>
+              <w:top w:type="dxa" w:w="60"/>
+              <w:left w:type="dxa" w:w="80"/>
+              <w:bottom w:type="dxa" w:w="60"/>
+              <w:right w:type="dxa" w:w="80"/>
+            </w:tcMar>
+            <w:vAlign w:val="center"/>
+          </w:tcPr>
+          <w:p>
+            <w:pPr>
+              <w:jc w:val="left"/>
+            </w:pPr>
+            <w:r>
+              <w:rPr>
+                <w:rFonts w:ascii="Calibri" w:cs="Calibri" w:eastAsia="Calibri" w:hAnsi="Calibri"/>
+                <w:b w:val="false"/>
+                <w:bCs w:val="false"/>
+                <w:i w:val="false"/>
+                <w:iCs w:val="false"/>
+                <w:color w:val="000000"/>
+                <w:sz w:val="20"/>
+                <w:szCs w:val="20"/>
+              </w:rPr>
+              <w:t xml:space="preserve">Accountant sees repairs but cannot open one</w:t>
+            </w:r>
+          </w:p>
+        </w:tc>
+        <w:tc>
+          <w:tcPr>
+            <w:tcW w:type="dxa" w:w="2600"/>
+            <w:tcBorders>
+              <w:top w:val="single" w:color="000000" w:sz="8"/>
+              <w:left w:val="single" w:color="000000" w:sz="8"/>
+              <w:bottom w:val="single" w:color="000000" w:sz="8"/>
+              <w:right w:val="single" w:color="000000" w:sz="8"/>
+            </w:tcBorders>
+            <w:shd w:fill="F7F7F7" w:color="F7F7F7" w:val="clear"/>
+            <w:tcMar>
+              <w:top w:type="dxa" w:w="60"/>
+              <w:left w:type="dxa" w:w="80"/>
+              <w:bottom w:type="dxa" w:w="60"/>
+              <w:right w:type="dxa" w:w="80"/>
+            </w:tcMar>
+            <w:vAlign w:val="center"/>
+          </w:tcPr>
+          <w:p>
+            <w:pPr>
+              <w:jc w:val="left"/>
+            </w:pPr>
+            <w:r>
+              <w:rPr>
+                <w:rFonts w:ascii="Calibri" w:cs="Calibri" w:eastAsia="Calibri" w:hAnsi="Calibri"/>
+                <w:b w:val="false"/>
+                <w:bCs w:val="false"/>
+                <w:i w:val="false"/>
+                <w:iCs w:val="false"/>
+                <w:color w:val="000000"/>
+                <w:sz w:val="20"/>
+                <w:szCs w:val="20"/>
+              </w:rPr>
+              <w:t xml:space="preserve">accountant@abutwins.com</w:t>
+            </w:r>
+          </w:p>
+        </w:tc>
+        <w:tc>
+          <w:tcPr>
+            <w:tcW w:type="dxa" w:w="3360"/>
+            <w:tcBorders>
+              <w:top w:val="single" w:color="000000" w:sz="8"/>
+              <w:left w:val="single" w:color="000000" w:sz="8"/>
+              <w:bottom w:val="single" w:color="000000" w:sz="8"/>
+              <w:right w:val="single" w:color="000000" w:sz="8"/>
+            </w:tcBorders>
+            <w:shd w:fill="F7F7F7" w:color="F7F7F7" w:val="clear"/>
+            <w:tcMar>
+              <w:top w:type="dxa" w:w="60"/>
+              <w:left w:type="dxa" w:w="80"/>
+              <w:bottom w:type="dxa" w:w="60"/>
+              <w:right w:type="dxa" w:w="80"/>
+            </w:tcMar>
+            <w:vAlign w:val="center"/>
+          </w:tcPr>
+          <w:p>
+            <w:pPr>
+              <w:jc w:val="left"/>
+            </w:pPr>
+            <w:r>
+              <w:rPr>
+                <w:rFonts w:ascii="Calibri" w:cs="Calibri" w:eastAsia="Calibri" w:hAnsi="Calibri"/>
+                <w:b w:val="false"/>
+                <w:bCs w:val="false"/>
+                <w:i w:val="false"/>
+                <w:iCs w:val="false"/>
+                <w:color w:val="000000"/>
+                <w:sz w:val="20"/>
+                <w:szCs w:val="20"/>
+              </w:rPr>
+              <w:t xml:space="preserve">Repairs list opens. Open repair form is hidden. No You are not allowed toast on Save.</w:t>
+            </w:r>
+          </w:p>
+        </w:tc>
+      </w:tr>
     </w:tbl>
     <w:p>
       <w:pPr>
@@ -43551,6 +44497,44 @@
           <w:szCs w:val="22"/>
         </w:rPr>
         <w:t xml:space="preserve">Version 1.22 puts Upload stock back in plain words. The left menu says Upload stock again. Staff can load many phones at once from Excel, add phones one after another on a supplier bill, or put one phone on the shelf with no bill. Shop managers, goods intake, and the stock uploader can use both ways.</w:t>
+      </w:r>
+    </w:p>
+    <w:p>
+      <w:pPr>
+        <w:spacing w:after="160" w:before="0" w:line="276"/>
+        <w:jc w:val="left"/>
+      </w:pPr>
+      <w:r>
+        <w:rPr>
+          <w:rFonts w:ascii="Calibri" w:cs="Calibri" w:eastAsia="Calibri" w:hAnsi="Calibri"/>
+          <w:b w:val="false"/>
+          <w:bCs w:val="false"/>
+          <w:i w:val="false"/>
+          <w:iCs w:val="false"/>
+          <w:color w:val="000000"/>
+          <w:sz w:val="22"/>
+          <w:szCs w:val="22"/>
+        </w:rPr>
+        <w:t xml:space="preserve">Version 1.23 adds Category to Correct and close opening stock. Staff can tap Phones, Accessories, Screen, or Laptop and give each group to a different person for a faster shelf count.</w:t>
+      </w:r>
+    </w:p>
+    <w:p>
+      <w:pPr>
+        <w:spacing w:after="160" w:before="0" w:line="276"/>
+        <w:jc w:val="left"/>
+      </w:pPr>
+      <w:r>
+        <w:rPr>
+          <w:rFonts w:ascii="Calibri" w:cs="Calibri" w:eastAsia="Calibri" w:hAnsi="Calibri"/>
+          <w:b w:val="false"/>
+          <w:bCs w:val="false"/>
+          <w:i w:val="false"/>
+          <w:iCs w:val="false"/>
+          <w:color w:val="000000"/>
+          <w:sz w:val="22"/>
+          <w:szCs w:val="22"/>
+        </w:rPr>
+        <w:t xml:space="preserve">Version 1.24 makes cash remittance on Close the day required only when cash came into the till. Transfer and POS days still close with no till count. The Financial Accountant and records checker can open every shop page to oversee the business, post money, and cannot sell, repair, load stock, approve shop work, or change Who can see what.</w:t>
       </w:r>
     </w:p>
     <w:p>

</xml_diff>

<commit_message>
feat: let the CEO correct the shop the same way the main admin can
The owner asked that admin or CEO be able to change the business. Undo money, Who can see what, Settings, shops, and staff now work for both, and Who did what still names every step.

Co-authored-by: Cursor <cursoragent@cursor.com>
</commit_message>
<xml_diff>
--- a/docs/Abu-Twins-Shop-System-User-Guide.docx
+++ b/docs/Abu-Twins-Shop-System-User-Guide.docx
@@ -459,7 +459,7 @@
                 <w:sz w:val="20"/>
                 <w:szCs w:val="20"/>
               </w:rPr>
-              <w:t xml:space="preserve">1.29</w:t>
+              <w:t xml:space="preserve">1.30</w:t>
             </w:r>
           </w:p>
         </w:tc>
@@ -533,7 +533,7 @@
                 <w:sz w:val="20"/>
                 <w:szCs w:val="20"/>
               </w:rPr>
-              <w:t xml:space="preserve">Ready for live shop use: reports by day, week, and month, larger stock uploads, till keeps working when the line drops</w:t>
+              <w:t xml:space="preserve">Updated: the main admin and the CEO can both correct the shop</w:t>
             </w:r>
           </w:p>
         </w:tc>
@@ -1053,6 +1053,25 @@
           <w:sz w:val="22"/>
           <w:szCs w:val="22"/>
         </w:rPr>
+        <w:t xml:space="preserve">The owner asked that the main admin and the CEO must both be able to correct the shop. They can now undo a true money mistake, change Who can see what, change Settings, open or close a shop, lock a staff login, and download a shop backup. Every correction is a new named step. An old invoice still cannot be secretly rewritten.</w:t>
+      </w:r>
+    </w:p>
+    <w:p>
+      <w:pPr>
+        <w:spacing w:after="160" w:before="0" w:line="276"/>
+        <w:jc w:val="left"/>
+      </w:pPr>
+      <w:r>
+        <w:rPr>
+          <w:rFonts w:ascii="Calibri" w:cs="Calibri" w:eastAsia="Calibri" w:hAnsi="Calibri"/>
+          <w:b w:val="false"/>
+          <w:bCs w:val="false"/>
+          <w:i w:val="false"/>
+          <w:iCs w:val="false"/>
+          <w:color w:val="000000"/>
+          <w:sz w:val="22"/>
+          <w:szCs w:val="22"/>
+        </w:rPr>
         <w:t xml:space="preserve">The system has grown steadily since we began. Section 16 lists what each release added, in order, if you want that history. You do not need to read it to use the system.</w:t>
       </w:r>
     </w:p>
@@ -1718,7 +1737,7 @@
           <w:sz w:val="22"/>
           <w:szCs w:val="22"/>
         </w:rPr>
-        <w:t xml:space="preserve">One shop system for all Abu Twins shops. Each phone has a unique number (IMEI). Accessories can have a serial number. Simple items like charger cords are counted by pieces. Goods that are still coming stay marked Coming. Goods in the shop stay marked In shop. A sale makes an invoice that cannot be edited. Money, returns, swaps, and repairs are written as new steps. Super Admin can show or hide a coming list. Super Admin can undo a money collection if a true mistake happened.</w:t>
+        <w:t xml:space="preserve">One shop system for all Abu Twins shops. Each phone has a unique number (IMEI). Accessories can have a serial number. Simple items like charger cords are counted by pieces. Goods that are still coming stay marked Coming. Goods in the shop stay marked In shop. A sale makes an invoice that cannot be edited. Money, returns, swaps, and repairs are written as new steps. Super Admin or the CEO can show or hide a coming list. Super Admin or the CEO can undo a money collection if a true mistake happened. Who did what keeps that step.</w:t>
       </w:r>
     </w:p>
     <w:p>
@@ -5419,7 +5438,7 @@
                 <w:sz w:val="20"/>
                 <w:szCs w:val="20"/>
               </w:rPr>
-              <w:t xml:space="preserve">The person who can see and do everything, and can undo a true mistake.</w:t>
+              <w:t xml:space="preserve">The person who can see and do everything, and can undo a true mistake. The CEO can do the same corrections.</w:t>
             </w:r>
           </w:p>
         </w:tc>
@@ -9396,7 +9415,7 @@
                 <w:sz w:val="21"/>
                 <w:szCs w:val="21"/>
               </w:rPr>
-              <w:t xml:space="preserve">If you cannot see a page, Super Admin has not given that page to your job. That is not a broken computer. Ask Super Admin.</w:t>
+              <w:t xml:space="preserve">If you cannot see a page, Super Admin or the CEO has not given that page to your job. That is not a broken computer. Ask them.</w:t>
             </w:r>
           </w:p>
           <w:p>
@@ -9415,7 +9434,7 @@
                 <w:sz w:val="21"/>
                 <w:szCs w:val="21"/>
               </w:rPr>
-              <w:t xml:space="preserve">Super Admin can do and undo everything. Other jobs only do what Super Admin ticks.</w:t>
+              <w:t xml:space="preserve">The main admin and the CEO can correct the shop. Other jobs only do what they tick. Nobody can secretly rewrite an old invoice.</w:t>
             </w:r>
           </w:p>
         </w:tc>
@@ -14715,7 +14734,7 @@
           <w:sz w:val="22"/>
           <w:szCs w:val="22"/>
         </w:rPr>
-        <w:t xml:space="preserve">Super Admin can reverse the last collection if a true mistake was posted. Other jobs cannot.</w:t>
+        <w:t xml:space="preserve">Super Admin or the CEO can reverse the last collection if a true mistake was posted. Other jobs cannot. The invoice lines still do not change.</w:t>
       </w:r>
     </w:p>
     <w:p>
@@ -21929,7 +21948,7 @@
           <w:sz w:val="22"/>
           <w:szCs w:val="22"/>
         </w:rPr>
-        <w:t xml:space="preserve">Shops lists Iwo Road as HQ and Challenge as Open. Super Admin can open a new shop anywhere in Nigeria. Super Admin can close a shop. Closed shops stay in a Super Admin-only list so old sales are not lost.</w:t>
+        <w:t xml:space="preserve">Shops lists Iwo Road as HQ and Challenge as Open. The main admin or the CEO can open a new shop anywhere in Nigeria, and can close a shop. Closed shops stay in an owner list so old sales are not lost.</w:t>
       </w:r>
     </w:p>
     <w:p>
@@ -22005,7 +22024,7 @@
           <w:sz w:val="22"/>
           <w:szCs w:val="22"/>
         </w:rPr>
-        <w:t xml:space="preserve">Next year Abu Twins may open in Ilorin. Super Admin types the shop name, a short code, and the address. Staff in Ilorin then work in that shop only.</w:t>
+        <w:t xml:space="preserve">Next year Abu Twins may open in Ilorin. The CEO types the shop name, a short code, and the address. Staff in Ilorin then work in that shop only.</w:t>
       </w:r>
     </w:p>
     <w:p>
@@ -22148,7 +22167,7 @@
           <w:sz w:val="22"/>
           <w:szCs w:val="22"/>
         </w:rPr>
-        <w:t xml:space="preserve">Sign in as Super Admin. Confirm a Closed list exists for old shops, and an Open a new shop form is there.</w:t>
+        <w:t xml:space="preserve">Confirm an Open a new shop form is there, and a Closed list exists for old shops.</w:t>
       </w:r>
     </w:p>
     <w:p>
@@ -22190,7 +22209,7 @@
           <w:sz w:val="22"/>
           <w:szCs w:val="22"/>
         </w:rPr>
-        <w:t xml:space="preserve">CEO sees only the two Ibadan shops.</w:t>
+        <w:t xml:space="preserve">CEO sees the Ibadan shops and can open or close a shop.</w:t>
       </w:r>
     </w:p>
     <w:p>
@@ -22259,7 +22278,7 @@
           <w:sz w:val="22"/>
           <w:szCs w:val="22"/>
         </w:rPr>
-        <w:t xml:space="preserve">Only Super Admin can open or close a shop.</w:t>
+        <w:t xml:space="preserve">A cashier cannot open or close a shop.</w:t>
       </w:r>
     </w:p>
     <w:p>
@@ -22316,7 +22335,7 @@
           <w:sz w:val="22"/>
           <w:szCs w:val="22"/>
         </w:rPr>
-        <w:t xml:space="preserve">Staff is the people list. Super Admin or a shop manager (if allowed) can add a person, pick their job, and pick their shop. Super Admin can lock a login.</w:t>
+        <w:t xml:space="preserve">Staff is the people list. Super Admin, the CEO, or a shop manager (if allowed) can add a person, pick their job, and pick their shop. Super Admin or the CEO can lock a login. The CEO cannot lock the main admin.</w:t>
       </w:r>
     </w:p>
     <w:p>
@@ -22392,7 +22411,7 @@
           <w:sz w:val="22"/>
           <w:szCs w:val="22"/>
         </w:rPr>
-        <w:t xml:space="preserve">A new cashier starts at Challenge. Super Admin adds their work email, sets job to Cashier, sets shop to Challenge, and gives them a first password. After they sign in, Super Admin asks them to change it.</w:t>
+        <w:t xml:space="preserve">A new cashier starts at Challenge. The CEO adds their work email, sets job to Cashier, sets shop to Challenge, and gives them a first password. After they sign in, the CEO asks them to change it.</w:t>
       </w:r>
     </w:p>
     <w:p>
@@ -22703,7 +22722,7 @@
           <w:sz w:val="22"/>
           <w:szCs w:val="22"/>
         </w:rPr>
-        <w:t xml:space="preserve">This page is Super Admin only. You tick the pages and the work for each job. Super Admin is not ticked here because Super Admin always has all rights.</w:t>
+        <w:t xml:space="preserve">This page is for the main admin and the CEO. You tick the pages and the work for each job. Super Admin and CEO are not ticked here because they always keep the right to change the shop.</w:t>
       </w:r>
     </w:p>
     <w:p>
@@ -22741,7 +22760,7 @@
           <w:sz w:val="22"/>
           <w:szCs w:val="22"/>
         </w:rPr>
-        <w:t xml:space="preserve">The CEO may want the accountant to see money but not Sell now. That should be a tick, not a phone call to Techvaults.</w:t>
+        <w:t xml:space="preserve">The CEO may want the accountant to see money but not Sell now. That should be a tick, not a phone call to Techvaults. The owner also asked that the CEO, not only Super Admin, can make that tick.</w:t>
       </w:r>
     </w:p>
     <w:p>
@@ -22779,7 +22798,7 @@
           <w:sz w:val="22"/>
           <w:szCs w:val="22"/>
         </w:rPr>
-        <w:t xml:space="preserve">The CEO asks that cashiers must not see Reports. Super Admin opens Who can see what, finds Cashier, unticks Reports, and saves. The cashier signs out and in. Reports is gone.</w:t>
+        <w:t xml:space="preserve">The CEO asks that cashiers must not see Reports. The CEO opens Who can see what, finds Cashier, unticks Reports, and saves. The cashier signs out and in. Reports is gone. Who did what shows the CEO made that change.</w:t>
       </w:r>
     </w:p>
     <w:p>
@@ -22829,7 +22848,7 @@
           <w:sz w:val="22"/>
           <w:szCs w:val="22"/>
         </w:rPr>
-        <w:t xml:space="preserve">Sign in as Super Admin.</w:t>
+        <w:t xml:space="preserve">Sign in as ceo@abutwins.com or admin@abutwins.com.</w:t>
       </w:r>
     </w:p>
     <w:p>
@@ -22964,7 +22983,7 @@
           <w:sz w:val="22"/>
           <w:szCs w:val="22"/>
         </w:rPr>
-        <w:t xml:space="preserve">CEO who opens this address is sent away. Only Super Admin may use it.</w:t>
+        <w:t xml:space="preserve">A cashier who opens this address is sent away. The main admin and the CEO may use it.</w:t>
       </w:r>
     </w:p>
     <w:p>
@@ -23010,7 +23029,7 @@
           <w:sz w:val="22"/>
           <w:szCs w:val="22"/>
         </w:rPr>
-        <w:t xml:space="preserve">Super Admin cannot remove Super Admin rights here. That is by design.</w:t>
+        <w:t xml:space="preserve">Nobody can remove Super Admin or CEO rights here. That is by design.</w:t>
       </w:r>
     </w:p>
     <w:p>
@@ -24336,7 +24355,7 @@
           <w:sz w:val="22"/>
           <w:szCs w:val="22"/>
         </w:rPr>
-        <w:t xml:space="preserve">Settings holds the shop name, phone, address, and email that print on invoices and on Check the books. It also holds the low stock alert, default warranty days (starts at zero so the cashier sets days on the sale), and whether cashiers may sell below the lowest price. Only Super Admin can change these. Super Admin can also download a shop backup: a copy of shops, staff emails (not passwords), stock, IMEIs, sales, and purchases. Keep that file off this computer.</w:t>
+        <w:t xml:space="preserve">Settings holds the shop name, phone, address, and email that print on invoices and on Check the books. It also holds the low stock alert, default warranty days (starts at zero so the cashier sets days on the sale), and whether cashiers may sell below the lowest price. The main admin or the CEO can change these. They can also download a shop backup: a copy of shops, staff emails (not passwords), stock, IMEIs, sales, and purchases. Keep that file off this computer.</w:t>
       </w:r>
     </w:p>
     <w:p>
@@ -24412,7 +24431,7 @@
           <w:sz w:val="22"/>
           <w:szCs w:val="22"/>
         </w:rPr>
-        <w:t xml:space="preserve">Techvaults set the invoice address to Iwo Road, Ibadan, Oyo State and the phone to 07062454854. If the phone number changes, Super Admin updates Settings. The next printed invoice and the next books PDF show the new number. Before a long holiday, Super Admin downloads a shop backup and keeps it off the till computer.</w:t>
+        <w:t xml:space="preserve">Techvaults set the invoice address to Iwo Road, Ibadan, Oyo State and the phone to 07062454854. If the phone number changes, the CEO updates Settings. The next printed invoice and the next books PDF show the new number. Before a long holiday, the CEO downloads a shop backup and keeps it off the till computer.</w:t>
       </w:r>
     </w:p>
     <w:p>
@@ -24462,7 +24481,7 @@
           <w:sz w:val="22"/>
           <w:szCs w:val="22"/>
         </w:rPr>
-        <w:t xml:space="preserve">Sign in as Super Admin.</w:t>
+        <w:t xml:space="preserve">Sign in as ceo@abutwins.com or admin@abutwins.com.</w:t>
       </w:r>
     </w:p>
     <w:p>
@@ -24586,7 +24605,7 @@
           <w:sz w:val="22"/>
           <w:szCs w:val="22"/>
         </w:rPr>
-        <w:t xml:space="preserve">Do not change live details during a first test unless the CEO asks.</w:t>
+        <w:t xml:space="preserve">Do not change live details during a first test unless you mean it.</w:t>
       </w:r>
     </w:p>
     <w:p>
@@ -24628,7 +24647,7 @@
           <w:sz w:val="22"/>
           <w:szCs w:val="22"/>
         </w:rPr>
-        <w:t xml:space="preserve">CEO can read settings but cannot change them. CEO does not see Download shop backup.</w:t>
+        <w:t xml:space="preserve">The CEO can change settings and download a shop backup.</w:t>
       </w:r>
     </w:p>
     <w:p>
@@ -25376,7 +25395,7 @@
           <w:sz w:val="22"/>
           <w:szCs w:val="22"/>
         </w:rPr>
-        <w:t xml:space="preserve">Sign out. Sign in as ceo@abutwins.com. Open How to use this. Confirm Who can see what is still missing, and Check the books is there.</w:t>
+        <w:t xml:space="preserve">Sign out. Sign in as ceo@abutwins.com. Open How to use this. Confirm Who can see what and Settings are in the CEO book.</w:t>
       </w:r>
     </w:p>
     <w:p>
@@ -25495,7 +25514,7 @@
           <w:sz w:val="22"/>
           <w:szCs w:val="22"/>
         </w:rPr>
-        <w:t xml:space="preserve">The CEO book does not have Who can see what. The CEO can read Settings but cannot change them.</w:t>
+        <w:t xml:space="preserve">The CEO book has Who can see what and Settings. The CEO can change them.</w:t>
       </w:r>
     </w:p>
     <w:p>
@@ -45029,6 +45048,159 @@
           </w:p>
         </w:tc>
       </w:tr>
+      <w:tr>
+        <w:trPr>
+          <w:trHeight w:val="320" w:hRule="atLeast"/>
+        </w:trPr>
+        <w:tc>
+          <w:tcPr>
+            <w:tcW w:type="dxa" w:w="600"/>
+            <w:tcBorders>
+              <w:top w:val="single" w:color="000000" w:sz="8"/>
+              <w:left w:val="single" w:color="000000" w:sz="8"/>
+              <w:bottom w:val="single" w:color="000000" w:sz="8"/>
+              <w:right w:val="single" w:color="000000" w:sz="8"/>
+            </w:tcBorders>
+            <w:shd w:fill="F7F7F7" w:color="F7F7F7" w:val="clear"/>
+            <w:tcMar>
+              <w:top w:type="dxa" w:w="60"/>
+              <w:left w:type="dxa" w:w="80"/>
+              <w:bottom w:type="dxa" w:w="60"/>
+              <w:right w:type="dxa" w:w="80"/>
+            </w:tcMar>
+            <w:vAlign w:val="center"/>
+          </w:tcPr>
+          <w:p>
+            <w:pPr>
+              <w:jc w:val="left"/>
+            </w:pPr>
+            <w:r>
+              <w:rPr>
+                <w:rFonts w:ascii="Calibri" w:cs="Calibri" w:eastAsia="Calibri" w:hAnsi="Calibri"/>
+                <w:b w:val="false"/>
+                <w:bCs w:val="false"/>
+                <w:i w:val="false"/>
+                <w:iCs w:val="false"/>
+                <w:color w:val="000000"/>
+                <w:sz w:val="20"/>
+                <w:szCs w:val="20"/>
+              </w:rPr>
+              <w:t xml:space="preserve">60</w:t>
+            </w:r>
+          </w:p>
+        </w:tc>
+        <w:tc>
+          <w:tcPr>
+            <w:tcW w:type="dxa" w:w="2800"/>
+            <w:tcBorders>
+              <w:top w:val="single" w:color="000000" w:sz="8"/>
+              <w:left w:val="single" w:color="000000" w:sz="8"/>
+              <w:bottom w:val="single" w:color="000000" w:sz="8"/>
+              <w:right w:val="single" w:color="000000" w:sz="8"/>
+            </w:tcBorders>
+            <w:shd w:fill="F7F7F7" w:color="F7F7F7" w:val="clear"/>
+            <w:tcMar>
+              <w:top w:type="dxa" w:w="60"/>
+              <w:left w:type="dxa" w:w="80"/>
+              <w:bottom w:type="dxa" w:w="60"/>
+              <w:right w:type="dxa" w:w="80"/>
+            </w:tcMar>
+            <w:vAlign w:val="center"/>
+          </w:tcPr>
+          <w:p>
+            <w:pPr>
+              <w:jc w:val="left"/>
+            </w:pPr>
+            <w:r>
+              <w:rPr>
+                <w:rFonts w:ascii="Calibri" w:cs="Calibri" w:eastAsia="Calibri" w:hAnsi="Calibri"/>
+                <w:b w:val="false"/>
+                <w:bCs w:val="false"/>
+                <w:i w:val="false"/>
+                <w:iCs w:val="false"/>
+                <w:color w:val="000000"/>
+                <w:sz w:val="20"/>
+                <w:szCs w:val="20"/>
+              </w:rPr>
+              <w:t xml:space="preserve">CEO can correct the shop</w:t>
+            </w:r>
+          </w:p>
+        </w:tc>
+        <w:tc>
+          <w:tcPr>
+            <w:tcW w:type="dxa" w:w="2600"/>
+            <w:tcBorders>
+              <w:top w:val="single" w:color="000000" w:sz="8"/>
+              <w:left w:val="single" w:color="000000" w:sz="8"/>
+              <w:bottom w:val="single" w:color="000000" w:sz="8"/>
+              <w:right w:val="single" w:color="000000" w:sz="8"/>
+            </w:tcBorders>
+            <w:shd w:fill="F7F7F7" w:color="F7F7F7" w:val="clear"/>
+            <w:tcMar>
+              <w:top w:type="dxa" w:w="60"/>
+              <w:left w:type="dxa" w:w="80"/>
+              <w:bottom w:type="dxa" w:w="60"/>
+              <w:right w:type="dxa" w:w="80"/>
+            </w:tcMar>
+            <w:vAlign w:val="center"/>
+          </w:tcPr>
+          <w:p>
+            <w:pPr>
+              <w:jc w:val="left"/>
+            </w:pPr>
+            <w:r>
+              <w:rPr>
+                <w:rFonts w:ascii="Calibri" w:cs="Calibri" w:eastAsia="Calibri" w:hAnsi="Calibri"/>
+                <w:b w:val="false"/>
+                <w:bCs w:val="false"/>
+                <w:i w:val="false"/>
+                <w:iCs w:val="false"/>
+                <w:color w:val="000000"/>
+                <w:sz w:val="20"/>
+                <w:szCs w:val="20"/>
+              </w:rPr>
+              <w:t xml:space="preserve">ceo@abutwins.com</w:t>
+            </w:r>
+          </w:p>
+        </w:tc>
+        <w:tc>
+          <w:tcPr>
+            <w:tcW w:type="dxa" w:w="3360"/>
+            <w:tcBorders>
+              <w:top w:val="single" w:color="000000" w:sz="8"/>
+              <w:left w:val="single" w:color="000000" w:sz="8"/>
+              <w:bottom w:val="single" w:color="000000" w:sz="8"/>
+              <w:right w:val="single" w:color="000000" w:sz="8"/>
+            </w:tcBorders>
+            <w:shd w:fill="F7F7F7" w:color="F7F7F7" w:val="clear"/>
+            <w:tcMar>
+              <w:top w:type="dxa" w:w="60"/>
+              <w:left w:type="dxa" w:w="80"/>
+              <w:bottom w:type="dxa" w:w="60"/>
+              <w:right w:type="dxa" w:w="80"/>
+            </w:tcMar>
+            <w:vAlign w:val="center"/>
+          </w:tcPr>
+          <w:p>
+            <w:pPr>
+              <w:jc w:val="left"/>
+            </w:pPr>
+            <w:r>
+              <w:rPr>
+                <w:rFonts w:ascii="Calibri" w:cs="Calibri" w:eastAsia="Calibri" w:hAnsi="Calibri"/>
+                <w:b w:val="false"/>
+                <w:bCs w:val="false"/>
+                <w:i w:val="false"/>
+                <w:iCs w:val="false"/>
+                <w:color w:val="000000"/>
+                <w:sz w:val="20"/>
+                <w:szCs w:val="20"/>
+              </w:rPr>
+              <w:t xml:space="preserve">Who can see what opens. Settings can be saved. Undo last money collected is on a paid invoice. Who did what shows the CEO. The invoice lines do not change.</w:t>
+            </w:r>
+          </w:p>
+        </w:tc>
+      </w:tr>
     </w:tbl>
     <w:p>
       <w:pPr>
@@ -45395,7 +45567,7 @@
           <w:sz w:val="22"/>
           <w:szCs w:val="22"/>
         </w:rPr>
-        <w:t xml:space="preserve">Staff cannot sell below the lowest price unless Super Admin turns that on.</w:t>
+        <w:t xml:space="preserve">Staff cannot sell below the lowest price unless Super Admin or the CEO turns that on.</w:t>
       </w:r>
     </w:p>
     <w:p>
@@ -45556,7 +45728,7 @@
           <w:sz w:val="22"/>
           <w:szCs w:val="22"/>
         </w:rPr>
-        <w:t xml:space="preserve">Only Super Admin can reverse a money collection.</w:t>
+        <w:t xml:space="preserve">The main admin or the CEO can reverse a money collection. Who did what keeps that step.</w:t>
       </w:r>
     </w:p>
     <w:p>
@@ -45579,7 +45751,7 @@
           <w:sz w:val="22"/>
           <w:szCs w:val="22"/>
         </w:rPr>
-        <w:t xml:space="preserve">Only Super Admin can tick Who can see what.</w:t>
+        <w:t xml:space="preserve">The main admin or the CEO can tick Who can see what.</w:t>
       </w:r>
     </w:p>
     <w:p>
@@ -46801,6 +46973,25 @@
     </w:p>
     <w:p>
       <w:pPr>
+        <w:spacing w:after="160" w:before="0" w:line="276"/>
+        <w:jc w:val="left"/>
+      </w:pPr>
+      <w:r>
+        <w:rPr>
+          <w:rFonts w:ascii="Calibri" w:cs="Calibri" w:eastAsia="Calibri" w:hAnsi="Calibri"/>
+          <w:b w:val="false"/>
+          <w:bCs w:val="false"/>
+          <w:i w:val="false"/>
+          <w:iCs w:val="false"/>
+          <w:color w:val="000000"/>
+          <w:sz w:val="22"/>
+          <w:szCs w:val="22"/>
+        </w:rPr>
+        <w:t xml:space="preserve">Version 1.30 gives the CEO the same correction rights as the main admin. The CEO can undo a true money mistake, change Who can see what, change Settings, open or close a shop, lock staff, and download a shop backup. Every correction is named in Who did what. An old invoice still cannot be secretly rewritten.</w:t>
+      </w:r>
+    </w:p>
+    <w:p>
+      <w:pPr>
         <w:pStyle w:val="Heading1"/>
         <w:pageBreakBefore/>
         <w:pBdr>
@@ -46838,7 +47029,7 @@
           <w:sz w:val="22"/>
           <w:szCs w:val="22"/>
         </w:rPr>
-        <w:t xml:space="preserve">You now have one system for two Ibadan shops, ready for more shops in Nigeria. Goods can be booked before they arrive. Shelf stock and coming stock stay apart. Every sale prints an invoice. Each job sees only what Super Admin allows.</w:t>
+        <w:t xml:space="preserve">You now have one system for two Ibadan shops, ready for more shops in Nigeria. Goods can be booked before they arrive. Shelf stock and coming stock stay apart. Every sale prints an invoice. Each job sees only what the main admin or the CEO allows.</w:t>
       </w:r>
     </w:p>
     <w:p>

</xml_diff>

<commit_message>
feat: search product names on a supplier bill and keep condition and storage separate
Staff type the item name, pick it, then fill condition, storage, cost, and quantity themselves so those details stay off the product name.

Co-authored-by: Cursor <cursoragent@cursor.com>
</commit_message>
<xml_diff>
--- a/docs/Abu-Twins-Shop-System-User-Guide.docx
+++ b/docs/Abu-Twins-Shop-System-User-Guide.docx
@@ -459,7 +459,7 @@
                 <w:sz w:val="20"/>
                 <w:szCs w:val="20"/>
               </w:rPr>
-              <w:t xml:space="preserve">1.30</w:t>
+              <w:t xml:space="preserve">1.31</w:t>
             </w:r>
           </w:p>
         </w:tc>
@@ -533,7 +533,7 @@
                 <w:sz w:val="20"/>
                 <w:szCs w:val="20"/>
               </w:rPr>
-              <w:t xml:space="preserve">Updated: the main admin and the CEO can both correct the shop</w:t>
+              <w:t xml:space="preserve">Updated: supplier bill item search, condition, and storage</w:t>
             </w:r>
           </w:p>
         </w:tc>
@@ -1054,6 +1054,25 @@
           <w:szCs w:val="22"/>
         </w:rPr>
         <w:t xml:space="preserve">The owner asked that the main admin and the CEO must both be able to correct the shop. They can now undo a true money mistake, change Who can see what, change Settings, open or close a shop, lock a staff login, and download a shop backup. Every correction is a new named step. An old invoice still cannot be secretly rewritten.</w:t>
+      </w:r>
+    </w:p>
+    <w:p>
+      <w:pPr>
+        <w:spacing w:after="160" w:before="0" w:line="276"/>
+        <w:jc w:val="left"/>
+      </w:pPr>
+      <w:r>
+        <w:rPr>
+          <w:rFonts w:ascii="Calibri" w:cs="Calibri" w:eastAsia="Calibri" w:hAnsi="Calibri"/>
+          <w:b w:val="false"/>
+          <w:bCs w:val="false"/>
+          <w:i w:val="false"/>
+          <w:iCs w:val="false"/>
+          <w:color w:val="000000"/>
+          <w:sz w:val="22"/>
+          <w:szCs w:val="22"/>
+        </w:rPr>
+        <w:t xml:space="preserve">On Upload stock, Supplier bill, the item line now works the way the shops asked. Type the product name in a search bar, pick the name, and only that name fills the item column. Condition, storage, brand, cost, and how many sit beside it. You pick Brand new, Uk, Open box, or Standard. You pick 32GB, 64GB, 128GB, 256GB, 1TB, or 2TB. Those details are not glued onto the product name.</w:t>
       </w:r>
     </w:p>
     <w:p>
@@ -7060,7 +7079,7 @@
                 <w:sz w:val="20"/>
                 <w:szCs w:val="20"/>
               </w:rPr>
-              <w:t xml:space="preserve">Cost</w:t>
+              <w:t xml:space="preserve">Item name</w:t>
             </w:r>
           </w:p>
         </w:tc>
@@ -7097,7 +7116,7 @@
                 <w:sz w:val="20"/>
                 <w:szCs w:val="20"/>
               </w:rPr>
-              <w:t xml:space="preserve">What you paid for the item. Shop stock shows this, not Cost Basis.</w:t>
+              <w:t xml:space="preserve">The product name only, on a supplier bill. Type it, pick it, then fill condition and storage beside it. Do not glue storage or condition onto the name.</w:t>
             </w:r>
           </w:p>
         </w:tc>
@@ -7139,7 +7158,7 @@
                 <w:sz w:val="20"/>
                 <w:szCs w:val="20"/>
               </w:rPr>
-              <w:t xml:space="preserve">Sell price</w:t>
+              <w:t xml:space="preserve">Cost</w:t>
             </w:r>
           </w:p>
         </w:tc>
@@ -7176,7 +7195,7 @@
                 <w:sz w:val="20"/>
                 <w:szCs w:val="20"/>
               </w:rPr>
-              <w:t xml:space="preserve">The list price a cashier sells at. Shop stock shows this, not Retail Price.</w:t>
+              <w:t xml:space="preserve">What you paid for the item. Shop stock shows this, not Cost Basis.</w:t>
             </w:r>
           </w:p>
         </w:tc>
@@ -7218,6 +7237,85 @@
                 <w:sz w:val="20"/>
                 <w:szCs w:val="20"/>
               </w:rPr>
+              <w:t xml:space="preserve">Sell price</w:t>
+            </w:r>
+          </w:p>
+        </w:tc>
+        <w:tc>
+          <w:tcPr>
+            <w:tcW w:type="dxa" w:w="6560"/>
+            <w:tcBorders>
+              <w:top w:val="single" w:color="000000" w:sz="8"/>
+              <w:left w:val="single" w:color="000000" w:sz="8"/>
+              <w:bottom w:val="single" w:color="000000" w:sz="8"/>
+              <w:right w:val="single" w:color="000000" w:sz="8"/>
+            </w:tcBorders>
+            <w:shd w:fill="FFFFFF" w:color="FFFFFF" w:val="clear"/>
+            <w:tcMar>
+              <w:top w:type="dxa" w:w="60"/>
+              <w:left w:type="dxa" w:w="80"/>
+              <w:bottom w:type="dxa" w:w="60"/>
+              <w:right w:type="dxa" w:w="80"/>
+            </w:tcMar>
+            <w:vAlign w:val="center"/>
+          </w:tcPr>
+          <w:p>
+            <w:pPr>
+              <w:jc w:val="left"/>
+            </w:pPr>
+            <w:r>
+              <w:rPr>
+                <w:rFonts w:ascii="Calibri" w:cs="Calibri" w:eastAsia="Calibri" w:hAnsi="Calibri"/>
+                <w:b w:val="false"/>
+                <w:bCs w:val="false"/>
+                <w:i w:val="false"/>
+                <w:iCs w:val="false"/>
+                <w:color w:val="000000"/>
+                <w:sz w:val="20"/>
+                <w:szCs w:val="20"/>
+              </w:rPr>
+              <w:t xml:space="preserve">The list price a cashier sells at. Shop stock shows this, not Retail Price.</w:t>
+            </w:r>
+          </w:p>
+        </w:tc>
+      </w:tr>
+      <w:tr>
+        <w:trPr>
+          <w:trHeight w:val="320" w:hRule="atLeast"/>
+        </w:trPr>
+        <w:tc>
+          <w:tcPr>
+            <w:tcW w:type="dxa" w:w="2800"/>
+            <w:tcBorders>
+              <w:top w:val="single" w:color="000000" w:sz="8"/>
+              <w:left w:val="single" w:color="000000" w:sz="8"/>
+              <w:bottom w:val="single" w:color="000000" w:sz="8"/>
+              <w:right w:val="single" w:color="000000" w:sz="8"/>
+            </w:tcBorders>
+            <w:shd w:fill="F7F7F7" w:color="F7F7F7" w:val="clear"/>
+            <w:tcMar>
+              <w:top w:type="dxa" w:w="60"/>
+              <w:left w:type="dxa" w:w="80"/>
+              <w:bottom w:type="dxa" w:w="60"/>
+              <w:right w:type="dxa" w:w="80"/>
+            </w:tcMar>
+            <w:vAlign w:val="center"/>
+          </w:tcPr>
+          <w:p>
+            <w:pPr>
+              <w:jc w:val="left"/>
+            </w:pPr>
+            <w:r>
+              <w:rPr>
+                <w:rFonts w:ascii="Calibri" w:cs="Calibri" w:eastAsia="Calibri" w:hAnsi="Calibri"/>
+                <w:b w:val="false"/>
+                <w:bCs w:val="false"/>
+                <w:i w:val="false"/>
+                <w:iCs w:val="false"/>
+                <w:color w:val="000000"/>
+                <w:sz w:val="20"/>
+                <w:szCs w:val="20"/>
+              </w:rPr>
               <w:t xml:space="preserve">Profit</w:t>
             </w:r>
           </w:p>
@@ -7231,7 +7329,7 @@
               <w:bottom w:val="single" w:color="000000" w:sz="8"/>
               <w:right w:val="single" w:color="000000" w:sz="8"/>
             </w:tcBorders>
-            <w:shd w:fill="FFFFFF" w:color="FFFFFF" w:val="clear"/>
+            <w:shd w:fill="F7F7F7" w:color="F7F7F7" w:val="clear"/>
             <w:tcMar>
               <w:top w:type="dxa" w:w="60"/>
               <w:left w:type="dxa" w:w="80"/>
@@ -28682,7 +28780,7 @@
           <w:sz w:val="22"/>
           <w:szCs w:val="22"/>
         </w:rPr>
-        <w:t xml:space="preserve">Upload stock is how phones get onto the shelf. There are three clear doors. Supplier bill lets you add phones one after another, or many lines on one bill, with the supplier and paid or not paid. Many at once (Excel) puts a whole shop on the system from one file as opening stock value. It is not a bill to pay. You can add a new supplier on that screen. One phone at a time is for a single phone in your hand with no bill. A sheet may be up to 25 MB and about 20,000 lines at a time. Split a bigger carton into more than one file. Unpaid supplier bills show as money we still owe. Opening stock never does.</w:t>
+        <w:t xml:space="preserve">Upload stock is how phones get onto the shelf. There are three clear doors. Supplier bill lets you add phones one after another, or many lines on one bill, with the supplier and paid or not paid. On that bill, type the product name in the search bar, pick the name, and only that name sits in the item column. Then pick condition (Brand new, Uk, Open box, or Standard) and storage (32GB, 64GB, 128GB, 256GB, 1TB, or 2TB) yourself, the same way you fill cost and how many. Those details stay off the product name. Many at once (Excel) puts a whole shop on the system from one file as opening stock value. It is not a bill to pay. You can add a new supplier on that screen. One phone at a time is for a single phone in your hand with no bill. A sheet may be up to 25 MB and about 20,000 lines at a time. Split a bigger carton into more than one file. Unpaid supplier bills show as money we still owe. Opening stock never does.</w:t>
       </w:r>
     </w:p>
     <w:p>
@@ -28720,7 +28818,7 @@
           <w:sz w:val="22"/>
           <w:szCs w:val="22"/>
         </w:rPr>
-        <w:t xml:space="preserve">Staff were looking for Upload stock and could not find Data Import. They also needed both bulk Excel and one-by-one intake. Small shops need shop managers and goods intake to use both ways, not only the Stock uploader login.</w:t>
+        <w:t xml:space="preserve">Staff were looking for Upload stock and could not find Data Import. They also needed both bulk Excel and one-by-one intake. Small shops need shop managers and goods intake to use both ways, not only the Stock uploader login. On the supplier bill, a long dropdown that mixed name, brand, and cost made it hard to find an item, and it glued storage and condition onto the name.</w:t>
       </w:r>
     </w:p>
     <w:p>
@@ -28758,7 +28856,7 @@
           <w:sz w:val="22"/>
           <w:szCs w:val="22"/>
         </w:rPr>
-        <w:t xml:space="preserve">Challenge receives part of a Dubai carton. Goods intake opens Upload stock, picks Supplier bill, marks it not paid yet, and scans three iPhone units one after another under the same PO. That evening, Bodija opens Many at once (Excel) and loads the full shop sheet. Sell now works on real shelf units the next morning.</w:t>
+        <w:t xml:space="preserve">Challenge receives part of a Dubai carton. Goods intake opens Upload stock, picks Supplier bill, types iPhone 16 Pro Max, picks that name, then picks Uk and 256GB, cost, and how many. The IMEI boxes open. That evening, Bodija opens Many at once (Excel) and loads the full shop sheet. Sell now works on real shelf units the next morning.</w:t>
       </w:r>
     </w:p>
     <w:p>
@@ -28901,7 +28999,7 @@
           <w:sz w:val="22"/>
           <w:szCs w:val="22"/>
         </w:rPr>
-        <w:t xml:space="preserve">On Supplier bill: pick the shop, the supplier, and whether it is paid. Add each IMEI or many lines, then save.</w:t>
+        <w:t xml:space="preserve">On Supplier bill: pick the shop and the supplier.</w:t>
       </w:r>
     </w:p>
     <w:p>
@@ -28932,6 +29030,68 @@
           <w:sz w:val="22"/>
           <w:szCs w:val="22"/>
         </w:rPr>
+        <w:t xml:space="preserve">Under What is on this bill, type the product name in the search bar and pick it. Only the name fills the item column.</w:t>
+      </w:r>
+    </w:p>
+    <w:p>
+      <w:pPr>
+        <w:spacing w:after="80" w:line="276"/>
+      </w:pPr>
+      <w:r>
+        <w:rPr>
+          <w:rFonts w:ascii="Calibri" w:cs="Calibri" w:eastAsia="Calibri" w:hAnsi="Calibri"/>
+          <w:b/>
+          <w:bCs/>
+          <w:i w:val="false"/>
+          <w:iCs w:val="false"/>
+          <w:color w:val="000000"/>
+          <w:sz w:val="22"/>
+          <w:szCs w:val="22"/>
+        </w:rPr>
+        <w:t xml:space="preserve">6. </w:t>
+      </w:r>
+      <w:r>
+        <w:rPr>
+          <w:rFonts w:ascii="Calibri" w:cs="Calibri" w:eastAsia="Calibri" w:hAnsi="Calibri"/>
+          <w:b w:val="false"/>
+          <w:bCs w:val="false"/>
+          <w:i w:val="false"/>
+          <w:iCs w:val="false"/>
+          <w:color w:val="000000"/>
+          <w:sz w:val="22"/>
+          <w:szCs w:val="22"/>
+        </w:rPr>
+        <w:t xml:space="preserve">Pick condition, pick storage, type cost and how many, then scan each IMEI. Save.</w:t>
+      </w:r>
+    </w:p>
+    <w:p>
+      <w:pPr>
+        <w:spacing w:after="80" w:line="276"/>
+      </w:pPr>
+      <w:r>
+        <w:rPr>
+          <w:rFonts w:ascii="Calibri" w:cs="Calibri" w:eastAsia="Calibri" w:hAnsi="Calibri"/>
+          <w:b/>
+          <w:bCs/>
+          <w:i w:val="false"/>
+          <w:iCs w:val="false"/>
+          <w:color w:val="000000"/>
+          <w:sz w:val="22"/>
+          <w:szCs w:val="22"/>
+        </w:rPr>
+        <w:t xml:space="preserve">7. </w:t>
+      </w:r>
+      <w:r>
+        <w:rPr>
+          <w:rFonts w:ascii="Calibri" w:cs="Calibri" w:eastAsia="Calibri" w:hAnsi="Calibri"/>
+          <w:b w:val="false"/>
+          <w:bCs w:val="false"/>
+          <w:i w:val="false"/>
+          <w:iCs w:val="false"/>
+          <w:color w:val="000000"/>
+          <w:sz w:val="22"/>
+          <w:szCs w:val="22"/>
+        </w:rPr>
         <w:t xml:space="preserve">On Many at once (Excel): pick shop, pick or add the supplier, then upload the PHONES / ACCESSORIES / SCREEN / LAPTOPS file. Do not type a paid amount.</w:t>
       </w:r>
     </w:p>
@@ -28950,7 +29110,7 @@
           <w:sz w:val="22"/>
           <w:szCs w:val="22"/>
         </w:rPr>
-        <w:t xml:space="preserve">6. </w:t>
+        <w:t xml:space="preserve">8. </w:t>
       </w:r>
       <w:r>
         <w:rPr>
@@ -28981,7 +29141,7 @@
           <w:sz w:val="22"/>
           <w:szCs w:val="22"/>
         </w:rPr>
-        <w:t xml:space="preserve">7. </w:t>
+        <w:t xml:space="preserve">9. </w:t>
       </w:r>
       <w:r>
         <w:rPr>
@@ -29060,6 +29220,52 @@
           <w:szCs w:val="22"/>
         </w:rPr>
         <w:t xml:space="preserve">Shop manager, goods intake, and stock uploader can open Upload stock and One phone at a time.</w:t>
+      </w:r>
+    </w:p>
+    <w:p>
+      <w:pPr>
+        <w:pStyle w:val="ListParagraph"/>
+        <w:numPr>
+          <w:ilvl w:val="0"/>
+          <w:numId w:val="2"/>
+        </w:numPr>
+        <w:spacing w:after="80" w:line="276"/>
+      </w:pPr>
+      <w:r>
+        <w:rPr>
+          <w:rFonts w:ascii="Calibri" w:cs="Calibri" w:eastAsia="Calibri" w:hAnsi="Calibri"/>
+          <w:b w:val="false"/>
+          <w:bCs w:val="false"/>
+          <w:i w:val="false"/>
+          <w:iCs w:val="false"/>
+          <w:color w:val="000000"/>
+          <w:sz w:val="22"/>
+          <w:szCs w:val="22"/>
+        </w:rPr>
+        <w:t xml:space="preserve">The item column is a search. Typing a name shows matching product names. Picking one fills only the name.</w:t>
+      </w:r>
+    </w:p>
+    <w:p>
+      <w:pPr>
+        <w:pStyle w:val="ListParagraph"/>
+        <w:numPr>
+          <w:ilvl w:val="0"/>
+          <w:numId w:val="2"/>
+        </w:numPr>
+        <w:spacing w:after="80" w:line="276"/>
+      </w:pPr>
+      <w:r>
+        <w:rPr>
+          <w:rFonts w:ascii="Calibri" w:cs="Calibri" w:eastAsia="Calibri" w:hAnsi="Calibri"/>
+          <w:b w:val="false"/>
+          <w:bCs w:val="false"/>
+          <w:i w:val="false"/>
+          <w:iCs w:val="false"/>
+          <w:color w:val="000000"/>
+          <w:sz w:val="22"/>
+          <w:szCs w:val="22"/>
+        </w:rPr>
+        <w:t xml:space="preserve">Condition and storage are their own pickers, beside cost and how many.</w:t>
       </w:r>
     </w:p>
     <w:p>
@@ -43207,7 +43413,7 @@
                 <w:sz w:val="20"/>
                 <w:szCs w:val="20"/>
               </w:rPr>
-              <w:t xml:space="preserve">Supplier bill accepts one IMEI after another. One phone at a time also works with no bill.</w:t>
+              <w:t xml:space="preserve">Supplier bill: type a product name, pick it, pick condition and storage, then add IMEIs. One phone at a time also works with no bill.</w:t>
             </w:r>
           </w:p>
         </w:tc>
@@ -46988,6 +47194,25 @@
           <w:szCs w:val="22"/>
         </w:rPr>
         <w:t xml:space="preserve">Version 1.30 gives the CEO the same correction rights as the main admin. The CEO can undo a true money mistake, change Who can see what, change Settings, open or close a shop, lock staff, and download a shop backup. Every correction is named in Who did what. An old invoice still cannot be secretly rewritten.</w:t>
+      </w:r>
+    </w:p>
+    <w:p>
+      <w:pPr>
+        <w:spacing w:after="160" w:before="0" w:line="276"/>
+        <w:jc w:val="left"/>
+      </w:pPr>
+      <w:r>
+        <w:rPr>
+          <w:rFonts w:ascii="Calibri" w:cs="Calibri" w:eastAsia="Calibri" w:hAnsi="Calibri"/>
+          <w:b w:val="false"/>
+          <w:bCs w:val="false"/>
+          <w:i w:val="false"/>
+          <w:iCs w:val="false"/>
+          <w:color w:val="000000"/>
+          <w:sz w:val="22"/>
+          <w:szCs w:val="22"/>
+        </w:rPr>
+        <w:t xml:space="preserve">Version 1.31 changes the supplier bill item line. You type the product name in a search bar and pick it. Only that name fills the item column. Condition, storage, brand, cost, and how many sit beside it, so storage and condition are not glued onto the name.</w:t>
       </w:r>
     </w:p>
     <w:p>

</xml_diff>

<commit_message>
feat: record opening cash and named banks on Money in and out
Cash in the till and Bank no longer start from zero. The accountant types opening cash per shop and adds each bank with its account number and opening balance so the books match the money the shops already held.

Co-authored-by: Cursor <cursoragent@cursor.com>
</commit_message>
<xml_diff>
--- a/docs/Abu-Twins-Shop-System-User-Guide.docx
+++ b/docs/Abu-Twins-Shop-System-User-Guide.docx
@@ -459,7 +459,7 @@
                 <w:sz w:val="20"/>
                 <w:szCs w:val="20"/>
               </w:rPr>
-              <w:t xml:space="preserve">1.34</w:t>
+              <w:t xml:space="preserve">1.35</w:t>
             </w:r>
           </w:p>
         </w:tc>
@@ -533,7 +533,7 @@
                 <w:sz w:val="20"/>
                 <w:szCs w:val="20"/>
               </w:rPr>
-              <w:t xml:space="preserve">Updated: unpaid supplier uploads now show on Reports as money owed</w:t>
+              <w:t xml:space="preserve">Updated: opening cash and named bank accounts on Money in and out</w:t>
             </w:r>
           </w:p>
         </w:tc>
@@ -1130,6 +1130,25 @@
           <w:szCs w:val="22"/>
         </w:rPr>
         <w:t xml:space="preserve">An unpaid supplier carton loaded on Upload stock now shows the same owed amount on Reports, Home, Money in and out, Check the books, Suppliers, and Goods from supplier. Opening stock stays value only. It is not a bill to pay. On Reports, Still owed to suppliers shows the house name and the amount. Click the house and the bills drop down.</w:t>
+      </w:r>
+    </w:p>
+    <w:p>
+      <w:pPr>
+        <w:spacing w:after="160" w:before="0" w:line="276"/>
+        <w:jc w:val="left"/>
+      </w:pPr>
+      <w:r>
+        <w:rPr>
+          <w:rFonts w:ascii="Calibri" w:cs="Calibri" w:eastAsia="Calibri" w:hAnsi="Calibri"/>
+          <w:b w:val="false"/>
+          <w:bCs w:val="false"/>
+          <w:i w:val="false"/>
+          <w:iCs w:val="false"/>
+          <w:color w:val="000000"/>
+          <w:sz w:val="22"/>
+          <w:szCs w:val="22"/>
+        </w:rPr>
+        <w:t xml:space="preserve">Money in and out now holds opening cash for each shop, and named bank accounts with account numbers and opening balances. That is the money already in the till and in the banks on the day the shops started using this software. It is not opening stock. Sales, expenses, and supplier payments sit on top of those figures.</w:t>
       </w:r>
     </w:p>
     <w:p>
@@ -5910,6 +5929,164 @@
                 <w:szCs w:val="20"/>
               </w:rPr>
               <w:t xml:space="preserve">The Excel Abu Twins already uses: one file per shop, with PHONES, ACCESSORIES, SCREEN, and LAPTOPS. Upload it on Many at once (Excel). Pick or add the supplier. There is no paid or unpaid. The value is what the shop started with.</w:t>
+            </w:r>
+          </w:p>
+        </w:tc>
+      </w:tr>
+      <w:tr>
+        <w:trPr>
+          <w:trHeight w:val="320" w:hRule="atLeast"/>
+        </w:trPr>
+        <w:tc>
+          <w:tcPr>
+            <w:tcW w:type="dxa" w:w="2800"/>
+            <w:tcBorders>
+              <w:top w:val="single" w:color="000000" w:sz="8"/>
+              <w:left w:val="single" w:color="000000" w:sz="8"/>
+              <w:bottom w:val="single" w:color="000000" w:sz="8"/>
+              <w:right w:val="single" w:color="000000" w:sz="8"/>
+            </w:tcBorders>
+            <w:shd w:fill="F7F7F7" w:color="F7F7F7" w:val="clear"/>
+            <w:tcMar>
+              <w:top w:type="dxa" w:w="60"/>
+              <w:left w:type="dxa" w:w="80"/>
+              <w:bottom w:type="dxa" w:w="60"/>
+              <w:right w:type="dxa" w:w="80"/>
+            </w:tcMar>
+            <w:vAlign w:val="center"/>
+          </w:tcPr>
+          <w:p>
+            <w:pPr>
+              <w:jc w:val="left"/>
+            </w:pPr>
+            <w:r>
+              <w:rPr>
+                <w:rFonts w:ascii="Calibri" w:cs="Calibri" w:eastAsia="Calibri" w:hAnsi="Calibri"/>
+                <w:b w:val="false"/>
+                <w:bCs w:val="false"/>
+                <w:i w:val="false"/>
+                <w:iCs w:val="false"/>
+                <w:color w:val="000000"/>
+                <w:sz w:val="20"/>
+                <w:szCs w:val="20"/>
+              </w:rPr>
+              <w:t xml:space="preserve">Opening cash</w:t>
+            </w:r>
+          </w:p>
+        </w:tc>
+        <w:tc>
+          <w:tcPr>
+            <w:tcW w:type="dxa" w:w="6560"/>
+            <w:tcBorders>
+              <w:top w:val="single" w:color="000000" w:sz="8"/>
+              <w:left w:val="single" w:color="000000" w:sz="8"/>
+              <w:bottom w:val="single" w:color="000000" w:sz="8"/>
+              <w:right w:val="single" w:color="000000" w:sz="8"/>
+            </w:tcBorders>
+            <w:shd w:fill="F7F7F7" w:color="F7F7F7" w:val="clear"/>
+            <w:tcMar>
+              <w:top w:type="dxa" w:w="60"/>
+              <w:left w:type="dxa" w:w="80"/>
+              <w:bottom w:type="dxa" w:w="60"/>
+              <w:right w:type="dxa" w:w="80"/>
+            </w:tcMar>
+            <w:vAlign w:val="center"/>
+          </w:tcPr>
+          <w:p>
+            <w:pPr>
+              <w:jc w:val="left"/>
+            </w:pPr>
+            <w:r>
+              <w:rPr>
+                <w:rFonts w:ascii="Calibri" w:cs="Calibri" w:eastAsia="Calibri" w:hAnsi="Calibri"/>
+                <w:b w:val="false"/>
+                <w:bCs w:val="false"/>
+                <w:i w:val="false"/>
+                <w:iCs w:val="false"/>
+                <w:color w:val="000000"/>
+                <w:sz w:val="20"/>
+                <w:szCs w:val="20"/>
+              </w:rPr>
+              <w:t xml:space="preserve">Cash in the till on the day the shops started using this software. The accountant types it on Money in and out. It is not opening stock.</w:t>
+            </w:r>
+          </w:p>
+        </w:tc>
+      </w:tr>
+      <w:tr>
+        <w:trPr>
+          <w:trHeight w:val="320" w:hRule="atLeast"/>
+        </w:trPr>
+        <w:tc>
+          <w:tcPr>
+            <w:tcW w:type="dxa" w:w="2800"/>
+            <w:tcBorders>
+              <w:top w:val="single" w:color="000000" w:sz="8"/>
+              <w:left w:val="single" w:color="000000" w:sz="8"/>
+              <w:bottom w:val="single" w:color="000000" w:sz="8"/>
+              <w:right w:val="single" w:color="000000" w:sz="8"/>
+            </w:tcBorders>
+            <w:shd w:fill="FFFFFF" w:color="FFFFFF" w:val="clear"/>
+            <w:tcMar>
+              <w:top w:type="dxa" w:w="60"/>
+              <w:left w:type="dxa" w:w="80"/>
+              <w:bottom w:type="dxa" w:w="60"/>
+              <w:right w:type="dxa" w:w="80"/>
+            </w:tcMar>
+            <w:vAlign w:val="center"/>
+          </w:tcPr>
+          <w:p>
+            <w:pPr>
+              <w:jc w:val="left"/>
+            </w:pPr>
+            <w:r>
+              <w:rPr>
+                <w:rFonts w:ascii="Calibri" w:cs="Calibri" w:eastAsia="Calibri" w:hAnsi="Calibri"/>
+                <w:b w:val="false"/>
+                <w:bCs w:val="false"/>
+                <w:i w:val="false"/>
+                <w:iCs w:val="false"/>
+                <w:color w:val="000000"/>
+                <w:sz w:val="20"/>
+                <w:szCs w:val="20"/>
+              </w:rPr>
+              <w:t xml:space="preserve">Bank account</w:t>
+            </w:r>
+          </w:p>
+        </w:tc>
+        <w:tc>
+          <w:tcPr>
+            <w:tcW w:type="dxa" w:w="6560"/>
+            <w:tcBorders>
+              <w:top w:val="single" w:color="000000" w:sz="8"/>
+              <w:left w:val="single" w:color="000000" w:sz="8"/>
+              <w:bottom w:val="single" w:color="000000" w:sz="8"/>
+              <w:right w:val="single" w:color="000000" w:sz="8"/>
+            </w:tcBorders>
+            <w:shd w:fill="FFFFFF" w:color="FFFFFF" w:val="clear"/>
+            <w:tcMar>
+              <w:top w:type="dxa" w:w="60"/>
+              <w:left w:type="dxa" w:w="80"/>
+              <w:bottom w:type="dxa" w:w="60"/>
+              <w:right w:type="dxa" w:w="80"/>
+            </w:tcMar>
+            <w:vAlign w:val="center"/>
+          </w:tcPr>
+          <w:p>
+            <w:pPr>
+              <w:jc w:val="left"/>
+            </w:pPr>
+            <w:r>
+              <w:rPr>
+                <w:rFonts w:ascii="Calibri" w:cs="Calibri" w:eastAsia="Calibri" w:hAnsi="Calibri"/>
+                <w:b w:val="false"/>
+                <w:bCs w:val="false"/>
+                <w:i w:val="false"/>
+                <w:iCs w:val="false"/>
+                <w:color w:val="000000"/>
+                <w:sz w:val="20"/>
+                <w:szCs w:val="20"/>
+              </w:rPr>
+              <w:t xml:space="preserve">A named bank or wallet on Money in and out, with the account number and the money already in it when this software started.</w:t>
             </w:r>
           </w:p>
         </w:tc>
@@ -20122,7 +20299,7 @@
           <w:sz w:val="22"/>
           <w:szCs w:val="22"/>
         </w:rPr>
-        <w:t xml:space="preserve">This page lists money that moved: collections, pay-outs, and the difference. It also lists people who still owe us and what Abu Twins still owes suppliers. Cashiers can open it to follow credit sales. From here you can open Close the day to count the till.</w:t>
+        <w:t xml:space="preserve">This page lists money that moved: collections, pay-outs, and the difference. It also lists people who still owe us and what Abu Twins still owes suppliers. At the top it holds opening cash for each shop, and named bank accounts with account numbers and opening balances. That is the money already in the till and in the banks on the day the shops started using this software. It is not opening stock. Cashiers can open it to follow credit sales. From here you can open Close the day to count the till.</w:t>
       </w:r>
     </w:p>
     <w:p>
@@ -20160,7 +20337,7 @@
           <w:sz w:val="22"/>
           <w:szCs w:val="22"/>
         </w:rPr>
-        <w:t xml:space="preserve">Sales pages show goods. This page shows naira. In a small shop the till person also needs to see who still owes payment.</w:t>
+        <w:t xml:space="preserve">Sales pages show goods. This page shows naira. The till person also needs to see who still owes payment. The accountant needs the cash and bank the shops already held, so Cash in the till and Bank do not start from zero.</w:t>
       </w:r>
     </w:p>
     <w:p>
@@ -20198,7 +20375,7 @@
           <w:sz w:val="22"/>
           <w:szCs w:val="22"/>
         </w:rPr>
-        <w:t xml:space="preserve">The Iwo Road cashier opens Money in &amp; out after lunch. People who still owe us shows three names. They call each one. Later the accountant checks Money in against the transfer alerts.</w:t>
+        <w:t xml:space="preserve">The accountant opens Money in and out on the day the software goes live. Iwo Road has 450,000 naira in the till. They type that as opening cash. They add GTBank with the account number and 8 million naira already in the account, then Access Bank with its own number and balance. Cash in the till now starts at 450,000. Bank starts at the sum of those openings. Later cash sales add on. Shop expenses come off the till. Transfer and POS add on the bank box.</w:t>
       </w:r>
     </w:p>
     <w:p>
@@ -20248,7 +20425,7 @@
           <w:sz w:val="22"/>
           <w:szCs w:val="22"/>
         </w:rPr>
-        <w:t xml:space="preserve">Sign in as cashier, accountant, or CEO.</w:t>
+        <w:t xml:space="preserve">Sign in as accountant, CEO, or Super Admin.</w:t>
       </w:r>
     </w:p>
     <w:p>
@@ -20279,7 +20456,7 @@
           <w:sz w:val="22"/>
           <w:szCs w:val="22"/>
         </w:rPr>
-        <w:t xml:space="preserve">Click Money in &amp; out.</w:t>
+        <w:t xml:space="preserve">Click Money in and out.</w:t>
       </w:r>
     </w:p>
     <w:p>
@@ -20310,7 +20487,7 @@
           <w:sz w:val="22"/>
           <w:szCs w:val="22"/>
         </w:rPr>
-        <w:t xml:space="preserve">Read Money in, Money out, and Difference.</w:t>
+        <w:t xml:space="preserve">Read Money we started with.</w:t>
       </w:r>
     </w:p>
     <w:p>
@@ -20341,7 +20518,7 @@
           <w:sz w:val="22"/>
           <w:szCs w:val="22"/>
         </w:rPr>
-        <w:t xml:space="preserve">Read People who still owe us.</w:t>
+        <w:t xml:space="preserve">Type opening cash for each shop. Save opening cash for this shop.</w:t>
       </w:r>
     </w:p>
     <w:p>
@@ -20372,7 +20549,100 @@
           <w:sz w:val="22"/>
           <w:szCs w:val="22"/>
         </w:rPr>
-        <w:t xml:space="preserve">Read the list of movements.</w:t>
+        <w:t xml:space="preserve">Add a bank. Type the bank name, the account number, and the opening balance. Save this bank account.</w:t>
+      </w:r>
+    </w:p>
+    <w:p>
+      <w:pPr>
+        <w:spacing w:after="80" w:line="276"/>
+      </w:pPr>
+      <w:r>
+        <w:rPr>
+          <w:rFonts w:ascii="Calibri" w:cs="Calibri" w:eastAsia="Calibri" w:hAnsi="Calibri"/>
+          <w:b/>
+          <w:bCs/>
+          <w:i w:val="false"/>
+          <w:iCs w:val="false"/>
+          <w:color w:val="000000"/>
+          <w:sz w:val="22"/>
+          <w:szCs w:val="22"/>
+        </w:rPr>
+        <w:t xml:space="preserve">6. </w:t>
+      </w:r>
+      <w:r>
+        <w:rPr>
+          <w:rFonts w:ascii="Calibri" w:cs="Calibri" w:eastAsia="Calibri" w:hAnsi="Calibri"/>
+          <w:b w:val="false"/>
+          <w:bCs w:val="false"/>
+          <w:i w:val="false"/>
+          <w:iCs w:val="false"/>
+          <w:color w:val="000000"/>
+          <w:sz w:val="22"/>
+          <w:szCs w:val="22"/>
+        </w:rPr>
+        <w:t xml:space="preserve">Read Cash in the till. It should show the opening cash plus cash sales minus shop expenses.</w:t>
+      </w:r>
+    </w:p>
+    <w:p>
+      <w:pPr>
+        <w:spacing w:after="80" w:line="276"/>
+      </w:pPr>
+      <w:r>
+        <w:rPr>
+          <w:rFonts w:ascii="Calibri" w:cs="Calibri" w:eastAsia="Calibri" w:hAnsi="Calibri"/>
+          <w:b/>
+          <w:bCs/>
+          <w:i w:val="false"/>
+          <w:iCs w:val="false"/>
+          <w:color w:val="000000"/>
+          <w:sz w:val="22"/>
+          <w:szCs w:val="22"/>
+        </w:rPr>
+        <w:t xml:space="preserve">7. </w:t>
+      </w:r>
+      <w:r>
+        <w:rPr>
+          <w:rFonts w:ascii="Calibri" w:cs="Calibri" w:eastAsia="Calibri" w:hAnsi="Calibri"/>
+          <w:b w:val="false"/>
+          <w:bCs w:val="false"/>
+          <w:i w:val="false"/>
+          <w:iCs w:val="false"/>
+          <w:color w:val="000000"/>
+          <w:sz w:val="22"/>
+          <w:szCs w:val="22"/>
+        </w:rPr>
+        <w:t xml:space="preserve">Read Bank, transfer, and POS. It should show the opening banks plus transfer and POS minus money sent to suppliers.</w:t>
+      </w:r>
+    </w:p>
+    <w:p>
+      <w:pPr>
+        <w:spacing w:after="80" w:line="276"/>
+      </w:pPr>
+      <w:r>
+        <w:rPr>
+          <w:rFonts w:ascii="Calibri" w:cs="Calibri" w:eastAsia="Calibri" w:hAnsi="Calibri"/>
+          <w:b/>
+          <w:bCs/>
+          <w:i w:val="false"/>
+          <w:iCs w:val="false"/>
+          <w:color w:val="000000"/>
+          <w:sz w:val="22"/>
+          <w:szCs w:val="22"/>
+        </w:rPr>
+        <w:t xml:space="preserve">8. </w:t>
+      </w:r>
+      <w:r>
+        <w:rPr>
+          <w:rFonts w:ascii="Calibri" w:cs="Calibri" w:eastAsia="Calibri" w:hAnsi="Calibri"/>
+          <w:b w:val="false"/>
+          <w:bCs w:val="false"/>
+          <w:i w:val="false"/>
+          <w:iCs w:val="false"/>
+          <w:color w:val="000000"/>
+          <w:sz w:val="22"/>
+          <w:szCs w:val="22"/>
+        </w:rPr>
+        <w:t xml:space="preserve">A cashier can still open Money in and out to read People who still owe us.</w:t>
       </w:r>
     </w:p>
     <w:p>
@@ -20414,7 +20684,7 @@
           <w:sz w:val="22"/>
           <w:szCs w:val="22"/>
         </w:rPr>
-        <w:t xml:space="preserve">A cashier can open Money in &amp; out.</w:t>
+        <w:t xml:space="preserve">Opening cash is on the page for each shop.</w:t>
       </w:r>
     </w:p>
     <w:p>
@@ -20437,7 +20707,7 @@
           <w:sz w:val="22"/>
           <w:szCs w:val="22"/>
         </w:rPr>
-        <w:t xml:space="preserve">People who still owe us shows credit balances.</w:t>
+        <w:t xml:space="preserve">Each bank shows its name, account number, shop, and opening balance.</w:t>
       </w:r>
     </w:p>
     <w:p>
@@ -20460,7 +20730,7 @@
           <w:sz w:val="22"/>
           <w:szCs w:val="22"/>
         </w:rPr>
-        <w:t xml:space="preserve">A finished cash sale appears as money in.</w:t>
+        <w:t xml:space="preserve">A second copy of the same account number is refused.</w:t>
       </w:r>
     </w:p>
     <w:p>
@@ -20483,7 +20753,7 @@
           <w:sz w:val="22"/>
           <w:szCs w:val="22"/>
         </w:rPr>
-        <w:t xml:space="preserve">An approved expense that was paid appears as money out.</w:t>
+        <w:t xml:space="preserve">Cash in the till includes opening cash. It does not start from zero.</w:t>
       </w:r>
     </w:p>
     <w:p>
@@ -20506,7 +20776,7 @@
           <w:sz w:val="22"/>
           <w:szCs w:val="22"/>
         </w:rPr>
-        <w:t xml:space="preserve">Figures are in naira.</w:t>
+        <w:t xml:space="preserve">Bank includes the opening balances of the named accounts.</w:t>
       </w:r>
     </w:p>
     <w:p>
@@ -20529,7 +20799,76 @@
           <w:sz w:val="22"/>
           <w:szCs w:val="22"/>
         </w:rPr>
-        <w:t xml:space="preserve">A link says Close the day and export cash count.</w:t>
+        <w:t xml:space="preserve">Opening stock is not on this page. Phones stay on Correct and close opening stock.</w:t>
+      </w:r>
+    </w:p>
+    <w:p>
+      <w:pPr>
+        <w:pStyle w:val="ListParagraph"/>
+        <w:numPr>
+          <w:ilvl w:val="0"/>
+          <w:numId w:val="2"/>
+        </w:numPr>
+        <w:spacing w:after="80" w:line="276"/>
+      </w:pPr>
+      <w:r>
+        <w:rPr>
+          <w:rFonts w:ascii="Calibri" w:cs="Calibri" w:eastAsia="Calibri" w:hAnsi="Calibri"/>
+          <w:b w:val="false"/>
+          <w:bCs w:val="false"/>
+          <w:i w:val="false"/>
+          <w:iCs w:val="false"/>
+          <w:color w:val="000000"/>
+          <w:sz w:val="22"/>
+          <w:szCs w:val="22"/>
+        </w:rPr>
+        <w:t xml:space="preserve">Who did what names the person who saved opening cash or a bank.</w:t>
+      </w:r>
+    </w:p>
+    <w:p>
+      <w:pPr>
+        <w:pStyle w:val="ListParagraph"/>
+        <w:numPr>
+          <w:ilvl w:val="0"/>
+          <w:numId w:val="2"/>
+        </w:numPr>
+        <w:spacing w:after="80" w:line="276"/>
+      </w:pPr>
+      <w:r>
+        <w:rPr>
+          <w:rFonts w:ascii="Calibri" w:cs="Calibri" w:eastAsia="Calibri" w:hAnsi="Calibri"/>
+          <w:b w:val="false"/>
+          <w:bCs w:val="false"/>
+          <w:i w:val="false"/>
+          <w:iCs w:val="false"/>
+          <w:color w:val="000000"/>
+          <w:sz w:val="22"/>
+          <w:szCs w:val="22"/>
+        </w:rPr>
+        <w:t xml:space="preserve">A cashier can open Money in and out but cannot type opening money.</w:t>
+      </w:r>
+    </w:p>
+    <w:p>
+      <w:pPr>
+        <w:pStyle w:val="ListParagraph"/>
+        <w:numPr>
+          <w:ilvl w:val="0"/>
+          <w:numId w:val="2"/>
+        </w:numPr>
+        <w:spacing w:after="80" w:line="276"/>
+      </w:pPr>
+      <w:r>
+        <w:rPr>
+          <w:rFonts w:ascii="Calibri" w:cs="Calibri" w:eastAsia="Calibri" w:hAnsi="Calibri"/>
+          <w:b w:val="false"/>
+          <w:bCs w:val="false"/>
+          <w:i w:val="false"/>
+          <w:iCs w:val="false"/>
+          <w:color w:val="000000"/>
+          <w:sz w:val="22"/>
+          <w:szCs w:val="22"/>
+        </w:rPr>
+        <w:t xml:space="preserve">A link says Close the day.</w:t>
       </w:r>
     </w:p>
     <w:p>
@@ -46708,6 +47047,159 @@
           </w:p>
         </w:tc>
       </w:tr>
+      <w:tr>
+        <w:trPr>
+          <w:trHeight w:val="320" w:hRule="atLeast"/>
+        </w:trPr>
+        <w:tc>
+          <w:tcPr>
+            <w:tcW w:type="dxa" w:w="600"/>
+            <w:tcBorders>
+              <w:top w:val="single" w:color="000000" w:sz="8"/>
+              <w:left w:val="single" w:color="000000" w:sz="8"/>
+              <w:bottom w:val="single" w:color="000000" w:sz="8"/>
+              <w:right w:val="single" w:color="000000" w:sz="8"/>
+            </w:tcBorders>
+            <w:shd w:fill="FFFFFF" w:color="FFFFFF" w:val="clear"/>
+            <w:tcMar>
+              <w:top w:type="dxa" w:w="60"/>
+              <w:left w:type="dxa" w:w="80"/>
+              <w:bottom w:type="dxa" w:w="60"/>
+              <w:right w:type="dxa" w:w="80"/>
+            </w:tcMar>
+            <w:vAlign w:val="center"/>
+          </w:tcPr>
+          <w:p>
+            <w:pPr>
+              <w:jc w:val="left"/>
+            </w:pPr>
+            <w:r>
+              <w:rPr>
+                <w:rFonts w:ascii="Calibri" w:cs="Calibri" w:eastAsia="Calibri" w:hAnsi="Calibri"/>
+                <w:b w:val="false"/>
+                <w:bCs w:val="false"/>
+                <w:i w:val="false"/>
+                <w:iCs w:val="false"/>
+                <w:color w:val="000000"/>
+                <w:sz w:val="20"/>
+                <w:szCs w:val="20"/>
+              </w:rPr>
+              <w:t xml:space="preserve">65</w:t>
+            </w:r>
+          </w:p>
+        </w:tc>
+        <w:tc>
+          <w:tcPr>
+            <w:tcW w:type="dxa" w:w="2800"/>
+            <w:tcBorders>
+              <w:top w:val="single" w:color="000000" w:sz="8"/>
+              <w:left w:val="single" w:color="000000" w:sz="8"/>
+              <w:bottom w:val="single" w:color="000000" w:sz="8"/>
+              <w:right w:val="single" w:color="000000" w:sz="8"/>
+            </w:tcBorders>
+            <w:shd w:fill="FFFFFF" w:color="FFFFFF" w:val="clear"/>
+            <w:tcMar>
+              <w:top w:type="dxa" w:w="60"/>
+              <w:left w:type="dxa" w:w="80"/>
+              <w:bottom w:type="dxa" w:w="60"/>
+              <w:right w:type="dxa" w:w="80"/>
+            </w:tcMar>
+            <w:vAlign w:val="center"/>
+          </w:tcPr>
+          <w:p>
+            <w:pPr>
+              <w:jc w:val="left"/>
+            </w:pPr>
+            <w:r>
+              <w:rPr>
+                <w:rFonts w:ascii="Calibri" w:cs="Calibri" w:eastAsia="Calibri" w:hAnsi="Calibri"/>
+                <w:b w:val="false"/>
+                <w:bCs w:val="false"/>
+                <w:i w:val="false"/>
+                <w:iCs w:val="false"/>
+                <w:color w:val="000000"/>
+                <w:sz w:val="20"/>
+                <w:szCs w:val="20"/>
+              </w:rPr>
+              <w:t xml:space="preserve">Opening cash and a named bank</w:t>
+            </w:r>
+          </w:p>
+        </w:tc>
+        <w:tc>
+          <w:tcPr>
+            <w:tcW w:type="dxa" w:w="2600"/>
+            <w:tcBorders>
+              <w:top w:val="single" w:color="000000" w:sz="8"/>
+              <w:left w:val="single" w:color="000000" w:sz="8"/>
+              <w:bottom w:val="single" w:color="000000" w:sz="8"/>
+              <w:right w:val="single" w:color="000000" w:sz="8"/>
+            </w:tcBorders>
+            <w:shd w:fill="FFFFFF" w:color="FFFFFF" w:val="clear"/>
+            <w:tcMar>
+              <w:top w:type="dxa" w:w="60"/>
+              <w:left w:type="dxa" w:w="80"/>
+              <w:bottom w:type="dxa" w:w="60"/>
+              <w:right w:type="dxa" w:w="80"/>
+            </w:tcMar>
+            <w:vAlign w:val="center"/>
+          </w:tcPr>
+          <w:p>
+            <w:pPr>
+              <w:jc w:val="left"/>
+            </w:pPr>
+            <w:r>
+              <w:rPr>
+                <w:rFonts w:ascii="Calibri" w:cs="Calibri" w:eastAsia="Calibri" w:hAnsi="Calibri"/>
+                <w:b w:val="false"/>
+                <w:bCs w:val="false"/>
+                <w:i w:val="false"/>
+                <w:iCs w:val="false"/>
+                <w:color w:val="000000"/>
+                <w:sz w:val="20"/>
+                <w:szCs w:val="20"/>
+              </w:rPr>
+              <w:t xml:space="preserve">accountant@abutwins.com</w:t>
+            </w:r>
+          </w:p>
+        </w:tc>
+        <w:tc>
+          <w:tcPr>
+            <w:tcW w:type="dxa" w:w="3360"/>
+            <w:tcBorders>
+              <w:top w:val="single" w:color="000000" w:sz="8"/>
+              <w:left w:val="single" w:color="000000" w:sz="8"/>
+              <w:bottom w:val="single" w:color="000000" w:sz="8"/>
+              <w:right w:val="single" w:color="000000" w:sz="8"/>
+            </w:tcBorders>
+            <w:shd w:fill="FFFFFF" w:color="FFFFFF" w:val="clear"/>
+            <w:tcMar>
+              <w:top w:type="dxa" w:w="60"/>
+              <w:left w:type="dxa" w:w="80"/>
+              <w:bottom w:type="dxa" w:w="60"/>
+              <w:right w:type="dxa" w:w="80"/>
+            </w:tcMar>
+            <w:vAlign w:val="center"/>
+          </w:tcPr>
+          <w:p>
+            <w:pPr>
+              <w:jc w:val="left"/>
+            </w:pPr>
+            <w:r>
+              <w:rPr>
+                <w:rFonts w:ascii="Calibri" w:cs="Calibri" w:eastAsia="Calibri" w:hAnsi="Calibri"/>
+                <w:b w:val="false"/>
+                <w:bCs w:val="false"/>
+                <w:i w:val="false"/>
+                <w:iCs w:val="false"/>
+                <w:color w:val="000000"/>
+                <w:sz w:val="20"/>
+                <w:szCs w:val="20"/>
+              </w:rPr>
+              <w:t xml:space="preserve">Open Money in and out. Type opening cash for Iwo Road, for example 450,000. Save. Add GTBank with an account number and an opening balance, for example 8,000,000. Cash in the till includes 450,000. Bank includes 8,000,000. Adding the same account number again is refused. Opening stock is not on this page.</w:t>
+            </w:r>
+          </w:p>
+        </w:tc>
+      </w:tr>
     </w:tbl>
     <w:p>
       <w:pPr>
@@ -46798,6 +47290,29 @@
           <w:sz w:val="22"/>
           <w:szCs w:val="22"/>
         </w:rPr>
+        <w:t xml:space="preserve">Opening cash is the naira in the till on the day the shops started using this software. A named bank has a name, an account number, and an opening balance. Both live on Money in and out. They are not opening stock.</w:t>
+      </w:r>
+    </w:p>
+    <w:p>
+      <w:pPr>
+        <w:pStyle w:val="ListParagraph"/>
+        <w:numPr>
+          <w:ilvl w:val="0"/>
+          <w:numId w:val="2"/>
+        </w:numPr>
+        <w:spacing w:after="80" w:line="276"/>
+      </w:pPr>
+      <w:r>
+        <w:rPr>
+          <w:rFonts w:ascii="Calibri" w:cs="Calibri" w:eastAsia="Calibri" w:hAnsi="Calibri"/>
+          <w:b w:val="false"/>
+          <w:bCs w:val="false"/>
+          <w:i w:val="false"/>
+          <w:iCs w:val="false"/>
+          <w:color w:val="000000"/>
+          <w:sz w:val="22"/>
+          <w:szCs w:val="22"/>
+        </w:rPr>
         <w:t xml:space="preserve">Credit sales on Check the books is what is still owed after money already received, not the full invoice.</w:t>
       </w:r>
     </w:p>
@@ -48686,6 +49201,25 @@
           <w:szCs w:val="22"/>
         </w:rPr>
         <w:t xml:space="preserve">Version 1.34 puts unpaid supplier cartons from Upload stock onto Reports, Home, Money in and out, and Check the books, with the same amount as Suppliers. Opening stock stays value only. On Reports, Still owed to suppliers shows the house name and the amount. Click the house and the bills drop down.</w:t>
+      </w:r>
+    </w:p>
+    <w:p>
+      <w:pPr>
+        <w:spacing w:after="160" w:before="0" w:line="276"/>
+        <w:jc w:val="left"/>
+      </w:pPr>
+      <w:r>
+        <w:rPr>
+          <w:rFonts w:ascii="Calibri" w:cs="Calibri" w:eastAsia="Calibri" w:hAnsi="Calibri"/>
+          <w:b w:val="false"/>
+          <w:bCs w:val="false"/>
+          <w:i w:val="false"/>
+          <w:iCs w:val="false"/>
+          <w:color w:val="000000"/>
+          <w:sz w:val="22"/>
+          <w:szCs w:val="22"/>
+        </w:rPr>
+        <w:t xml:space="preserve">Version 1.35 puts opening cash and named bank accounts on Money in and out. The accountant types the cash in the till and adds each bank with its account number and opening balance. Cash in the till and Bank start from those figures, then sales, expenses, and supplier payments sit on top. Opening stock stays phones and pieces, not naira.</w:t>
       </w:r>
     </w:p>
     <w:p>

</xml_diff>

<commit_message>
feat: send phones back by IMEI only and move the supplier account
Staff should not pick a house on Send back to supplier. Scanning the IMEI fills the phone, supplier, and cost, and several phones can go in one send-back. That cost cuts what we still owe, or shows They owe us if the house already was paid.

Co-authored-by: Cursor <cursoragent@cursor.com>
</commit_message>
<xml_diff>
--- a/docs/Abu-Twins-Shop-System-User-Guide.docx
+++ b/docs/Abu-Twins-Shop-System-User-Guide.docx
@@ -459,7 +459,7 @@
                 <w:sz w:val="20"/>
                 <w:szCs w:val="20"/>
               </w:rPr>
-              <w:t xml:space="preserve">1.35</w:t>
+              <w:t xml:space="preserve">1.37</w:t>
             </w:r>
           </w:p>
         </w:tc>
@@ -533,7 +533,7 @@
                 <w:sz w:val="20"/>
                 <w:szCs w:val="20"/>
               </w:rPr>
-              <w:t xml:space="preserve">Updated: opening cash and named bank accounts on Money in and out</w:t>
+              <w:t xml:space="preserve">Updated: send phones back to a supplier by IMEI only, in bulk, and move the house account</w:t>
             </w:r>
           </w:p>
         </w:tc>
@@ -1149,6 +1149,44 @@
           <w:szCs w:val="22"/>
         </w:rPr>
         <w:t xml:space="preserve">Money in and out now holds opening cash for each shop, and named bank accounts with account numbers and opening balances. That is the money already in the till and in the banks on the day the shops started using this software. It is not opening stock. Sales, expenses, and supplier payments sit on top of those figures.</w:t>
+      </w:r>
+    </w:p>
+    <w:p>
+      <w:pPr>
+        <w:spacing w:after="160" w:before="0" w:line="276"/>
+        <w:jc w:val="left"/>
+      </w:pPr>
+      <w:r>
+        <w:rPr>
+          <w:rFonts w:ascii="Calibri" w:cs="Calibri" w:eastAsia="Calibri" w:hAnsi="Calibri"/>
+          <w:b w:val="false"/>
+          <w:bCs w:val="false"/>
+          <w:i w:val="false"/>
+          <w:iCs w:val="false"/>
+          <w:color w:val="000000"/>
+          <w:sz w:val="22"/>
+          <w:szCs w:val="22"/>
+        </w:rPr>
+        <w:t xml:space="preserve">Sign out now goes straight to Sign in. You do not see a half-built shop page in between. The left side of Sign in is a shop film on a blue field. There is no still photo under it. Click the large play mark to play. Click again to pause.</w:t>
+      </w:r>
+    </w:p>
+    <w:p>
+      <w:pPr>
+        <w:spacing w:after="160" w:before="0" w:line="276"/>
+        <w:jc w:val="left"/>
+      </w:pPr>
+      <w:r>
+        <w:rPr>
+          <w:rFonts w:ascii="Calibri" w:cs="Calibri" w:eastAsia="Calibri" w:hAnsi="Calibri"/>
+          <w:b w:val="false"/>
+          <w:bCs w:val="false"/>
+          <w:i w:val="false"/>
+          <w:iCs w:val="false"/>
+          <w:color w:val="000000"/>
+          <w:sz w:val="22"/>
+          <w:szCs w:val="22"/>
+        </w:rPr>
+        <w:t xml:space="preserve">When a phone must go back to the supplier, scan the IMEI only. Do not pick the house. The phone name, the supplier, and the cost fill in from that number. Scan ten or twenty phones if they all go back to the same house in one send-back. That cost comes off what we still owe. If we do not owe that house, they owe us. The CEO, the accountant, and the records checker can see both on Suppliers, Money in and out, Reports, Home, and Check the books.</w:t>
       </w:r>
     </w:p>
     <w:p>
@@ -7193,6 +7231,164 @@
                 <w:szCs w:val="20"/>
               </w:rPr>
               <w:t xml:space="preserve">One row for one supplier, even if the name was saved more than once. Click the row to open the bills inside it.</w:t>
+            </w:r>
+          </w:p>
+        </w:tc>
+      </w:tr>
+      <w:tr>
+        <w:trPr>
+          <w:trHeight w:val="320" w:hRule="atLeast"/>
+        </w:trPr>
+        <w:tc>
+          <w:tcPr>
+            <w:tcW w:type="dxa" w:w="2800"/>
+            <w:tcBorders>
+              <w:top w:val="single" w:color="000000" w:sz="8"/>
+              <w:left w:val="single" w:color="000000" w:sz="8"/>
+              <w:bottom w:val="single" w:color="000000" w:sz="8"/>
+              <w:right w:val="single" w:color="000000" w:sz="8"/>
+            </w:tcBorders>
+            <w:shd w:fill="F7F7F7" w:color="F7F7F7" w:val="clear"/>
+            <w:tcMar>
+              <w:top w:type="dxa" w:w="60"/>
+              <w:left w:type="dxa" w:w="80"/>
+              <w:bottom w:type="dxa" w:w="60"/>
+              <w:right w:type="dxa" w:w="80"/>
+            </w:tcMar>
+            <w:vAlign w:val="center"/>
+          </w:tcPr>
+          <w:p>
+            <w:pPr>
+              <w:jc w:val="left"/>
+            </w:pPr>
+            <w:r>
+              <w:rPr>
+                <w:rFonts w:ascii="Calibri" w:cs="Calibri" w:eastAsia="Calibri" w:hAnsi="Calibri"/>
+                <w:b w:val="false"/>
+                <w:bCs w:val="false"/>
+                <w:i w:val="false"/>
+                <w:iCs w:val="false"/>
+                <w:color w:val="000000"/>
+                <w:sz w:val="20"/>
+                <w:szCs w:val="20"/>
+              </w:rPr>
+              <w:t xml:space="preserve">Send back to supplier</w:t>
+            </w:r>
+          </w:p>
+        </w:tc>
+        <w:tc>
+          <w:tcPr>
+            <w:tcW w:type="dxa" w:w="6560"/>
+            <w:tcBorders>
+              <w:top w:val="single" w:color="000000" w:sz="8"/>
+              <w:left w:val="single" w:color="000000" w:sz="8"/>
+              <w:bottom w:val="single" w:color="000000" w:sz="8"/>
+              <w:right w:val="single" w:color="000000" w:sz="8"/>
+            </w:tcBorders>
+            <w:shd w:fill="F7F7F7" w:color="F7F7F7" w:val="clear"/>
+            <w:tcMar>
+              <w:top w:type="dxa" w:w="60"/>
+              <w:left w:type="dxa" w:w="80"/>
+              <w:bottom w:type="dxa" w:w="60"/>
+              <w:right w:type="dxa" w:w="80"/>
+            </w:tcMar>
+            <w:vAlign w:val="center"/>
+          </w:tcPr>
+          <w:p>
+            <w:pPr>
+              <w:jc w:val="left"/>
+            </w:pPr>
+            <w:r>
+              <w:rPr>
+                <w:rFonts w:ascii="Calibri" w:cs="Calibri" w:eastAsia="Calibri" w:hAnsi="Calibri"/>
+                <w:b w:val="false"/>
+                <w:bCs w:val="false"/>
+                <w:i w:val="false"/>
+                <w:iCs w:val="false"/>
+                <w:color w:val="000000"/>
+                <w:sz w:val="20"/>
+                <w:szCs w:val="20"/>
+              </w:rPr>
+              <w:t xml:space="preserve">Scan IMEIs that must go back to the house that supplied them. Do not pick the supplier. Scan as many phones as are going in that one send-back.</w:t>
+            </w:r>
+          </w:p>
+        </w:tc>
+      </w:tr>
+      <w:tr>
+        <w:trPr>
+          <w:trHeight w:val="320" w:hRule="atLeast"/>
+        </w:trPr>
+        <w:tc>
+          <w:tcPr>
+            <w:tcW w:type="dxa" w:w="2800"/>
+            <w:tcBorders>
+              <w:top w:val="single" w:color="000000" w:sz="8"/>
+              <w:left w:val="single" w:color="000000" w:sz="8"/>
+              <w:bottom w:val="single" w:color="000000" w:sz="8"/>
+              <w:right w:val="single" w:color="000000" w:sz="8"/>
+            </w:tcBorders>
+            <w:shd w:fill="FFFFFF" w:color="FFFFFF" w:val="clear"/>
+            <w:tcMar>
+              <w:top w:type="dxa" w:w="60"/>
+              <w:left w:type="dxa" w:w="80"/>
+              <w:bottom w:type="dxa" w:w="60"/>
+              <w:right w:type="dxa" w:w="80"/>
+            </w:tcMar>
+            <w:vAlign w:val="center"/>
+          </w:tcPr>
+          <w:p>
+            <w:pPr>
+              <w:jc w:val="left"/>
+            </w:pPr>
+            <w:r>
+              <w:rPr>
+                <w:rFonts w:ascii="Calibri" w:cs="Calibri" w:eastAsia="Calibri" w:hAnsi="Calibri"/>
+                <w:b w:val="false"/>
+                <w:bCs w:val="false"/>
+                <w:i w:val="false"/>
+                <w:iCs w:val="false"/>
+                <w:color w:val="000000"/>
+                <w:sz w:val="20"/>
+                <w:szCs w:val="20"/>
+              </w:rPr>
+              <w:t xml:space="preserve">They owe us</w:t>
+            </w:r>
+          </w:p>
+        </w:tc>
+        <w:tc>
+          <w:tcPr>
+            <w:tcW w:type="dxa" w:w="6560"/>
+            <w:tcBorders>
+              <w:top w:val="single" w:color="000000" w:sz="8"/>
+              <w:left w:val="single" w:color="000000" w:sz="8"/>
+              <w:bottom w:val="single" w:color="000000" w:sz="8"/>
+              <w:right w:val="single" w:color="000000" w:sz="8"/>
+            </w:tcBorders>
+            <w:shd w:fill="FFFFFF" w:color="FFFFFF" w:val="clear"/>
+            <w:tcMar>
+              <w:top w:type="dxa" w:w="60"/>
+              <w:left w:type="dxa" w:w="80"/>
+              <w:bottom w:type="dxa" w:w="60"/>
+              <w:right w:type="dxa" w:w="80"/>
+            </w:tcMar>
+            <w:vAlign w:val="center"/>
+          </w:tcPr>
+          <w:p>
+            <w:pPr>
+              <w:jc w:val="left"/>
+            </w:pPr>
+            <w:r>
+              <w:rPr>
+                <w:rFonts w:ascii="Calibri" w:cs="Calibri" w:eastAsia="Calibri" w:hAnsi="Calibri"/>
+                <w:b w:val="false"/>
+                <w:bCs w:val="false"/>
+                <w:i w:val="false"/>
+                <w:iCs w:val="false"/>
+                <w:color w:val="000000"/>
+                <w:sz w:val="20"/>
+                <w:szCs w:val="20"/>
+              </w:rPr>
+              <w:t xml:space="preserve">A surplus on a supplier after send-backs. We do not owe that house. That house owes Abu Twins.</w:t>
             </w:r>
           </w:p>
         </w:tc>
@@ -10331,7 +10527,7 @@
           <w:sz w:val="22"/>
           <w:szCs w:val="22"/>
         </w:rPr>
-        <w:t xml:space="preserve">The left side says abutwins Softskills and Own The Future.</w:t>
+        <w:t xml:space="preserve">The left side is a shop film on a blue field. Click the play mark to play. Click again to pause. There is no still photo sitting under the film.</w:t>
       </w:r>
     </w:p>
     <w:p>
@@ -10354,7 +10550,7 @@
           <w:sz w:val="22"/>
           <w:szCs w:val="22"/>
         </w:rPr>
-        <w:t xml:space="preserve">The bottom of the sign-in page says Software by Techvaults Limited. You can click it to open techvaults.com.</w:t>
+        <w:t xml:space="preserve">The left side also says abutwins Softskills.</w:t>
       </w:r>
     </w:p>
     <w:p>
@@ -10377,7 +10573,7 @@
           <w:sz w:val="22"/>
           <w:szCs w:val="22"/>
         </w:rPr>
-        <w:t xml:space="preserve">After a correct login you land on Home, or the first page your job is allowed to see.</w:t>
+        <w:t xml:space="preserve">The bottom of the sign-in page says Software by Techvaults Limited. You can click it to open techvaults.com.</w:t>
       </w:r>
     </w:p>
     <w:p>
@@ -10400,7 +10596,7 @@
           <w:sz w:val="22"/>
           <w:szCs w:val="22"/>
         </w:rPr>
-        <w:t xml:space="preserve">While it checks, the button says Checking your sign-in, not three dots.</w:t>
+        <w:t xml:space="preserve">After a correct login you land on Home, or the first page your job is allowed to see.</w:t>
       </w:r>
     </w:p>
     <w:p>
@@ -10423,7 +10619,7 @@
           <w:sz w:val="22"/>
           <w:szCs w:val="22"/>
         </w:rPr>
-        <w:t xml:space="preserve">A wrong email or password shows: Email or password is not correct, or this login is locked.</w:t>
+        <w:t xml:space="preserve">While it checks, the button says Checking your sign-in, not three dots.</w:t>
       </w:r>
     </w:p>
     <w:p>
@@ -10446,26 +10642,7 @@
           <w:sz w:val="22"/>
           <w:szCs w:val="22"/>
         </w:rPr>
-        <w:t xml:space="preserve">A locked staff account cannot enter.</w:t>
-      </w:r>
-    </w:p>
-    <w:p>
-      <w:pPr>
-        <w:pStyle w:val="Heading3"/>
-        <w:spacing w:after="80" w:before="200"/>
-      </w:pPr>
-      <w:r>
-        <w:rPr>
-          <w:rFonts w:ascii="Calibri" w:cs="Calibri" w:eastAsia="Calibri" w:hAnsi="Calibri"/>
-          <w:b/>
-          <w:bCs/>
-          <w:i w:val="false"/>
-          <w:iCs w:val="false"/>
-          <w:color w:val="000000"/>
-          <w:sz w:val="24"/>
-          <w:szCs w:val="24"/>
-        </w:rPr>
-        <w:t xml:space="preserve">If you get stuck</w:t>
+        <w:t xml:space="preserve">A wrong email or password shows: Email or password is not correct, or this login is locked.</w:t>
       </w:r>
     </w:p>
     <w:p>
@@ -10488,7 +10665,26 @@
           <w:sz w:val="22"/>
           <w:szCs w:val="22"/>
         </w:rPr>
-        <w:t xml:space="preserve">Check you are using the email, not a phone number.</w:t>
+        <w:t xml:space="preserve">A locked staff account cannot enter.</w:t>
+      </w:r>
+    </w:p>
+    <w:p>
+      <w:pPr>
+        <w:pStyle w:val="Heading3"/>
+        <w:spacing w:after="80" w:before="200"/>
+      </w:pPr>
+      <w:r>
+        <w:rPr>
+          <w:rFonts w:ascii="Calibri" w:cs="Calibri" w:eastAsia="Calibri" w:hAnsi="Calibri"/>
+          <w:b/>
+          <w:bCs/>
+          <w:i w:val="false"/>
+          <w:iCs w:val="false"/>
+          <w:color w:val="000000"/>
+          <w:sz w:val="24"/>
+          <w:szCs w:val="24"/>
+        </w:rPr>
+        <w:t xml:space="preserve">If you get stuck</w:t>
       </w:r>
     </w:p>
     <w:p>
@@ -10511,7 +10707,53 @@
           <w:sz w:val="22"/>
           <w:szCs w:val="22"/>
         </w:rPr>
+        <w:t xml:space="preserve">Check you are using the email, not a phone number.</w:t>
+      </w:r>
+    </w:p>
+    <w:p>
+      <w:pPr>
+        <w:pStyle w:val="ListParagraph"/>
+        <w:numPr>
+          <w:ilvl w:val="0"/>
+          <w:numId w:val="2"/>
+        </w:numPr>
+        <w:spacing w:after="80" w:line="276"/>
+      </w:pPr>
+      <w:r>
+        <w:rPr>
+          <w:rFonts w:ascii="Calibri" w:cs="Calibri" w:eastAsia="Calibri" w:hAnsi="Calibri"/>
+          <w:b w:val="false"/>
+          <w:bCs w:val="false"/>
+          <w:i w:val="false"/>
+          <w:iCs w:val="false"/>
+          <w:color w:val="000000"/>
+          <w:sz w:val="22"/>
+          <w:szCs w:val="22"/>
+        </w:rPr>
         <w:t xml:space="preserve">Ask Super Admin to restore the account if it was locked.</w:t>
+      </w:r>
+    </w:p>
+    <w:p>
+      <w:pPr>
+        <w:pStyle w:val="ListParagraph"/>
+        <w:numPr>
+          <w:ilvl w:val="0"/>
+          <w:numId w:val="2"/>
+        </w:numPr>
+        <w:spacing w:after="80" w:line="276"/>
+      </w:pPr>
+      <w:r>
+        <w:rPr>
+          <w:rFonts w:ascii="Calibri" w:cs="Calibri" w:eastAsia="Calibri" w:hAnsi="Calibri"/>
+          <w:b w:val="false"/>
+          <w:bCs w:val="false"/>
+          <w:i w:val="false"/>
+          <w:iCs w:val="false"/>
+          <w:color w:val="000000"/>
+          <w:sz w:val="22"/>
+          <w:szCs w:val="22"/>
+        </w:rPr>
+        <w:t xml:space="preserve">Sign out from your name at the top. The screen goes blue, then Sign in. You should not see Home or a broken shop page in between.</w:t>
       </w:r>
     </w:p>
     <w:p>
@@ -15849,7 +16091,7 @@
           <w:sz w:val="22"/>
           <w:szCs w:val="22"/>
         </w:rPr>
-        <w:t xml:space="preserve">Suppliers is the list of people and companies you buy from. Each house has one name and one phone. Four boxes sit at the top: how many houses, what we bought, what we paid, and what we still owe. Click a box to see the houses that make that number. The list shows one summary row per house. Click IRIS, or any house, and the bills drop down with their values. Copies of the same name are folded into that one row. The system refuses a new copy, including extra spaces, capital letters, Ltd on the end, or a phone that already belongs to another house.</w:t>
+        <w:t xml:space="preserve">Suppliers is the list of people and companies you buy from. Each house has one name and one phone. Boxes sit at the top: how many houses, what we bought, what we paid, what we still owe, and what they owe us after send-backs. Click a box to see the houses that make that number. The list shows one summary row per house. Click IRIS, or any house, and the bills drop down with their values. Copies of the same name are folded into that one row. The system refuses a new copy, including extra spaces, capital letters, Ltd on the end, or a phone that already belongs to another house.</w:t>
       </w:r>
     </w:p>
     <w:p>
@@ -15887,7 +16129,7 @@
           <w:sz w:val="22"/>
           <w:szCs w:val="22"/>
         </w:rPr>
-        <w:t xml:space="preserve">You need one name for each source so money owed to them is clear. Two spellings of the same supplier split the bills and hide what you still owe. Showing every copy and every bill at once makes the page too long to read.</w:t>
+        <w:t xml:space="preserve">You need one name for each source so money owed to them, and money they owe you after phones go back, is clear. Two spellings of the same supplier split the bills and hide the true balance. Showing every copy and every bill at once makes the page too long to read.</w:t>
       </w:r>
     </w:p>
     <w:p>
@@ -15925,7 +16167,7 @@
           <w:sz w:val="22"/>
           <w:szCs w:val="22"/>
         </w:rPr>
-        <w:t xml:space="preserve">Iwo Road opens Suppliers and sees IRIS as one row, not a pile of lines. They click We still owe. Only IRIS stays. They click IRIS and the unpaid bill drops down with the naira. IDAL, which had been typed four times, sits as one house. Click IDAL and the copies and the paid bills are there.</w:t>
+        <w:t xml:space="preserve">Iwo Road opens Suppliers and sees IRIS as one row, not a pile of lines. They click We still owe. Only IRIS stays. They click IRIS and the unpaid bill drops down with the naira. After they send five faulty phones back, They owe us shows if the send-back was more than the unpaid bill. IDAL, which had been typed four times, sits as one house. Click IDAL and the copies and the paid bills are there.</w:t>
       </w:r>
     </w:p>
     <w:p>
@@ -16006,7 +16248,7 @@
           <w:sz w:val="22"/>
           <w:szCs w:val="22"/>
         </w:rPr>
-        <w:t xml:space="preserve">Read the four boxes at the top. Click We still owe. The list shows only houses with money still owed.</w:t>
+        <w:t xml:space="preserve">Read the boxes at the top. Click We still owe. The list shows only houses with money still owed.</w:t>
       </w:r>
     </w:p>
     <w:p>
@@ -16037,6 +16279,37 @@
           <w:sz w:val="22"/>
           <w:szCs w:val="22"/>
         </w:rPr>
+        <w:t xml:space="preserve">Click They owe us to see houses with a surplus after send-backs.</w:t>
+      </w:r>
+    </w:p>
+    <w:p>
+      <w:pPr>
+        <w:spacing w:after="80" w:line="276"/>
+      </w:pPr>
+      <w:r>
+        <w:rPr>
+          <w:rFonts w:ascii="Calibri" w:cs="Calibri" w:eastAsia="Calibri" w:hAnsi="Calibri"/>
+          <w:b/>
+          <w:bCs/>
+          <w:i w:val="false"/>
+          <w:iCs w:val="false"/>
+          <w:color w:val="000000"/>
+          <w:sz w:val="22"/>
+          <w:szCs w:val="22"/>
+        </w:rPr>
+        <w:t xml:space="preserve">4. </w:t>
+      </w:r>
+      <w:r>
+        <w:rPr>
+          <w:rFonts w:ascii="Calibri" w:cs="Calibri" w:eastAsia="Calibri" w:hAnsi="Calibri"/>
+          <w:b w:val="false"/>
+          <w:bCs w:val="false"/>
+          <w:i w:val="false"/>
+          <w:iCs w:val="false"/>
+          <w:color w:val="000000"/>
+          <w:sz w:val="22"/>
+          <w:szCs w:val="22"/>
+        </w:rPr>
         <w:t xml:space="preserve">Click Suppliers on the books to see every house again.</w:t>
       </w:r>
     </w:p>
@@ -16055,37 +16328,6 @@
           <w:sz w:val="22"/>
           <w:szCs w:val="22"/>
         </w:rPr>
-        <w:t xml:space="preserve">4. </w:t>
-      </w:r>
-      <w:r>
-        <w:rPr>
-          <w:rFonts w:ascii="Calibri" w:cs="Calibri" w:eastAsia="Calibri" w:hAnsi="Calibri"/>
-          <w:b w:val="false"/>
-          <w:bCs w:val="false"/>
-          <w:i w:val="false"/>
-          <w:iCs w:val="false"/>
-          <w:color w:val="000000"/>
-          <w:sz w:val="22"/>
-          <w:szCs w:val="22"/>
-        </w:rPr>
-        <w:t xml:space="preserve">Click a house name such as IRIS. The bills drop down. Each bill has bought, paid, still owed, and status.</w:t>
-      </w:r>
-    </w:p>
-    <w:p>
-      <w:pPr>
-        <w:spacing w:after="80" w:line="276"/>
-      </w:pPr>
-      <w:r>
-        <w:rPr>
-          <w:rFonts w:ascii="Calibri" w:cs="Calibri" w:eastAsia="Calibri" w:hAnsi="Calibri"/>
-          <w:b/>
-          <w:bCs/>
-          <w:i w:val="false"/>
-          <w:iCs w:val="false"/>
-          <w:color w:val="000000"/>
-          <w:sz w:val="22"/>
-          <w:szCs w:val="22"/>
-        </w:rPr>
         <w:t xml:space="preserve">5. </w:t>
       </w:r>
       <w:r>
@@ -16099,6 +16341,37 @@
           <w:sz w:val="22"/>
           <w:szCs w:val="22"/>
         </w:rPr>
+        <w:t xml:space="preserve">Click a house name such as IRIS. The bills drop down. Each bill has bought, paid, sent back, balance, and status.</w:t>
+      </w:r>
+    </w:p>
+    <w:p>
+      <w:pPr>
+        <w:spacing w:after="80" w:line="276"/>
+      </w:pPr>
+      <w:r>
+        <w:rPr>
+          <w:rFonts w:ascii="Calibri" w:cs="Calibri" w:eastAsia="Calibri" w:hAnsi="Calibri"/>
+          <w:b/>
+          <w:bCs/>
+          <w:i w:val="false"/>
+          <w:iCs w:val="false"/>
+          <w:color w:val="000000"/>
+          <w:sz w:val="22"/>
+          <w:szCs w:val="22"/>
+        </w:rPr>
+        <w:t xml:space="preserve">6. </w:t>
+      </w:r>
+      <w:r>
+        <w:rPr>
+          <w:rFonts w:ascii="Calibri" w:cs="Calibri" w:eastAsia="Calibri" w:hAnsi="Calibri"/>
+          <w:b w:val="false"/>
+          <w:bCs w:val="false"/>
+          <w:i w:val="false"/>
+          <w:iCs w:val="false"/>
+          <w:color w:val="000000"/>
+          <w:sz w:val="22"/>
+          <w:szCs w:val="22"/>
+        </w:rPr>
         <w:t xml:space="preserve">Open a bill number if you need the carton trail, or Open the full page for that house.</w:t>
       </w:r>
     </w:p>
@@ -16117,7 +16390,7 @@
           <w:sz w:val="22"/>
           <w:szCs w:val="22"/>
         </w:rPr>
-        <w:t xml:space="preserve">6. </w:t>
+        <w:t xml:space="preserve">7. </w:t>
       </w:r>
       <w:r>
         <w:rPr>
@@ -16148,7 +16421,7 @@
           <w:sz w:val="22"/>
           <w:szCs w:val="22"/>
         </w:rPr>
-        <w:t xml:space="preserve">7. </w:t>
+        <w:t xml:space="preserve">8. </w:t>
       </w:r>
       <w:r>
         <w:rPr>
@@ -16203,7 +16476,7 @@
           <w:sz w:val="22"/>
           <w:szCs w:val="22"/>
         </w:rPr>
-        <w:t xml:space="preserve">Each of the four boxes is clickable and shows the houses that make that number.</w:t>
+        <w:t xml:space="preserve">Each box is clickable and shows the houses that make that number.</w:t>
       </w:r>
     </w:p>
     <w:p>
@@ -16323,394 +16596,6 @@
     </w:p>
     <w:p>
       <w:pPr>
-        <w:pStyle w:val="Heading2"/>
-        <w:spacing w:after="120" w:before="280"/>
-      </w:pPr>
-      <w:r>
-        <w:rPr>
-          <w:rFonts w:ascii="Calibri" w:cs="Calibri" w:eastAsia="Calibri" w:hAnsi="Calibri"/>
-          <w:b/>
-          <w:bCs/>
-          <w:i w:val="false"/>
-          <w:iCs w:val="false"/>
-          <w:color w:val="000000"/>
-          <w:sz w:val="26"/>
-          <w:szCs w:val="26"/>
-        </w:rPr>
-        <w:t xml:space="preserve">10.10 Goods from supplier</w:t>
-      </w:r>
-    </w:p>
-    <w:p>
-      <w:pPr>
-        <w:pStyle w:val="Heading3"/>
-        <w:spacing w:after="80" w:before="200"/>
-      </w:pPr>
-      <w:r>
-        <w:rPr>
-          <w:rFonts w:ascii="Calibri" w:cs="Calibri" w:eastAsia="Calibri" w:hAnsi="Calibri"/>
-          <w:b/>
-          <w:bCs/>
-          <w:i w:val="false"/>
-          <w:iCs w:val="false"/>
-          <w:color w:val="000000"/>
-          <w:sz w:val="24"/>
-          <w:szCs w:val="24"/>
-        </w:rPr>
-        <w:t xml:space="preserve">What this page is</w:t>
-      </w:r>
-    </w:p>
-    <w:p>
-      <w:pPr>
-        <w:spacing w:after="160" w:before="0" w:line="276"/>
-        <w:jc w:val="left"/>
-      </w:pPr>
-      <w:r>
-        <w:rPr>
-          <w:rFonts w:ascii="Calibri" w:cs="Calibri" w:eastAsia="Calibri" w:hAnsi="Calibri"/>
-          <w:b w:val="false"/>
-          <w:bCs w:val="false"/>
-          <w:i w:val="false"/>
-          <w:iCs w:val="false"/>
-          <w:color w:val="000000"/>
-          <w:sz w:val="22"/>
-          <w:szCs w:val="22"/>
-        </w:rPr>
-        <w:t xml:space="preserve">This page documents expected cartons from named suppliers in other countries and cities. Tap a bill status chip (Received, Part received, Waiting, and so on) to cut the list. Each bill shows when it was booked or received in Lagos time. It is also the trail if a product goes missing. You can see how many were supplied, how many were scanned, how many were sold on invoices (including today before close), and how many the system still says are In shop. Coming is not In shop until the boxes are checked. You can also send a failed unit, including a phone a customer returned to us, back to that supplier. This is not Shop to shop, and it is not Neighbor shop fill.</w:t>
-      </w:r>
-    </w:p>
-    <w:p>
-      <w:pPr>
-        <w:pStyle w:val="Heading3"/>
-        <w:spacing w:after="80" w:before="200"/>
-      </w:pPr>
-      <w:r>
-        <w:rPr>
-          <w:rFonts w:ascii="Calibri" w:cs="Calibri" w:eastAsia="Calibri" w:hAnsi="Calibri"/>
-          <w:b/>
-          <w:bCs/>
-          <w:i w:val="false"/>
-          <w:iCs w:val="false"/>
-          <w:color w:val="000000"/>
-          <w:sz w:val="24"/>
-          <w:szCs w:val="24"/>
-        </w:rPr>
-        <w:t xml:space="preserve">Why it is here</w:t>
-      </w:r>
-    </w:p>
-    <w:p>
-      <w:pPr>
-        <w:spacing w:after="160" w:before="0" w:line="276"/>
-        <w:jc w:val="left"/>
-      </w:pPr>
-      <w:r>
-        <w:rPr>
-          <w:rFonts w:ascii="Calibri" w:cs="Calibri" w:eastAsia="Calibri" w:hAnsi="Calibri"/>
-          <w:b w:val="false"/>
-          <w:bCs w:val="false"/>
-          <w:i w:val="false"/>
-          <w:iCs w:val="false"/>
-          <w:color w:val="000000"/>
-          <w:sz w:val="22"/>
-          <w:szCs w:val="22"/>
-        </w:rPr>
-        <w:t xml:space="preserve">If a phone leaves without a sale, the supplier bill is the first count. Expected minus recorded shows units that never got a number. Still in shop versus the shelf shows units that may have been sold off the books. Sold today helps you check before Close the day.</w:t>
-      </w:r>
-    </w:p>
-    <w:p>
-      <w:pPr>
-        <w:pStyle w:val="Heading3"/>
-        <w:spacing w:after="80" w:before="200"/>
-      </w:pPr>
-      <w:r>
-        <w:rPr>
-          <w:rFonts w:ascii="Calibri" w:cs="Calibri" w:eastAsia="Calibri" w:hAnsi="Calibri"/>
-          <w:b/>
-          <w:bCs/>
-          <w:i w:val="false"/>
-          <w:iCs w:val="false"/>
-          <w:color w:val="000000"/>
-          <w:sz w:val="24"/>
-          <w:szCs w:val="24"/>
-        </w:rPr>
-        <w:t xml:space="preserve">A real shop story</w:t>
-      </w:r>
-    </w:p>
-    <w:p>
-      <w:pPr>
-        <w:spacing w:after="160" w:before="0" w:line="276"/>
-        <w:jc w:val="left"/>
-      </w:pPr>
-      <w:r>
-        <w:rPr>
-          <w:rFonts w:ascii="Calibri" w:cs="Calibri" w:eastAsia="Calibri" w:hAnsi="Calibri"/>
-          <w:b w:val="false"/>
-          <w:bCs w:val="false"/>
-          <w:i w:val="false"/>
-          <w:iCs w:val="false"/>
-          <w:color w:val="000000"/>
-          <w:sz w:val="22"/>
-          <w:szCs w:val="22"/>
-        </w:rPr>
-        <w:t xml:space="preserve">A carton of twenty Tecno units is booked from Dubai to Iwo Road. Eighteen IMEIs are scanned. Two never appear. Later the shelf has sixteen In shop phones, but the bill still says eighteen In shop and two sold on invoices. The manager searches one missing IMEI, opens the bill, and sees it is still In shop on the system with no invoice. That is a missing product, not a typing job. They count stock before close.</w:t>
-      </w:r>
-    </w:p>
-    <w:p>
-      <w:pPr>
-        <w:pStyle w:val="Heading3"/>
-        <w:spacing w:after="80" w:before="200"/>
-      </w:pPr>
-      <w:r>
-        <w:rPr>
-          <w:rFonts w:ascii="Calibri" w:cs="Calibri" w:eastAsia="Calibri" w:hAnsi="Calibri"/>
-          <w:b/>
-          <w:bCs/>
-          <w:i w:val="false"/>
-          <w:iCs w:val="false"/>
-          <w:color w:val="000000"/>
-          <w:sz w:val="24"/>
-          <w:szCs w:val="24"/>
-        </w:rPr>
-        <w:t xml:space="preserve">How to try it</w:t>
-      </w:r>
-    </w:p>
-    <w:p>
-      <w:pPr>
-        <w:spacing w:after="80" w:line="276"/>
-      </w:pPr>
-      <w:r>
-        <w:rPr>
-          <w:rFonts w:ascii="Calibri" w:cs="Calibri" w:eastAsia="Calibri" w:hAnsi="Calibri"/>
-          <w:b/>
-          <w:bCs/>
-          <w:i w:val="false"/>
-          <w:iCs w:val="false"/>
-          <w:color w:val="000000"/>
-          <w:sz w:val="22"/>
-          <w:szCs w:val="22"/>
-        </w:rPr>
-        <w:t xml:space="preserve">1. </w:t>
-      </w:r>
-      <w:r>
-        <w:rPr>
-          <w:rFonts w:ascii="Calibri" w:cs="Calibri" w:eastAsia="Calibri" w:hAnsi="Calibri"/>
-          <w:b w:val="false"/>
-          <w:bCs w:val="false"/>
-          <w:i w:val="false"/>
-          <w:iCs w:val="false"/>
-          <w:color w:val="000000"/>
-          <w:sz w:val="22"/>
-          <w:szCs w:val="22"/>
-        </w:rPr>
-        <w:t xml:space="preserve">Click Goods from supplier.</w:t>
-      </w:r>
-    </w:p>
-    <w:p>
-      <w:pPr>
-        <w:spacing w:after="80" w:line="276"/>
-      </w:pPr>
-      <w:r>
-        <w:rPr>
-          <w:rFonts w:ascii="Calibri" w:cs="Calibri" w:eastAsia="Calibri" w:hAnsi="Calibri"/>
-          <w:b/>
-          <w:bCs/>
-          <w:i w:val="false"/>
-          <w:iCs w:val="false"/>
-          <w:color w:val="000000"/>
-          <w:sz w:val="22"/>
-          <w:szCs w:val="22"/>
-        </w:rPr>
-        <w:t xml:space="preserve">2. </w:t>
-      </w:r>
-      <w:r>
-        <w:rPr>
-          <w:rFonts w:ascii="Calibri" w:cs="Calibri" w:eastAsia="Calibri" w:hAnsi="Calibri"/>
-          <w:b w:val="false"/>
-          <w:bCs w:val="false"/>
-          <w:i w:val="false"/>
-          <w:iCs w:val="false"/>
-          <w:color w:val="000000"/>
-          <w:sz w:val="22"/>
-          <w:szCs w:val="22"/>
-        </w:rPr>
-        <w:t xml:space="preserve">Add expected goods: supplier, shop, item, quantity, cost, country or city, and due date if you know it.</w:t>
-      </w:r>
-    </w:p>
-    <w:p>
-      <w:pPr>
-        <w:spacing w:after="80" w:line="276"/>
-      </w:pPr>
-      <w:r>
-        <w:rPr>
-          <w:rFonts w:ascii="Calibri" w:cs="Calibri" w:eastAsia="Calibri" w:hAnsi="Calibri"/>
-          <w:b/>
-          <w:bCs/>
-          <w:i w:val="false"/>
-          <w:iCs w:val="false"/>
-          <w:color w:val="000000"/>
-          <w:sz w:val="22"/>
-          <w:szCs w:val="22"/>
-        </w:rPr>
-        <w:t xml:space="preserve">3. </w:t>
-      </w:r>
-      <w:r>
-        <w:rPr>
-          <w:rFonts w:ascii="Calibri" w:cs="Calibri" w:eastAsia="Calibri" w:hAnsi="Calibri"/>
-          <w:b w:val="false"/>
-          <w:bCs w:val="false"/>
-          <w:i w:val="false"/>
-          <w:iCs w:val="false"/>
-          <w:color w:val="000000"/>
-          <w:sz w:val="22"/>
-          <w:szCs w:val="22"/>
-        </w:rPr>
-        <w:t xml:space="preserve">Open the bill. Book IMEIs as Coming if the carton is still on the road, or confirm they are in this shop if the boxes are on the counter.</w:t>
-      </w:r>
-    </w:p>
-    <w:p>
-      <w:pPr>
-        <w:spacing w:after="80" w:line="276"/>
-      </w:pPr>
-      <w:r>
-        <w:rPr>
-          <w:rFonts w:ascii="Calibri" w:cs="Calibri" w:eastAsia="Calibri" w:hAnsi="Calibri"/>
-          <w:b/>
-          <w:bCs/>
-          <w:i w:val="false"/>
-          <w:iCs w:val="false"/>
-          <w:color w:val="000000"/>
-          <w:sz w:val="22"/>
-          <w:szCs w:val="22"/>
-        </w:rPr>
-        <w:t xml:space="preserve">4. </w:t>
-      </w:r>
-      <w:r>
-        <w:rPr>
-          <w:rFonts w:ascii="Calibri" w:cs="Calibri" w:eastAsia="Calibri" w:hAnsi="Calibri"/>
-          <w:b w:val="false"/>
-          <w:bCs w:val="false"/>
-          <w:i w:val="false"/>
-          <w:iCs w:val="false"/>
-          <w:color w:val="000000"/>
-          <w:sz w:val="22"/>
-          <w:szCs w:val="22"/>
-        </w:rPr>
-        <w:t xml:space="preserve">Search by IMEI, bill number, supplier, or product when you need that carton trail.</w:t>
-      </w:r>
-    </w:p>
-    <w:p>
-      <w:pPr>
-        <w:spacing w:after="80" w:line="276"/>
-      </w:pPr>
-      <w:r>
-        <w:rPr>
-          <w:rFonts w:ascii="Calibri" w:cs="Calibri" w:eastAsia="Calibri" w:hAnsi="Calibri"/>
-          <w:b/>
-          <w:bCs/>
-          <w:i w:val="false"/>
-          <w:iCs w:val="false"/>
-          <w:color w:val="000000"/>
-          <w:sz w:val="22"/>
-          <w:szCs w:val="22"/>
-        </w:rPr>
-        <w:t xml:space="preserve">5. </w:t>
-      </w:r>
-      <w:r>
-        <w:rPr>
-          <w:rFonts w:ascii="Calibri" w:cs="Calibri" w:eastAsia="Calibri" w:hAnsi="Calibri"/>
-          <w:b w:val="false"/>
-          <w:bCs w:val="false"/>
-          <w:i w:val="false"/>
-          <w:iCs w:val="false"/>
-          <w:color w:val="000000"/>
-          <w:sz w:val="22"/>
-          <w:szCs w:val="22"/>
-        </w:rPr>
-        <w:t xml:space="preserve">Read Expected, Recorded, Sold on the system, Sold today, and Still in shop. If the shelf is short, count stock.</w:t>
-      </w:r>
-    </w:p>
-    <w:p>
-      <w:pPr>
-        <w:spacing w:after="80" w:line="276"/>
-      </w:pPr>
-      <w:r>
-        <w:rPr>
-          <w:rFonts w:ascii="Calibri" w:cs="Calibri" w:eastAsia="Calibri" w:hAnsi="Calibri"/>
-          <w:b/>
-          <w:bCs/>
-          <w:i w:val="false"/>
-          <w:iCs w:val="false"/>
-          <w:color w:val="000000"/>
-          <w:sz w:val="22"/>
-          <w:szCs w:val="22"/>
-        </w:rPr>
-        <w:t xml:space="preserve">6. </w:t>
-      </w:r>
-      <w:r>
-        <w:rPr>
-          <w:rFonts w:ascii="Calibri" w:cs="Calibri" w:eastAsia="Calibri" w:hAnsi="Calibri"/>
-          <w:b w:val="false"/>
-          <w:bCs w:val="false"/>
-          <w:i w:val="false"/>
-          <w:iCs w:val="false"/>
-          <w:color w:val="000000"/>
-          <w:sz w:val="22"/>
-          <w:szCs w:val="22"/>
-        </w:rPr>
-        <w:t xml:space="preserve">Pay the supplier as a separate money step.</w:t>
-      </w:r>
-    </w:p>
-    <w:p>
-      <w:pPr>
-        <w:spacing w:after="80" w:line="276"/>
-      </w:pPr>
-      <w:r>
-        <w:rPr>
-          <w:rFonts w:ascii="Calibri" w:cs="Calibri" w:eastAsia="Calibri" w:hAnsi="Calibri"/>
-          <w:b/>
-          <w:bCs/>
-          <w:i w:val="false"/>
-          <w:iCs w:val="false"/>
-          <w:color w:val="000000"/>
-          <w:sz w:val="22"/>
-          <w:szCs w:val="22"/>
-        </w:rPr>
-        <w:t xml:space="preserve">7. </w:t>
-      </w:r>
-      <w:r>
-        <w:rPr>
-          <w:rFonts w:ascii="Calibri" w:cs="Calibri" w:eastAsia="Calibri" w:hAnsi="Calibri"/>
-          <w:b w:val="false"/>
-          <w:bCs w:val="false"/>
-          <w:i w:val="false"/>
-          <w:iCs w:val="false"/>
-          <w:color w:val="000000"/>
-          <w:sz w:val="22"/>
-          <w:szCs w:val="22"/>
-        </w:rPr>
-        <w:t xml:space="preserve">If a unit must go back, scan those IMEIs on Send back to supplier, or pick Send back to the supplier on Returns.</w:t>
-      </w:r>
-    </w:p>
-    <w:p>
-      <w:pPr>
-        <w:pStyle w:val="Heading3"/>
-        <w:spacing w:after="80" w:before="200"/>
-      </w:pPr>
-      <w:r>
-        <w:rPr>
-          <w:rFonts w:ascii="Calibri" w:cs="Calibri" w:eastAsia="Calibri" w:hAnsi="Calibri"/>
-          <w:b/>
-          <w:bCs/>
-          <w:i w:val="false"/>
-          <w:iCs w:val="false"/>
-          <w:color w:val="000000"/>
-          <w:sz w:val="24"/>
-          <w:szCs w:val="24"/>
-        </w:rPr>
-        <w:t xml:space="preserve">What you should see</w:t>
-      </w:r>
-    </w:p>
-    <w:p>
-      <w:pPr>
         <w:pStyle w:val="ListParagraph"/>
         <w:numPr>
           <w:ilvl w:val="0"/>
@@ -16729,7 +16614,395 @@
           <w:sz w:val="22"/>
           <w:szCs w:val="22"/>
         </w:rPr>
-        <w:t xml:space="preserve">Expected, recorded, sold, sold today, and still in shop are separate numbers.</w:t>
+        <w:t xml:space="preserve">They owe us is the surplus after phones were sent back, not a new bill.</w:t>
+      </w:r>
+    </w:p>
+    <w:p>
+      <w:pPr>
+        <w:pStyle w:val="Heading2"/>
+        <w:spacing w:after="120" w:before="280"/>
+      </w:pPr>
+      <w:r>
+        <w:rPr>
+          <w:rFonts w:ascii="Calibri" w:cs="Calibri" w:eastAsia="Calibri" w:hAnsi="Calibri"/>
+          <w:b/>
+          <w:bCs/>
+          <w:i w:val="false"/>
+          <w:iCs w:val="false"/>
+          <w:color w:val="000000"/>
+          <w:sz w:val="26"/>
+          <w:szCs w:val="26"/>
+        </w:rPr>
+        <w:t xml:space="preserve">10.10 Goods from supplier</w:t>
+      </w:r>
+    </w:p>
+    <w:p>
+      <w:pPr>
+        <w:pStyle w:val="Heading3"/>
+        <w:spacing w:after="80" w:before="200"/>
+      </w:pPr>
+      <w:r>
+        <w:rPr>
+          <w:rFonts w:ascii="Calibri" w:cs="Calibri" w:eastAsia="Calibri" w:hAnsi="Calibri"/>
+          <w:b/>
+          <w:bCs/>
+          <w:i w:val="false"/>
+          <w:iCs w:val="false"/>
+          <w:color w:val="000000"/>
+          <w:sz w:val="24"/>
+          <w:szCs w:val="24"/>
+        </w:rPr>
+        <w:t xml:space="preserve">What this page is</w:t>
+      </w:r>
+    </w:p>
+    <w:p>
+      <w:pPr>
+        <w:spacing w:after="160" w:before="0" w:line="276"/>
+        <w:jc w:val="left"/>
+      </w:pPr>
+      <w:r>
+        <w:rPr>
+          <w:rFonts w:ascii="Calibri" w:cs="Calibri" w:eastAsia="Calibri" w:hAnsi="Calibri"/>
+          <w:b w:val="false"/>
+          <w:bCs w:val="false"/>
+          <w:i w:val="false"/>
+          <w:iCs w:val="false"/>
+          <w:color w:val="000000"/>
+          <w:sz w:val="22"/>
+          <w:szCs w:val="22"/>
+        </w:rPr>
+        <w:t xml:space="preserve">This page documents expected cartons from named suppliers in other countries and cities. Tap a bill status chip (Received, Part received, Waiting, and so on) to cut the list. Each bill shows when it was booked or received in Lagos time. It is also the trail if a product goes missing. You can see how many were supplied, how many were scanned, how many were sold on invoices (including today before close), and how many the system still says are In shop. Coming is not In shop until the boxes are checked. Send back to supplier is scan only. You do not pick the house. Scan every IMEI going back in that one send-back. This is not Shop to shop, and it is not Neighbor shop fill.</w:t>
+      </w:r>
+    </w:p>
+    <w:p>
+      <w:pPr>
+        <w:pStyle w:val="Heading3"/>
+        <w:spacing w:after="80" w:before="200"/>
+      </w:pPr>
+      <w:r>
+        <w:rPr>
+          <w:rFonts w:ascii="Calibri" w:cs="Calibri" w:eastAsia="Calibri" w:hAnsi="Calibri"/>
+          <w:b/>
+          <w:bCs/>
+          <w:i w:val="false"/>
+          <w:iCs w:val="false"/>
+          <w:color w:val="000000"/>
+          <w:sz w:val="24"/>
+          <w:szCs w:val="24"/>
+        </w:rPr>
+        <w:t xml:space="preserve">Why it is here</w:t>
+      </w:r>
+    </w:p>
+    <w:p>
+      <w:pPr>
+        <w:spacing w:after="160" w:before="0" w:line="276"/>
+        <w:jc w:val="left"/>
+      </w:pPr>
+      <w:r>
+        <w:rPr>
+          <w:rFonts w:ascii="Calibri" w:cs="Calibri" w:eastAsia="Calibri" w:hAnsi="Calibri"/>
+          <w:b w:val="false"/>
+          <w:bCs w:val="false"/>
+          <w:i w:val="false"/>
+          <w:iCs w:val="false"/>
+          <w:color w:val="000000"/>
+          <w:sz w:val="22"/>
+          <w:szCs w:val="22"/>
+        </w:rPr>
+        <w:t xml:space="preserve">If a phone leaves without a sale, the supplier bill is the first count. Expected minus recorded shows units that never got a number. Still in shop versus the shelf shows units that may have been sold off the books. Sold today helps you check before Close the day. A send-back must name the house from the IMEI so the payable, or the surplus they owe us, stays honest.</w:t>
+      </w:r>
+    </w:p>
+    <w:p>
+      <w:pPr>
+        <w:pStyle w:val="Heading3"/>
+        <w:spacing w:after="80" w:before="200"/>
+      </w:pPr>
+      <w:r>
+        <w:rPr>
+          <w:rFonts w:ascii="Calibri" w:cs="Calibri" w:eastAsia="Calibri" w:hAnsi="Calibri"/>
+          <w:b/>
+          <w:bCs/>
+          <w:i w:val="false"/>
+          <w:iCs w:val="false"/>
+          <w:color w:val="000000"/>
+          <w:sz w:val="24"/>
+          <w:szCs w:val="24"/>
+        </w:rPr>
+        <w:t xml:space="preserve">A real shop story</w:t>
+      </w:r>
+    </w:p>
+    <w:p>
+      <w:pPr>
+        <w:spacing w:after="160" w:before="0" w:line="276"/>
+        <w:jc w:val="left"/>
+      </w:pPr>
+      <w:r>
+        <w:rPr>
+          <w:rFonts w:ascii="Calibri" w:cs="Calibri" w:eastAsia="Calibri" w:hAnsi="Calibri"/>
+          <w:b w:val="false"/>
+          <w:bCs w:val="false"/>
+          <w:i w:val="false"/>
+          <w:iCs w:val="false"/>
+          <w:color w:val="000000"/>
+          <w:sz w:val="22"/>
+          <w:szCs w:val="22"/>
+        </w:rPr>
+        <w:t xml:space="preserve">Challenge has twelve Redmi phones from IRIS that will not power on. The cashier opens Goods from supplier, scans the first IMEI, and IRIS, the phone name, and the cost appear. They scan the other eleven. They do not pick a supplier. They send the twelve back. What Abu Twins still owed IRIS drops by the cost of those twelve. If the bill was already paid, They owe us shows the surplus so the CEO can see it without calling accounts.</w:t>
+      </w:r>
+    </w:p>
+    <w:p>
+      <w:pPr>
+        <w:pStyle w:val="Heading3"/>
+        <w:spacing w:after="80" w:before="200"/>
+      </w:pPr>
+      <w:r>
+        <w:rPr>
+          <w:rFonts w:ascii="Calibri" w:cs="Calibri" w:eastAsia="Calibri" w:hAnsi="Calibri"/>
+          <w:b/>
+          <w:bCs/>
+          <w:i w:val="false"/>
+          <w:iCs w:val="false"/>
+          <w:color w:val="000000"/>
+          <w:sz w:val="24"/>
+          <w:szCs w:val="24"/>
+        </w:rPr>
+        <w:t xml:space="preserve">How to try it</w:t>
+      </w:r>
+    </w:p>
+    <w:p>
+      <w:pPr>
+        <w:spacing w:after="80" w:line="276"/>
+      </w:pPr>
+      <w:r>
+        <w:rPr>
+          <w:rFonts w:ascii="Calibri" w:cs="Calibri" w:eastAsia="Calibri" w:hAnsi="Calibri"/>
+          <w:b/>
+          <w:bCs/>
+          <w:i w:val="false"/>
+          <w:iCs w:val="false"/>
+          <w:color w:val="000000"/>
+          <w:sz w:val="22"/>
+          <w:szCs w:val="22"/>
+        </w:rPr>
+        <w:t xml:space="preserve">1. </w:t>
+      </w:r>
+      <w:r>
+        <w:rPr>
+          <w:rFonts w:ascii="Calibri" w:cs="Calibri" w:eastAsia="Calibri" w:hAnsi="Calibri"/>
+          <w:b w:val="false"/>
+          <w:bCs w:val="false"/>
+          <w:i w:val="false"/>
+          <w:iCs w:val="false"/>
+          <w:color w:val="000000"/>
+          <w:sz w:val="22"/>
+          <w:szCs w:val="22"/>
+        </w:rPr>
+        <w:t xml:space="preserve">Click Goods from supplier.</w:t>
+      </w:r>
+    </w:p>
+    <w:p>
+      <w:pPr>
+        <w:spacing w:after="80" w:line="276"/>
+      </w:pPr>
+      <w:r>
+        <w:rPr>
+          <w:rFonts w:ascii="Calibri" w:cs="Calibri" w:eastAsia="Calibri" w:hAnsi="Calibri"/>
+          <w:b/>
+          <w:bCs/>
+          <w:i w:val="false"/>
+          <w:iCs w:val="false"/>
+          <w:color w:val="000000"/>
+          <w:sz w:val="22"/>
+          <w:szCs w:val="22"/>
+        </w:rPr>
+        <w:t xml:space="preserve">2. </w:t>
+      </w:r>
+      <w:r>
+        <w:rPr>
+          <w:rFonts w:ascii="Calibri" w:cs="Calibri" w:eastAsia="Calibri" w:hAnsi="Calibri"/>
+          <w:b w:val="false"/>
+          <w:bCs w:val="false"/>
+          <w:i w:val="false"/>
+          <w:iCs w:val="false"/>
+          <w:color w:val="000000"/>
+          <w:sz w:val="22"/>
+          <w:szCs w:val="22"/>
+        </w:rPr>
+        <w:t xml:space="preserve">Add expected goods: supplier, shop, item, quantity, cost, country or city, and due date if you know it.</w:t>
+      </w:r>
+    </w:p>
+    <w:p>
+      <w:pPr>
+        <w:spacing w:after="80" w:line="276"/>
+      </w:pPr>
+      <w:r>
+        <w:rPr>
+          <w:rFonts w:ascii="Calibri" w:cs="Calibri" w:eastAsia="Calibri" w:hAnsi="Calibri"/>
+          <w:b/>
+          <w:bCs/>
+          <w:i w:val="false"/>
+          <w:iCs w:val="false"/>
+          <w:color w:val="000000"/>
+          <w:sz w:val="22"/>
+          <w:szCs w:val="22"/>
+        </w:rPr>
+        <w:t xml:space="preserve">3. </w:t>
+      </w:r>
+      <w:r>
+        <w:rPr>
+          <w:rFonts w:ascii="Calibri" w:cs="Calibri" w:eastAsia="Calibri" w:hAnsi="Calibri"/>
+          <w:b w:val="false"/>
+          <w:bCs w:val="false"/>
+          <w:i w:val="false"/>
+          <w:iCs w:val="false"/>
+          <w:color w:val="000000"/>
+          <w:sz w:val="22"/>
+          <w:szCs w:val="22"/>
+        </w:rPr>
+        <w:t xml:space="preserve">Open the bill. Book IMEIs as Coming if the carton is still on the road, or confirm they are in this shop if the boxes are on the counter.</w:t>
+      </w:r>
+    </w:p>
+    <w:p>
+      <w:pPr>
+        <w:spacing w:after="80" w:line="276"/>
+      </w:pPr>
+      <w:r>
+        <w:rPr>
+          <w:rFonts w:ascii="Calibri" w:cs="Calibri" w:eastAsia="Calibri" w:hAnsi="Calibri"/>
+          <w:b/>
+          <w:bCs/>
+          <w:i w:val="false"/>
+          <w:iCs w:val="false"/>
+          <w:color w:val="000000"/>
+          <w:sz w:val="22"/>
+          <w:szCs w:val="22"/>
+        </w:rPr>
+        <w:t xml:space="preserve">4. </w:t>
+      </w:r>
+      <w:r>
+        <w:rPr>
+          <w:rFonts w:ascii="Calibri" w:cs="Calibri" w:eastAsia="Calibri" w:hAnsi="Calibri"/>
+          <w:b w:val="false"/>
+          <w:bCs w:val="false"/>
+          <w:i w:val="false"/>
+          <w:iCs w:val="false"/>
+          <w:color w:val="000000"/>
+          <w:sz w:val="22"/>
+          <w:szCs w:val="22"/>
+        </w:rPr>
+        <w:t xml:space="preserve">Search by IMEI, bill number, supplier, or product when you need that carton trail.</w:t>
+      </w:r>
+    </w:p>
+    <w:p>
+      <w:pPr>
+        <w:spacing w:after="80" w:line="276"/>
+      </w:pPr>
+      <w:r>
+        <w:rPr>
+          <w:rFonts w:ascii="Calibri" w:cs="Calibri" w:eastAsia="Calibri" w:hAnsi="Calibri"/>
+          <w:b/>
+          <w:bCs/>
+          <w:i w:val="false"/>
+          <w:iCs w:val="false"/>
+          <w:color w:val="000000"/>
+          <w:sz w:val="22"/>
+          <w:szCs w:val="22"/>
+        </w:rPr>
+        <w:t xml:space="preserve">5. </w:t>
+      </w:r>
+      <w:r>
+        <w:rPr>
+          <w:rFonts w:ascii="Calibri" w:cs="Calibri" w:eastAsia="Calibri" w:hAnsi="Calibri"/>
+          <w:b w:val="false"/>
+          <w:bCs w:val="false"/>
+          <w:i w:val="false"/>
+          <w:iCs w:val="false"/>
+          <w:color w:val="000000"/>
+          <w:sz w:val="22"/>
+          <w:szCs w:val="22"/>
+        </w:rPr>
+        <w:t xml:space="preserve">Read Expected, Recorded, Sold on the system, Sold today, and Still in shop. If the shelf is short, count stock.</w:t>
+      </w:r>
+    </w:p>
+    <w:p>
+      <w:pPr>
+        <w:spacing w:after="80" w:line="276"/>
+      </w:pPr>
+      <w:r>
+        <w:rPr>
+          <w:rFonts w:ascii="Calibri" w:cs="Calibri" w:eastAsia="Calibri" w:hAnsi="Calibri"/>
+          <w:b/>
+          <w:bCs/>
+          <w:i w:val="false"/>
+          <w:iCs w:val="false"/>
+          <w:color w:val="000000"/>
+          <w:sz w:val="22"/>
+          <w:szCs w:val="22"/>
+        </w:rPr>
+        <w:t xml:space="preserve">6. </w:t>
+      </w:r>
+      <w:r>
+        <w:rPr>
+          <w:rFonts w:ascii="Calibri" w:cs="Calibri" w:eastAsia="Calibri" w:hAnsi="Calibri"/>
+          <w:b w:val="false"/>
+          <w:bCs w:val="false"/>
+          <w:i w:val="false"/>
+          <w:iCs w:val="false"/>
+          <w:color w:val="000000"/>
+          <w:sz w:val="22"/>
+          <w:szCs w:val="22"/>
+        </w:rPr>
+        <w:t xml:space="preserve">Pay the supplier as a separate money step.</w:t>
+      </w:r>
+    </w:p>
+    <w:p>
+      <w:pPr>
+        <w:spacing w:after="80" w:line="276"/>
+      </w:pPr>
+      <w:r>
+        <w:rPr>
+          <w:rFonts w:ascii="Calibri" w:cs="Calibri" w:eastAsia="Calibri" w:hAnsi="Calibri"/>
+          <w:b/>
+          <w:bCs/>
+          <w:i w:val="false"/>
+          <w:iCs w:val="false"/>
+          <w:color w:val="000000"/>
+          <w:sz w:val="22"/>
+          <w:szCs w:val="22"/>
+        </w:rPr>
+        <w:t xml:space="preserve">7. </w:t>
+      </w:r>
+      <w:r>
+        <w:rPr>
+          <w:rFonts w:ascii="Calibri" w:cs="Calibri" w:eastAsia="Calibri" w:hAnsi="Calibri"/>
+          <w:b w:val="false"/>
+          <w:bCs w:val="false"/>
+          <w:i w:val="false"/>
+          <w:iCs w:val="false"/>
+          <w:color w:val="000000"/>
+          <w:sz w:val="22"/>
+          <w:szCs w:val="22"/>
+        </w:rPr>
+        <w:t xml:space="preserve">If units must go back, open Send back to supplier. Scan the first IMEI. Read the phone name, the house, and the cost. Scan the next phones for the same house, then send them back.</w:t>
+      </w:r>
+    </w:p>
+    <w:p>
+      <w:pPr>
+        <w:pStyle w:val="Heading3"/>
+        <w:spacing w:after="80" w:before="200"/>
+      </w:pPr>
+      <w:r>
+        <w:rPr>
+          <w:rFonts w:ascii="Calibri" w:cs="Calibri" w:eastAsia="Calibri" w:hAnsi="Calibri"/>
+          <w:b/>
+          <w:bCs/>
+          <w:i w:val="false"/>
+          <w:iCs w:val="false"/>
+          <w:color w:val="000000"/>
+          <w:sz w:val="24"/>
+          <w:szCs w:val="24"/>
+        </w:rPr>
+        <w:t xml:space="preserve">What you should see</w:t>
       </w:r>
     </w:p>
     <w:p>
@@ -16752,7 +17025,7 @@
           <w:sz w:val="22"/>
           <w:szCs w:val="22"/>
         </w:rPr>
-        <w:t xml:space="preserve">Never scanned versus the bill is expected minus recorded.</w:t>
+        <w:t xml:space="preserve">Expected, recorded, sold, sold today, and still in shop are separate numbers.</w:t>
       </w:r>
     </w:p>
     <w:p>
@@ -16775,7 +17048,7 @@
           <w:sz w:val="22"/>
           <w:szCs w:val="22"/>
         </w:rPr>
-        <w:t xml:space="preserve">Each IMEI on the bill shows its status, shop, and invoice if it was sold.</w:t>
+        <w:t xml:space="preserve">Never scanned versus the bill is expected minus recorded.</w:t>
       </w:r>
     </w:p>
     <w:p>
@@ -16798,7 +17071,7 @@
           <w:sz w:val="22"/>
           <w:szCs w:val="22"/>
         </w:rPr>
-        <w:t xml:space="preserve">The origin country or city is visible on the bill.</w:t>
+        <w:t xml:space="preserve">Each IMEI on the bill shows its status, shop, and invoice if it was sold.</w:t>
       </w:r>
     </w:p>
     <w:p>
@@ -16821,7 +17094,7 @@
           <w:sz w:val="22"/>
           <w:szCs w:val="22"/>
         </w:rPr>
-        <w:t xml:space="preserve">Coming IMEIs cannot be sold on Sell now.</w:t>
+        <w:t xml:space="preserve">The origin country or city is visible on the bill.</w:t>
       </w:r>
     </w:p>
     <w:p>
@@ -16844,7 +17117,122 @@
           <w:sz w:val="22"/>
           <w:szCs w:val="22"/>
         </w:rPr>
+        <w:t xml:space="preserve">Coming IMEIs cannot be sold on Sell now.</w:t>
+      </w:r>
+    </w:p>
+    <w:p>
+      <w:pPr>
+        <w:pStyle w:val="ListParagraph"/>
+        <w:numPr>
+          <w:ilvl w:val="0"/>
+          <w:numId w:val="2"/>
+        </w:numPr>
+        <w:spacing w:after="80" w:line="276"/>
+      </w:pPr>
+      <w:r>
+        <w:rPr>
+          <w:rFonts w:ascii="Calibri" w:cs="Calibri" w:eastAsia="Calibri" w:hAnsi="Calibri"/>
+          <w:b w:val="false"/>
+          <w:bCs w:val="false"/>
+          <w:i w:val="false"/>
+          <w:iCs w:val="false"/>
+          <w:color w:val="000000"/>
+          <w:sz w:val="22"/>
+          <w:szCs w:val="22"/>
+        </w:rPr>
         <w:t xml:space="preserve">A unit sent back shows Sent back to supplier. It is not Shop to shop.</w:t>
+      </w:r>
+    </w:p>
+    <w:p>
+      <w:pPr>
+        <w:pStyle w:val="ListParagraph"/>
+        <w:numPr>
+          <w:ilvl w:val="0"/>
+          <w:numId w:val="2"/>
+        </w:numPr>
+        <w:spacing w:after="80" w:line="276"/>
+      </w:pPr>
+      <w:r>
+        <w:rPr>
+          <w:rFonts w:ascii="Calibri" w:cs="Calibri" w:eastAsia="Calibri" w:hAnsi="Calibri"/>
+          <w:b w:val="false"/>
+          <w:bCs w:val="false"/>
+          <w:i w:val="false"/>
+          <w:iCs w:val="false"/>
+          <w:color w:val="000000"/>
+          <w:sz w:val="22"/>
+          <w:szCs w:val="22"/>
+        </w:rPr>
+        <w:t xml:space="preserve">There is no supplier picker on Send back to supplier. The IMEI names the house.</w:t>
+      </w:r>
+    </w:p>
+    <w:p>
+      <w:pPr>
+        <w:pStyle w:val="ListParagraph"/>
+        <w:numPr>
+          <w:ilvl w:val="0"/>
+          <w:numId w:val="2"/>
+        </w:numPr>
+        <w:spacing w:after="80" w:line="276"/>
+      </w:pPr>
+      <w:r>
+        <w:rPr>
+          <w:rFonts w:ascii="Calibri" w:cs="Calibri" w:eastAsia="Calibri" w:hAnsi="Calibri"/>
+          <w:b w:val="false"/>
+          <w:bCs w:val="false"/>
+          <w:i w:val="false"/>
+          <w:iCs w:val="false"/>
+          <w:color w:val="000000"/>
+          <w:sz w:val="22"/>
+          <w:szCs w:val="22"/>
+        </w:rPr>
+        <w:t xml:space="preserve">You can scan many IMEIs in one send-back, as long as they belong to one house.</w:t>
+      </w:r>
+    </w:p>
+    <w:p>
+      <w:pPr>
+        <w:pStyle w:val="ListParagraph"/>
+        <w:numPr>
+          <w:ilvl w:val="0"/>
+          <w:numId w:val="2"/>
+        </w:numPr>
+        <w:spacing w:after="80" w:line="276"/>
+      </w:pPr>
+      <w:r>
+        <w:rPr>
+          <w:rFonts w:ascii="Calibri" w:cs="Calibri" w:eastAsia="Calibri" w:hAnsi="Calibri"/>
+          <w:b w:val="false"/>
+          <w:bCs w:val="false"/>
+          <w:i w:val="false"/>
+          <w:iCs w:val="false"/>
+          <w:color w:val="000000"/>
+          <w:sz w:val="22"/>
+          <w:szCs w:val="22"/>
+        </w:rPr>
+        <w:t xml:space="preserve">The house account drops if we still owe them, or shows They owe us if we do not.</w:t>
+      </w:r>
+    </w:p>
+    <w:p>
+      <w:pPr>
+        <w:pStyle w:val="ListParagraph"/>
+        <w:numPr>
+          <w:ilvl w:val="0"/>
+          <w:numId w:val="2"/>
+        </w:numPr>
+        <w:spacing w:after="80" w:line="276"/>
+      </w:pPr>
+      <w:r>
+        <w:rPr>
+          <w:rFonts w:ascii="Calibri" w:cs="Calibri" w:eastAsia="Calibri" w:hAnsi="Calibri"/>
+          <w:b w:val="false"/>
+          <w:bCs w:val="false"/>
+          <w:i w:val="false"/>
+          <w:iCs w:val="false"/>
+          <w:color w:val="000000"/>
+          <w:sz w:val="22"/>
+          <w:szCs w:val="22"/>
+        </w:rPr>
+        <w:t xml:space="preserve">Opening stock sent back does not change money owed.</w:t>
       </w:r>
     </w:p>
     <w:p>
@@ -47200,6 +47588,312 @@
           </w:p>
         </w:tc>
       </w:tr>
+      <w:tr>
+        <w:trPr>
+          <w:trHeight w:val="320" w:hRule="atLeast"/>
+        </w:trPr>
+        <w:tc>
+          <w:tcPr>
+            <w:tcW w:type="dxa" w:w="600"/>
+            <w:tcBorders>
+              <w:top w:val="single" w:color="000000" w:sz="8"/>
+              <w:left w:val="single" w:color="000000" w:sz="8"/>
+              <w:bottom w:val="single" w:color="000000" w:sz="8"/>
+              <w:right w:val="single" w:color="000000" w:sz="8"/>
+            </w:tcBorders>
+            <w:shd w:fill="F7F7F7" w:color="F7F7F7" w:val="clear"/>
+            <w:tcMar>
+              <w:top w:type="dxa" w:w="60"/>
+              <w:left w:type="dxa" w:w="80"/>
+              <w:bottom w:type="dxa" w:w="60"/>
+              <w:right w:type="dxa" w:w="80"/>
+            </w:tcMar>
+            <w:vAlign w:val="center"/>
+          </w:tcPr>
+          <w:p>
+            <w:pPr>
+              <w:jc w:val="left"/>
+            </w:pPr>
+            <w:r>
+              <w:rPr>
+                <w:rFonts w:ascii="Calibri" w:cs="Calibri" w:eastAsia="Calibri" w:hAnsi="Calibri"/>
+                <w:b w:val="false"/>
+                <w:bCs w:val="false"/>
+                <w:i w:val="false"/>
+                <w:iCs w:val="false"/>
+                <w:color w:val="000000"/>
+                <w:sz w:val="20"/>
+                <w:szCs w:val="20"/>
+              </w:rPr>
+              <w:t xml:space="preserve">66</w:t>
+            </w:r>
+          </w:p>
+        </w:tc>
+        <w:tc>
+          <w:tcPr>
+            <w:tcW w:type="dxa" w:w="2800"/>
+            <w:tcBorders>
+              <w:top w:val="single" w:color="000000" w:sz="8"/>
+              <w:left w:val="single" w:color="000000" w:sz="8"/>
+              <w:bottom w:val="single" w:color="000000" w:sz="8"/>
+              <w:right w:val="single" w:color="000000" w:sz="8"/>
+            </w:tcBorders>
+            <w:shd w:fill="F7F7F7" w:color="F7F7F7" w:val="clear"/>
+            <w:tcMar>
+              <w:top w:type="dxa" w:w="60"/>
+              <w:left w:type="dxa" w:w="80"/>
+              <w:bottom w:type="dxa" w:w="60"/>
+              <w:right w:type="dxa" w:w="80"/>
+            </w:tcMar>
+            <w:vAlign w:val="center"/>
+          </w:tcPr>
+          <w:p>
+            <w:pPr>
+              <w:jc w:val="left"/>
+            </w:pPr>
+            <w:r>
+              <w:rPr>
+                <w:rFonts w:ascii="Calibri" w:cs="Calibri" w:eastAsia="Calibri" w:hAnsi="Calibri"/>
+                <w:b w:val="false"/>
+                <w:bCs w:val="false"/>
+                <w:i w:val="false"/>
+                <w:iCs w:val="false"/>
+                <w:color w:val="000000"/>
+                <w:sz w:val="20"/>
+                <w:szCs w:val="20"/>
+              </w:rPr>
+              <w:t xml:space="preserve">Sign out goes straight to Sign in</w:t>
+            </w:r>
+          </w:p>
+        </w:tc>
+        <w:tc>
+          <w:tcPr>
+            <w:tcW w:type="dxa" w:w="2600"/>
+            <w:tcBorders>
+              <w:top w:val="single" w:color="000000" w:sz="8"/>
+              <w:left w:val="single" w:color="000000" w:sz="8"/>
+              <w:bottom w:val="single" w:color="000000" w:sz="8"/>
+              <w:right w:val="single" w:color="000000" w:sz="8"/>
+            </w:tcBorders>
+            <w:shd w:fill="F7F7F7" w:color="F7F7F7" w:val="clear"/>
+            <w:tcMar>
+              <w:top w:type="dxa" w:w="60"/>
+              <w:left w:type="dxa" w:w="80"/>
+              <w:bottom w:type="dxa" w:w="60"/>
+              <w:right w:type="dxa" w:w="80"/>
+            </w:tcMar>
+            <w:vAlign w:val="center"/>
+          </w:tcPr>
+          <w:p>
+            <w:pPr>
+              <w:jc w:val="left"/>
+            </w:pPr>
+            <w:r>
+              <w:rPr>
+                <w:rFonts w:ascii="Calibri" w:cs="Calibri" w:eastAsia="Calibri" w:hAnsi="Calibri"/>
+                <w:b w:val="false"/>
+                <w:bCs w:val="false"/>
+                <w:i w:val="false"/>
+                <w:iCs w:val="false"/>
+                <w:color w:val="000000"/>
+                <w:sz w:val="20"/>
+                <w:szCs w:val="20"/>
+              </w:rPr>
+              <w:t xml:space="preserve">cashier@abutwins.com</w:t>
+            </w:r>
+          </w:p>
+        </w:tc>
+        <w:tc>
+          <w:tcPr>
+            <w:tcW w:type="dxa" w:w="3360"/>
+            <w:tcBorders>
+              <w:top w:val="single" w:color="000000" w:sz="8"/>
+              <w:left w:val="single" w:color="000000" w:sz="8"/>
+              <w:bottom w:val="single" w:color="000000" w:sz="8"/>
+              <w:right w:val="single" w:color="000000" w:sz="8"/>
+            </w:tcBorders>
+            <w:shd w:fill="F7F7F7" w:color="F7F7F7" w:val="clear"/>
+            <w:tcMar>
+              <w:top w:type="dxa" w:w="60"/>
+              <w:left w:type="dxa" w:w="80"/>
+              <w:bottom w:type="dxa" w:w="60"/>
+              <w:right w:type="dxa" w:w="80"/>
+            </w:tcMar>
+            <w:vAlign w:val="center"/>
+          </w:tcPr>
+          <w:p>
+            <w:pPr>
+              <w:jc w:val="left"/>
+            </w:pPr>
+            <w:r>
+              <w:rPr>
+                <w:rFonts w:ascii="Calibri" w:cs="Calibri" w:eastAsia="Calibri" w:hAnsi="Calibri"/>
+                <w:b w:val="false"/>
+                <w:bCs w:val="false"/>
+                <w:i w:val="false"/>
+                <w:iCs w:val="false"/>
+                <w:color w:val="000000"/>
+                <w:sz w:val="20"/>
+                <w:szCs w:val="20"/>
+              </w:rPr>
+              <w:t xml:space="preserve">From Home, open your name. Click Sign out. The screen says Signing you out, then Sign in. You do not see Home or a skeleton shop page in between. On Sign in, click the play mark. The film moves. Click again and it pauses.</w:t>
+            </w:r>
+          </w:p>
+        </w:tc>
+      </w:tr>
+      <w:tr>
+        <w:trPr>
+          <w:trHeight w:val="320" w:hRule="atLeast"/>
+        </w:trPr>
+        <w:tc>
+          <w:tcPr>
+            <w:tcW w:type="dxa" w:w="600"/>
+            <w:tcBorders>
+              <w:top w:val="single" w:color="000000" w:sz="8"/>
+              <w:left w:val="single" w:color="000000" w:sz="8"/>
+              <w:bottom w:val="single" w:color="000000" w:sz="8"/>
+              <w:right w:val="single" w:color="000000" w:sz="8"/>
+            </w:tcBorders>
+            <w:shd w:fill="FFFFFF" w:color="FFFFFF" w:val="clear"/>
+            <w:tcMar>
+              <w:top w:type="dxa" w:w="60"/>
+              <w:left w:type="dxa" w:w="80"/>
+              <w:bottom w:type="dxa" w:w="60"/>
+              <w:right w:type="dxa" w:w="80"/>
+            </w:tcMar>
+            <w:vAlign w:val="center"/>
+          </w:tcPr>
+          <w:p>
+            <w:pPr>
+              <w:jc w:val="left"/>
+            </w:pPr>
+            <w:r>
+              <w:rPr>
+                <w:rFonts w:ascii="Calibri" w:cs="Calibri" w:eastAsia="Calibri" w:hAnsi="Calibri"/>
+                <w:b w:val="false"/>
+                <w:bCs w:val="false"/>
+                <w:i w:val="false"/>
+                <w:iCs w:val="false"/>
+                <w:color w:val="000000"/>
+                <w:sz w:val="20"/>
+                <w:szCs w:val="20"/>
+              </w:rPr>
+              <w:t xml:space="preserve">67</w:t>
+            </w:r>
+          </w:p>
+        </w:tc>
+        <w:tc>
+          <w:tcPr>
+            <w:tcW w:type="dxa" w:w="2800"/>
+            <w:tcBorders>
+              <w:top w:val="single" w:color="000000" w:sz="8"/>
+              <w:left w:val="single" w:color="000000" w:sz="8"/>
+              <w:bottom w:val="single" w:color="000000" w:sz="8"/>
+              <w:right w:val="single" w:color="000000" w:sz="8"/>
+            </w:tcBorders>
+            <w:shd w:fill="FFFFFF" w:color="FFFFFF" w:val="clear"/>
+            <w:tcMar>
+              <w:top w:type="dxa" w:w="60"/>
+              <w:left w:type="dxa" w:w="80"/>
+              <w:bottom w:type="dxa" w:w="60"/>
+              <w:right w:type="dxa" w:w="80"/>
+            </w:tcMar>
+            <w:vAlign w:val="center"/>
+          </w:tcPr>
+          <w:p>
+            <w:pPr>
+              <w:jc w:val="left"/>
+            </w:pPr>
+            <w:r>
+              <w:rPr>
+                <w:rFonts w:ascii="Calibri" w:cs="Calibri" w:eastAsia="Calibri" w:hAnsi="Calibri"/>
+                <w:b w:val="false"/>
+                <w:bCs w:val="false"/>
+                <w:i w:val="false"/>
+                <w:iCs w:val="false"/>
+                <w:color w:val="000000"/>
+                <w:sz w:val="20"/>
+                <w:szCs w:val="20"/>
+              </w:rPr>
+              <w:t xml:space="preserve">Send phones back by IMEI only</w:t>
+            </w:r>
+          </w:p>
+        </w:tc>
+        <w:tc>
+          <w:tcPr>
+            <w:tcW w:type="dxa" w:w="2600"/>
+            <w:tcBorders>
+              <w:top w:val="single" w:color="000000" w:sz="8"/>
+              <w:left w:val="single" w:color="000000" w:sz="8"/>
+              <w:bottom w:val="single" w:color="000000" w:sz="8"/>
+              <w:right w:val="single" w:color="000000" w:sz="8"/>
+            </w:tcBorders>
+            <w:shd w:fill="FFFFFF" w:color="FFFFFF" w:val="clear"/>
+            <w:tcMar>
+              <w:top w:type="dxa" w:w="60"/>
+              <w:left w:type="dxa" w:w="80"/>
+              <w:bottom w:type="dxa" w:w="60"/>
+              <w:right w:type="dxa" w:w="80"/>
+            </w:tcMar>
+            <w:vAlign w:val="center"/>
+          </w:tcPr>
+          <w:p>
+            <w:pPr>
+              <w:jc w:val="left"/>
+            </w:pPr>
+            <w:r>
+              <w:rPr>
+                <w:rFonts w:ascii="Calibri" w:cs="Calibri" w:eastAsia="Calibri" w:hAnsi="Calibri"/>
+                <w:b w:val="false"/>
+                <w:bCs w:val="false"/>
+                <w:i w:val="false"/>
+                <w:iCs w:val="false"/>
+                <w:color w:val="000000"/>
+                <w:sz w:val="20"/>
+                <w:szCs w:val="20"/>
+              </w:rPr>
+              <w:t xml:space="preserve">vault@abutwins.com or manager@abutwins.com</w:t>
+            </w:r>
+          </w:p>
+        </w:tc>
+        <w:tc>
+          <w:tcPr>
+            <w:tcW w:type="dxa" w:w="3360"/>
+            <w:tcBorders>
+              <w:top w:val="single" w:color="000000" w:sz="8"/>
+              <w:left w:val="single" w:color="000000" w:sz="8"/>
+              <w:bottom w:val="single" w:color="000000" w:sz="8"/>
+              <w:right w:val="single" w:color="000000" w:sz="8"/>
+            </w:tcBorders>
+            <w:shd w:fill="FFFFFF" w:color="FFFFFF" w:val="clear"/>
+            <w:tcMar>
+              <w:top w:type="dxa" w:w="60"/>
+              <w:left w:type="dxa" w:w="80"/>
+              <w:bottom w:type="dxa" w:w="60"/>
+              <w:right w:type="dxa" w:w="80"/>
+            </w:tcMar>
+            <w:vAlign w:val="center"/>
+          </w:tcPr>
+          <w:p>
+            <w:pPr>
+              <w:jc w:val="left"/>
+            </w:pPr>
+            <w:r>
+              <w:rPr>
+                <w:rFonts w:ascii="Calibri" w:cs="Calibri" w:eastAsia="Calibri" w:hAnsi="Calibri"/>
+                <w:b w:val="false"/>
+                <w:bCs w:val="false"/>
+                <w:i w:val="false"/>
+                <w:iCs w:val="false"/>
+                <w:color w:val="000000"/>
+                <w:sz w:val="20"/>
+                <w:szCs w:val="20"/>
+              </w:rPr>
+              <w:t xml:space="preserve">On Goods from supplier, Send back to supplier, there is no supplier list. Scan one IMEI. The phone name, the house, and the cost appear. Scan more IMEIs from the same house. Send them. Still owed on that house drops. If the bill was already paid, They owe us shows on Suppliers, Money in and out, Reports, Home, and Check the books. Scanning a phone from a second house is refused until this send-back is finished.</w:t>
+            </w:r>
+          </w:p>
+        </w:tc>
+      </w:tr>
     </w:tbl>
     <w:p>
       <w:pPr>
@@ -47543,7 +48237,7 @@
           <w:sz w:val="22"/>
           <w:szCs w:val="22"/>
         </w:rPr>
-        <w:t xml:space="preserve">On Reports, Still owed to suppliers shows the house name and the amount. Click the house to open its bills.</w:t>
+        <w:t xml:space="preserve">On Reports, Still owed to suppliers shows the house name and the amount. Click the house to open its bills. Suppliers who owe us is the surplus after send-backs.</w:t>
       </w:r>
     </w:p>
     <w:p>
@@ -47566,7 +48260,7 @@
           <w:sz w:val="22"/>
           <w:szCs w:val="22"/>
         </w:rPr>
-        <w:t xml:space="preserve">A shop only sees its own records. A person at Bodija cannot open an Iwo Road sale, customer, or phone, even if they are handed the exact link. Only head office sees across the three shops.</w:t>
+        <w:t xml:space="preserve">Send phones back to a supplier by scanning the IMEI only. Do not pick the house. One send-back is one house. That cost comes off what we still owe, or leaves They owe us if we do not owe that house. Opening stock sent back does not change money owed.</w:t>
       </w:r>
     </w:p>
     <w:p>
@@ -47589,7 +48283,7 @@
           <w:sz w:val="22"/>
           <w:szCs w:val="22"/>
         </w:rPr>
-        <w:t xml:space="preserve">Two tills cannot sell the same phone. Whichever completes first gets the invoice. The other is refused and nothing half-happens: no invoice, no money entry, no stock change.</w:t>
+        <w:t xml:space="preserve">A shop only sees its own records. A person at Bodija cannot open an Iwo Road sale, customer, or phone, even if they are handed the exact link. Only head office sees across the three shops.</w:t>
       </w:r>
     </w:p>
     <w:p>
@@ -47612,7 +48306,7 @@
           <w:sz w:val="22"/>
           <w:szCs w:val="22"/>
         </w:rPr>
-        <w:t xml:space="preserve">Shop stock can never fall below zero, and two clerks collecting from the same customer at the same moment cannot wipe out each other's entry.</w:t>
+        <w:t xml:space="preserve">Two tills cannot sell the same phone. Whichever completes first gets the invoice. The other is refused and nothing half-happens: no invoice, no money entry, no stock change.</w:t>
       </w:r>
     </w:p>
     <w:p>
@@ -47635,7 +48329,7 @@
           <w:sz w:val="22"/>
           <w:szCs w:val="22"/>
         </w:rPr>
-        <w:t xml:space="preserve">Pressing a save button twice does not do the work twice. The button refuses the second press while the first is still going.</w:t>
+        <w:t xml:space="preserve">Shop stock can never fall below zero, and two clerks collecting from the same customer at the same moment cannot wipe out each other's entry.</w:t>
       </w:r>
     </w:p>
     <w:p>
@@ -47658,7 +48352,7 @@
           <w:sz w:val="22"/>
           <w:szCs w:val="22"/>
         </w:rPr>
-        <w:t xml:space="preserve">A shop manager can only add staff to their own shop.</w:t>
+        <w:t xml:space="preserve">Pressing a save button twice does not do the work twice. The button refuses the second press while the first is still going.</w:t>
       </w:r>
     </w:p>
     <w:p>
@@ -47681,7 +48375,7 @@
           <w:sz w:val="22"/>
           <w:szCs w:val="22"/>
         </w:rPr>
-        <w:t xml:space="preserve">A walk-in sale needs a name before a return.</w:t>
+        <w:t xml:space="preserve">A shop manager can only add staff to their own shop.</w:t>
       </w:r>
     </w:p>
     <w:p>
@@ -47704,7 +48398,7 @@
           <w:sz w:val="22"/>
           <w:szCs w:val="22"/>
         </w:rPr>
-        <w:t xml:space="preserve">Staff cannot sell below the lowest price unless Super Admin or the CEO turns that on.</w:t>
+        <w:t xml:space="preserve">A walk-in sale needs a name before a return.</w:t>
       </w:r>
     </w:p>
     <w:p>
@@ -47727,7 +48421,7 @@
           <w:sz w:val="22"/>
           <w:szCs w:val="22"/>
         </w:rPr>
-        <w:t xml:space="preserve">Many selling prices can change in one save. Tick the items, type each new figure, and update. That is not a carton sale. You still sell by the unit. The mix can be any brand or accessory.</w:t>
+        <w:t xml:space="preserve">Staff cannot sell below the lowest price unless Super Admin or the CEO turns that on.</w:t>
       </w:r>
     </w:p>
     <w:p>
@@ -47750,7 +48444,7 @@
           <w:sz w:val="22"/>
           <w:szCs w:val="22"/>
         </w:rPr>
-        <w:t xml:space="preserve">If a past business day had sales and is not closed, nobody starts a new live sale. Super Admin is locked too. Already parked sales may still post.</w:t>
+        <w:t xml:space="preserve">Many selling prices can change in one save. Tick the items, type each new figure, and update. That is not a carton sale. You still sell by the unit. The mix can be any brand or accessory.</w:t>
       </w:r>
     </w:p>
     <w:p>
@@ -47773,7 +48467,7 @@
           <w:sz w:val="22"/>
           <w:szCs w:val="22"/>
         </w:rPr>
-        <w:t xml:space="preserve">A parked sale that sits more than two hours, or vanishes from a device, alerts Super Admin, the CEO, and the records checker.</w:t>
+        <w:t xml:space="preserve">If a past business day had sales and is not closed, nobody starts a new live sale. Super Admin is locked too. Already parked sales may still post.</w:t>
       </w:r>
     </w:p>
     <w:p>
@@ -47796,7 +48490,53 @@
           <w:sz w:val="22"/>
           <w:szCs w:val="22"/>
         </w:rPr>
+        <w:t xml:space="preserve">A parked sale that sits more than two hours, or vanishes from a device, alerts Super Admin, the CEO, and the records checker.</w:t>
+      </w:r>
+    </w:p>
+    <w:p>
+      <w:pPr>
+        <w:pStyle w:val="ListParagraph"/>
+        <w:numPr>
+          <w:ilvl w:val="0"/>
+          <w:numId w:val="2"/>
+        </w:numPr>
+        <w:spacing w:after="80" w:line="276"/>
+      </w:pPr>
+      <w:r>
+        <w:rPr>
+          <w:rFonts w:ascii="Calibri" w:cs="Calibri" w:eastAsia="Calibri" w:hAnsi="Calibri"/>
+          <w:b w:val="false"/>
+          <w:bCs w:val="false"/>
+          <w:i w:val="false"/>
+          <w:iCs w:val="false"/>
+          <w:color w:val="000000"/>
+          <w:sz w:val="22"/>
+          <w:szCs w:val="22"/>
+        </w:rPr>
         <w:t xml:space="preserve">A refresh on a dead line must not wipe a parked sale. The invoice is still only born on the server.</w:t>
+      </w:r>
+    </w:p>
+    <w:p>
+      <w:pPr>
+        <w:pStyle w:val="ListParagraph"/>
+        <w:numPr>
+          <w:ilvl w:val="0"/>
+          <w:numId w:val="2"/>
+        </w:numPr>
+        <w:spacing w:after="80" w:line="276"/>
+      </w:pPr>
+      <w:r>
+        <w:rPr>
+          <w:rFonts w:ascii="Calibri" w:cs="Calibri" w:eastAsia="Calibri" w:hAnsi="Calibri"/>
+          <w:b w:val="false"/>
+          <w:bCs w:val="false"/>
+          <w:i w:val="false"/>
+          <w:iCs w:val="false"/>
+          <w:color w:val="000000"/>
+          <w:sz w:val="22"/>
+          <w:szCs w:val="22"/>
+        </w:rPr>
+        <w:t xml:space="preserve">Sign out from your name. The next screen is Sign in. A half-built shop page in between is a fault.</w:t>
       </w:r>
     </w:p>
     <w:p>
@@ -49220,6 +49960,44 @@
           <w:szCs w:val="22"/>
         </w:rPr>
         <w:t xml:space="preserve">Version 1.35 puts opening cash and named bank accounts on Money in and out. The accountant types the cash in the till and adds each bank with its account number and opening balance. Cash in the till and Bank start from those figures, then sales, expenses, and supplier payments sit on top. Opening stock stays phones and pieces, not naira.</w:t>
+      </w:r>
+    </w:p>
+    <w:p>
+      <w:pPr>
+        <w:spacing w:after="160" w:before="0" w:line="276"/>
+        <w:jc w:val="left"/>
+      </w:pPr>
+      <w:r>
+        <w:rPr>
+          <w:rFonts w:ascii="Calibri" w:cs="Calibri" w:eastAsia="Calibri" w:hAnsi="Calibri"/>
+          <w:b w:val="false"/>
+          <w:bCs w:val="false"/>
+          <w:i w:val="false"/>
+          <w:iCs w:val="false"/>
+          <w:color w:val="000000"/>
+          <w:sz w:val="22"/>
+          <w:szCs w:val="22"/>
+        </w:rPr>
+        <w:t xml:space="preserve">Version 1.36 makes Sign out go straight to Sign in, with a blue Signing you out screen and no half-built shop page in between. The left side of Sign in is a shop film. Click the play mark to play. There is no still photo under the film.</w:t>
+      </w:r>
+    </w:p>
+    <w:p>
+      <w:pPr>
+        <w:spacing w:after="160" w:before="0" w:line="276"/>
+        <w:jc w:val="left"/>
+      </w:pPr>
+      <w:r>
+        <w:rPr>
+          <w:rFonts w:ascii="Calibri" w:cs="Calibri" w:eastAsia="Calibri" w:hAnsi="Calibri"/>
+          <w:b w:val="false"/>
+          <w:bCs w:val="false"/>
+          <w:i w:val="false"/>
+          <w:iCs w:val="false"/>
+          <w:color w:val="000000"/>
+          <w:sz w:val="22"/>
+          <w:szCs w:val="22"/>
+        </w:rPr>
+        <w:t xml:space="preserve">Version 1.37 makes Send back to supplier scan only. The IMEI names the phone, the house, and the cost. You can scan many phones in one send-back if they belong to one house. The house account drops if Abu Twins still owes them. If not, They owe us shows so the CEO, the accountant, and the records checker can see the surplus without calling accounts.</w:t>
       </w:r>
     </w:p>
     <w:p>

</xml_diff>

<commit_message>
Make Returns show true value and replacement balance.
Log a return records return item value; Replace picks an In shop unit with replacement value and Receivable or Payable. Apply after approval moves stock and settles money. Correct and close reminds staff to fill zero prices and missing pieces before Close.

Co-authored-by: Cursor <cursoragent@cursor.com>
</commit_message>
<xml_diff>
--- a/docs/Abu-Twins-Shop-System-User-Guide.docx
+++ b/docs/Abu-Twins-Shop-System-User-Guide.docx
@@ -459,7 +459,7 @@
                 <w:sz w:val="20"/>
                 <w:szCs w:val="20"/>
               </w:rPr>
-              <w:t xml:space="preserve">1.46</w:t>
+              <w:t xml:space="preserve">1.47</w:t>
             </w:r>
           </w:p>
         </w:tc>
@@ -533,7 +533,7 @@
                 <w:sz w:val="20"/>
                 <w:szCs w:val="20"/>
               </w:rPr>
-              <w:t xml:space="preserve">Updated: Swap Deal values, approval before stock, IMEI or serial</w:t>
+              <w:t xml:space="preserve">Updated: Returns show return value, replacement value, Receivable or Payable</w:t>
             </w:r>
           </w:p>
         </w:tc>
@@ -1358,6 +1358,25 @@
           <w:szCs w:val="22"/>
         </w:rPr>
         <w:t xml:space="preserve">Swap Deal now takes a typed customer if they are new, accepts IMEI or serial for phones and laptops, records swap-in value and shop-item value with Receivable or Payable, and only moves stock after Needs approval says yes.</w:t>
+      </w:r>
+    </w:p>
+    <w:p>
+      <w:pPr>
+        <w:spacing w:after="160" w:before="0" w:line="276"/>
+        <w:jc w:val="left"/>
+      </w:pPr>
+      <w:r>
+        <w:rPr>
+          <w:rFonts w:ascii="Calibri" w:cs="Calibri" w:eastAsia="Calibri" w:hAnsi="Calibri"/>
+          <w:b w:val="false"/>
+          <w:bCs w:val="false"/>
+          <w:i w:val="false"/>
+          <w:iCs w:val="false"/>
+          <w:color w:val="000000"/>
+          <w:sz w:val="22"/>
+          <w:szCs w:val="22"/>
+        </w:rPr>
+        <w:t xml:space="preserve">Returns now show the return item value, and on Replace from our stock staff pick the In shop unit and its value. Receivable or Payable appears so money matches the event, not quantity alone. Stock and money still wait for Needs approval.</w:t>
       </w:r>
     </w:p>
     <w:p>
@@ -19517,7 +19536,7 @@
           <w:sz w:val="22"/>
           <w:szCs w:val="22"/>
         </w:rPr>
-        <w:t xml:space="preserve">A return starts from a sold IMEI. You say why it came back. A manager approves. Then you refund, give credit, send to repair, replace, or send the unit back to the supplier. The old invoice is not rewritten. Tap Waiting, Approved, or Done to cut the list. Each card shows when it was asked, approved, or finished in Lagos time.</w:t>
+        <w:t xml:space="preserve">A return starts from a sold IMEI or serial. You record the return item value from the original sale. If the outcome is Replace from our stock, you pick the In shop unit and its value. The balance is Receivable if the replacement is worth more, or Payable if the returned item is worth more. Save sends Needs approval. After yes, Apply moves stock and settles the money. The old invoice is not rewritten. Tap Waiting, Approved, or Done to cut the list.</w:t>
       </w:r>
     </w:p>
     <w:p>
@@ -19555,7 +19574,7 @@
           <w:sz w:val="22"/>
           <w:szCs w:val="22"/>
         </w:rPr>
-        <w:t xml:space="preserve">If staff edit the old sale, the day’s cash lies. A return is a new story that points at the old invoice.</w:t>
+        <w:t xml:space="preserve">If staff only write a quantity, the true money of the return is hidden. A clearer return shows stock and value together.</w:t>
       </w:r>
     </w:p>
     <w:p>
@@ -19593,7 +19612,7 @@
           <w:sz w:val="22"/>
           <w:szCs w:val="22"/>
         </w:rPr>
-        <w:t xml:space="preserve">A buyer returns a faulty Camon 30. The cashier enters the IMEI and the reason. The shop manager approves. The phone comes back to the shop or goes to repair. The original invoice still shows the sale.</w:t>
+        <w:t xml:space="preserve">A buyer returns a phone bought for 450,000 and takes a higher phone as replacement. The cashier logs return value 450,000, picks the In shop phone at 520,000, and sees Receivable 70,000. The manager says yes. Apply moves stock and collects the difference. The original invoice still shows the first sale.</w:t>
       </w:r>
     </w:p>
     <w:p>
@@ -19643,7 +19662,7 @@
           <w:sz w:val="22"/>
           <w:szCs w:val="22"/>
         </w:rPr>
-        <w:t xml:space="preserve">Open a sold invoice that has a named buyer.</w:t>
+        <w:t xml:space="preserve">Click Returns.</w:t>
       </w:r>
     </w:p>
     <w:p>
@@ -19674,7 +19693,7 @@
           <w:sz w:val="22"/>
           <w:szCs w:val="22"/>
         </w:rPr>
-        <w:t xml:space="preserve">Click Returns.</w:t>
+        <w:t xml:space="preserve">Pick the sold device. Confirm return item value.</w:t>
       </w:r>
     </w:p>
     <w:p>
@@ -19705,7 +19724,7 @@
           <w:sz w:val="22"/>
           <w:szCs w:val="22"/>
         </w:rPr>
-        <w:t xml:space="preserve">Enter the sold IMEI and the reason.</w:t>
+        <w:t xml:space="preserve">Pick Replace from our stock when giving another unit. Pick the In shop unit and its value. Confirm Receivable or Payable.</w:t>
       </w:r>
     </w:p>
     <w:p>
@@ -19736,7 +19755,7 @@
           <w:sz w:val="22"/>
           <w:szCs w:val="22"/>
         </w:rPr>
-        <w:t xml:space="preserve">Ask a manager to open Needs approval and say yes.</w:t>
+        <w:t xml:space="preserve">Save for approval. A manager says yes on Needs approval.</w:t>
       </w:r>
     </w:p>
     <w:p>
@@ -19767,7 +19786,7 @@
           <w:sz w:val="22"/>
           <w:szCs w:val="22"/>
         </w:rPr>
-        <w:t xml:space="preserve">Complete the return outcome.</w:t>
+        <w:t xml:space="preserve">Apply outcome. Collect or pay the balance on a Replace.</w:t>
       </w:r>
     </w:p>
     <w:p>
@@ -19809,7 +19828,7 @@
           <w:sz w:val="22"/>
           <w:szCs w:val="22"/>
         </w:rPr>
-        <w:t xml:space="preserve">Walk-in sales block the return until a buyer name is attached.</w:t>
+        <w:t xml:space="preserve">Log a return shows the goods and the money, not quantity alone.</w:t>
       </w:r>
     </w:p>
     <w:p>
@@ -19832,7 +19851,7 @@
           <w:sz w:val="22"/>
           <w:szCs w:val="22"/>
         </w:rPr>
-        <w:t xml:space="preserve">The old invoice does not change.</w:t>
+        <w:t xml:space="preserve">Replace uses a dropdown of In shop units with values.</w:t>
       </w:r>
     </w:p>
     <w:p>
@@ -19855,7 +19874,7 @@
           <w:sz w:val="22"/>
           <w:szCs w:val="22"/>
         </w:rPr>
-        <w:t xml:space="preserve">The IMEI status can become Returned, move to repair, or become Sent back to supplier.</w:t>
+        <w:t xml:space="preserve">Stock and money wait until Needs approval says yes.</w:t>
       </w:r>
     </w:p>
     <w:p>
@@ -19878,7 +19897,7 @@
           <w:sz w:val="22"/>
           <w:szCs w:val="22"/>
         </w:rPr>
-        <w:t xml:space="preserve">A refund is a new money record, not an erase.</w:t>
+        <w:t xml:space="preserve">The old invoice does not change.</w:t>
       </w:r>
     </w:p>
     <w:p>
@@ -52329,6 +52348,25 @@
           <w:szCs w:val="22"/>
         </w:rPr>
         <w:t xml:space="preserve">Version 1.46 reshapes Swap Deal. Staff can type a new customer, enter IMEI or serial for phones and laptops, record swap-in value and shop-item value with Receivable or Payable, and save for approval. Stock hits and leaves only after Needs approval says yes. Then settle the money and print.</w:t>
+      </w:r>
+    </w:p>
+    <w:p>
+      <w:pPr>
+        <w:spacing w:after="160" w:before="0" w:line="276"/>
+        <w:jc w:val="left"/>
+      </w:pPr>
+      <w:r>
+        <w:rPr>
+          <w:rFonts w:ascii="Calibri" w:cs="Calibri" w:eastAsia="Calibri" w:hAnsi="Calibri"/>
+          <w:b w:val="false"/>
+          <w:bCs w:val="false"/>
+          <w:i w:val="false"/>
+          <w:iCs w:val="false"/>
+          <w:color w:val="000000"/>
+          <w:sz w:val="22"/>
+          <w:szCs w:val="22"/>
+        </w:rPr>
+        <w:t xml:space="preserve">Version 1.47 makes Returns show true value. Log a return records return item value. Replace from our stock picks an In shop unit and its value, with Receivable or Payable. After approval, Apply moves stock and settles the money. Correct and close opening stock remains the place to fill zero prices and missing piece counts before Close.</w:t>
       </w:r>
     </w:p>
     <w:p>

</xml_diff>

<commit_message>
Fold duplicate stock IMEIs into one entry and show branded wait screens.
Uploads keep going when numbers repeat or already exist, staff can edit later, and long jobs show the Abu Twins mark with shop-named status and a percent bar.

Co-authored-by: Cursor <cursoragent@cursor.com>
</commit_message>
<xml_diff>
--- a/docs/Abu-Twins-Shop-System-User-Guide.docx
+++ b/docs/Abu-Twins-Shop-System-User-Guide.docx
@@ -459,7 +459,7 @@
                 <w:sz w:val="20"/>
                 <w:szCs w:val="20"/>
               </w:rPr>
-              <w:t xml:space="preserve">1.47</w:t>
+              <w:t xml:space="preserve">1.49</w:t>
             </w:r>
           </w:p>
         </w:tc>
@@ -533,7 +533,7 @@
                 <w:sz w:val="20"/>
                 <w:szCs w:val="20"/>
               </w:rPr>
-              <w:t xml:space="preserve">Updated: Returns show return value, replacement value, Receivable or Payable</w:t>
+              <w:t xml:space="preserve">Updated: branded wait screens with percent and shop-named status</w:t>
             </w:r>
           </w:p>
         </w:tc>
@@ -31212,7 +31212,7 @@
           <w:sz w:val="22"/>
           <w:szCs w:val="22"/>
         </w:rPr>
-        <w:t xml:space="preserve">Upload stock is how phones get onto the shelf. There are three clear doors. Supplier bill lets you add phones one after another, or many lines on one bill, with the supplier and paid or not paid. On that bill, type the product name in the search bar, pick the name, and only that name sits in the item column. Then pick condition (Brand new, Uk, Open box, or Standard) and storage (32GB, 64GB, 128GB, 256GB, 1TB, or 2TB) yourself, the same way you fill cost and how many. Those details stay off the product name. Scanning an IMEI only fills that box. It does not save the bill. Fill the rest of the line, then press Upload this stock. A new supplier name or phone that is already on the books is refused. Many at once (Excel) puts a whole shop on the system from one file as opening stock value. It is not a bill to pay. You can add a new supplier on that screen, with the same name and phone check. One phone at a time is for a single phone in your hand with no bill. Scan fills IMEI 1. You still pick the item, the look, and the supplier, then press Add phone to shop. A sheet may be up to 25 MB and about 20,000 lines at a time. Split a bigger carton into more than one file. Unpaid supplier bills show as money we still owe. Opening stock never does.</w:t>
+        <w:t xml:space="preserve">Upload stock is how phones get onto the shelf. There are three clear doors. Supplier bill lets you add phones one after another, or many lines on one bill, with the supplier and paid or not paid. On that bill, type the product name in the search bar, pick the name, and only that name sits in the item column. Then pick condition (Brand new, Uk, Open box, or Standard) and storage (32GB, 64GB, 128GB, 256GB, 1TB, or 2TB) yourself, the same way you fill cost and how many. Those details stay off the product name. Scanning an IMEI only fills that box. It does not save the bill. Fill the rest of the line, then press Upload this stock. A repeated IMEI or serial in the bill or sheet is counted once. A number already on the system is left as it is and is not doubled. Staff can edit later on Phones and items or Correct and close opening stock. A new supplier name or phone that is already on the books is refused. Many at once (Excel) puts a whole shop on the system from one file as opening stock value. It is not a bill to pay. You can add a new supplier on that screen, with the same name and phone check. One phone at a time is for a single phone in your hand with no bill. Scan fills IMEI 1. You still pick the item, the look, and the supplier, then press Add phone to shop. A sheet may be up to 25 MB and about 20,000 lines at a time. Split a bigger carton into more than one file. Unpaid supplier bills show as money we still owe. Opening stock never does.</w:t>
       </w:r>
     </w:p>
     <w:p>
@@ -31250,7 +31250,7 @@
           <w:sz w:val="22"/>
           <w:szCs w:val="22"/>
         </w:rPr>
-        <w:t xml:space="preserve">Staff were looking for Upload stock and could not find Data Import. They also needed both bulk Excel and one-by-one intake. Small shops need shop managers and goods intake to use both ways, not only the Stock uploader login. On the supplier bill, a long dropdown that mixed name, brand, and cost made it hard to find an item, and it glued storage and condition onto the name. A scanner that saves the form on Enter booked phones with empty fields. Two spellings of one supplier split the money trail.</w:t>
+        <w:t xml:space="preserve">Staff were looking for Upload stock and could not find Data Import. They also needed both bulk Excel and one-by-one intake. Small shops need shop managers and goods intake to use both ways, not only the Stock uploader login. On the supplier bill, a long dropdown that mixed name, brand, and cost made it hard to find an item, and it glued storage and condition onto the name. A scanner that saves the form on Enter booked phones with empty fields. Two spellings of one supplier split the money trail. A duplicated IMEI in a sheet used to stop the whole load; the shops need the good lines to go in, with the repeat kept as one entry.</w:t>
       </w:r>
     </w:p>
     <w:p>
@@ -31288,7 +31288,7 @@
           <w:sz w:val="22"/>
           <w:szCs w:val="22"/>
         </w:rPr>
-        <w:t xml:space="preserve">Challenge receives part of a Dubai carton. Goods intake opens Upload stock, picks Supplier bill, types iPhone 16 Pro Max, picks that name, then picks Uk and 256GB, cost, and how many. They scan the first IMEI. The box fills. The form does not save. They fill the next IMEI and press Upload this stock when the carton line is complete. That evening, Bodija opens Many at once (Excel) and loads the full shop sheet. Sell now works on real shelf units the next morning.</w:t>
+        <w:t xml:space="preserve">Challenge receives part of a Dubai carton. Goods intake opens Upload stock, picks Supplier bill, types iPhone 16 Pro Max, picks that name, then picks Uk and 256GB, cost, and how many. They scan the first IMEI twice by mistake. The upload still completes. That IMEI sits once. That evening, Bodija opens Many at once (Excel) and loads the full shop sheet. Two rows share one IMEI. The sheet still loads. Sell now works on real shelf units the next morning.</w:t>
       </w:r>
     </w:p>
     <w:p>
@@ -31766,7 +31766,7 @@
           <w:sz w:val="22"/>
           <w:szCs w:val="22"/>
         </w:rPr>
-        <w:t xml:space="preserve">A copy of a supplier name or phone is refused. Staff pick the name already on the list.</w:t>
+        <w:t xml:space="preserve">A repeated IMEI or serial is counted once. The upload still completes. Numbers already on the system are not doubled.</w:t>
       </w:r>
     </w:p>
     <w:p>
@@ -31789,7 +31789,7 @@
           <w:sz w:val="22"/>
           <w:szCs w:val="22"/>
         </w:rPr>
-        <w:t xml:space="preserve">Unpaid supplier bills appear under Still owed to suppliers. Opening stock does not.</w:t>
+        <w:t xml:space="preserve">After a soft duplicate note, staff can edit the shelf on Correct and close opening stock or Phones and items.</w:t>
       </w:r>
     </w:p>
     <w:p>
@@ -31812,7 +31812,7 @@
           <w:sz w:val="22"/>
           <w:szCs w:val="22"/>
         </w:rPr>
-        <w:t xml:space="preserve">A good opening stock file creates its own record and books stock for that shop. It does not show as money owed.</w:t>
+        <w:t xml:space="preserve">While stock is uploading, a full-screen Abu Twins wait shows the shop name, moving status lines, and a percent bar. Keep the page open until 100 percent.</w:t>
       </w:r>
     </w:p>
     <w:p>
@@ -31835,7 +31835,76 @@
           <w:sz w:val="22"/>
           <w:szCs w:val="22"/>
         </w:rPr>
-        <w:t xml:space="preserve">A file with a bad line loads nothing and names the tab and line to fix.</w:t>
+        <w:t xml:space="preserve">A copy of a supplier name or phone is refused. Staff pick the name already on the list.</w:t>
+      </w:r>
+    </w:p>
+    <w:p>
+      <w:pPr>
+        <w:pStyle w:val="ListParagraph"/>
+        <w:numPr>
+          <w:ilvl w:val="0"/>
+          <w:numId w:val="2"/>
+        </w:numPr>
+        <w:spacing w:after="80" w:line="276"/>
+      </w:pPr>
+      <w:r>
+        <w:rPr>
+          <w:rFonts w:ascii="Calibri" w:cs="Calibri" w:eastAsia="Calibri" w:hAnsi="Calibri"/>
+          <w:b w:val="false"/>
+          <w:bCs w:val="false"/>
+          <w:i w:val="false"/>
+          <w:iCs w:val="false"/>
+          <w:color w:val="000000"/>
+          <w:sz w:val="22"/>
+          <w:szCs w:val="22"/>
+        </w:rPr>
+        <w:t xml:space="preserve">Unpaid supplier bills appear under Still owed to suppliers. Opening stock does not.</w:t>
+      </w:r>
+    </w:p>
+    <w:p>
+      <w:pPr>
+        <w:pStyle w:val="ListParagraph"/>
+        <w:numPr>
+          <w:ilvl w:val="0"/>
+          <w:numId w:val="2"/>
+        </w:numPr>
+        <w:spacing w:after="80" w:line="276"/>
+      </w:pPr>
+      <w:r>
+        <w:rPr>
+          <w:rFonts w:ascii="Calibri" w:cs="Calibri" w:eastAsia="Calibri" w:hAnsi="Calibri"/>
+          <w:b w:val="false"/>
+          <w:bCs w:val="false"/>
+          <w:i w:val="false"/>
+          <w:iCs w:val="false"/>
+          <w:color w:val="000000"/>
+          <w:sz w:val="22"/>
+          <w:szCs w:val="22"/>
+        </w:rPr>
+        <w:t xml:space="preserve">A good opening stock file creates its own record and books stock for that shop. It does not show as money owed.</w:t>
+      </w:r>
+    </w:p>
+    <w:p>
+      <w:pPr>
+        <w:pStyle w:val="ListParagraph"/>
+        <w:numPr>
+          <w:ilvl w:val="0"/>
+          <w:numId w:val="2"/>
+        </w:numPr>
+        <w:spacing w:after="80" w:line="276"/>
+      </w:pPr>
+      <w:r>
+        <w:rPr>
+          <w:rFonts w:ascii="Calibri" w:cs="Calibri" w:eastAsia="Calibri" w:hAnsi="Calibri"/>
+          <w:b w:val="false"/>
+          <w:bCs w:val="false"/>
+          <w:i w:val="false"/>
+          <w:iCs w:val="false"/>
+          <w:color w:val="000000"/>
+          <w:sz w:val="22"/>
+          <w:szCs w:val="22"/>
+        </w:rPr>
+        <w:t xml:space="preserve">A file with a bad line (wrong shop, short IMEI, missing name) loads nothing and names the tab and line to fix.</w:t>
       </w:r>
     </w:p>
     <w:p>
@@ -50027,6 +50096,312 @@
           </w:p>
         </w:tc>
       </w:tr>
+      <w:tr>
+        <w:trPr>
+          <w:trHeight w:val="320" w:hRule="atLeast"/>
+        </w:trPr>
+        <w:tc>
+          <w:tcPr>
+            <w:tcW w:type="dxa" w:w="600"/>
+            <w:tcBorders>
+              <w:top w:val="single" w:color="000000" w:sz="8"/>
+              <w:left w:val="single" w:color="000000" w:sz="8"/>
+              <w:bottom w:val="single" w:color="000000" w:sz="8"/>
+              <w:right w:val="single" w:color="000000" w:sz="8"/>
+            </w:tcBorders>
+            <w:shd w:fill="FFFFFF" w:color="FFFFFF" w:val="clear"/>
+            <w:tcMar>
+              <w:top w:type="dxa" w:w="60"/>
+              <w:left w:type="dxa" w:w="80"/>
+              <w:bottom w:type="dxa" w:w="60"/>
+              <w:right w:type="dxa" w:w="80"/>
+            </w:tcMar>
+            <w:vAlign w:val="center"/>
+          </w:tcPr>
+          <w:p>
+            <w:pPr>
+              <w:jc w:val="left"/>
+            </w:pPr>
+            <w:r>
+              <w:rPr>
+                <w:rFonts w:ascii="Calibri" w:cs="Calibri" w:eastAsia="Calibri" w:hAnsi="Calibri"/>
+                <w:b w:val="false"/>
+                <w:bCs w:val="false"/>
+                <w:i w:val="false"/>
+                <w:iCs w:val="false"/>
+                <w:color w:val="000000"/>
+                <w:sz w:val="20"/>
+                <w:szCs w:val="20"/>
+              </w:rPr>
+              <w:t xml:space="preserve">74</w:t>
+            </w:r>
+          </w:p>
+        </w:tc>
+        <w:tc>
+          <w:tcPr>
+            <w:tcW w:type="dxa" w:w="2800"/>
+            <w:tcBorders>
+              <w:top w:val="single" w:color="000000" w:sz="8"/>
+              <w:left w:val="single" w:color="000000" w:sz="8"/>
+              <w:bottom w:val="single" w:color="000000" w:sz="8"/>
+              <w:right w:val="single" w:color="000000" w:sz="8"/>
+            </w:tcBorders>
+            <w:shd w:fill="FFFFFF" w:color="FFFFFF" w:val="clear"/>
+            <w:tcMar>
+              <w:top w:type="dxa" w:w="60"/>
+              <w:left w:type="dxa" w:w="80"/>
+              <w:bottom w:type="dxa" w:w="60"/>
+              <w:right w:type="dxa" w:w="80"/>
+            </w:tcMar>
+            <w:vAlign w:val="center"/>
+          </w:tcPr>
+          <w:p>
+            <w:pPr>
+              <w:jc w:val="left"/>
+            </w:pPr>
+            <w:r>
+              <w:rPr>
+                <w:rFonts w:ascii="Calibri" w:cs="Calibri" w:eastAsia="Calibri" w:hAnsi="Calibri"/>
+                <w:b w:val="false"/>
+                <w:bCs w:val="false"/>
+                <w:i w:val="false"/>
+                <w:iCs w:val="false"/>
+                <w:color w:val="000000"/>
+                <w:sz w:val="20"/>
+                <w:szCs w:val="20"/>
+              </w:rPr>
+              <w:t xml:space="preserve">Duplicate IMEI on stock upload counted once</w:t>
+            </w:r>
+          </w:p>
+        </w:tc>
+        <w:tc>
+          <w:tcPr>
+            <w:tcW w:type="dxa" w:w="2600"/>
+            <w:tcBorders>
+              <w:top w:val="single" w:color="000000" w:sz="8"/>
+              <w:left w:val="single" w:color="000000" w:sz="8"/>
+              <w:bottom w:val="single" w:color="000000" w:sz="8"/>
+              <w:right w:val="single" w:color="000000" w:sz="8"/>
+            </w:tcBorders>
+            <w:shd w:fill="FFFFFF" w:color="FFFFFF" w:val="clear"/>
+            <w:tcMar>
+              <w:top w:type="dxa" w:w="60"/>
+              <w:left w:type="dxa" w:w="80"/>
+              <w:bottom w:type="dxa" w:w="60"/>
+              <w:right w:type="dxa" w:w="80"/>
+            </w:tcMar>
+            <w:vAlign w:val="center"/>
+          </w:tcPr>
+          <w:p>
+            <w:pPr>
+              <w:jc w:val="left"/>
+            </w:pPr>
+            <w:r>
+              <w:rPr>
+                <w:rFonts w:ascii="Calibri" w:cs="Calibri" w:eastAsia="Calibri" w:hAnsi="Calibri"/>
+                <w:b w:val="false"/>
+                <w:bCs w:val="false"/>
+                <w:i w:val="false"/>
+                <w:iCs w:val="false"/>
+                <w:color w:val="000000"/>
+                <w:sz w:val="20"/>
+                <w:szCs w:val="20"/>
+              </w:rPr>
+              <w:t xml:space="preserve">uploader@abutwins.com or manager@abutwins.com</w:t>
+            </w:r>
+          </w:p>
+        </w:tc>
+        <w:tc>
+          <w:tcPr>
+            <w:tcW w:type="dxa" w:w="3360"/>
+            <w:tcBorders>
+              <w:top w:val="single" w:color="000000" w:sz="8"/>
+              <w:left w:val="single" w:color="000000" w:sz="8"/>
+              <w:bottom w:val="single" w:color="000000" w:sz="8"/>
+              <w:right w:val="single" w:color="000000" w:sz="8"/>
+            </w:tcBorders>
+            <w:shd w:fill="FFFFFF" w:color="FFFFFF" w:val="clear"/>
+            <w:tcMar>
+              <w:top w:type="dxa" w:w="60"/>
+              <w:left w:type="dxa" w:w="80"/>
+              <w:bottom w:type="dxa" w:w="60"/>
+              <w:right w:type="dxa" w:w="80"/>
+            </w:tcMar>
+            <w:vAlign w:val="center"/>
+          </w:tcPr>
+          <w:p>
+            <w:pPr>
+              <w:jc w:val="left"/>
+            </w:pPr>
+            <w:r>
+              <w:rPr>
+                <w:rFonts w:ascii="Calibri" w:cs="Calibri" w:eastAsia="Calibri" w:hAnsi="Calibri"/>
+                <w:b w:val="false"/>
+                <w:bCs w:val="false"/>
+                <w:i w:val="false"/>
+                <w:iCs w:val="false"/>
+                <w:color w:val="000000"/>
+                <w:sz w:val="20"/>
+                <w:szCs w:val="20"/>
+              </w:rPr>
+              <w:t xml:space="preserve">On Supplier bill or Many at once (Excel), put the same IMEI twice. Upload still completes. That phone sits once. A number already on the system is not doubled. Soft notes name what was folded. Staff can edit later on Phones and items or Correct and close opening stock.</w:t>
+            </w:r>
+          </w:p>
+        </w:tc>
+      </w:tr>
+      <w:tr>
+        <w:trPr>
+          <w:trHeight w:val="320" w:hRule="atLeast"/>
+        </w:trPr>
+        <w:tc>
+          <w:tcPr>
+            <w:tcW w:type="dxa" w:w="600"/>
+            <w:tcBorders>
+              <w:top w:val="single" w:color="000000" w:sz="8"/>
+              <w:left w:val="single" w:color="000000" w:sz="8"/>
+              <w:bottom w:val="single" w:color="000000" w:sz="8"/>
+              <w:right w:val="single" w:color="000000" w:sz="8"/>
+            </w:tcBorders>
+            <w:shd w:fill="F7F7F7" w:color="F7F7F7" w:val="clear"/>
+            <w:tcMar>
+              <w:top w:type="dxa" w:w="60"/>
+              <w:left w:type="dxa" w:w="80"/>
+              <w:bottom w:type="dxa" w:w="60"/>
+              <w:right w:type="dxa" w:w="80"/>
+            </w:tcMar>
+            <w:vAlign w:val="center"/>
+          </w:tcPr>
+          <w:p>
+            <w:pPr>
+              <w:jc w:val="left"/>
+            </w:pPr>
+            <w:r>
+              <w:rPr>
+                <w:rFonts w:ascii="Calibri" w:cs="Calibri" w:eastAsia="Calibri" w:hAnsi="Calibri"/>
+                <w:b w:val="false"/>
+                <w:bCs w:val="false"/>
+                <w:i w:val="false"/>
+                <w:iCs w:val="false"/>
+                <w:color w:val="000000"/>
+                <w:sz w:val="20"/>
+                <w:szCs w:val="20"/>
+              </w:rPr>
+              <w:t xml:space="preserve">75</w:t>
+            </w:r>
+          </w:p>
+        </w:tc>
+        <w:tc>
+          <w:tcPr>
+            <w:tcW w:type="dxa" w:w="2800"/>
+            <w:tcBorders>
+              <w:top w:val="single" w:color="000000" w:sz="8"/>
+              <w:left w:val="single" w:color="000000" w:sz="8"/>
+              <w:bottom w:val="single" w:color="000000" w:sz="8"/>
+              <w:right w:val="single" w:color="000000" w:sz="8"/>
+            </w:tcBorders>
+            <w:shd w:fill="F7F7F7" w:color="F7F7F7" w:val="clear"/>
+            <w:tcMar>
+              <w:top w:type="dxa" w:w="60"/>
+              <w:left w:type="dxa" w:w="80"/>
+              <w:bottom w:type="dxa" w:w="60"/>
+              <w:right w:type="dxa" w:w="80"/>
+            </w:tcMar>
+            <w:vAlign w:val="center"/>
+          </w:tcPr>
+          <w:p>
+            <w:pPr>
+              <w:jc w:val="left"/>
+            </w:pPr>
+            <w:r>
+              <w:rPr>
+                <w:rFonts w:ascii="Calibri" w:cs="Calibri" w:eastAsia="Calibri" w:hAnsi="Calibri"/>
+                <w:b w:val="false"/>
+                <w:bCs w:val="false"/>
+                <w:i w:val="false"/>
+                <w:iCs w:val="false"/>
+                <w:color w:val="000000"/>
+                <w:sz w:val="20"/>
+                <w:szCs w:val="20"/>
+              </w:rPr>
+              <w:t xml:space="preserve">Branded wait while stock uploads</w:t>
+            </w:r>
+          </w:p>
+        </w:tc>
+        <w:tc>
+          <w:tcPr>
+            <w:tcW w:type="dxa" w:w="2600"/>
+            <w:tcBorders>
+              <w:top w:val="single" w:color="000000" w:sz="8"/>
+              <w:left w:val="single" w:color="000000" w:sz="8"/>
+              <w:bottom w:val="single" w:color="000000" w:sz="8"/>
+              <w:right w:val="single" w:color="000000" w:sz="8"/>
+            </w:tcBorders>
+            <w:shd w:fill="F7F7F7" w:color="F7F7F7" w:val="clear"/>
+            <w:tcMar>
+              <w:top w:type="dxa" w:w="60"/>
+              <w:left w:type="dxa" w:w="80"/>
+              <w:bottom w:type="dxa" w:w="60"/>
+              <w:right w:type="dxa" w:w="80"/>
+            </w:tcMar>
+            <w:vAlign w:val="center"/>
+          </w:tcPr>
+          <w:p>
+            <w:pPr>
+              <w:jc w:val="left"/>
+            </w:pPr>
+            <w:r>
+              <w:rPr>
+                <w:rFonts w:ascii="Calibri" w:cs="Calibri" w:eastAsia="Calibri" w:hAnsi="Calibri"/>
+                <w:b w:val="false"/>
+                <w:bCs w:val="false"/>
+                <w:i w:val="false"/>
+                <w:iCs w:val="false"/>
+                <w:color w:val="000000"/>
+                <w:sz w:val="20"/>
+                <w:szCs w:val="20"/>
+              </w:rPr>
+              <w:t xml:space="preserve">uploader@abutwins.com or manager@abutwins.com</w:t>
+            </w:r>
+          </w:p>
+        </w:tc>
+        <w:tc>
+          <w:tcPr>
+            <w:tcW w:type="dxa" w:w="3360"/>
+            <w:tcBorders>
+              <w:top w:val="single" w:color="000000" w:sz="8"/>
+              <w:left w:val="single" w:color="000000" w:sz="8"/>
+              <w:bottom w:val="single" w:color="000000" w:sz="8"/>
+              <w:right w:val="single" w:color="000000" w:sz="8"/>
+            </w:tcBorders>
+            <w:shd w:fill="F7F7F7" w:color="F7F7F7" w:val="clear"/>
+            <w:tcMar>
+              <w:top w:type="dxa" w:w="60"/>
+              <w:left w:type="dxa" w:w="80"/>
+              <w:bottom w:type="dxa" w:w="60"/>
+              <w:right w:type="dxa" w:w="80"/>
+            </w:tcMar>
+            <w:vAlign w:val="center"/>
+          </w:tcPr>
+          <w:p>
+            <w:pPr>
+              <w:jc w:val="left"/>
+            </w:pPr>
+            <w:r>
+              <w:rPr>
+                <w:rFonts w:ascii="Calibri" w:cs="Calibri" w:eastAsia="Calibri" w:hAnsi="Calibri"/>
+                <w:b w:val="false"/>
+                <w:bCs w:val="false"/>
+                <w:i w:val="false"/>
+                <w:iCs w:val="false"/>
+                <w:color w:val="000000"/>
+                <w:sz w:val="20"/>
+                <w:szCs w:val="20"/>
+              </w:rPr>
+              <w:t xml:space="preserve">Start an opening stock or Supplier bill upload. The full screen shows the Abu Twins mark, a title that names the shop, moving status lines, and a percent bar. The page returns after 100 percent.</w:t>
+            </w:r>
+          </w:p>
+        </w:tc>
+      </w:tr>
     </w:tbl>
     <w:p>
       <w:pPr>
@@ -50899,7 +51274,7 @@
           <w:sz w:val="22"/>
           <w:szCs w:val="22"/>
         </w:rPr>
-        <w:t xml:space="preserve">Sending the same sheet twice is safe. A phone or customer already on the system is left exactly as it is.</w:t>
+        <w:t xml:space="preserve">Sending the same sheet twice is safe. A repeated IMEI or serial is counted once. A phone already on the system is left as it is and is not doubled. Staff can edit later on Correct and close opening stock or Phones and items.</w:t>
       </w:r>
     </w:p>
     <w:p>
@@ -52367,6 +52742,44 @@
           <w:szCs w:val="22"/>
         </w:rPr>
         <w:t xml:space="preserve">Version 1.47 makes Returns show true value. Log a return records return item value. Replace from our stock picks an In shop unit and its value, with Receivable or Payable. After approval, Apply moves stock and settles the money. Correct and close opening stock remains the place to fill zero prices and missing piece counts before Close.</w:t>
+      </w:r>
+    </w:p>
+    <w:p>
+      <w:pPr>
+        <w:spacing w:after="160" w:before="0" w:line="276"/>
+        <w:jc w:val="left"/>
+      </w:pPr>
+      <w:r>
+        <w:rPr>
+          <w:rFonts w:ascii="Calibri" w:cs="Calibri" w:eastAsia="Calibri" w:hAnsi="Calibri"/>
+          <w:b w:val="false"/>
+          <w:bCs w:val="false"/>
+          <w:i w:val="false"/>
+          <w:iCs w:val="false"/>
+          <w:color w:val="000000"/>
+          <w:sz w:val="22"/>
+          <w:szCs w:val="22"/>
+        </w:rPr>
+        <w:t xml:space="preserve">Version 1.48 makes every stock upload treat a repeated IMEI or serial as one entry. The upload still completes. Numbers already on the system are not doubled. Staff can correct the shelf later on Correct and close opening stock or Phones and items.</w:t>
+      </w:r>
+    </w:p>
+    <w:p>
+      <w:pPr>
+        <w:spacing w:after="160" w:before="0" w:line="276"/>
+        <w:jc w:val="left"/>
+      </w:pPr>
+      <w:r>
+        <w:rPr>
+          <w:rFonts w:ascii="Calibri" w:cs="Calibri" w:eastAsia="Calibri" w:hAnsi="Calibri"/>
+          <w:b w:val="false"/>
+          <w:bCs w:val="false"/>
+          <w:i w:val="false"/>
+          <w:iCs w:val="false"/>
+          <w:color w:val="000000"/>
+          <w:sz w:val="22"/>
+          <w:szCs w:val="22"/>
+        </w:rPr>
+        <w:t xml:space="preserve">Version 1.49 puts a branded wait screen on long jobs. When you upload stock, sign in, sign out, or open a heavy page, the Abu Twins mark shows with a moving status line and a percent bar. Opening stock names the shop, for example Uploading opening stock to Iwo Road. Keep the page open until the bar reaches 100 percent.</w:t>
       </w:r>
     </w:p>
     <w:p>

</xml_diff>

<commit_message>
Keep each shop’s stock, sales, and expenses on that shop only.
Opening uploads no longer create zero shelf rows on other shops, and shop staff cannot sell or book money against another branch.

Co-authored-by: Cursor <cursoragent@cursor.com>
</commit_message>
<xml_diff>
--- a/docs/Abu-Twins-Shop-System-User-Guide.docx
+++ b/docs/Abu-Twins-Shop-System-User-Guide.docx
@@ -459,7 +459,7 @@
                 <w:sz w:val="20"/>
                 <w:szCs w:val="20"/>
               </w:rPr>
-              <w:t xml:space="preserve">1.49</w:t>
+              <w:t xml:space="preserve">1.50</w:t>
             </w:r>
           </w:p>
         </w:tc>
@@ -533,7 +533,7 @@
                 <w:sz w:val="20"/>
                 <w:szCs w:val="20"/>
               </w:rPr>
-              <w:t xml:space="preserve">Updated: branded wait screens with percent and shop-named status</w:t>
+              <w:t xml:space="preserve">Updated: each shop keeps its own stock, sales, and values</w:t>
             </w:r>
           </w:p>
         </w:tc>
@@ -50402,6 +50402,159 @@
           </w:p>
         </w:tc>
       </w:tr>
+      <w:tr>
+        <w:trPr>
+          <w:trHeight w:val="320" w:hRule="atLeast"/>
+        </w:trPr>
+        <w:tc>
+          <w:tcPr>
+            <w:tcW w:type="dxa" w:w="600"/>
+            <w:tcBorders>
+              <w:top w:val="single" w:color="000000" w:sz="8"/>
+              <w:left w:val="single" w:color="000000" w:sz="8"/>
+              <w:bottom w:val="single" w:color="000000" w:sz="8"/>
+              <w:right w:val="single" w:color="000000" w:sz="8"/>
+            </w:tcBorders>
+            <w:shd w:fill="FFFFFF" w:color="FFFFFF" w:val="clear"/>
+            <w:tcMar>
+              <w:top w:type="dxa" w:w="60"/>
+              <w:left w:type="dxa" w:w="80"/>
+              <w:bottom w:type="dxa" w:w="60"/>
+              <w:right w:type="dxa" w:w="80"/>
+            </w:tcMar>
+            <w:vAlign w:val="center"/>
+          </w:tcPr>
+          <w:p>
+            <w:pPr>
+              <w:jc w:val="left"/>
+            </w:pPr>
+            <w:r>
+              <w:rPr>
+                <w:rFonts w:ascii="Calibri" w:cs="Calibri" w:eastAsia="Calibri" w:hAnsi="Calibri"/>
+                <w:b w:val="false"/>
+                <w:bCs w:val="false"/>
+                <w:i w:val="false"/>
+                <w:iCs w:val="false"/>
+                <w:color w:val="000000"/>
+                <w:sz w:val="20"/>
+                <w:szCs w:val="20"/>
+              </w:rPr>
+              <w:t xml:space="preserve">76</w:t>
+            </w:r>
+          </w:p>
+        </w:tc>
+        <w:tc>
+          <w:tcPr>
+            <w:tcW w:type="dxa" w:w="2800"/>
+            <w:tcBorders>
+              <w:top w:val="single" w:color="000000" w:sz="8"/>
+              <w:left w:val="single" w:color="000000" w:sz="8"/>
+              <w:bottom w:val="single" w:color="000000" w:sz="8"/>
+              <w:right w:val="single" w:color="000000" w:sz="8"/>
+            </w:tcBorders>
+            <w:shd w:fill="FFFFFF" w:color="FFFFFF" w:val="clear"/>
+            <w:tcMar>
+              <w:top w:type="dxa" w:w="60"/>
+              <w:left w:type="dxa" w:w="80"/>
+              <w:bottom w:type="dxa" w:w="60"/>
+              <w:right w:type="dxa" w:w="80"/>
+            </w:tcMar>
+            <w:vAlign w:val="center"/>
+          </w:tcPr>
+          <w:p>
+            <w:pPr>
+              <w:jc w:val="left"/>
+            </w:pPr>
+            <w:r>
+              <w:rPr>
+                <w:rFonts w:ascii="Calibri" w:cs="Calibri" w:eastAsia="Calibri" w:hAnsi="Calibri"/>
+                <w:b w:val="false"/>
+                <w:bCs w:val="false"/>
+                <w:i w:val="false"/>
+                <w:iCs w:val="false"/>
+                <w:color w:val="000000"/>
+                <w:sz w:val="20"/>
+                <w:szCs w:val="20"/>
+              </w:rPr>
+              <w:t xml:space="preserve">Iwo upload does not fill Challenge</w:t>
+            </w:r>
+          </w:p>
+        </w:tc>
+        <w:tc>
+          <w:tcPr>
+            <w:tcW w:type="dxa" w:w="2600"/>
+            <w:tcBorders>
+              <w:top w:val="single" w:color="000000" w:sz="8"/>
+              <w:left w:val="single" w:color="000000" w:sz="8"/>
+              <w:bottom w:val="single" w:color="000000" w:sz="8"/>
+              <w:right w:val="single" w:color="000000" w:sz="8"/>
+            </w:tcBorders>
+            <w:shd w:fill="FFFFFF" w:color="FFFFFF" w:val="clear"/>
+            <w:tcMar>
+              <w:top w:type="dxa" w:w="60"/>
+              <w:left w:type="dxa" w:w="80"/>
+              <w:bottom w:type="dxa" w:w="60"/>
+              <w:right w:type="dxa" w:w="80"/>
+            </w:tcMar>
+            <w:vAlign w:val="center"/>
+          </w:tcPr>
+          <w:p>
+            <w:pPr>
+              <w:jc w:val="left"/>
+            </w:pPr>
+            <w:r>
+              <w:rPr>
+                <w:rFonts w:ascii="Calibri" w:cs="Calibri" w:eastAsia="Calibri" w:hAnsi="Calibri"/>
+                <w:b w:val="false"/>
+                <w:bCs w:val="false"/>
+                <w:i w:val="false"/>
+                <w:iCs w:val="false"/>
+                <w:color w:val="000000"/>
+                <w:sz w:val="20"/>
+                <w:szCs w:val="20"/>
+              </w:rPr>
+              <w:t xml:space="preserve">uploader@abutwins.com</w:t>
+            </w:r>
+          </w:p>
+        </w:tc>
+        <w:tc>
+          <w:tcPr>
+            <w:tcW w:type="dxa" w:w="3360"/>
+            <w:tcBorders>
+              <w:top w:val="single" w:color="000000" w:sz="8"/>
+              <w:left w:val="single" w:color="000000" w:sz="8"/>
+              <w:bottom w:val="single" w:color="000000" w:sz="8"/>
+              <w:right w:val="single" w:color="000000" w:sz="8"/>
+            </w:tcBorders>
+            <w:shd w:fill="FFFFFF" w:color="FFFFFF" w:val="clear"/>
+            <w:tcMar>
+              <w:top w:type="dxa" w:w="60"/>
+              <w:left w:type="dxa" w:w="80"/>
+              <w:bottom w:type="dxa" w:w="60"/>
+              <w:right w:type="dxa" w:w="80"/>
+            </w:tcMar>
+            <w:vAlign w:val="center"/>
+          </w:tcPr>
+          <w:p>
+            <w:pPr>
+              <w:jc w:val="left"/>
+            </w:pPr>
+            <w:r>
+              <w:rPr>
+                <w:rFonts w:ascii="Calibri" w:cs="Calibri" w:eastAsia="Calibri" w:hAnsi="Calibri"/>
+                <w:b w:val="false"/>
+                <w:bCs w:val="false"/>
+                <w:i w:val="false"/>
+                <w:iCs w:val="false"/>
+                <w:color w:val="000000"/>
+                <w:sz w:val="20"/>
+                <w:szCs w:val="20"/>
+              </w:rPr>
+              <w:t xml:space="preserve">Upload opening stock for Iwo Road only. Challenge Shop stock stays empty for those units. Sell now at Challenge cannot scan Iwo IMEIs. Head office shop picker on Iwo shows Iwo totals only.</w:t>
+            </w:r>
+          </w:p>
+        </w:tc>
+      </w:tr>
     </w:tbl>
     <w:p>
       <w:pPr>
@@ -52780,6 +52933,25 @@
           <w:szCs w:val="22"/>
         </w:rPr>
         <w:t xml:space="preserve">Version 1.49 puts a branded wait screen on long jobs. When you upload stock, sign in, sign out, or open a heavy page, the Abu Twins mark shows with a moving status line and a percent bar. Opening stock names the shop, for example Uploading opening stock to Iwo Road. Keep the page open until the bar reaches 100 percent.</w:t>
+      </w:r>
+    </w:p>
+    <w:p>
+      <w:pPr>
+        <w:spacing w:after="160" w:before="0" w:line="276"/>
+        <w:jc w:val="left"/>
+      </w:pPr>
+      <w:r>
+        <w:rPr>
+          <w:rFonts w:ascii="Calibri" w:cs="Calibri" w:eastAsia="Calibri" w:hAnsi="Calibri"/>
+          <w:b w:val="false"/>
+          <w:bCs w:val="false"/>
+          <w:i w:val="false"/>
+          <w:iCs w:val="false"/>
+          <w:color w:val="000000"/>
+          <w:sz w:val="22"/>
+          <w:szCs w:val="22"/>
+        </w:rPr>
+        <w:t xml:space="preserve">Version 1.50 keeps each shop's stock and money apart. Uploading for Iwo Road books only Iwo Road. Sell now, expenses, and uploads for shop staff stay in their own shop. Head office can still pick a shop at the top and see that shop's real totals.</w:t>
       </w:r>
     </w:p>
     <w:p>

</xml_diff>

<commit_message>
Add Opening Stock as the default supplier when the house is unknown.
Staff can upload shelf stock without a phone number, and missing form fields now show plain shop messages.

Co-authored-by: Cursor <cursoragent@cursor.com>
</commit_message>
<xml_diff>
--- a/docs/Abu-Twins-Shop-System-User-Guide.docx
+++ b/docs/Abu-Twins-Shop-System-User-Guide.docx
@@ -459,7 +459,7 @@
                 <w:sz w:val="20"/>
                 <w:szCs w:val="20"/>
               </w:rPr>
-              <w:t xml:space="preserve">1.50</w:t>
+              <w:t xml:space="preserve">1.51</w:t>
             </w:r>
           </w:p>
         </w:tc>
@@ -533,7 +533,7 @@
                 <w:sz w:val="20"/>
                 <w:szCs w:val="20"/>
               </w:rPr>
-              <w:t xml:space="preserve">Updated: each shop keeps its own stock, sales, and values</w:t>
+              <w:t xml:space="preserve">Updated: Opening Stock supplier option when the house is not known yet</w:t>
             </w:r>
           </w:p>
         </w:tc>
@@ -52952,6 +52952,25 @@
           <w:szCs w:val="22"/>
         </w:rPr>
         <w:t xml:space="preserve">Version 1.50 keeps each shop's stock and money apart. Uploading for Iwo Road books only Iwo Road. Sell now, expenses, and uploads for shop staff stay in their own shop. Head office can still pick a shop at the top and see that shop's real totals.</w:t>
+      </w:r>
+    </w:p>
+    <w:p>
+      <w:pPr>
+        <w:spacing w:after="160" w:before="0" w:line="276"/>
+        <w:jc w:val="left"/>
+      </w:pPr>
+      <w:r>
+        <w:rPr>
+          <w:rFonts w:ascii="Calibri" w:cs="Calibri" w:eastAsia="Calibri" w:hAnsi="Calibri"/>
+          <w:b w:val="false"/>
+          <w:bCs w:val="false"/>
+          <w:i w:val="false"/>
+          <w:iCs w:val="false"/>
+          <w:color w:val="000000"/>
+          <w:sz w:val="22"/>
+          <w:szCs w:val="22"/>
+        </w:rPr>
+        <w:t xml:space="preserve">Version 1.51 adds Opening Stock as a supplier choice on Many at once (Excel). Use it when stock is already on the shelf and the real house is not known yet. No phone number is required for that choice. Form checks speak in plain shop words when something is missing.</w:t>
       </w:r>
     </w:p>
     <w:p>

</xml_diff>

<commit_message>
Restrict permanent deletes to the CEO and document the all-shop auditor.
Keep Super Admin reach for audit work across shops while only the Managing Director can remove brands, items, banks, or lock staff logins.

Co-authored-by: Cursor <cursoragent@cursor.com>
</commit_message>
<xml_diff>
--- a/docs/Abu-Twins-Shop-System-User-Guide.docx
+++ b/docs/Abu-Twins-Shop-System-User-Guide.docx
@@ -385,7 +385,7 @@
                 <w:sz w:val="20"/>
                 <w:szCs w:val="20"/>
               </w:rPr>
-              <w:t xml:space="preserve">17 September 2026</w:t>
+              <w:t xml:space="preserve">18 September 2026</w:t>
             </w:r>
           </w:p>
         </w:tc>
@@ -459,7 +459,7 @@
                 <w:sz w:val="20"/>
                 <w:szCs w:val="20"/>
               </w:rPr>
-              <w:t xml:space="preserve">1.51</w:t>
+              <w:t xml:space="preserve">1.52</w:t>
             </w:r>
           </w:p>
         </w:tc>
@@ -533,7 +533,7 @@
                 <w:sz w:val="20"/>
                 <w:szCs w:val="20"/>
               </w:rPr>
-              <w:t xml:space="preserve">Updated: Opening Stock supplier option when the house is not known yet</w:t>
+              <w:t xml:space="preserve">Updated: all-shop auditor login; only the CEO can permanently remove</w:t>
             </w:r>
           </w:p>
         </w:tc>
@@ -806,7 +806,7 @@
           <w:sz w:val="22"/>
           <w:szCs w:val="22"/>
         </w:rPr>
-        <w:t xml:space="preserve">This release also answers the question of how the shops get loaded in the first place. Your team can now put the whole business into the system from an Excel sheet: the item list, what is on each shelf, and every phone by IMEI. Booking a container in by hand, one phone at a time, is where an evening goes. A sheet does it in one press.</w:t>
+        <w:t xml:space="preserve">From this version, permanently removing brands, items, bank accounts, or locking a staff login is for the Managing Director only. The all-shop auditor can oversee every branch like Super Admin, but cannot wipe those records.</w:t>
       </w:r>
     </w:p>
     <w:p>
@@ -825,7 +825,7 @@
           <w:sz w:val="22"/>
           <w:szCs w:val="22"/>
         </w:rPr>
-        <w:t xml:space="preserve">Because that is powerful, it is also narrow. A new job called Stock uploader does only that work. It cannot sell, cannot see money, and cannot approve anything. Loading the item list is now limited to that job and to Super Admin, so three shops cannot end up with three different names for the same phone.</w:t>
+        <w:t xml:space="preserve">This release also answers the question of how the shops get loaded in the first place. Your team can now put the whole business into the system from an Excel sheet: the item list, what is on each shelf, and every phone by IMEI. Booking a container in by hand, one phone at a time, is where an evening goes. A sheet does it in one press.</w:t>
       </w:r>
     </w:p>
     <w:p>
@@ -844,7 +844,7 @@
           <w:sz w:val="22"/>
           <w:szCs w:val="22"/>
         </w:rPr>
-        <w:t xml:space="preserve">Every sale can now be handed over as a receipt: saved as a file to send to a customer, printed for a whole day at once, or printed the moment the sale is finished at the till.</w:t>
+        <w:t xml:space="preserve">Because that is powerful, it is also narrow. A new job called Stock uploader does only that work. It cannot sell, cannot see money, and cannot approve anything. Loading the item list is now limited to that job and to Super Admin, so three shops cannot end up with three different names for the same phone.</w:t>
       </w:r>
     </w:p>
     <w:p>
@@ -863,7 +863,7 @@
           <w:sz w:val="22"/>
           <w:szCs w:val="22"/>
         </w:rPr>
-        <w:t xml:space="preserve">Long lists are easier to read now. On Sales, Goods from supplier, Expenses, Shop to shop, Needs approval, Returns, Swap Deal, Repairs, Goods on the way, and Phone IMEIs, you can tap a status chip or a stage to show only that cut. Time on each row is Lagos time, in plain words like Today, 14:30.</w:t>
+        <w:t xml:space="preserve">Every sale can now be handed over as a receipt: saved as a file to send to a customer, printed for a whole day at once, or printed the moment the sale is finished at the till.</w:t>
       </w:r>
     </w:p>
     <w:p>
@@ -882,7 +882,7 @@
           <w:sz w:val="22"/>
           <w:szCs w:val="22"/>
         </w:rPr>
-        <w:t xml:space="preserve">This release also makes everyday words clearer for the till. Trade-In and Exchange is now Swap Deal on the left menu. Profit shows each phone with its storage and condition, the cost price, and a button to extract the list. Cashiers can open Money in and out and Customers and money owed so they can follow people who bought on credit. When you put a phone on the shelf, How the phone looks uses Brand new, Uk, OPENBOX, Faulty, and Non Active, you can add a new supplier on the spot, and battery health is no longer asked.</w:t>
+        <w:t xml:space="preserve">Long lists are easier to read now. On Sales, Goods from supplier, Expenses, Shop to shop, Needs approval, Returns, Swap Deal, Repairs, Goods on the way, and Phone IMEIs, you can tap a status chip or a stage to show only that cut. Time on each row is Lagos time, in plain words like Today, 14:30.</w:t>
       </w:r>
     </w:p>
     <w:p>
@@ -901,7 +901,7 @@
           <w:sz w:val="22"/>
           <w:szCs w:val="22"/>
         </w:rPr>
-        <w:t xml:space="preserve">Upload stock is easy to find again. The left menu says Upload stock, not Data Import. You can load many phones at once from Excel, or add phones one after another on a supplier bill, or put one phone on the shelf with no bill. Shop managers, goods intake, and the stock uploader can use both ways.</w:t>
+        <w:t xml:space="preserve">This release also makes everyday words clearer for the till. Trade-In and Exchange is now Swap Deal on the left menu. Profit shows each phone with its storage and condition, the cost price, and a button to extract the list. Cashiers can open Money in and out and Customers and money owed so they can follow people who bought on credit. When you put a phone on the shelf, How the phone looks uses Brand new, Uk, OPENBOX, Faulty, and Non Active, you can add a new supplier on the spot, and battery health is no longer asked.</w:t>
       </w:r>
     </w:p>
     <w:p>
@@ -920,7 +920,7 @@
           <w:sz w:val="22"/>
           <w:szCs w:val="22"/>
         </w:rPr>
-        <w:t xml:space="preserve">Correct and close opening stock now shows each item's category. You can tap Phones, Accessories, Screen, or Laptop so different people can count different groups at the same time.</w:t>
+        <w:t xml:space="preserve">Upload stock is easy to find again. The left menu says Upload stock, not Data Import. You can load many phones at once from Excel, or add phones one after another on a supplier bill, or put one phone on the shelf with no bill. Shop managers, goods intake, and the stock uploader can use both ways.</w:t>
       </w:r>
     </w:p>
     <w:p>
@@ -939,7 +939,7 @@
           <w:sz w:val="22"/>
           <w:szCs w:val="22"/>
         </w:rPr>
-        <w:t xml:space="preserve">Close the day is more flexible for shops that sell mostly by transfer and POS. Cash remittance is required only when cash came into the till. Transfer and POS days still close so Sell now can open the next day, but with no till count. The Financial Accountant and records checker can open every shop page to oversee the business. They can post money. They cannot sell, open repairs, load stock, approve shop work, or change Who can see what.</w:t>
+        <w:t xml:space="preserve">Correct and close opening stock now shows each item's category. You can tap Phones, Accessories, Screen, or Laptop so different people can count different groups at the same time.</w:t>
       </w:r>
     </w:p>
     <w:p>
@@ -958,7 +958,7 @@
           <w:sz w:val="22"/>
           <w:szCs w:val="22"/>
         </w:rPr>
-        <w:t xml:space="preserve">Opening stock from Excel is now value only. You pick or add the supplier, upload the shop sheet, and the system stores quantity, cost, and selling prices. It is not a bill to pay, and it cannot make money short. New cartons with a supplier bill still use Supplier bill, where paid or unpaid belongs. Check the books now counts Cash received, Transfer received, and POS received from the money that actually came in, even when the sale is on credit. Credit sales is only the remaining balance. Warranty on a new item starts at zero days. The cashier sets the days on the sale.</w:t>
+        <w:t xml:space="preserve">Close the day is more flexible for shops that sell mostly by transfer and POS. Cash remittance is required only when cash came into the till. Transfer and POS days still close so Sell now can open the next day, but with no till count. The Financial Accountant and records checker can open every shop page to oversee the business. They can post money. They cannot sell, open repairs, load stock, approve shop work, or change Who can see what.</w:t>
       </w:r>
     </w:p>
     <w:p>
@@ -977,7 +977,7 @@
           <w:sz w:val="22"/>
           <w:szCs w:val="22"/>
         </w:rPr>
-        <w:t xml:space="preserve">On Sell now, credit sales can still take money today. The cashier types the amount received now and says if it was cash, transfer, or POS. Check the books then shows that deposit in the right box, and Credit sales as only what is still owed.</w:t>
+        <w:t xml:space="preserve">Opening stock from Excel is now value only. You pick or add the supplier, upload the shop sheet, and the system stores quantity, cost, and selling prices. It is not a bill to pay, and it cannot make money short. New cartons with a supplier bill still use Supplier bill, where paid or unpaid belongs. Check the books now counts Cash received, Transfer received, and POS received from the money that actually came in, even when the sale is on credit. Credit sales is only the remaining balance. Warranty on a new item starts at zero days. The cashier sets the days on the sale.</w:t>
       </w:r>
     </w:p>
     <w:p>
@@ -996,7 +996,7 @@
           <w:sz w:val="22"/>
           <w:szCs w:val="22"/>
         </w:rPr>
-        <w:t xml:space="preserve">The leftover office words on the left menu, Home, Shop stock, Money in and out, Reports, Check the books, and Who can see what are now shop words. Staff see Home, Sell now, Close the day, Shop stock, Cost, and Sell price, not Point of Sale, SKU, or Cost Basis. How the phone looks stays Brand new, Uk, OPENBOX, Faulty, and Non Active.</w:t>
+        <w:t xml:space="preserve">On Sell now, credit sales can still take money today. The cashier types the amount received now and says if it was cash, transfer, or POS. Check the books then shows that deposit in the right box, and Credit sales as only what is still owed.</w:t>
       </w:r>
     </w:p>
     <w:p>
@@ -1015,7 +1015,7 @@
           <w:sz w:val="22"/>
           <w:szCs w:val="22"/>
         </w:rPr>
-        <w:t xml:space="preserve">On Sell now, a scanned IMEI now shows storage and How the phone looks from the intake, not only the item name. After the sale, the till clears for the next buyer. Buttons say this sale, not cart or transaction.</w:t>
+        <w:t xml:space="preserve">The leftover office words on the left menu, Home, Shop stock, Money in and out, Reports, Check the books, and Who can see what are now shop words. Staff see Home, Sell now, Close the day, Shop stock, Cost, and Sell price, not Point of Sale, SKU, or Cost Basis. How the phone looks stays Brand new, Uk, OPENBOX, Faulty, and Non Active.</w:t>
       </w:r>
     </w:p>
     <w:p>
@@ -1034,7 +1034,7 @@
           <w:sz w:val="22"/>
           <w:szCs w:val="22"/>
         </w:rPr>
-        <w:t xml:space="preserve">This release is for going live. Reports now opens one day, the last 7 days, or this month so far, and puts last period next to this period so a meeting can see movement. Stock intake can take a larger Excel sheet, and phones are written in batches so a big carton does not time out. Sell now does not load every IMEI into the phone. Scan the number. When the line drops, parked sales stay on the device. When the line returns, the remaining sales still send even if one sale needs a fix. Redis on the server does not help a cashier phone when MTN drops. The phone store and the service worker do.</w:t>
+        <w:t xml:space="preserve">On Sell now, a scanned IMEI now shows storage and How the phone looks from the intake, not only the item name. After the sale, the till clears for the next buyer. Buttons say this sale, not cart or transaction.</w:t>
       </w:r>
     </w:p>
     <w:p>
@@ -1053,7 +1053,26 @@
           <w:sz w:val="22"/>
           <w:szCs w:val="22"/>
         </w:rPr>
-        <w:t xml:space="preserve">The owner asked that the main admin and the CEO must both be able to correct the shop. They can now undo a true money mistake, change Who can see what, change Settings, open or close a shop, lock a staff login, and download a shop backup. Every correction is a new named step. An old invoice still cannot be secretly rewritten.</w:t>
+        <w:t xml:space="preserve">This release is for going live. Reports now opens one day, the last 7 days, or this month so far, and puts last period next to this period so a meeting can see movement. Stock intake can take a larger Excel sheet, and phones are written in batches so a big carton does not time out. Sell now does not load every IMEI into the phone. Scan the number. When the line drops, parked sales stay on the device. When the line returns, the remaining sales still send even if one sale needs a fix. Redis on the server does not help a cashier phone when MTN drops. The phone store and the service worker do.</w:t>
+      </w:r>
+    </w:p>
+    <w:p>
+      <w:pPr>
+        <w:spacing w:after="160" w:before="0" w:line="276"/>
+        <w:jc w:val="left"/>
+      </w:pPr>
+      <w:r>
+        <w:rPr>
+          <w:rFonts w:ascii="Calibri" w:cs="Calibri" w:eastAsia="Calibri" w:hAnsi="Calibri"/>
+          <w:b w:val="false"/>
+          <w:bCs w:val="false"/>
+          <w:i w:val="false"/>
+          <w:iCs w:val="false"/>
+          <w:color w:val="000000"/>
+          <w:sz w:val="22"/>
+          <w:szCs w:val="22"/>
+        </w:rPr>
+        <w:t xml:space="preserve">The owner asked that the main admin and the CEO must both be able to correct the shop. They can now undo a true money mistake, change Who can see what, change Settings, open or close a shop, and download a shop backup. Permanently removing brands, items, or bank accounts, and locking a staff login, is for the Managing Director only. Every correction is a new named step. An old invoice still cannot be secretly rewritten.</w:t>
       </w:r>
     </w:p>
     <w:p>
@@ -9675,7 +9694,7 @@
                 <w:sz w:val="20"/>
                 <w:szCs w:val="20"/>
               </w:rPr>
-              <w:t xml:space="preserve">See all shops. Watch sales, stock, and money. Cannot change Who can see what.</w:t>
+              <w:t xml:space="preserve">See all shops. Watch sales, stock, and money. Only the CEO can permanently remove brands, items, banks, or lock a staff login.</w:t>
             </w:r>
           </w:p>
         </w:tc>
@@ -9949,7 +9968,7 @@
                 <w:sz w:val="20"/>
                 <w:szCs w:val="20"/>
               </w:rPr>
-              <w:t xml:space="preserve">Shop manager</w:t>
+              <w:t xml:space="preserve">Auditor (all shops)</w:t>
             </w:r>
           </w:p>
         </w:tc>
@@ -9986,7 +10005,7 @@
                 <w:sz w:val="20"/>
                 <w:szCs w:val="20"/>
               </w:rPr>
-              <w:t xml:space="preserve">The manager at Iwo Road, Bodija, or Challenge</w:t>
+              <w:t xml:space="preserve">Internal auditor with Super Admin reach</w:t>
             </w:r>
           </w:p>
         </w:tc>
@@ -10023,7 +10042,7 @@
                 <w:sz w:val="20"/>
                 <w:szCs w:val="20"/>
               </w:rPr>
-              <w:t xml:space="preserve">Run one shop. Sell, receive, upload stock, transfer, approve shop work. Sees only that shop. Does not add items or change prices.</w:t>
+              <w:t xml:space="preserve">Same reach as Super Admin across every branch for audit work. Cannot permanently remove brands, items, banks, or lock staff. Only the CEO can.</w:t>
             </w:r>
           </w:p>
         </w:tc>
@@ -10065,7 +10084,7 @@
                 <w:sz w:val="20"/>
                 <w:szCs w:val="20"/>
               </w:rPr>
-              <w:t xml:space="preserve">Goods intake</w:t>
+              <w:t xml:space="preserve">Shop manager</w:t>
             </w:r>
           </w:p>
         </w:tc>
@@ -10102,7 +10121,7 @@
                 <w:sz w:val="20"/>
                 <w:szCs w:val="20"/>
               </w:rPr>
-              <w:t xml:space="preserve">The person who books incoming goods</w:t>
+              <w:t xml:space="preserve">The manager at Iwo Road, Bodija, or Challenge</w:t>
             </w:r>
           </w:p>
         </w:tc>
@@ -10139,7 +10158,7 @@
                 <w:sz w:val="20"/>
                 <w:szCs w:val="20"/>
               </w:rPr>
-              <w:t xml:space="preserve">Book goods before they arrive. Receive phones. Upload stock one by one or many from Excel. Send goods to a shop.</w:t>
+              <w:t xml:space="preserve">Run one shop. Sell, receive, upload stock, transfer, approve shop work. Sees only that shop. Does not add items or change prices.</w:t>
             </w:r>
           </w:p>
         </w:tc>
@@ -10181,7 +10200,7 @@
                 <w:sz w:val="20"/>
                 <w:szCs w:val="20"/>
               </w:rPr>
-              <w:t xml:space="preserve">Stock uploader</w:t>
+              <w:t xml:space="preserve">Goods intake</w:t>
             </w:r>
           </w:p>
         </w:tc>
@@ -10218,7 +10237,7 @@
                 <w:sz w:val="20"/>
                 <w:szCs w:val="20"/>
               </w:rPr>
-              <w:t xml:space="preserve">The person who puts stock on the shelf in the system</w:t>
+              <w:t xml:space="preserve">The person who books incoming goods</w:t>
             </w:r>
           </w:p>
         </w:tc>
@@ -10255,7 +10274,7 @@
                 <w:sz w:val="20"/>
                 <w:szCs w:val="20"/>
               </w:rPr>
-              <w:t xml:space="preserve">Upload stock on a supplier bill, one phone at a time, or many from Excel. Add item names. No selling, no posting cash, no approving.</w:t>
+              <w:t xml:space="preserve">Book goods before they arrive. Receive phones. Upload stock one by one or many from Excel. Send goods to a shop.</w:t>
             </w:r>
           </w:p>
         </w:tc>
@@ -10297,7 +10316,7 @@
                 <w:sz w:val="20"/>
                 <w:szCs w:val="20"/>
               </w:rPr>
-              <w:t xml:space="preserve">Cashier</w:t>
+              <w:t xml:space="preserve">Stock uploader</w:t>
             </w:r>
           </w:p>
         </w:tc>
@@ -10334,7 +10353,7 @@
                 <w:sz w:val="20"/>
                 <w:szCs w:val="20"/>
               </w:rPr>
-              <w:t xml:space="preserve">Front desk money person</w:t>
+              <w:t xml:space="preserve">The person who puts stock on the shelf in the system</w:t>
             </w:r>
           </w:p>
         </w:tc>
@@ -10371,7 +10390,7 @@
                 <w:sz w:val="20"/>
                 <w:szCs w:val="20"/>
               </w:rPr>
-              <w:t xml:space="preserve">Sell now. Close the day. Collect money. Record a return. Write shop expenses. See who still owes us.</w:t>
+              <w:t xml:space="preserve">Upload stock on a supplier bill, one phone at a time, or many from Excel. Add item names. No selling, no posting cash, no approving.</w:t>
             </w:r>
           </w:p>
         </w:tc>
@@ -10413,7 +10432,7 @@
                 <w:sz w:val="20"/>
                 <w:szCs w:val="20"/>
               </w:rPr>
-              <w:t xml:space="preserve">Sales person</w:t>
+              <w:t xml:space="preserve">Cashier</w:t>
             </w:r>
           </w:p>
         </w:tc>
@@ -10450,7 +10469,7 @@
                 <w:sz w:val="20"/>
                 <w:szCs w:val="20"/>
               </w:rPr>
-              <w:t xml:space="preserve">Floor seller</w:t>
+              <w:t xml:space="preserve">Front desk money person</w:t>
             </w:r>
           </w:p>
         </w:tc>
@@ -10487,7 +10506,7 @@
                 <w:sz w:val="20"/>
                 <w:szCs w:val="20"/>
               </w:rPr>
-              <w:t xml:space="preserve">Sell now. Close the day. See customers, money owed, expenses, and items.</w:t>
+              <w:t xml:space="preserve">Sell now. Close the day. Collect money. Record a return. Write shop expenses. See who still owes us.</w:t>
             </w:r>
           </w:p>
         </w:tc>
@@ -10529,6 +10548,122 @@
                 <w:sz w:val="20"/>
                 <w:szCs w:val="20"/>
               </w:rPr>
+              <w:t xml:space="preserve">Sales person</w:t>
+            </w:r>
+          </w:p>
+        </w:tc>
+        <w:tc>
+          <w:tcPr>
+            <w:tcW w:type="dxa" w:w="3000"/>
+            <w:tcBorders>
+              <w:top w:val="single" w:color="000000" w:sz="8"/>
+              <w:left w:val="single" w:color="000000" w:sz="8"/>
+              <w:bottom w:val="single" w:color="000000" w:sz="8"/>
+              <w:right w:val="single" w:color="000000" w:sz="8"/>
+            </w:tcBorders>
+            <w:shd w:fill="F7F7F7" w:color="F7F7F7" w:val="clear"/>
+            <w:tcMar>
+              <w:top w:type="dxa" w:w="60"/>
+              <w:left w:type="dxa" w:w="80"/>
+              <w:bottom w:type="dxa" w:w="60"/>
+              <w:right w:type="dxa" w:w="80"/>
+            </w:tcMar>
+            <w:vAlign w:val="center"/>
+          </w:tcPr>
+          <w:p>
+            <w:pPr>
+              <w:jc w:val="left"/>
+            </w:pPr>
+            <w:r>
+              <w:rPr>
+                <w:rFonts w:ascii="Calibri" w:cs="Calibri" w:eastAsia="Calibri" w:hAnsi="Calibri"/>
+                <w:b w:val="false"/>
+                <w:bCs w:val="false"/>
+                <w:i w:val="false"/>
+                <w:iCs w:val="false"/>
+                <w:color w:val="000000"/>
+                <w:sz w:val="20"/>
+                <w:szCs w:val="20"/>
+              </w:rPr>
+              <w:t xml:space="preserve">Floor seller</w:t>
+            </w:r>
+          </w:p>
+        </w:tc>
+        <w:tc>
+          <w:tcPr>
+            <w:tcW w:type="dxa" w:w="4160"/>
+            <w:tcBorders>
+              <w:top w:val="single" w:color="000000" w:sz="8"/>
+              <w:left w:val="single" w:color="000000" w:sz="8"/>
+              <w:bottom w:val="single" w:color="000000" w:sz="8"/>
+              <w:right w:val="single" w:color="000000" w:sz="8"/>
+            </w:tcBorders>
+            <w:shd w:fill="F7F7F7" w:color="F7F7F7" w:val="clear"/>
+            <w:tcMar>
+              <w:top w:type="dxa" w:w="60"/>
+              <w:left w:type="dxa" w:w="80"/>
+              <w:bottom w:type="dxa" w:w="60"/>
+              <w:right w:type="dxa" w:w="80"/>
+            </w:tcMar>
+            <w:vAlign w:val="center"/>
+          </w:tcPr>
+          <w:p>
+            <w:pPr>
+              <w:jc w:val="left"/>
+            </w:pPr>
+            <w:r>
+              <w:rPr>
+                <w:rFonts w:ascii="Calibri" w:cs="Calibri" w:eastAsia="Calibri" w:hAnsi="Calibri"/>
+                <w:b w:val="false"/>
+                <w:bCs w:val="false"/>
+                <w:i w:val="false"/>
+                <w:iCs w:val="false"/>
+                <w:color w:val="000000"/>
+                <w:sz w:val="20"/>
+                <w:szCs w:val="20"/>
+              </w:rPr>
+              <w:t xml:space="preserve">Sell now. Close the day. See customers, money owed, expenses, and items.</w:t>
+            </w:r>
+          </w:p>
+        </w:tc>
+      </w:tr>
+      <w:tr>
+        <w:trPr>
+          <w:trHeight w:val="320" w:hRule="atLeast"/>
+        </w:trPr>
+        <w:tc>
+          <w:tcPr>
+            <w:tcW w:type="dxa" w:w="2200"/>
+            <w:tcBorders>
+              <w:top w:val="single" w:color="000000" w:sz="8"/>
+              <w:left w:val="single" w:color="000000" w:sz="8"/>
+              <w:bottom w:val="single" w:color="000000" w:sz="8"/>
+              <w:right w:val="single" w:color="000000" w:sz="8"/>
+            </w:tcBorders>
+            <w:shd w:fill="FFFFFF" w:color="FFFFFF" w:val="clear"/>
+            <w:tcMar>
+              <w:top w:type="dxa" w:w="60"/>
+              <w:left w:type="dxa" w:w="80"/>
+              <w:bottom w:type="dxa" w:w="60"/>
+              <w:right w:type="dxa" w:w="80"/>
+            </w:tcMar>
+            <w:vAlign w:val="center"/>
+          </w:tcPr>
+          <w:p>
+            <w:pPr>
+              <w:jc w:val="left"/>
+            </w:pPr>
+            <w:r>
+              <w:rPr>
+                <w:rFonts w:ascii="Calibri" w:cs="Calibri" w:eastAsia="Calibri" w:hAnsi="Calibri"/>
+                <w:b w:val="false"/>
+                <w:bCs w:val="false"/>
+                <w:i w:val="false"/>
+                <w:iCs w:val="false"/>
+                <w:color w:val="000000"/>
+                <w:sz w:val="20"/>
+                <w:szCs w:val="20"/>
+              </w:rPr>
               <w:t xml:space="preserve">Repair engineer</w:t>
             </w:r>
           </w:p>
@@ -10542,7 +10677,7 @@
               <w:bottom w:val="single" w:color="000000" w:sz="8"/>
               <w:right w:val="single" w:color="000000" w:sz="8"/>
             </w:tcBorders>
-            <w:shd w:fill="F7F7F7" w:color="F7F7F7" w:val="clear"/>
+            <w:shd w:fill="FFFFFF" w:color="FFFFFF" w:val="clear"/>
             <w:tcMar>
               <w:top w:type="dxa" w:w="60"/>
               <w:left w:type="dxa" w:w="80"/>
@@ -10579,7 +10714,7 @@
               <w:bottom w:val="single" w:color="000000" w:sz="8"/>
               <w:right w:val="single" w:color="000000" w:sz="8"/>
             </w:tcBorders>
-            <w:shd w:fill="F7F7F7" w:color="F7F7F7" w:val="clear"/>
+            <w:shd w:fill="FFFFFF" w:color="FFFFFF" w:val="clear"/>
             <w:tcMar>
               <w:top w:type="dxa" w:w="60"/>
               <w:left w:type="dxa" w:w="80"/>
@@ -12965,7 +13100,7 @@
           <w:sz w:val="22"/>
           <w:szCs w:val="22"/>
         </w:rPr>
-        <w:t xml:space="preserve">This is the list of things Abu Twins sells: phones, tablets, buds, charger cords, and more. Each line has a name, an item code, a brand, a condition, cost, lowest price, selling price, warranty days, units in shop, and a tracking type: IMEI, serial, or no number. Staff who can add items may upload many names from Excel or CSV, add one product by hand, and change warranty days. Staff who can change prices can tick many lines at once, type a new selling price on each line, and save them together. On each line, Change or remove lets you edit details, reduce stock, or take the item off the active list. Find item code, brand, or model to narrow the list first.</w:t>
+        <w:t xml:space="preserve">This is the list of things Abu Twins sells: phones, tablets, buds, charger cords, and more. Each line has a name, an item code, a brand, a condition, cost, lowest price, selling price, warranty days, units in shop, and a tracking type: IMEI, serial, or no number. Staff who can add items may upload many names from Excel or CSV, add one product by hand, and change warranty days. Staff who can change prices can tick many lines at once, type a new selling price on each line, and save them together. On each line, Change lets you edit details or reduce stock. Only the Managing Director sees Remove item. Find item code, brand, or model to narrow the list first.</w:t>
       </w:r>
     </w:p>
     <w:p>
@@ -24765,7 +24900,7 @@
           <w:sz w:val="22"/>
           <w:szCs w:val="22"/>
         </w:rPr>
-        <w:t xml:space="preserve">Staff is the people list. Super Admin, the CEO, or a shop manager (if allowed) can add a person, pick their job, and pick their shop. Super Admin or the CEO can lock a login. The CEO cannot lock the main admin.</w:t>
+        <w:t xml:space="preserve">Staff is the people list. Super Admin, the CEO, or a shop manager (if allowed) can add a person, pick their job, and pick their shop. Only the Managing Director can Disable or Restore a login. The CEO cannot lock the main admin.</w:t>
       </w:r>
     </w:p>
     <w:p>
@@ -24803,7 +24938,7 @@
           <w:sz w:val="22"/>
           <w:szCs w:val="22"/>
         </w:rPr>
-        <w:t xml:space="preserve">A person who leaves the company must not keep a key to the till.</w:t>
+        <w:t xml:space="preserve">People change shops and jobs. The list must stay current. Locking a login is a hard remove from the system, so only the CEO does that for now.</w:t>
       </w:r>
     </w:p>
     <w:p>
@@ -24841,7 +24976,7 @@
           <w:sz w:val="22"/>
           <w:szCs w:val="22"/>
         </w:rPr>
-        <w:t xml:space="preserve">A new cashier starts at Challenge. The CEO adds their work email, sets job to Cashier, sets shop to Challenge, and gives them a first password. After they sign in, the CEO asks them to change it.</w:t>
+        <w:t xml:space="preserve">A cashier leaves Iwo Road. The Managing Director opens Staff, finds that person, and clicks Disable. That login stops working. Who did what shows the CEO made that change.</w:t>
       </w:r>
     </w:p>
     <w:p>
@@ -24891,7 +25026,7 @@
           <w:sz w:val="22"/>
           <w:szCs w:val="22"/>
         </w:rPr>
-        <w:t xml:space="preserve">Sign in as Super Admin.</w:t>
+        <w:t xml:space="preserve">Click Staff.</w:t>
       </w:r>
     </w:p>
     <w:p>
@@ -24922,7 +25057,7 @@
           <w:sz w:val="22"/>
           <w:szCs w:val="22"/>
         </w:rPr>
-        <w:t xml:space="preserve">Click Staff.</w:t>
+        <w:t xml:space="preserve">Read names, jobs, shops, and Active or Disabled.</w:t>
       </w:r>
     </w:p>
     <w:p>
@@ -24953,7 +25088,7 @@
           <w:sz w:val="22"/>
           <w:szCs w:val="22"/>
         </w:rPr>
-        <w:t xml:space="preserve">Read names, jobs, shops, and Active or Disabled.</w:t>
+        <w:t xml:space="preserve">Add a person with name, email, job, shop, and first password when you have that right.</w:t>
       </w:r>
     </w:p>
     <w:p>
@@ -24984,7 +25119,38 @@
           <w:sz w:val="22"/>
           <w:szCs w:val="22"/>
         </w:rPr>
-        <w:t xml:space="preserve">Do not disable the only Super Admin during a test.</w:t>
+        <w:t xml:space="preserve">Edit job or move shop when that person changes work.</w:t>
+      </w:r>
+    </w:p>
+    <w:p>
+      <w:pPr>
+        <w:spacing w:after="80" w:line="276"/>
+      </w:pPr>
+      <w:r>
+        <w:rPr>
+          <w:rFonts w:ascii="Calibri" w:cs="Calibri" w:eastAsia="Calibri" w:hAnsi="Calibri"/>
+          <w:b/>
+          <w:bCs/>
+          <w:i w:val="false"/>
+          <w:iCs w:val="false"/>
+          <w:color w:val="000000"/>
+          <w:sz w:val="22"/>
+          <w:szCs w:val="22"/>
+        </w:rPr>
+        <w:t xml:space="preserve">5. </w:t>
+      </w:r>
+      <w:r>
+        <w:rPr>
+          <w:rFonts w:ascii="Calibri" w:cs="Calibri" w:eastAsia="Calibri" w:hAnsi="Calibri"/>
+          <w:b w:val="false"/>
+          <w:bCs w:val="false"/>
+          <w:i w:val="false"/>
+          <w:iCs w:val="false"/>
+          <w:color w:val="000000"/>
+          <w:sz w:val="22"/>
+          <w:szCs w:val="22"/>
+        </w:rPr>
+        <w:t xml:space="preserve">Only the Managing Director uses Disable or Restore.</w:t>
       </w:r>
     </w:p>
     <w:p>
@@ -25026,7 +25192,7 @@
           <w:sz w:val="22"/>
           <w:szCs w:val="22"/>
         </w:rPr>
-        <w:t xml:space="preserve">Each test person in section 12 appears.</w:t>
+        <w:t xml:space="preserve">Disable stops that person from signing in.</w:t>
       </w:r>
     </w:p>
     <w:p>
@@ -25049,7 +25215,7 @@
           <w:sz w:val="22"/>
           <w:szCs w:val="22"/>
         </w:rPr>
-        <w:t xml:space="preserve">Challenge manager shows Challenge, Ibadan.</w:t>
+        <w:t xml:space="preserve">Who did what keeps the change.</w:t>
       </w:r>
     </w:p>
     <w:p>
@@ -25072,30 +25238,7 @@
           <w:sz w:val="22"/>
           <w:szCs w:val="22"/>
         </w:rPr>
-        <w:t xml:space="preserve">Disable stops that person from signing in.</w:t>
-      </w:r>
-    </w:p>
-    <w:p>
-      <w:pPr>
-        <w:pStyle w:val="ListParagraph"/>
-        <w:numPr>
-          <w:ilvl w:val="0"/>
-          <w:numId w:val="2"/>
-        </w:numPr>
-        <w:spacing w:after="80" w:line="276"/>
-      </w:pPr>
-      <w:r>
-        <w:rPr>
-          <w:rFonts w:ascii="Calibri" w:cs="Calibri" w:eastAsia="Calibri" w:hAnsi="Calibri"/>
-          <w:b w:val="false"/>
-          <w:bCs w:val="false"/>
-          <w:i w:val="false"/>
-          <w:iCs w:val="false"/>
-          <w:color w:val="000000"/>
-          <w:sz w:val="22"/>
-          <w:szCs w:val="22"/>
-        </w:rPr>
-        <w:t xml:space="preserve">Restore lets them sign in again.</w:t>
+        <w:t xml:space="preserve">Super Admin and the all-shop auditor do not see Disable.</w:t>
       </w:r>
     </w:p>
     <w:p>
@@ -49558,7 +49701,7 @@
                 <w:sz w:val="20"/>
                 <w:szCs w:val="20"/>
               </w:rPr>
-              <w:t xml:space="preserve">Change or remove stock on the price list</w:t>
+              <w:t xml:space="preserve">Change stock on the price list</w:t>
             </w:r>
           </w:p>
         </w:tc>
@@ -49632,7 +49775,7 @@
                 <w:sz w:val="20"/>
                 <w:szCs w:val="20"/>
               </w:rPr>
-              <w:t xml:space="preserve">On Phones &amp; items, click Change or remove on a cord. Reduce stock by pieces. On a phone, Reduce stock asks for IMEI lines. Remove item hides a used name or deletes an unused one.</w:t>
+              <w:t xml:space="preserve">On Phones &amp; items, click Change on a cord. Reduce stock by pieces. On a phone, Reduce stock asks for IMEI lines. Remove item is not shown. Only the Managing Director sees Remove.</w:t>
             </w:r>
           </w:p>
         </w:tc>
@@ -50551,6 +50694,159 @@
                 <w:szCs w:val="20"/>
               </w:rPr>
               <w:t xml:space="preserve">Upload opening stock for Iwo Road only. Challenge Shop stock stays empty for those units. Sell now at Challenge cannot scan Iwo IMEIs. Head office shop picker on Iwo shows Iwo totals only.</w:t>
+            </w:r>
+          </w:p>
+        </w:tc>
+      </w:tr>
+      <w:tr>
+        <w:trPr>
+          <w:trHeight w:val="320" w:hRule="atLeast"/>
+        </w:trPr>
+        <w:tc>
+          <w:tcPr>
+            <w:tcW w:type="dxa" w:w="600"/>
+            <w:tcBorders>
+              <w:top w:val="single" w:color="000000" w:sz="8"/>
+              <w:left w:val="single" w:color="000000" w:sz="8"/>
+              <w:bottom w:val="single" w:color="000000" w:sz="8"/>
+              <w:right w:val="single" w:color="000000" w:sz="8"/>
+            </w:tcBorders>
+            <w:shd w:fill="F7F7F7" w:color="F7F7F7" w:val="clear"/>
+            <w:tcMar>
+              <w:top w:type="dxa" w:w="60"/>
+              <w:left w:type="dxa" w:w="80"/>
+              <w:bottom w:type="dxa" w:w="60"/>
+              <w:right w:type="dxa" w:w="80"/>
+            </w:tcMar>
+            <w:vAlign w:val="center"/>
+          </w:tcPr>
+          <w:p>
+            <w:pPr>
+              <w:jc w:val="left"/>
+            </w:pPr>
+            <w:r>
+              <w:rPr>
+                <w:rFonts w:ascii="Calibri" w:cs="Calibri" w:eastAsia="Calibri" w:hAnsi="Calibri"/>
+                <w:b w:val="false"/>
+                <w:bCs w:val="false"/>
+                <w:i w:val="false"/>
+                <w:iCs w:val="false"/>
+                <w:color w:val="000000"/>
+                <w:sz w:val="20"/>
+                <w:szCs w:val="20"/>
+              </w:rPr>
+              <w:t xml:space="preserve">77</w:t>
+            </w:r>
+          </w:p>
+        </w:tc>
+        <w:tc>
+          <w:tcPr>
+            <w:tcW w:type="dxa" w:w="2800"/>
+            <w:tcBorders>
+              <w:top w:val="single" w:color="000000" w:sz="8"/>
+              <w:left w:val="single" w:color="000000" w:sz="8"/>
+              <w:bottom w:val="single" w:color="000000" w:sz="8"/>
+              <w:right w:val="single" w:color="000000" w:sz="8"/>
+            </w:tcBorders>
+            <w:shd w:fill="F7F7F7" w:color="F7F7F7" w:val="clear"/>
+            <w:tcMar>
+              <w:top w:type="dxa" w:w="60"/>
+              <w:left w:type="dxa" w:w="80"/>
+              <w:bottom w:type="dxa" w:w="60"/>
+              <w:right w:type="dxa" w:w="80"/>
+            </w:tcMar>
+            <w:vAlign w:val="center"/>
+          </w:tcPr>
+          <w:p>
+            <w:pPr>
+              <w:jc w:val="left"/>
+            </w:pPr>
+            <w:r>
+              <w:rPr>
+                <w:rFonts w:ascii="Calibri" w:cs="Calibri" w:eastAsia="Calibri" w:hAnsi="Calibri"/>
+                <w:b w:val="false"/>
+                <w:bCs w:val="false"/>
+                <w:i w:val="false"/>
+                <w:iCs w:val="false"/>
+                <w:color w:val="000000"/>
+                <w:sz w:val="20"/>
+                <w:szCs w:val="20"/>
+              </w:rPr>
+              <w:t xml:space="preserve">Only the CEO can permanently remove</w:t>
+            </w:r>
+          </w:p>
+        </w:tc>
+        <w:tc>
+          <w:tcPr>
+            <w:tcW w:type="dxa" w:w="2600"/>
+            <w:tcBorders>
+              <w:top w:val="single" w:color="000000" w:sz="8"/>
+              <w:left w:val="single" w:color="000000" w:sz="8"/>
+              <w:bottom w:val="single" w:color="000000" w:sz="8"/>
+              <w:right w:val="single" w:color="000000" w:sz="8"/>
+            </w:tcBorders>
+            <w:shd w:fill="F7F7F7" w:color="F7F7F7" w:val="clear"/>
+            <w:tcMar>
+              <w:top w:type="dxa" w:w="60"/>
+              <w:left w:type="dxa" w:w="80"/>
+              <w:bottom w:type="dxa" w:w="60"/>
+              <w:right w:type="dxa" w:w="80"/>
+            </w:tcMar>
+            <w:vAlign w:val="center"/>
+          </w:tcPr>
+          <w:p>
+            <w:pPr>
+              <w:jc w:val="left"/>
+            </w:pPr>
+            <w:r>
+              <w:rPr>
+                <w:rFonts w:ascii="Calibri" w:cs="Calibri" w:eastAsia="Calibri" w:hAnsi="Calibri"/>
+                <w:b w:val="false"/>
+                <w:bCs w:val="false"/>
+                <w:i w:val="false"/>
+                <w:iCs w:val="false"/>
+                <w:color w:val="000000"/>
+                <w:sz w:val="20"/>
+                <w:szCs w:val="20"/>
+              </w:rPr>
+              <w:t xml:space="preserve">ceo@abutwins.com then Super Admin</w:t>
+            </w:r>
+          </w:p>
+        </w:tc>
+        <w:tc>
+          <w:tcPr>
+            <w:tcW w:type="dxa" w:w="3360"/>
+            <w:tcBorders>
+              <w:top w:val="single" w:color="000000" w:sz="8"/>
+              <w:left w:val="single" w:color="000000" w:sz="8"/>
+              <w:bottom w:val="single" w:color="000000" w:sz="8"/>
+              <w:right w:val="single" w:color="000000" w:sz="8"/>
+            </w:tcBorders>
+            <w:shd w:fill="F7F7F7" w:color="F7F7F7" w:val="clear"/>
+            <w:tcMar>
+              <w:top w:type="dxa" w:w="60"/>
+              <w:left w:type="dxa" w:w="80"/>
+              <w:bottom w:type="dxa" w:w="60"/>
+              <w:right w:type="dxa" w:w="80"/>
+            </w:tcMar>
+            <w:vAlign w:val="center"/>
+          </w:tcPr>
+          <w:p>
+            <w:pPr>
+              <w:jc w:val="left"/>
+            </w:pPr>
+            <w:r>
+              <w:rPr>
+                <w:rFonts w:ascii="Calibri" w:cs="Calibri" w:eastAsia="Calibri" w:hAnsi="Calibri"/>
+                <w:b w:val="false"/>
+                <w:bCs w:val="false"/>
+                <w:i w:val="false"/>
+                <w:iCs w:val="false"/>
+                <w:color w:val="000000"/>
+                <w:sz w:val="20"/>
+                <w:szCs w:val="20"/>
+              </w:rPr>
+              <w:t xml:space="preserve">As CEO, Staff shows Disable, price list shows Remove, and a bank can leave the books. As Super Admin or the all-shop auditor, those remove actions are hidden or refused.</w:t>
             </w:r>
           </w:p>
         </w:tc>
@@ -51013,6 +51309,29 @@
           <w:sz w:val="22"/>
           <w:szCs w:val="22"/>
         </w:rPr>
+        <w:t xml:space="preserve">Permanently removing a brand, an item, a bank account, or locking a staff login is for the Managing Director only. Super Admin and the all-shop auditor oversee the business but cannot wipe those records.</w:t>
+      </w:r>
+    </w:p>
+    <w:p>
+      <w:pPr>
+        <w:pStyle w:val="ListParagraph"/>
+        <w:numPr>
+          <w:ilvl w:val="0"/>
+          <w:numId w:val="2"/>
+        </w:numPr>
+        <w:spacing w:after="80" w:line="276"/>
+      </w:pPr>
+      <w:r>
+        <w:rPr>
+          <w:rFonts w:ascii="Calibri" w:cs="Calibri" w:eastAsia="Calibri" w:hAnsi="Calibri"/>
+          <w:b w:val="false"/>
+          <w:bCs w:val="false"/>
+          <w:i w:val="false"/>
+          <w:iCs w:val="false"/>
+          <w:color w:val="000000"/>
+          <w:sz w:val="22"/>
+          <w:szCs w:val="22"/>
+        </w:rPr>
         <w:t xml:space="preserve">Two tills cannot sell the same phone. Whichever completes first gets the invoice. The other is refused and nothing half-happens: no invoice, no money entry, no stock change.</w:t>
       </w:r>
     </w:p>
@@ -52971,6 +53290,25 @@
           <w:szCs w:val="22"/>
         </w:rPr>
         <w:t xml:space="preserve">Version 1.51 adds Opening Stock as a supplier choice on Many at once (Excel). Use it when stock is already on the shelf and the real house is not known yet. No phone number is required for that choice. Form checks speak in plain shop words when something is missing.</w:t>
+      </w:r>
+    </w:p>
+    <w:p>
+      <w:pPr>
+        <w:spacing w:after="160" w:before="0" w:line="276"/>
+        <w:jc w:val="left"/>
+      </w:pPr>
+      <w:r>
+        <w:rPr>
+          <w:rFonts w:ascii="Calibri" w:cs="Calibri" w:eastAsia="Calibri" w:hAnsi="Calibri"/>
+          <w:b w:val="false"/>
+          <w:bCs w:val="false"/>
+          <w:i w:val="false"/>
+          <w:iCs w:val="false"/>
+          <w:color w:val="000000"/>
+          <w:sz w:val="22"/>
+          <w:szCs w:val="22"/>
+        </w:rPr>
+        <w:t xml:space="preserve">Version 1.52 gives the all-shop auditor Super Admin reach across every branch for audit work. Permanently removing brands, items, or bank accounts, and locking a staff login, is for the Managing Director only.</w:t>
       </w:r>
     </w:p>
     <w:p>

</xml_diff>

<commit_message>
Let Sell now take piece items by quantity on the till.
Pouches, cords, and other no-IMEI stock use an editable Pieces box capped at on hand, while IMEI and serial units stay one each.

Co-authored-by: Cursor <cursoragent@cursor.com>
</commit_message>
<xml_diff>
--- a/docs/Abu-Twins-Shop-System-User-Guide.docx
+++ b/docs/Abu-Twins-Shop-System-User-Guide.docx
@@ -459,7 +459,7 @@
                 <w:sz w:val="20"/>
                 <w:szCs w:val="20"/>
               </w:rPr>
-              <w:t xml:space="preserve">1.53</w:t>
+              <w:t xml:space="preserve">1.54</w:t>
             </w:r>
           </w:p>
         </w:tc>
@@ -533,7 +533,7 @@
                 <w:sz w:val="20"/>
                 <w:szCs w:val="20"/>
               </w:rPr>
-              <w:t xml:space="preserve">Updated: sales returns, list sell price floor, till find and phone details</w:t>
+              <w:t xml:space="preserve">Updated: sell pouches and cords by pieces on Sell now</w:t>
             </w:r>
           </w:p>
         </w:tc>
@@ -15375,7 +15375,7 @@
           <w:sz w:val="22"/>
           <w:szCs w:val="22"/>
         </w:rPr>
-        <w:t xml:space="preserve">Sell now is the till. You scan an IMEI, or type to find by IMEI, phone name, brand, category, storage, or accessory. Each line shows storage and How the phone looks (Brand new, Uk, OPENBOX) under the name. You cannot sell under the list sell price unless Super Admin overrides. Selling above the list is allowed, and Amount received updates when you change the price so the day books match. Credit sales can still take a deposit today. The system then makes an invoice and clears the till for the next buyer. A USB scanner works like a keyboard: scan, then Enter. If yesterday had sales and nobody closed that day, Complete sale stays locked until the till is counted. If the line drops and the till is not locked, the sale stays on this device as a parked sale and posts when the line returns.</w:t>
+        <w:t xml:space="preserve">Sell now is the till. You scan an IMEI, or type to find by IMEI, phone name, brand, category, storage, or a piece item such as a pouch or charger cord. Phones with IMEI or serial stay one unit each. Piece items show a Pieces box so you sell as many as you have on hand. Each phone line shows storage and How the phone looks under the name. You cannot sell under the list sell price unless Super Admin overrides. Selling above the list is allowed, and Amount received updates when you change the price so the day books match.</w:t>
       </w:r>
     </w:p>
     <w:p>
@@ -15413,7 +15413,7 @@
           <w:sz w:val="22"/>
           <w:szCs w:val="22"/>
         </w:rPr>
-        <w:t xml:space="preserve">Selling from memory is how phones vanish. Selling under the list sell price without Super Admin is how margin vanishes. The till only offers what is In shop, and only after older days with sales are closed.</w:t>
+        <w:t xml:space="preserve">Selling from memory is how phones vanish. Piece items without a quantity box force staff to tap the same cord many times. The till only offers what is In shop, and only after older days with sales are closed.</w:t>
       </w:r>
     </w:p>
     <w:p>
@@ -15451,7 +15451,7 @@
           <w:sz w:val="22"/>
           <w:szCs w:val="22"/>
         </w:rPr>
-        <w:t xml:space="preserve">Monday at Iwo Road. Sunday had cash sales and nobody closed. The cashier opens Sell now. A red note says the shop has not closed 6 September. Complete sale is locked. They open Close the day, count the drawer, and close Sunday. Sell now opens. A buyer wants a Camon 30. They type Camon in Find, pick the phone, see 128GB · Uk under the name, collect transfer and finish. Later they raise the price above the list. Amount received rises with it. The day’s sales record matches.</w:t>
+        <w:t xml:space="preserve">Monday at Iwo Road. A buyer wants three charger cords and one Camon 30. The cashier finds the cord, adds it, types 3 in Pieces, scans the phone IMEI, and finishes. Shop stock drops by three cords and one phone. The invoice shows both lines.</w:t>
       </w:r>
     </w:p>
     <w:p>
@@ -15656,7 +15656,7 @@
           <w:sz w:val="22"/>
           <w:szCs w:val="22"/>
         </w:rPr>
-        <w:t xml:space="preserve">Try a price under the list sell price. Complete sale should refuse unless Super Admin overrides.</w:t>
+        <w:t xml:space="preserve">Find a pouch or charger cord. Add it. Type how many pieces on this sale. You cannot type more than on hand.</w:t>
       </w:r>
     </w:p>
     <w:p>
@@ -15687,7 +15687,7 @@
           <w:sz w:val="22"/>
           <w:szCs w:val="22"/>
         </w:rPr>
-        <w:t xml:space="preserve">Try a price above the list. Amount received should rise with the new total.</w:t>
+        <w:t xml:space="preserve">Try a price under the list sell price. Complete sale should refuse unless Super Admin overrides.</w:t>
       </w:r>
     </w:p>
     <w:p>
@@ -15706,6 +15706,37 @@
           <w:szCs w:val="22"/>
         </w:rPr>
         <w:t xml:space="preserve">8. </w:t>
+      </w:r>
+      <w:r>
+        <w:rPr>
+          <w:rFonts w:ascii="Calibri" w:cs="Calibri" w:eastAsia="Calibri" w:hAnsi="Calibri"/>
+          <w:b w:val="false"/>
+          <w:bCs w:val="false"/>
+          <w:i w:val="false"/>
+          <w:iCs w:val="false"/>
+          <w:color w:val="000000"/>
+          <w:sz w:val="22"/>
+          <w:szCs w:val="22"/>
+        </w:rPr>
+        <w:t xml:space="preserve">Try a price above the list. Amount received should rise with the new total.</w:t>
+      </w:r>
+    </w:p>
+    <w:p>
+      <w:pPr>
+        <w:spacing w:after="80" w:line="276"/>
+      </w:pPr>
+      <w:r>
+        <w:rPr>
+          <w:rFonts w:ascii="Calibri" w:cs="Calibri" w:eastAsia="Calibri" w:hAnsi="Calibri"/>
+          <w:b/>
+          <w:bCs/>
+          <w:i w:val="false"/>
+          <w:iCs w:val="false"/>
+          <w:color w:val="000000"/>
+          <w:sz w:val="22"/>
+          <w:szCs w:val="22"/>
+        </w:rPr>
+        <w:t xml:space="preserve">9. </w:t>
       </w:r>
       <w:r>
         <w:rPr>
@@ -15783,7 +15814,53 @@
           <w:sz w:val="22"/>
           <w:szCs w:val="22"/>
         </w:rPr>
-        <w:t xml:space="preserve">Find matches IMEI, name, brand, category, and storage.</w:t>
+        <w:t xml:space="preserve">Find matches IMEI, name, brand, category, storage, and piece items.</w:t>
+      </w:r>
+    </w:p>
+    <w:p>
+      <w:pPr>
+        <w:pStyle w:val="ListParagraph"/>
+        <w:numPr>
+          <w:ilvl w:val="0"/>
+          <w:numId w:val="2"/>
+        </w:numPr>
+        <w:spacing w:after="80" w:line="276"/>
+      </w:pPr>
+      <w:r>
+        <w:rPr>
+          <w:rFonts w:ascii="Calibri" w:cs="Calibri" w:eastAsia="Calibri" w:hAnsi="Calibri"/>
+          <w:b w:val="false"/>
+          <w:bCs w:val="false"/>
+          <w:i w:val="false"/>
+          <w:iCs w:val="false"/>
+          <w:color w:val="000000"/>
+          <w:sz w:val="22"/>
+          <w:szCs w:val="22"/>
+        </w:rPr>
+        <w:t xml:space="preserve">Piece items have an editable Pieces box. IMEI lines stay at 1.</w:t>
+      </w:r>
+    </w:p>
+    <w:p>
+      <w:pPr>
+        <w:pStyle w:val="ListParagraph"/>
+        <w:numPr>
+          <w:ilvl w:val="0"/>
+          <w:numId w:val="2"/>
+        </w:numPr>
+        <w:spacing w:after="80" w:line="276"/>
+      </w:pPr>
+      <w:r>
+        <w:rPr>
+          <w:rFonts w:ascii="Calibri" w:cs="Calibri" w:eastAsia="Calibri" w:hAnsi="Calibri"/>
+          <w:b w:val="false"/>
+          <w:bCs w:val="false"/>
+          <w:i w:val="false"/>
+          <w:iCs w:val="false"/>
+          <w:color w:val="000000"/>
+          <w:sz w:val="22"/>
+          <w:szCs w:val="22"/>
+        </w:rPr>
+        <w:t xml:space="preserve">Pieces cannot go above on hand in this shop.</w:t>
       </w:r>
     </w:p>
     <w:p>
@@ -51051,6 +51128,159 @@
           </w:p>
         </w:tc>
       </w:tr>
+      <w:tr>
+        <w:trPr>
+          <w:trHeight w:val="320" w:hRule="atLeast"/>
+        </w:trPr>
+        <w:tc>
+          <w:tcPr>
+            <w:tcW w:type="dxa" w:w="600"/>
+            <w:tcBorders>
+              <w:top w:val="single" w:color="000000" w:sz="8"/>
+              <w:left w:val="single" w:color="000000" w:sz="8"/>
+              <w:bottom w:val="single" w:color="000000" w:sz="8"/>
+              <w:right w:val="single" w:color="000000" w:sz="8"/>
+            </w:tcBorders>
+            <w:shd w:fill="F7F7F7" w:color="F7F7F7" w:val="clear"/>
+            <w:tcMar>
+              <w:top w:type="dxa" w:w="60"/>
+              <w:left w:type="dxa" w:w="80"/>
+              <w:bottom w:type="dxa" w:w="60"/>
+              <w:right w:type="dxa" w:w="80"/>
+            </w:tcMar>
+            <w:vAlign w:val="center"/>
+          </w:tcPr>
+          <w:p>
+            <w:pPr>
+              <w:jc w:val="left"/>
+            </w:pPr>
+            <w:r>
+              <w:rPr>
+                <w:rFonts w:ascii="Calibri" w:cs="Calibri" w:eastAsia="Calibri" w:hAnsi="Calibri"/>
+                <w:b w:val="false"/>
+                <w:bCs w:val="false"/>
+                <w:i w:val="false"/>
+                <w:iCs w:val="false"/>
+                <w:color w:val="000000"/>
+                <w:sz w:val="20"/>
+                <w:szCs w:val="20"/>
+              </w:rPr>
+              <w:t xml:space="preserve">81</w:t>
+            </w:r>
+          </w:p>
+        </w:tc>
+        <w:tc>
+          <w:tcPr>
+            <w:tcW w:type="dxa" w:w="2800"/>
+            <w:tcBorders>
+              <w:top w:val="single" w:color="000000" w:sz="8"/>
+              <w:left w:val="single" w:color="000000" w:sz="8"/>
+              <w:bottom w:val="single" w:color="000000" w:sz="8"/>
+              <w:right w:val="single" w:color="000000" w:sz="8"/>
+            </w:tcBorders>
+            <w:shd w:fill="F7F7F7" w:color="F7F7F7" w:val="clear"/>
+            <w:tcMar>
+              <w:top w:type="dxa" w:w="60"/>
+              <w:left w:type="dxa" w:w="80"/>
+              <w:bottom w:type="dxa" w:w="60"/>
+              <w:right w:type="dxa" w:w="80"/>
+            </w:tcMar>
+            <w:vAlign w:val="center"/>
+          </w:tcPr>
+          <w:p>
+            <w:pPr>
+              <w:jc w:val="left"/>
+            </w:pPr>
+            <w:r>
+              <w:rPr>
+                <w:rFonts w:ascii="Calibri" w:cs="Calibri" w:eastAsia="Calibri" w:hAnsi="Calibri"/>
+                <w:b w:val="false"/>
+                <w:bCs w:val="false"/>
+                <w:i w:val="false"/>
+                <w:iCs w:val="false"/>
+                <w:color w:val="000000"/>
+                <w:sz w:val="20"/>
+                <w:szCs w:val="20"/>
+              </w:rPr>
+              <w:t xml:space="preserve">Sell piece items by quantity</w:t>
+            </w:r>
+          </w:p>
+        </w:tc>
+        <w:tc>
+          <w:tcPr>
+            <w:tcW w:type="dxa" w:w="2600"/>
+            <w:tcBorders>
+              <w:top w:val="single" w:color="000000" w:sz="8"/>
+              <w:left w:val="single" w:color="000000" w:sz="8"/>
+              <w:bottom w:val="single" w:color="000000" w:sz="8"/>
+              <w:right w:val="single" w:color="000000" w:sz="8"/>
+            </w:tcBorders>
+            <w:shd w:fill="F7F7F7" w:color="F7F7F7" w:val="clear"/>
+            <w:tcMar>
+              <w:top w:type="dxa" w:w="60"/>
+              <w:left w:type="dxa" w:w="80"/>
+              <w:bottom w:type="dxa" w:w="60"/>
+              <w:right w:type="dxa" w:w="80"/>
+            </w:tcMar>
+            <w:vAlign w:val="center"/>
+          </w:tcPr>
+          <w:p>
+            <w:pPr>
+              <w:jc w:val="left"/>
+            </w:pPr>
+            <w:r>
+              <w:rPr>
+                <w:rFonts w:ascii="Calibri" w:cs="Calibri" w:eastAsia="Calibri" w:hAnsi="Calibri"/>
+                <w:b w:val="false"/>
+                <w:bCs w:val="false"/>
+                <w:i w:val="false"/>
+                <w:iCs w:val="false"/>
+                <w:color w:val="000000"/>
+                <w:sz w:val="20"/>
+                <w:szCs w:val="20"/>
+              </w:rPr>
+              <w:t xml:space="preserve">cashier@abutwins.com</w:t>
+            </w:r>
+          </w:p>
+        </w:tc>
+        <w:tc>
+          <w:tcPr>
+            <w:tcW w:type="dxa" w:w="3360"/>
+            <w:tcBorders>
+              <w:top w:val="single" w:color="000000" w:sz="8"/>
+              <w:left w:val="single" w:color="000000" w:sz="8"/>
+              <w:bottom w:val="single" w:color="000000" w:sz="8"/>
+              <w:right w:val="single" w:color="000000" w:sz="8"/>
+            </w:tcBorders>
+            <w:shd w:fill="F7F7F7" w:color="F7F7F7" w:val="clear"/>
+            <w:tcMar>
+              <w:top w:type="dxa" w:w="60"/>
+              <w:left w:type="dxa" w:w="80"/>
+              <w:bottom w:type="dxa" w:w="60"/>
+              <w:right w:type="dxa" w:w="80"/>
+            </w:tcMar>
+            <w:vAlign w:val="center"/>
+          </w:tcPr>
+          <w:p>
+            <w:pPr>
+              <w:jc w:val="left"/>
+            </w:pPr>
+            <w:r>
+              <w:rPr>
+                <w:rFonts w:ascii="Calibri" w:cs="Calibri" w:eastAsia="Calibri" w:hAnsi="Calibri"/>
+                <w:b w:val="false"/>
+                <w:bCs w:val="false"/>
+                <w:i w:val="false"/>
+                <w:iCs w:val="false"/>
+                <w:color w:val="000000"/>
+                <w:sz w:val="20"/>
+                <w:szCs w:val="20"/>
+              </w:rPr>
+              <w:t xml:space="preserve">Find a pouch or charger cord. Add it. Type 3 in Pieces. Complete sale. Shop stock drops by 3. An IMEI phone line stays at 1 piece.</w:t>
+            </w:r>
+          </w:p>
+        </w:tc>
+      </w:tr>
     </w:tbl>
     <w:p>
       <w:pPr>
@@ -51509,6 +51739,52 @@
           <w:sz w:val="22"/>
           <w:szCs w:val="22"/>
         </w:rPr>
+        <w:t xml:space="preserve">A sale must stay at or above the list sell price unless Super Admin overrides. Selling above the list is allowed. Amount received updates with the new total.</w:t>
+      </w:r>
+    </w:p>
+    <w:p>
+      <w:pPr>
+        <w:pStyle w:val="ListParagraph"/>
+        <w:numPr>
+          <w:ilvl w:val="0"/>
+          <w:numId w:val="2"/>
+        </w:numPr>
+        <w:spacing w:after="80" w:line="276"/>
+      </w:pPr>
+      <w:r>
+        <w:rPr>
+          <w:rFonts w:ascii="Calibri" w:cs="Calibri" w:eastAsia="Calibri" w:hAnsi="Calibri"/>
+          <w:b w:val="false"/>
+          <w:bCs w:val="false"/>
+          <w:i w:val="false"/>
+          <w:iCs w:val="false"/>
+          <w:color w:val="000000"/>
+          <w:sz w:val="22"/>
+          <w:szCs w:val="22"/>
+        </w:rPr>
+        <w:t xml:space="preserve">Piece items such as pouches and charger cords sell by Pieces on Sell now, up to on hand. Phones and laptops with IMEI or serial stay one unit each.</w:t>
+      </w:r>
+    </w:p>
+    <w:p>
+      <w:pPr>
+        <w:pStyle w:val="ListParagraph"/>
+        <w:numPr>
+          <w:ilvl w:val="0"/>
+          <w:numId w:val="2"/>
+        </w:numPr>
+        <w:spacing w:after="80" w:line="276"/>
+      </w:pPr>
+      <w:r>
+        <w:rPr>
+          <w:rFonts w:ascii="Calibri" w:cs="Calibri" w:eastAsia="Calibri" w:hAnsi="Calibri"/>
+          <w:b w:val="false"/>
+          <w:bCs w:val="false"/>
+          <w:i w:val="false"/>
+          <w:iCs w:val="false"/>
+          <w:color w:val="000000"/>
+          <w:sz w:val="22"/>
+          <w:szCs w:val="22"/>
+        </w:rPr>
         <w:t xml:space="preserve">Permanently removing a brand, an item, a bank account, or locking a staff login is for the Managing Director only. Super Admin and the all-shop auditor oversee the business but cannot wipe those records.</w:t>
       </w:r>
     </w:p>
@@ -53528,6 +53804,25 @@
           <w:szCs w:val="22"/>
         </w:rPr>
         <w:t xml:space="preserve">Version 1.53 lets sales reps open Returns and find a sold IMEI beyond the recent list. Sell now blocks prices under the list sell price unless Super Admin overrides, keeps selling above the list, and updates Amount received when the price changes. Staff can find by IMEI, name, brand, category, or storage, and each line shows storage and Uk or Brand new under the name.</w:t>
+      </w:r>
+    </w:p>
+    <w:p>
+      <w:pPr>
+        <w:spacing w:after="160" w:before="0" w:line="276"/>
+        <w:jc w:val="left"/>
+      </w:pPr>
+      <w:r>
+        <w:rPr>
+          <w:rFonts w:ascii="Calibri" w:cs="Calibri" w:eastAsia="Calibri" w:hAnsi="Calibri"/>
+          <w:b w:val="false"/>
+          <w:bCs w:val="false"/>
+          <w:i w:val="false"/>
+          <w:iCs w:val="false"/>
+          <w:color w:val="000000"/>
+          <w:sz w:val="22"/>
+          <w:szCs w:val="22"/>
+        </w:rPr>
+        <w:t xml:space="preserve">Version 1.54 lets Sell now take piece items by quantity. Pouches, charger cords, and other no-IMEI stock use a Pieces box on this sale, capped at what is on hand. Phones and laptops with IMEI or serial stay one unit each and are still added by scan or find.</w:t>
       </w:r>
     </w:p>
     <w:p>

</xml_diff>

<commit_message>
Align Sell now with initial sell price floor and upward flexibility.
Cashiers start at the uploaded wholesale floor, may raise for walk-in buyers, cannot go under without CEO or Super Admin, and the invoice keeps the charged price.

Co-authored-by: Cursor <cursoragent@cursor.com>
</commit_message>
<xml_diff>
--- a/docs/Abu-Twins-Shop-System-User-Guide.docx
+++ b/docs/Abu-Twins-Shop-System-User-Guide.docx
@@ -459,7 +459,7 @@
                 <w:sz w:val="20"/>
                 <w:szCs w:val="20"/>
               </w:rPr>
-              <w:t xml:space="preserve">1.54</w:t>
+              <w:t xml:space="preserve">1.55</w:t>
             </w:r>
           </w:p>
         </w:tc>
@@ -533,7 +533,7 @@
                 <w:sz w:val="20"/>
                 <w:szCs w:val="20"/>
               </w:rPr>
-              <w:t xml:space="preserve">Updated: sell pouches and cords by pieces on Sell now</w:t>
+              <w:t xml:space="preserve">Updated: initial sell price floor with upward flexibility for walk-ins</w:t>
             </w:r>
           </w:p>
         </w:tc>
@@ -15375,7 +15375,7 @@
           <w:sz w:val="22"/>
           <w:szCs w:val="22"/>
         </w:rPr>
-        <w:t xml:space="preserve">Sell now is the till. You scan an IMEI, or type to find by IMEI, phone name, brand, category, storage, or a piece item such as a pouch or charger cord. Phones with IMEI or serial stay one unit each. Piece items show a Pieces box so you sell as many as you have on hand. Each phone line shows storage and How the phone looks under the name. You cannot sell under the list sell price unless Super Admin overrides. Selling above the list is allowed, and Amount received updates when you change the price so the day books match.</w:t>
+        <w:t xml:space="preserve">Sell now is the till. You scan an IMEI, or type to find by IMEI, phone name, brand, category, storage, or a piece item such as a pouch or charger cord. Phones with IMEI or serial stay one unit each. Piece items show a Pieces box so you sell as many as you have on hand. Each phone line shows storage and How the phone looks under the name. The uploaded initial sell price is the floor (often for wholesale). You may raise it for a walk-in buyer. You cannot go under it unless the CEO or Super Admin overrides. Amount received updates when you change the price, and the invoice keeps what was charged.</w:t>
       </w:r>
     </w:p>
     <w:p>
@@ -15413,7 +15413,7 @@
           <w:sz w:val="22"/>
           <w:szCs w:val="22"/>
         </w:rPr>
-        <w:t xml:space="preserve">Selling from memory is how phones vanish. Piece items without a quantity box force staff to tap the same cord many times. The till only offers what is In shop, and only after older days with sales are closed.</w:t>
+        <w:t xml:space="preserve">Wholesale and walk-in buyers often pay different amounts for the same phone. The shop needs a floor so cashiers cannot quietly undercut the uploaded price, and room to raise the price when a walk-in arrives.</w:t>
       </w:r>
     </w:p>
     <w:p>
@@ -15451,7 +15451,7 @@
           <w:sz w:val="22"/>
           <w:szCs w:val="22"/>
         </w:rPr>
-        <w:t xml:space="preserve">Monday at Iwo Road. A buyer wants three charger cords and one Camon 30. The cashier finds the cord, adds it, types 3 in Pieces, scans the phone IMEI, and finishes. Shop stock drops by three cords and one phone. The invoice shows both lines.</w:t>
+        <w:t xml:space="preserve">Monday at Iwo Road. A wholesaler buys a Camon 30 at the initial sell price. Later a walk-in wants the same phone. The cashier raises the price on Sell now. Amount received rises with it. The day’s sales record shows both sales at the prices charged.</w:t>
       </w:r>
     </w:p>
     <w:p>
@@ -15625,7 +15625,7 @@
           <w:sz w:val="22"/>
           <w:szCs w:val="22"/>
         </w:rPr>
-        <w:t xml:space="preserve">Scan an In shop IMEI, or type a name, brand, category, or IMEI in Find. Add it. You should see storage and How the phone looks on that line.</w:t>
+        <w:t xml:space="preserve">Scan an In shop IMEI, or type a name, brand, category, or IMEI in Find. Add it. Confirm the price starts at the initial sell price.</w:t>
       </w:r>
     </w:p>
     <w:p>
@@ -15656,7 +15656,7 @@
           <w:sz w:val="22"/>
           <w:szCs w:val="22"/>
         </w:rPr>
-        <w:t xml:space="preserve">Find a pouch or charger cord. Add it. Type how many pieces on this sale. You cannot type more than on hand.</w:t>
+        <w:t xml:space="preserve">For a walk-in, raise the price. Amount received should rise with the new total.</w:t>
       </w:r>
     </w:p>
     <w:p>
@@ -15687,7 +15687,7 @@
           <w:sz w:val="22"/>
           <w:szCs w:val="22"/>
         </w:rPr>
-        <w:t xml:space="preserve">Try a price under the list sell price. Complete sale should refuse unless Super Admin overrides.</w:t>
+        <w:t xml:space="preserve">Try a price under the initial sell price. Complete sale should refuse unless the CEO or Super Admin overrides.</w:t>
       </w:r>
     </w:p>
     <w:p>
@@ -15718,7 +15718,7 @@
           <w:sz w:val="22"/>
           <w:szCs w:val="22"/>
         </w:rPr>
-        <w:t xml:space="preserve">Try a price above the list. Amount received should rise with the new total.</w:t>
+        <w:t xml:space="preserve">Find a pouch or charger cord. Add it. Type how many pieces on this sale.</w:t>
       </w:r>
     </w:p>
     <w:p>
@@ -15860,7 +15860,7 @@
           <w:sz w:val="22"/>
           <w:szCs w:val="22"/>
         </w:rPr>
-        <w:t xml:space="preserve">Pieces cannot go above on hand in this shop.</w:t>
+        <w:t xml:space="preserve">The price starts at the initial sell price. Raising it is allowed. Going under is blocked without CEO or Super Admin.</w:t>
       </w:r>
     </w:p>
     <w:p>
@@ -15883,53 +15883,7 @@
           <w:sz w:val="22"/>
           <w:szCs w:val="22"/>
         </w:rPr>
-        <w:t xml:space="preserve">The scanned line shows storage and How the phone looks from intake.</w:t>
-      </w:r>
-    </w:p>
-    <w:p>
-      <w:pPr>
-        <w:pStyle w:val="ListParagraph"/>
-        <w:numPr>
-          <w:ilvl w:val="0"/>
-          <w:numId w:val="2"/>
-        </w:numPr>
-        <w:spacing w:after="80" w:line="276"/>
-      </w:pPr>
-      <w:r>
-        <w:rPr>
-          <w:rFonts w:ascii="Calibri" w:cs="Calibri" w:eastAsia="Calibri" w:hAnsi="Calibri"/>
-          <w:b w:val="false"/>
-          <w:bCs w:val="false"/>
-          <w:i w:val="false"/>
-          <w:iCs w:val="false"/>
-          <w:color w:val="000000"/>
-          <w:sz w:val="22"/>
-          <w:szCs w:val="22"/>
-        </w:rPr>
-        <w:t xml:space="preserve">A price under the list sell price is blocked unless Super Admin overrides.</w:t>
-      </w:r>
-    </w:p>
-    <w:p>
-      <w:pPr>
-        <w:pStyle w:val="ListParagraph"/>
-        <w:numPr>
-          <w:ilvl w:val="0"/>
-          <w:numId w:val="2"/>
-        </w:numPr>
-        <w:spacing w:after="80" w:line="276"/>
-      </w:pPr>
-      <w:r>
-        <w:rPr>
-          <w:rFonts w:ascii="Calibri" w:cs="Calibri" w:eastAsia="Calibri" w:hAnsi="Calibri"/>
-          <w:b w:val="false"/>
-          <w:bCs w:val="false"/>
-          <w:i w:val="false"/>
-          <w:iCs w:val="false"/>
-          <w:color w:val="000000"/>
-          <w:sz w:val="22"/>
-          <w:szCs w:val="22"/>
-        </w:rPr>
-        <w:t xml:space="preserve">A price above the list is allowed and Amount received updates.</w:t>
+        <w:t xml:space="preserve">Amount received updates when the price changes. The invoice keeps the charged price.</w:t>
       </w:r>
     </w:p>
     <w:p>
@@ -50896,7 +50850,7 @@
                 <w:sz w:val="20"/>
                 <w:szCs w:val="20"/>
               </w:rPr>
-              <w:t xml:space="preserve">List sell price floor on Sell now</w:t>
+              <w:t xml:space="preserve">Initial sell price floor on Sell now</w:t>
             </w:r>
           </w:p>
         </w:tc>
@@ -50933,7 +50887,7 @@
                 <w:sz w:val="20"/>
                 <w:szCs w:val="20"/>
               </w:rPr>
-              <w:t xml:space="preserve">cashier then Super Admin</w:t>
+              <w:t xml:space="preserve">cashier then CEO or Super Admin</w:t>
             </w:r>
           </w:p>
         </w:tc>
@@ -50970,7 +50924,7 @@
                 <w:sz w:val="20"/>
                 <w:szCs w:val="20"/>
               </w:rPr>
-              <w:t xml:space="preserve">A price under the list sell price is refused for the cashier. Super Admin can override. A price above the list completes and the day’s paid amount matches.</w:t>
+              <w:t xml:space="preserve">Price starts at the uploaded initial sell price. Raising it for a walk-in works and the day paid amount matches. Going under is refused for the cashier. CEO or Super Admin can override.</w:t>
             </w:r>
           </w:p>
         </w:tc>
@@ -51739,7 +51693,7 @@
           <w:sz w:val="22"/>
           <w:szCs w:val="22"/>
         </w:rPr>
-        <w:t xml:space="preserve">A sale must stay at or above the list sell price unless Super Admin overrides. Selling above the list is allowed. Amount received updates with the new total.</w:t>
+        <w:t xml:space="preserve">A sale must stay at or above the initial sell price uploaded for that item, unless the CEO or Super Admin overrides. Cashiers may raise the price for a walk-in buyer. The invoice and day books keep the price that was charged.</w:t>
       </w:r>
     </w:p>
     <w:p>
@@ -53823,6 +53777,25 @@
           <w:szCs w:val="22"/>
         </w:rPr>
         <w:t xml:space="preserve">Version 1.54 lets Sell now take piece items by quantity. Pouches, charger cords, and other no-IMEI stock use a Pieces box on this sale, capped at what is on hand. Phones and laptops with IMEI or serial stay one unit each and are still added by scan or find.</w:t>
+      </w:r>
+    </w:p>
+    <w:p>
+      <w:pPr>
+        <w:spacing w:after="160" w:before="0" w:line="276"/>
+        <w:jc w:val="left"/>
+      </w:pPr>
+      <w:r>
+        <w:rPr>
+          <w:rFonts w:ascii="Calibri" w:cs="Calibri" w:eastAsia="Calibri" w:hAnsi="Calibri"/>
+          <w:b w:val="false"/>
+          <w:bCs w:val="false"/>
+          <w:i w:val="false"/>
+          <w:iCs w:val="false"/>
+          <w:color w:val="000000"/>
+          <w:sz w:val="22"/>
+          <w:szCs w:val="22"/>
+        </w:rPr>
+        <w:t xml:space="preserve">Version 1.55 locks the till to the uploaded initial sell price as the floor. That price is often the wholesale figure. Cashiers may raise it for a walk-in buyer. They cannot go under it unless the CEO or Super Admin overrides. The invoice and day books keep the price that was charged.</w:t>
       </w:r>
     </w:p>
     <w:p>

</xml_diff>

<commit_message>
Lock cash pay-outs when the till cannot cover them.
Stop shop expenses, cash refunds, and other cash out from driving Cash in the till below zero, and document the rule in the shop guide.

Co-authored-by: Cursor <cursoragent@cursor.com>
</commit_message>
<xml_diff>
--- a/docs/Abu-Twins-Shop-System-User-Guide.docx
+++ b/docs/Abu-Twins-Shop-System-User-Guide.docx
@@ -459,7 +459,7 @@
                 <w:sz w:val="20"/>
                 <w:szCs w:val="20"/>
               </w:rPr>
-              <w:t xml:space="preserve">1.56</w:t>
+              <w:t xml:space="preserve">1.57</w:t>
             </w:r>
           </w:p>
         </w:tc>
@@ -533,7 +533,7 @@
                 <w:sz w:val="20"/>
                 <w:szCs w:val="20"/>
               </w:rPr>
-              <w:t xml:space="preserve">Updated: Sell now is Cash or Bank, linked to named bank accounts</w:t>
+              <w:t xml:space="preserve">Updated: cash till lock stops pay-outs when the till is empty</w:t>
             </w:r>
           </w:p>
         </w:tc>
@@ -1415,6 +1415,25 @@
           <w:szCs w:val="22"/>
         </w:rPr>
         <w:t xml:space="preserve">Returns now show the return item value, and on Replace from our stock staff pick the In shop unit and its value. Receivable or Payable appears so money matches the event, not quantity alone. Stock and money still wait for Needs approval.</w:t>
+      </w:r>
+    </w:p>
+    <w:p>
+      <w:pPr>
+        <w:spacing w:after="160" w:before="0" w:line="276"/>
+        <w:jc w:val="left"/>
+      </w:pPr>
+      <w:r>
+        <w:rPr>
+          <w:rFonts w:ascii="Calibri" w:cs="Calibri" w:eastAsia="Calibri" w:hAnsi="Calibri"/>
+          <w:b w:val="false"/>
+          <w:bCs w:val="false"/>
+          <w:i w:val="false"/>
+          <w:iCs w:val="false"/>
+          <w:color w:val="000000"/>
+          <w:sz w:val="22"/>
+          <w:szCs w:val="22"/>
+        </w:rPr>
+        <w:t xml:space="preserve">Cash in the till cannot go below zero for new pay-outs. Shop expenses, cash refunds, neighbor cash pay, and cash swap pay-outs are refused when the till does not hold enough. Waiting expenses do not take cash until a manager says yes. Cash sales still add to the till as usual.</w:t>
       </w:r>
     </w:p>
     <w:p>
@@ -23519,7 +23538,7 @@
           <w:sz w:val="22"/>
           <w:szCs w:val="22"/>
         </w:rPr>
-        <w:t xml:space="preserve">Shop expenses is for fuel, rent, salary, and light bill. Cashiers can write these too, because the shop is small and the till person often pays the bills. A manager still says yes before money can leave. Tap All expenses, Waiting, or Approved to cut the list. Each row shows when it was asked and, if yes, when it was approved, in Lagos time.</w:t>
+        <w:t xml:space="preserve">Shop expenses is for fuel, rent, salary, and light bill. Cashiers can write these too, because the shop is small and the till person often pays the bills. A manager still says yes before money can leave. The page shows cash in the till. A cash bill cannot be more than that cash. If the till is empty, the system refuses the bill. Tap All expenses, Waiting, or Approved to cut the list. Each row shows when it was asked and, if yes, when it was approved, in Lagos time.</w:t>
       </w:r>
     </w:p>
     <w:p>
@@ -23557,7 +23576,7 @@
           <w:sz w:val="22"/>
           <w:szCs w:val="22"/>
         </w:rPr>
-        <w:t xml:space="preserve">If anyone can tap cash for ‘fuel’ with no yes, the till will never match. But locking expenses only to accounts would leave the till person stuck when they already paid fuel.</w:t>
+        <w:t xml:space="preserve">If anyone can tap cash for fuel when the till is empty, Cash in the till goes negative and the books lie. The till must hold the money first.</w:t>
       </w:r>
     </w:p>
     <w:p>
@@ -23595,7 +23614,7 @@
           <w:sz w:val="22"/>
           <w:szCs w:val="22"/>
         </w:rPr>
-        <w:t xml:space="preserve">The Challenge cashier pays for fuel, opens Shop expenses, and writes the amount. The request waits on Needs approval. The CEO says yes. Then the pay-out is recorded.</w:t>
+        <w:t xml:space="preserve">Challenge has 5,000 naira cash in the till. The cashier writes a 4,000 naira fuel bill. It waits for yes. The CEO says yes and Cash in the till becomes 1,000 naira. Later someone tries a 20,000 naira bill while the till shows 1,000. Save is refused. They must collect cash sales first, or pay that bill from the bank.</w:t>
       </w:r>
     </w:p>
     <w:p>
@@ -23676,7 +23695,7 @@
           <w:sz w:val="22"/>
           <w:szCs w:val="22"/>
         </w:rPr>
-        <w:t xml:space="preserve">Create a small test expense only if leadership agrees, for example a ₦1 practice line marked TEST.</w:t>
+        <w:t xml:space="preserve">Read Cash in the till now.</w:t>
       </w:r>
     </w:p>
     <w:p>
@@ -23707,7 +23726,69 @@
           <w:sz w:val="22"/>
           <w:szCs w:val="22"/>
         </w:rPr>
-        <w:t xml:space="preserve">Open Needs approval as a manager and say yes or no.</w:t>
+        <w:t xml:space="preserve">Create a small test expense only if leadership agrees, for example a 1 naira practice line marked TEST, and only if the till holds at least that much.</w:t>
+      </w:r>
+    </w:p>
+    <w:p>
+      <w:pPr>
+        <w:spacing w:after="80" w:line="276"/>
+      </w:pPr>
+      <w:r>
+        <w:rPr>
+          <w:rFonts w:ascii="Calibri" w:cs="Calibri" w:eastAsia="Calibri" w:hAnsi="Calibri"/>
+          <w:b/>
+          <w:bCs/>
+          <w:i w:val="false"/>
+          <w:iCs w:val="false"/>
+          <w:color w:val="000000"/>
+          <w:sz w:val="22"/>
+          <w:szCs w:val="22"/>
+        </w:rPr>
+        <w:t xml:space="preserve">4. </w:t>
+      </w:r>
+      <w:r>
+        <w:rPr>
+          <w:rFonts w:ascii="Calibri" w:cs="Calibri" w:eastAsia="Calibri" w:hAnsi="Calibri"/>
+          <w:b w:val="false"/>
+          <w:bCs w:val="false"/>
+          <w:i w:val="false"/>
+          <w:iCs w:val="false"/>
+          <w:color w:val="000000"/>
+          <w:sz w:val="22"/>
+          <w:szCs w:val="22"/>
+        </w:rPr>
+        <w:t xml:space="preserve">Try an amount bigger than cash in the till. Save should refuse.</w:t>
+      </w:r>
+    </w:p>
+    <w:p>
+      <w:pPr>
+        <w:spacing w:after="80" w:line="276"/>
+      </w:pPr>
+      <w:r>
+        <w:rPr>
+          <w:rFonts w:ascii="Calibri" w:cs="Calibri" w:eastAsia="Calibri" w:hAnsi="Calibri"/>
+          <w:b/>
+          <w:bCs/>
+          <w:i w:val="false"/>
+          <w:iCs w:val="false"/>
+          <w:color w:val="000000"/>
+          <w:sz w:val="22"/>
+          <w:szCs w:val="22"/>
+        </w:rPr>
+        <w:t xml:space="preserve">5. </w:t>
+      </w:r>
+      <w:r>
+        <w:rPr>
+          <w:rFonts w:ascii="Calibri" w:cs="Calibri" w:eastAsia="Calibri" w:hAnsi="Calibri"/>
+          <w:b w:val="false"/>
+          <w:bCs w:val="false"/>
+          <w:i w:val="false"/>
+          <w:iCs w:val="false"/>
+          <w:color w:val="000000"/>
+          <w:sz w:val="22"/>
+          <w:szCs w:val="22"/>
+        </w:rPr>
+        <w:t xml:space="preserve">Open Needs approval as a manager and say yes or no on a bill the till can cover.</w:t>
       </w:r>
     </w:p>
     <w:p>
@@ -23772,7 +23853,7 @@
           <w:sz w:val="22"/>
           <w:szCs w:val="22"/>
         </w:rPr>
-        <w:t xml:space="preserve">The form says Ask for this shop bill. Categories are Transport, Fuel, Rent, Light bill, Repairs, Salary, Marketing, or Other shop bill.</w:t>
+        <w:t xml:space="preserve">The form says Ask for this shop bill and shows cash in the till.</w:t>
       </w:r>
     </w:p>
     <w:p>
@@ -23795,7 +23876,7 @@
           <w:sz w:val="22"/>
           <w:szCs w:val="22"/>
         </w:rPr>
-        <w:t xml:space="preserve">A new expense waits. Money does not leave until yes.</w:t>
+        <w:t xml:space="preserve">A bill bigger than cash in the till is refused.</w:t>
       </w:r>
     </w:p>
     <w:p>
@@ -23818,7 +23899,7 @@
           <w:sz w:val="22"/>
           <w:szCs w:val="22"/>
         </w:rPr>
-        <w:t xml:space="preserve">A no leaves the expense rejected.</w:t>
+        <w:t xml:space="preserve">A new expense waits. Money does not leave until yes.</w:t>
       </w:r>
     </w:p>
     <w:p>
@@ -23841,7 +23922,30 @@
           <w:sz w:val="22"/>
           <w:szCs w:val="22"/>
         </w:rPr>
-        <w:t xml:space="preserve">A yes then allows the pay-out to show in Money in &amp; out.</w:t>
+        <w:t xml:space="preserve">A no leaves the expense rejected.</w:t>
+      </w:r>
+    </w:p>
+    <w:p>
+      <w:pPr>
+        <w:pStyle w:val="ListParagraph"/>
+        <w:numPr>
+          <w:ilvl w:val="0"/>
+          <w:numId w:val="2"/>
+        </w:numPr>
+        <w:spacing w:after="80" w:line="276"/>
+      </w:pPr>
+      <w:r>
+        <w:rPr>
+          <w:rFonts w:ascii="Calibri" w:cs="Calibri" w:eastAsia="Calibri" w:hAnsi="Calibri"/>
+          <w:b w:val="false"/>
+          <w:bCs w:val="false"/>
+          <w:i w:val="false"/>
+          <w:iCs w:val="false"/>
+          <w:color w:val="000000"/>
+          <w:sz w:val="22"/>
+          <w:szCs w:val="22"/>
+        </w:rPr>
+        <w:t xml:space="preserve">A yes then takes the cash on Money in and out. Waiting bills do not reduce cash until yes.</w:t>
       </w:r>
     </w:p>
     <w:p>
@@ -51411,6 +51515,159 @@
           </w:p>
         </w:tc>
       </w:tr>
+      <w:tr>
+        <w:trPr>
+          <w:trHeight w:val="320" w:hRule="atLeast"/>
+        </w:trPr>
+        <w:tc>
+          <w:tcPr>
+            <w:tcW w:type="dxa" w:w="600"/>
+            <w:tcBorders>
+              <w:top w:val="single" w:color="000000" w:sz="8"/>
+              <w:left w:val="single" w:color="000000" w:sz="8"/>
+              <w:bottom w:val="single" w:color="000000" w:sz="8"/>
+              <w:right w:val="single" w:color="000000" w:sz="8"/>
+            </w:tcBorders>
+            <w:shd w:fill="F7F7F7" w:color="F7F7F7" w:val="clear"/>
+            <w:tcMar>
+              <w:top w:type="dxa" w:w="60"/>
+              <w:left w:type="dxa" w:w="80"/>
+              <w:bottom w:type="dxa" w:w="60"/>
+              <w:right w:type="dxa" w:w="80"/>
+            </w:tcMar>
+            <w:vAlign w:val="center"/>
+          </w:tcPr>
+          <w:p>
+            <w:pPr>
+              <w:jc w:val="left"/>
+            </w:pPr>
+            <w:r>
+              <w:rPr>
+                <w:rFonts w:ascii="Calibri" w:cs="Calibri" w:eastAsia="Calibri" w:hAnsi="Calibri"/>
+                <w:b w:val="false"/>
+                <w:bCs w:val="false"/>
+                <w:i w:val="false"/>
+                <w:iCs w:val="false"/>
+                <w:color w:val="000000"/>
+                <w:sz w:val="20"/>
+                <w:szCs w:val="20"/>
+              </w:rPr>
+              <w:t xml:space="preserve">83</w:t>
+            </w:r>
+          </w:p>
+        </w:tc>
+        <w:tc>
+          <w:tcPr>
+            <w:tcW w:type="dxa" w:w="2800"/>
+            <w:tcBorders>
+              <w:top w:val="single" w:color="000000" w:sz="8"/>
+              <w:left w:val="single" w:color="000000" w:sz="8"/>
+              <w:bottom w:val="single" w:color="000000" w:sz="8"/>
+              <w:right w:val="single" w:color="000000" w:sz="8"/>
+            </w:tcBorders>
+            <w:shd w:fill="F7F7F7" w:color="F7F7F7" w:val="clear"/>
+            <w:tcMar>
+              <w:top w:type="dxa" w:w="60"/>
+              <w:left w:type="dxa" w:w="80"/>
+              <w:bottom w:type="dxa" w:w="60"/>
+              <w:right w:type="dxa" w:w="80"/>
+            </w:tcMar>
+            <w:vAlign w:val="center"/>
+          </w:tcPr>
+          <w:p>
+            <w:pPr>
+              <w:jc w:val="left"/>
+            </w:pPr>
+            <w:r>
+              <w:rPr>
+                <w:rFonts w:ascii="Calibri" w:cs="Calibri" w:eastAsia="Calibri" w:hAnsi="Calibri"/>
+                <w:b w:val="false"/>
+                <w:bCs w:val="false"/>
+                <w:i w:val="false"/>
+                <w:iCs w:val="false"/>
+                <w:color w:val="000000"/>
+                <w:sz w:val="20"/>
+                <w:szCs w:val="20"/>
+              </w:rPr>
+              <w:t xml:space="preserve">Cash till lock on shop expenses</w:t>
+            </w:r>
+          </w:p>
+        </w:tc>
+        <w:tc>
+          <w:tcPr>
+            <w:tcW w:type="dxa" w:w="2600"/>
+            <w:tcBorders>
+              <w:top w:val="single" w:color="000000" w:sz="8"/>
+              <w:left w:val="single" w:color="000000" w:sz="8"/>
+              <w:bottom w:val="single" w:color="000000" w:sz="8"/>
+              <w:right w:val="single" w:color="000000" w:sz="8"/>
+            </w:tcBorders>
+            <w:shd w:fill="F7F7F7" w:color="F7F7F7" w:val="clear"/>
+            <w:tcMar>
+              <w:top w:type="dxa" w:w="60"/>
+              <w:left w:type="dxa" w:w="80"/>
+              <w:bottom w:type="dxa" w:w="60"/>
+              <w:right w:type="dxa" w:w="80"/>
+            </w:tcMar>
+            <w:vAlign w:val="center"/>
+          </w:tcPr>
+          <w:p>
+            <w:pPr>
+              <w:jc w:val="left"/>
+            </w:pPr>
+            <w:r>
+              <w:rPr>
+                <w:rFonts w:ascii="Calibri" w:cs="Calibri" w:eastAsia="Calibri" w:hAnsi="Calibri"/>
+                <w:b w:val="false"/>
+                <w:bCs w:val="false"/>
+                <w:i w:val="false"/>
+                <w:iCs w:val="false"/>
+                <w:color w:val="000000"/>
+                <w:sz w:val="20"/>
+                <w:szCs w:val="20"/>
+              </w:rPr>
+              <w:t xml:space="preserve">cashier@abutwins.com</w:t>
+            </w:r>
+          </w:p>
+        </w:tc>
+        <w:tc>
+          <w:tcPr>
+            <w:tcW w:type="dxa" w:w="3360"/>
+            <w:tcBorders>
+              <w:top w:val="single" w:color="000000" w:sz="8"/>
+              <w:left w:val="single" w:color="000000" w:sz="8"/>
+              <w:bottom w:val="single" w:color="000000" w:sz="8"/>
+              <w:right w:val="single" w:color="000000" w:sz="8"/>
+            </w:tcBorders>
+            <w:shd w:fill="F7F7F7" w:color="F7F7F7" w:val="clear"/>
+            <w:tcMar>
+              <w:top w:type="dxa" w:w="60"/>
+              <w:left w:type="dxa" w:w="80"/>
+              <w:bottom w:type="dxa" w:w="60"/>
+              <w:right w:type="dxa" w:w="80"/>
+            </w:tcMar>
+            <w:vAlign w:val="center"/>
+          </w:tcPr>
+          <w:p>
+            <w:pPr>
+              <w:jc w:val="left"/>
+            </w:pPr>
+            <w:r>
+              <w:rPr>
+                <w:rFonts w:ascii="Calibri" w:cs="Calibri" w:eastAsia="Calibri" w:hAnsi="Calibri"/>
+                <w:b w:val="false"/>
+                <w:bCs w:val="false"/>
+                <w:i w:val="false"/>
+                <w:iCs w:val="false"/>
+                <w:color w:val="000000"/>
+                <w:sz w:val="20"/>
+                <w:szCs w:val="20"/>
+              </w:rPr>
+              <w:t xml:space="preserve">With cash in the till at zero, Save this shop bill for any amount is refused. After a cash sale, a bill within the till amount waits for yes. Saying yes reduces Cash in the till. A bill above the till is refused on create and on yes.</w:t>
+            </w:r>
+          </w:p>
+        </w:tc>
+      </w:tr>
     </w:tbl>
     <w:p>
       <w:pPr>
@@ -53972,6 +54229,44 @@
           <w:szCs w:val="22"/>
         </w:rPr>
         <w:t xml:space="preserve">Version 1.55 locks the till to the uploaded initial sell price as the floor. That price is often the wholesale figure. Cashiers may raise it for a walk-in buyer. They cannot go under it unless the CEO or Super Admin overrides. The invoice and day books keep the price that was charged.</w:t>
+      </w:r>
+    </w:p>
+    <w:p>
+      <w:pPr>
+        <w:spacing w:after="160" w:before="0" w:line="276"/>
+        <w:jc w:val="left"/>
+      </w:pPr>
+      <w:r>
+        <w:rPr>
+          <w:rFonts w:ascii="Calibri" w:cs="Calibri" w:eastAsia="Calibri" w:hAnsi="Calibri"/>
+          <w:b w:val="false"/>
+          <w:bCs w:val="false"/>
+          <w:i w:val="false"/>
+          <w:iCs w:val="false"/>
+          <w:color w:val="000000"/>
+          <w:sz w:val="22"/>
+          <w:szCs w:val="22"/>
+        </w:rPr>
+        <w:t xml:space="preserve">Version 1.56 makes Sell now Cash or Bank only, and links Bank sales to a named bank account from Money in and out.</w:t>
+      </w:r>
+    </w:p>
+    <w:p>
+      <w:pPr>
+        <w:spacing w:after="160" w:before="0" w:line="276"/>
+        <w:jc w:val="left"/>
+      </w:pPr>
+      <w:r>
+        <w:rPr>
+          <w:rFonts w:ascii="Calibri" w:cs="Calibri" w:eastAsia="Calibri" w:hAnsi="Calibri"/>
+          <w:b w:val="false"/>
+          <w:bCs w:val="false"/>
+          <w:i w:val="false"/>
+          <w:iCs w:val="false"/>
+          <w:color w:val="000000"/>
+          <w:sz w:val="22"/>
+          <w:szCs w:val="22"/>
+        </w:rPr>
+        <w:t xml:space="preserve">Version 1.57 locks cash pay-outs. Shop expenses, cash refunds, and other cash out cannot run when Cash in the till is empty or short. Waiting bills do not take cash until yes. Cash sales still add to the till.</w:t>
       </w:r>
     </w:p>
     <w:p>

</xml_diff>

<commit_message>
Unify Sell now into one scan-or-type box for every item.
Replace the separate IMEI scan and find fields with a single till lookup so phones and piece items share one clear counter path.

Co-authored-by: Cursor <cursoragent@cursor.com>
</commit_message>
<xml_diff>
--- a/docs/Abu-Twins-Shop-System-User-Guide.docx
+++ b/docs/Abu-Twins-Shop-System-User-Guide.docx
@@ -459,7 +459,7 @@
                 <w:sz w:val="20"/>
                 <w:szCs w:val="20"/>
               </w:rPr>
-              <w:t xml:space="preserve">1.57</w:t>
+              <w:t xml:space="preserve">1.58</w:t>
             </w:r>
           </w:p>
         </w:tc>
@@ -533,7 +533,7 @@
                 <w:sz w:val="20"/>
                 <w:szCs w:val="20"/>
               </w:rPr>
-              <w:t xml:space="preserve">Updated: cash till lock stops pay-outs when the till is empty</w:t>
+              <w:t xml:space="preserve">Updated: Sell now uses one scan-or-type box for every item</w:t>
             </w:r>
           </w:p>
         </w:tc>
@@ -1415,6 +1415,25 @@
           <w:szCs w:val="22"/>
         </w:rPr>
         <w:t xml:space="preserve">Returns now show the return item value, and on Replace from our stock staff pick the In shop unit and its value. Receivable or Payable appears so money matches the event, not quantity alone. Stock and money still wait for Needs approval.</w:t>
+      </w:r>
+    </w:p>
+    <w:p>
+      <w:pPr>
+        <w:spacing w:after="160" w:before="0" w:line="276"/>
+        <w:jc w:val="left"/>
+      </w:pPr>
+      <w:r>
+        <w:rPr>
+          <w:rFonts w:ascii="Calibri" w:cs="Calibri" w:eastAsia="Calibri" w:hAnsi="Calibri"/>
+          <w:b w:val="false"/>
+          <w:bCs w:val="false"/>
+          <w:i w:val="false"/>
+          <w:iCs w:val="false"/>
+          <w:color w:val="000000"/>
+          <w:sz w:val="22"/>
+          <w:szCs w:val="22"/>
+        </w:rPr>
+        <w:t xml:space="preserve">Sell now now has one box only. Scan or type IMEI, serial, phone name, brand, category, pouch, or charger cord in that same place. There is no second find field. That keeps the till simple when light is low or the line is rough.</w:t>
       </w:r>
     </w:p>
     <w:p>
@@ -15394,7 +15413,7 @@
           <w:sz w:val="22"/>
           <w:szCs w:val="22"/>
         </w:rPr>
-        <w:t xml:space="preserve">Sell now is the till. You scan an IMEI, or type to find by IMEI, phone name, brand, category, storage, or a piece item such as a pouch or charger cord. Phones with IMEI or serial stay one unit each. Piece items show a Pieces box so you sell as many as you have on hand. Each phone line shows storage and How the phone looks under the name. The uploaded initial sell price is the floor (often for wholesale). You may raise it for a walk-in buyer. You cannot go under it unless the CEO or Super Admin overrides. Payment is Cash or Bank only. Bank means the full amount landed in one named bank account from Money in and out. Transfer, POS terminal, and USSD all count as Bank. There is no split payment.</w:t>
+        <w:t xml:space="preserve">Sell now is the till. There is one box: Scan or type to add to this sale. Use it for IMEI, serial, phone name, brand, category, storage, pouch, or charger cord. Phones and piece items share that same box. Phones with IMEI or serial stay one unit each. Piece items show a Pieces box on the sale line so you sell as many as you have on hand. Each phone line shows storage and How the phone looks under the name. The uploaded initial sell price is the floor (often for wholesale). You may raise it for a walk-in buyer. You cannot go under it unless the CEO or Super Admin overrides. Payment is Cash or Bank only. Bank means the full amount landed in one named bank account from Money in and out. Transfer, POS terminal, and USSD all count as Bank. There is no split payment.</w:t>
       </w:r>
     </w:p>
     <w:p>
@@ -15432,7 +15451,7 @@
           <w:sz w:val="22"/>
           <w:szCs w:val="22"/>
         </w:rPr>
-        <w:t xml:space="preserve">Wholesale and walk-in buyers often pay different amounts for the same phone. The shop needs a floor so cashiers cannot quietly undercut the uploaded price, and room to raise the price when a walk-in arrives. Cash is cash. Bank is bank. Staff should not argue about POS versus transfer when the money is the same bank money.</w:t>
+        <w:t xml:space="preserve">Two boxes on the till slow staff down, especially when light is low or a USB scanner is in use. One clear box for every item keeps the counter fast. Wholesale and walk-in buyers often pay different amounts for the same phone, so the floor and Cash or Bank rules stay.</w:t>
       </w:r>
     </w:p>
     <w:p>
@@ -15470,7 +15489,7 @@
           <w:sz w:val="22"/>
           <w:szCs w:val="22"/>
         </w:rPr>
-        <w:t xml:space="preserve">Monday at Iwo Road. A wholesaler buys a Camon 30 and pays by bank transfer into GTBank. The cashier picks Bank, then GTBank on Sell now. Later a walk-in pays cash for another phone. The day’s sales record shows cash in the till and bank into GTBank.</w:t>
+        <w:t xml:space="preserve">Monday at Iwo Road. The cashier scans a Camon 30 IMEI in the one box. Later a buyer wants a pouch. The cashier types pouch in the same box, taps the match, sets Pieces to 2, and finishes with cash. There was no second find field to hunt for.</w:t>
       </w:r>
     </w:p>
     <w:p>
@@ -15644,7 +15663,7 @@
           <w:sz w:val="22"/>
           <w:szCs w:val="22"/>
         </w:rPr>
-        <w:t xml:space="preserve">Scan an In shop IMEI, or type a name, brand, category, or IMEI in Find. Add it. Confirm the price starts at the initial sell price.</w:t>
+        <w:t xml:space="preserve">In the one box, scan an In shop IMEI, or type a name, brand, category, serial, or piece item. Press Enter or tap a match. Confirm the price starts at the initial sell price.</w:t>
       </w:r>
     </w:p>
     <w:p>
@@ -15737,7 +15756,7 @@
           <w:sz w:val="22"/>
           <w:szCs w:val="22"/>
         </w:rPr>
-        <w:t xml:space="preserve">Find a pouch or charger cord. Add it. Type how many pieces on this sale.</w:t>
+        <w:t xml:space="preserve">Type a pouch or charger cord in the same box. Add it. Type how many pieces on this sale.</w:t>
       </w:r>
     </w:p>
     <w:p>
@@ -15833,7 +15852,30 @@
           <w:sz w:val="22"/>
           <w:szCs w:val="22"/>
         </w:rPr>
-        <w:t xml:space="preserve">Find matches IMEI, name, brand, category, storage, and piece items.</w:t>
+        <w:t xml:space="preserve">There is one Scan or type box, not a separate phone scan and find field.</w:t>
+      </w:r>
+    </w:p>
+    <w:p>
+      <w:pPr>
+        <w:pStyle w:val="ListParagraph"/>
+        <w:numPr>
+          <w:ilvl w:val="0"/>
+          <w:numId w:val="2"/>
+        </w:numPr>
+        <w:spacing w:after="80" w:line="276"/>
+      </w:pPr>
+      <w:r>
+        <w:rPr>
+          <w:rFonts w:ascii="Calibri" w:cs="Calibri" w:eastAsia="Calibri" w:hAnsi="Calibri"/>
+          <w:b w:val="false"/>
+          <w:bCs w:val="false"/>
+          <w:i w:val="false"/>
+          <w:iCs w:val="false"/>
+          <w:color w:val="000000"/>
+          <w:sz w:val="22"/>
+          <w:szCs w:val="22"/>
+        </w:rPr>
+        <w:t xml:space="preserve">That box matches IMEI, serial, name, brand, category, storage, and piece items.</w:t>
       </w:r>
     </w:p>
     <w:p>
@@ -51130,7 +51172,7 @@
                 <w:sz w:val="20"/>
                 <w:szCs w:val="20"/>
               </w:rPr>
-              <w:t xml:space="preserve">Find on Sell now by name or category</w:t>
+              <w:t xml:space="preserve">One box on Sell now finds phones and piece items</w:t>
             </w:r>
           </w:p>
         </w:tc>
@@ -51204,7 +51246,7 @@
                 <w:sz w:val="20"/>
                 <w:szCs w:val="20"/>
               </w:rPr>
-              <w:t xml:space="preserve">Type a phone name, brand, category, or storage. Hits show storage and Uk or Brand new. Enter adds the first hit.</w:t>
+              <w:t xml:space="preserve">Sell now shows one Scan or type box. Type a phone name, brand, category, storage, or pouch. Hits list phones and piece items together. Enter adds the first hit. There is no second find field.</w:t>
             </w:r>
           </w:p>
         </w:tc>
@@ -51664,6 +51706,159 @@
                 <w:szCs w:val="20"/>
               </w:rPr>
               <w:t xml:space="preserve">With cash in the till at zero, Save this shop bill for any amount is refused. After a cash sale, a bill within the till amount waits for yes. Saying yes reduces Cash in the till. A bill above the till is refused on create and on yes.</w:t>
+            </w:r>
+          </w:p>
+        </w:tc>
+      </w:tr>
+      <w:tr>
+        <w:trPr>
+          <w:trHeight w:val="320" w:hRule="atLeast"/>
+        </w:trPr>
+        <w:tc>
+          <w:tcPr>
+            <w:tcW w:type="dxa" w:w="600"/>
+            <w:tcBorders>
+              <w:top w:val="single" w:color="000000" w:sz="8"/>
+              <w:left w:val="single" w:color="000000" w:sz="8"/>
+              <w:bottom w:val="single" w:color="000000" w:sz="8"/>
+              <w:right w:val="single" w:color="000000" w:sz="8"/>
+            </w:tcBorders>
+            <w:shd w:fill="FFFFFF" w:color="FFFFFF" w:val="clear"/>
+            <w:tcMar>
+              <w:top w:type="dxa" w:w="60"/>
+              <w:left w:type="dxa" w:w="80"/>
+              <w:bottom w:type="dxa" w:w="60"/>
+              <w:right w:type="dxa" w:w="80"/>
+            </w:tcMar>
+            <w:vAlign w:val="center"/>
+          </w:tcPr>
+          <w:p>
+            <w:pPr>
+              <w:jc w:val="left"/>
+            </w:pPr>
+            <w:r>
+              <w:rPr>
+                <w:rFonts w:ascii="Calibri" w:cs="Calibri" w:eastAsia="Calibri" w:hAnsi="Calibri"/>
+                <w:b w:val="false"/>
+                <w:bCs w:val="false"/>
+                <w:i w:val="false"/>
+                <w:iCs w:val="false"/>
+                <w:color w:val="000000"/>
+                <w:sz w:val="20"/>
+                <w:szCs w:val="20"/>
+              </w:rPr>
+              <w:t xml:space="preserve">84</w:t>
+            </w:r>
+          </w:p>
+        </w:tc>
+        <w:tc>
+          <w:tcPr>
+            <w:tcW w:type="dxa" w:w="2800"/>
+            <w:tcBorders>
+              <w:top w:val="single" w:color="000000" w:sz="8"/>
+              <w:left w:val="single" w:color="000000" w:sz="8"/>
+              <w:bottom w:val="single" w:color="000000" w:sz="8"/>
+              <w:right w:val="single" w:color="000000" w:sz="8"/>
+            </w:tcBorders>
+            <w:shd w:fill="FFFFFF" w:color="FFFFFF" w:val="clear"/>
+            <w:tcMar>
+              <w:top w:type="dxa" w:w="60"/>
+              <w:left w:type="dxa" w:w="80"/>
+              <w:bottom w:type="dxa" w:w="60"/>
+              <w:right w:type="dxa" w:w="80"/>
+            </w:tcMar>
+            <w:vAlign w:val="center"/>
+          </w:tcPr>
+          <w:p>
+            <w:pPr>
+              <w:jc w:val="left"/>
+            </w:pPr>
+            <w:r>
+              <w:rPr>
+                <w:rFonts w:ascii="Calibri" w:cs="Calibri" w:eastAsia="Calibri" w:hAnsi="Calibri"/>
+                <w:b w:val="false"/>
+                <w:bCs w:val="false"/>
+                <w:i w:val="false"/>
+                <w:iCs w:val="false"/>
+                <w:color w:val="000000"/>
+                <w:sz w:val="20"/>
+                <w:szCs w:val="20"/>
+              </w:rPr>
+              <w:t xml:space="preserve">Sell now one scan-or-type box</w:t>
+            </w:r>
+          </w:p>
+        </w:tc>
+        <w:tc>
+          <w:tcPr>
+            <w:tcW w:type="dxa" w:w="2600"/>
+            <w:tcBorders>
+              <w:top w:val="single" w:color="000000" w:sz="8"/>
+              <w:left w:val="single" w:color="000000" w:sz="8"/>
+              <w:bottom w:val="single" w:color="000000" w:sz="8"/>
+              <w:right w:val="single" w:color="000000" w:sz="8"/>
+            </w:tcBorders>
+            <w:shd w:fill="FFFFFF" w:color="FFFFFF" w:val="clear"/>
+            <w:tcMar>
+              <w:top w:type="dxa" w:w="60"/>
+              <w:left w:type="dxa" w:w="80"/>
+              <w:bottom w:type="dxa" w:w="60"/>
+              <w:right w:type="dxa" w:w="80"/>
+            </w:tcMar>
+            <w:vAlign w:val="center"/>
+          </w:tcPr>
+          <w:p>
+            <w:pPr>
+              <w:jc w:val="left"/>
+            </w:pPr>
+            <w:r>
+              <w:rPr>
+                <w:rFonts w:ascii="Calibri" w:cs="Calibri" w:eastAsia="Calibri" w:hAnsi="Calibri"/>
+                <w:b w:val="false"/>
+                <w:bCs w:val="false"/>
+                <w:i w:val="false"/>
+                <w:iCs w:val="false"/>
+                <w:color w:val="000000"/>
+                <w:sz w:val="20"/>
+                <w:szCs w:val="20"/>
+              </w:rPr>
+              <w:t xml:space="preserve">cashier@abutwins.com</w:t>
+            </w:r>
+          </w:p>
+        </w:tc>
+        <w:tc>
+          <w:tcPr>
+            <w:tcW w:type="dxa" w:w="3360"/>
+            <w:tcBorders>
+              <w:top w:val="single" w:color="000000" w:sz="8"/>
+              <w:left w:val="single" w:color="000000" w:sz="8"/>
+              <w:bottom w:val="single" w:color="000000" w:sz="8"/>
+              <w:right w:val="single" w:color="000000" w:sz="8"/>
+            </w:tcBorders>
+            <w:shd w:fill="FFFFFF" w:color="FFFFFF" w:val="clear"/>
+            <w:tcMar>
+              <w:top w:type="dxa" w:w="60"/>
+              <w:left w:type="dxa" w:w="80"/>
+              <w:bottom w:type="dxa" w:w="60"/>
+              <w:right w:type="dxa" w:w="80"/>
+            </w:tcMar>
+            <w:vAlign w:val="center"/>
+          </w:tcPr>
+          <w:p>
+            <w:pPr>
+              <w:jc w:val="left"/>
+            </w:pPr>
+            <w:r>
+              <w:rPr>
+                <w:rFonts w:ascii="Calibri" w:cs="Calibri" w:eastAsia="Calibri" w:hAnsi="Calibri"/>
+                <w:b w:val="false"/>
+                <w:bCs w:val="false"/>
+                <w:i w:val="false"/>
+                <w:iCs w:val="false"/>
+                <w:color w:val="000000"/>
+                <w:sz w:val="20"/>
+                <w:szCs w:val="20"/>
+              </w:rPr>
+              <w:t xml:space="preserve">Add to this sale has one box. Scan an IMEI. Type a charger cord name in the same box. Both add to This sale. No second search line appears.</w:t>
             </w:r>
           </w:p>
         </w:tc>
@@ -54267,6 +54462,25 @@
           <w:szCs w:val="22"/>
         </w:rPr>
         <w:t xml:space="preserve">Version 1.57 locks cash pay-outs. Shop expenses, cash refunds, and other cash out cannot run when Cash in the till is empty or short. Waiting bills do not take cash until yes. Cash sales still add to the till.</w:t>
+      </w:r>
+    </w:p>
+    <w:p>
+      <w:pPr>
+        <w:spacing w:after="160" w:before="0" w:line="276"/>
+        <w:jc w:val="left"/>
+      </w:pPr>
+      <w:r>
+        <w:rPr>
+          <w:rFonts w:ascii="Calibri" w:cs="Calibri" w:eastAsia="Calibri" w:hAnsi="Calibri"/>
+          <w:b w:val="false"/>
+          <w:bCs w:val="false"/>
+          <w:i w:val="false"/>
+          <w:iCs w:val="false"/>
+          <w:color w:val="000000"/>
+          <w:sz w:val="22"/>
+          <w:szCs w:val="22"/>
+        </w:rPr>
+        <w:t xml:space="preserve">Version 1.58 puts one Scan or type box on Sell now for phones and piece items. The second find field is gone.</w:t>
       </w:r>
     </w:p>
     <w:p>

</xml_diff>

<commit_message>
Show Sales, Paid, and Balance columns with filter totals.
Split the combined Total / Paid cell so cashiers and managers can check sales value, money taken, and what is still owed for a day or date range.

Co-authored-by: Cursor <cursoragent@cursor.com>
</commit_message>
<xml_diff>
--- a/docs/Abu-Twins-Shop-System-User-Guide.docx
+++ b/docs/Abu-Twins-Shop-System-User-Guide.docx
@@ -459,7 +459,7 @@
                 <w:sz w:val="20"/>
                 <w:szCs w:val="20"/>
               </w:rPr>
-              <w:t xml:space="preserve">1.58</w:t>
+              <w:t xml:space="preserve">1.59</w:t>
             </w:r>
           </w:p>
         </w:tc>
@@ -533,7 +533,7 @@
                 <w:sz w:val="20"/>
                 <w:szCs w:val="20"/>
               </w:rPr>
-              <w:t xml:space="preserve">Updated: Sell now uses one scan-or-type box for every item</w:t>
+              <w:t xml:space="preserve">Updated: Sales list shows Sales, Paid, Balance, and filter totals</w:t>
             </w:r>
           </w:p>
         </w:tc>
@@ -1434,6 +1434,25 @@
           <w:szCs w:val="22"/>
         </w:rPr>
         <w:t xml:space="preserve">Sell now now has one box only. Scan or type IMEI, serial, phone name, brand, category, pouch, or charger cord in that same place. There is no second find field. That keeps the till simple when light is low or the line is rough.</w:t>
+      </w:r>
+    </w:p>
+    <w:p>
+      <w:pPr>
+        <w:spacing w:after="160" w:before="0" w:line="276"/>
+        <w:jc w:val="left"/>
+      </w:pPr>
+      <w:r>
+        <w:rPr>
+          <w:rFonts w:ascii="Calibri" w:cs="Calibri" w:eastAsia="Calibri" w:hAnsi="Calibri"/>
+          <w:b w:val="false"/>
+          <w:bCs w:val="false"/>
+          <w:i w:val="false"/>
+          <w:iCs w:val="false"/>
+          <w:color w:val="000000"/>
+          <w:sz w:val="22"/>
+          <w:szCs w:val="22"/>
+        </w:rPr>
+        <w:t xml:space="preserve">Sales now shows Branch, Customer, Sales, Paid, Balance, and Payment method as their own columns. Balance is paid minus sales, so money still owed shows as a negative figure. Totals for sales value, payments, and balance sit above the list and again at the foot, and they follow Today, Last 7 days, or Last 30 days.</w:t>
       </w:r>
     </w:p>
     <w:p>
@@ -16047,7 +16066,7 @@
           <w:sz w:val="22"/>
           <w:szCs w:val="22"/>
         </w:rPr>
-        <w:t xml:space="preserve">Sales is the list of every invoice. Tap Paid up, Part paid, or Unpaid to cut the list by money on the bill. Tap Today, Last 7 days, or Last 30 days under When it was sold. Each row has a When column in Lagos time. Open one invoice to collect remaining money, attach a buyer name, or print. The invoice itself cannot be edited. Items, IMEIs, and prices stay as they were on the day of the sale.</w:t>
+        <w:t xml:space="preserve">Sales is the list of every invoice. Each row has its own columns for Branch, Customer, Sales value, Paid, Balance, and Payment method. Balance is paid minus sales: a 6,000 naira sale with nothing paid shows Balance -6,000. Tap Paid up, Part paid, or Unpaid to cut the list by money on the bill. Tap Today, Last 7 days, or Last 30 days under When it was sold. Cards at the top and a totals row at the foot show Sales value, Payments received, and Balance for the filter. Each row has a When column in Lagos time. Open one invoice to collect remaining money, attach a buyer name, or print. The invoice itself cannot be edited. Items, IMEIs, and prices stay as they were on the day of the sale.</w:t>
       </w:r>
     </w:p>
     <w:p>
@@ -16085,7 +16104,7 @@
           <w:sz w:val="22"/>
           <w:szCs w:val="22"/>
         </w:rPr>
-        <w:t xml:space="preserve">If staff can change yesterday’s sale, the day’s cash never matches. The paper the buyer holds must match the system.</w:t>
+        <w:t xml:space="preserve">Cashiers and managers need one clear picture of what was sold, what was paid, and what is still owed for a day or a stretch of days. A combined Total / Paid cell hid the balance.</w:t>
       </w:r>
     </w:p>
     <w:p>
@@ -16123,7 +16142,7 @@
           <w:sz w:val="22"/>
           <w:szCs w:val="22"/>
         </w:rPr>
-        <w:t xml:space="preserve">A buyer paid half yesterday. Today they bring the rest. The cashier opens the invoice, types the rest, and posts the collection. The old lines do not change. A new payment line is added. The printed invoice still shows the same phones.</w:t>
+        <w:t xml:space="preserve">Friday at Iwo Road. The manager taps Today on Sales. The cards show Sales value 180,000, Payments received 120,000, and Balance -60,000. One row is a credit sale for 60,000 with Paid 0 and Balance -60,000. They open that invoice and collect the rest. After refresh, Paid matches Sales and Balance is zero for that bill.</w:t>
       </w:r>
     </w:p>
     <w:p>
@@ -16204,7 +16223,7 @@
           <w:sz w:val="22"/>
           <w:szCs w:val="22"/>
         </w:rPr>
-        <w:t xml:space="preserve">Open any invoice.</w:t>
+        <w:t xml:space="preserve">Tap Today, or Last 7 days, to match the cashier day you are checking.</w:t>
       </w:r>
     </w:p>
     <w:p>
@@ -16235,7 +16254,7 @@
           <w:sz w:val="22"/>
           <w:szCs w:val="22"/>
         </w:rPr>
-        <w:t xml:space="preserve">Read the yellow note: This sale cannot be changed.</w:t>
+        <w:t xml:space="preserve">Read Sales value, Payments received, and Balance on the cards and on the totals row.</w:t>
       </w:r>
     </w:p>
     <w:p>
@@ -16266,7 +16285,7 @@
           <w:sz w:val="22"/>
           <w:szCs w:val="22"/>
         </w:rPr>
-        <w:t xml:space="preserve">Scroll to the blue invoice header.</w:t>
+        <w:t xml:space="preserve">Confirm Branch, Customer, Sales, Paid, Balance, and Payment method each have their own column.</w:t>
       </w:r>
     </w:p>
     <w:p>
@@ -16297,6 +16316,99 @@
           <w:sz w:val="22"/>
           <w:szCs w:val="22"/>
         </w:rPr>
+        <w:t xml:space="preserve">Open any invoice.</w:t>
+      </w:r>
+    </w:p>
+    <w:p>
+      <w:pPr>
+        <w:spacing w:after="80" w:line="276"/>
+      </w:pPr>
+      <w:r>
+        <w:rPr>
+          <w:rFonts w:ascii="Calibri" w:cs="Calibri" w:eastAsia="Calibri" w:hAnsi="Calibri"/>
+          <w:b/>
+          <w:bCs/>
+          <w:i w:val="false"/>
+          <w:iCs w:val="false"/>
+          <w:color w:val="000000"/>
+          <w:sz w:val="22"/>
+          <w:szCs w:val="22"/>
+        </w:rPr>
+        <w:t xml:space="preserve">6. </w:t>
+      </w:r>
+      <w:r>
+        <w:rPr>
+          <w:rFonts w:ascii="Calibri" w:cs="Calibri" w:eastAsia="Calibri" w:hAnsi="Calibri"/>
+          <w:b w:val="false"/>
+          <w:bCs w:val="false"/>
+          <w:i w:val="false"/>
+          <w:iCs w:val="false"/>
+          <w:color w:val="000000"/>
+          <w:sz w:val="22"/>
+          <w:szCs w:val="22"/>
+        </w:rPr>
+        <w:t xml:space="preserve">Read the yellow note: This sale cannot be changed.</w:t>
+      </w:r>
+    </w:p>
+    <w:p>
+      <w:pPr>
+        <w:spacing w:after="80" w:line="276"/>
+      </w:pPr>
+      <w:r>
+        <w:rPr>
+          <w:rFonts w:ascii="Calibri" w:cs="Calibri" w:eastAsia="Calibri" w:hAnsi="Calibri"/>
+          <w:b/>
+          <w:bCs/>
+          <w:i w:val="false"/>
+          <w:iCs w:val="false"/>
+          <w:color w:val="000000"/>
+          <w:sz w:val="22"/>
+          <w:szCs w:val="22"/>
+        </w:rPr>
+        <w:t xml:space="preserve">7. </w:t>
+      </w:r>
+      <w:r>
+        <w:rPr>
+          <w:rFonts w:ascii="Calibri" w:cs="Calibri" w:eastAsia="Calibri" w:hAnsi="Calibri"/>
+          <w:b w:val="false"/>
+          <w:bCs w:val="false"/>
+          <w:i w:val="false"/>
+          <w:iCs w:val="false"/>
+          <w:color w:val="000000"/>
+          <w:sz w:val="22"/>
+          <w:szCs w:val="22"/>
+        </w:rPr>
+        <w:t xml:space="preserve">Scroll to the blue invoice header.</w:t>
+      </w:r>
+    </w:p>
+    <w:p>
+      <w:pPr>
+        <w:spacing w:after="80" w:line="276"/>
+      </w:pPr>
+      <w:r>
+        <w:rPr>
+          <w:rFonts w:ascii="Calibri" w:cs="Calibri" w:eastAsia="Calibri" w:hAnsi="Calibri"/>
+          <w:b/>
+          <w:bCs/>
+          <w:i w:val="false"/>
+          <w:iCs w:val="false"/>
+          <w:color w:val="000000"/>
+          <w:sz w:val="22"/>
+          <w:szCs w:val="22"/>
+        </w:rPr>
+        <w:t xml:space="preserve">8. </w:t>
+      </w:r>
+      <w:r>
+        <w:rPr>
+          <w:rFonts w:ascii="Calibri" w:cs="Calibri" w:eastAsia="Calibri" w:hAnsi="Calibri"/>
+          <w:b w:val="false"/>
+          <w:bCs w:val="false"/>
+          <w:i w:val="false"/>
+          <w:iCs w:val="false"/>
+          <w:color w:val="000000"/>
+          <w:sz w:val="22"/>
+          <w:szCs w:val="22"/>
+        </w:rPr>
         <w:t xml:space="preserve">Click Print invoice. (You may cancel the print box after you see the preview.)</w:t>
       </w:r>
     </w:p>
@@ -16317,6 +16429,75 @@
           <w:szCs w:val="24"/>
         </w:rPr>
         <w:t xml:space="preserve">What you should see</w:t>
+      </w:r>
+    </w:p>
+    <w:p>
+      <w:pPr>
+        <w:pStyle w:val="ListParagraph"/>
+        <w:numPr>
+          <w:ilvl w:val="0"/>
+          <w:numId w:val="2"/>
+        </w:numPr>
+        <w:spacing w:after="80" w:line="276"/>
+      </w:pPr>
+      <w:r>
+        <w:rPr>
+          <w:rFonts w:ascii="Calibri" w:cs="Calibri" w:eastAsia="Calibri" w:hAnsi="Calibri"/>
+          <w:b w:val="false"/>
+          <w:bCs w:val="false"/>
+          <w:i w:val="false"/>
+          <w:iCs w:val="false"/>
+          <w:color w:val="000000"/>
+          <w:sz w:val="22"/>
+          <w:szCs w:val="22"/>
+        </w:rPr>
+        <w:t xml:space="preserve">Sales, Paid, and Balance are separate columns. There is no Total / Paid combined cell.</w:t>
+      </w:r>
+    </w:p>
+    <w:p>
+      <w:pPr>
+        <w:pStyle w:val="ListParagraph"/>
+        <w:numPr>
+          <w:ilvl w:val="0"/>
+          <w:numId w:val="2"/>
+        </w:numPr>
+        <w:spacing w:after="80" w:line="276"/>
+      </w:pPr>
+      <w:r>
+        <w:rPr>
+          <w:rFonts w:ascii="Calibri" w:cs="Calibri" w:eastAsia="Calibri" w:hAnsi="Calibri"/>
+          <w:b w:val="false"/>
+          <w:bCs w:val="false"/>
+          <w:i w:val="false"/>
+          <w:iCs w:val="false"/>
+          <w:color w:val="000000"/>
+          <w:sz w:val="22"/>
+          <w:szCs w:val="22"/>
+        </w:rPr>
+        <w:t xml:space="preserve">A sale of 6,000 with nothing paid shows Balance -6,000.</w:t>
+      </w:r>
+    </w:p>
+    <w:p>
+      <w:pPr>
+        <w:pStyle w:val="ListParagraph"/>
+        <w:numPr>
+          <w:ilvl w:val="0"/>
+          <w:numId w:val="2"/>
+        </w:numPr>
+        <w:spacing w:after="80" w:line="276"/>
+      </w:pPr>
+      <w:r>
+        <w:rPr>
+          <w:rFonts w:ascii="Calibri" w:cs="Calibri" w:eastAsia="Calibri" w:hAnsi="Calibri"/>
+          <w:b w:val="false"/>
+          <w:bCs w:val="false"/>
+          <w:i w:val="false"/>
+          <w:iCs w:val="false"/>
+          <w:color w:val="000000"/>
+          <w:sz w:val="22"/>
+          <w:szCs w:val="22"/>
+        </w:rPr>
+        <w:t xml:space="preserve">Filter totals match the sum of the rows on that filter.</w:t>
       </w:r>
     </w:p>
     <w:p>
@@ -51863,6 +52044,159 @@
           </w:p>
         </w:tc>
       </w:tr>
+      <w:tr>
+        <w:trPr>
+          <w:trHeight w:val="320" w:hRule="atLeast"/>
+        </w:trPr>
+        <w:tc>
+          <w:tcPr>
+            <w:tcW w:type="dxa" w:w="600"/>
+            <w:tcBorders>
+              <w:top w:val="single" w:color="000000" w:sz="8"/>
+              <w:left w:val="single" w:color="000000" w:sz="8"/>
+              <w:bottom w:val="single" w:color="000000" w:sz="8"/>
+              <w:right w:val="single" w:color="000000" w:sz="8"/>
+            </w:tcBorders>
+            <w:shd w:fill="F7F7F7" w:color="F7F7F7" w:val="clear"/>
+            <w:tcMar>
+              <w:top w:type="dxa" w:w="60"/>
+              <w:left w:type="dxa" w:w="80"/>
+              <w:bottom w:type="dxa" w:w="60"/>
+              <w:right w:type="dxa" w:w="80"/>
+            </w:tcMar>
+            <w:vAlign w:val="center"/>
+          </w:tcPr>
+          <w:p>
+            <w:pPr>
+              <w:jc w:val="left"/>
+            </w:pPr>
+            <w:r>
+              <w:rPr>
+                <w:rFonts w:ascii="Calibri" w:cs="Calibri" w:eastAsia="Calibri" w:hAnsi="Calibri"/>
+                <w:b w:val="false"/>
+                <w:bCs w:val="false"/>
+                <w:i w:val="false"/>
+                <w:iCs w:val="false"/>
+                <w:color w:val="000000"/>
+                <w:sz w:val="20"/>
+                <w:szCs w:val="20"/>
+              </w:rPr>
+              <w:t xml:space="preserve">85</w:t>
+            </w:r>
+          </w:p>
+        </w:tc>
+        <w:tc>
+          <w:tcPr>
+            <w:tcW w:type="dxa" w:w="2800"/>
+            <w:tcBorders>
+              <w:top w:val="single" w:color="000000" w:sz="8"/>
+              <w:left w:val="single" w:color="000000" w:sz="8"/>
+              <w:bottom w:val="single" w:color="000000" w:sz="8"/>
+              <w:right w:val="single" w:color="000000" w:sz="8"/>
+            </w:tcBorders>
+            <w:shd w:fill="F7F7F7" w:color="F7F7F7" w:val="clear"/>
+            <w:tcMar>
+              <w:top w:type="dxa" w:w="60"/>
+              <w:left w:type="dxa" w:w="80"/>
+              <w:bottom w:type="dxa" w:w="60"/>
+              <w:right w:type="dxa" w:w="80"/>
+            </w:tcMar>
+            <w:vAlign w:val="center"/>
+          </w:tcPr>
+          <w:p>
+            <w:pPr>
+              <w:jc w:val="left"/>
+            </w:pPr>
+            <w:r>
+              <w:rPr>
+                <w:rFonts w:ascii="Calibri" w:cs="Calibri" w:eastAsia="Calibri" w:hAnsi="Calibri"/>
+                <w:b w:val="false"/>
+                <w:bCs w:val="false"/>
+                <w:i w:val="false"/>
+                <w:iCs w:val="false"/>
+                <w:color w:val="000000"/>
+                <w:sz w:val="20"/>
+                <w:szCs w:val="20"/>
+              </w:rPr>
+              <w:t xml:space="preserve">Sales list Balance and filter totals</w:t>
+            </w:r>
+          </w:p>
+        </w:tc>
+        <w:tc>
+          <w:tcPr>
+            <w:tcW w:type="dxa" w:w="2600"/>
+            <w:tcBorders>
+              <w:top w:val="single" w:color="000000" w:sz="8"/>
+              <w:left w:val="single" w:color="000000" w:sz="8"/>
+              <w:bottom w:val="single" w:color="000000" w:sz="8"/>
+              <w:right w:val="single" w:color="000000" w:sz="8"/>
+            </w:tcBorders>
+            <w:shd w:fill="F7F7F7" w:color="F7F7F7" w:val="clear"/>
+            <w:tcMar>
+              <w:top w:type="dxa" w:w="60"/>
+              <w:left w:type="dxa" w:w="80"/>
+              <w:bottom w:type="dxa" w:w="60"/>
+              <w:right w:type="dxa" w:w="80"/>
+            </w:tcMar>
+            <w:vAlign w:val="center"/>
+          </w:tcPr>
+          <w:p>
+            <w:pPr>
+              <w:jc w:val="left"/>
+            </w:pPr>
+            <w:r>
+              <w:rPr>
+                <w:rFonts w:ascii="Calibri" w:cs="Calibri" w:eastAsia="Calibri" w:hAnsi="Calibri"/>
+                <w:b w:val="false"/>
+                <w:bCs w:val="false"/>
+                <w:i w:val="false"/>
+                <w:iCs w:val="false"/>
+                <w:color w:val="000000"/>
+                <w:sz w:val="20"/>
+                <w:szCs w:val="20"/>
+              </w:rPr>
+              <w:t xml:space="preserve">cashier@abutwins.com or manager</w:t>
+            </w:r>
+          </w:p>
+        </w:tc>
+        <w:tc>
+          <w:tcPr>
+            <w:tcW w:type="dxa" w:w="3360"/>
+            <w:tcBorders>
+              <w:top w:val="single" w:color="000000" w:sz="8"/>
+              <w:left w:val="single" w:color="000000" w:sz="8"/>
+              <w:bottom w:val="single" w:color="000000" w:sz="8"/>
+              <w:right w:val="single" w:color="000000" w:sz="8"/>
+            </w:tcBorders>
+            <w:shd w:fill="F7F7F7" w:color="F7F7F7" w:val="clear"/>
+            <w:tcMar>
+              <w:top w:type="dxa" w:w="60"/>
+              <w:left w:type="dxa" w:w="80"/>
+              <w:bottom w:type="dxa" w:w="60"/>
+              <w:right w:type="dxa" w:w="80"/>
+            </w:tcMar>
+            <w:vAlign w:val="center"/>
+          </w:tcPr>
+          <w:p>
+            <w:pPr>
+              <w:jc w:val="left"/>
+            </w:pPr>
+            <w:r>
+              <w:rPr>
+                <w:rFonts w:ascii="Calibri" w:cs="Calibri" w:eastAsia="Calibri" w:hAnsi="Calibri"/>
+                <w:b w:val="false"/>
+                <w:bCs w:val="false"/>
+                <w:i w:val="false"/>
+                <w:iCs w:val="false"/>
+                <w:color w:val="000000"/>
+                <w:sz w:val="20"/>
+                <w:szCs w:val="20"/>
+              </w:rPr>
+              <w:t xml:space="preserve">Sales shows Branch, Customer, Sales, Paid, Balance, Payment method. A 6,000 unpaid bill shows Balance -6,000. Tap Today. Top cards and the foot totals match Sales value, Payments received, and Balance for that day.</w:t>
+            </w:r>
+          </w:p>
+        </w:tc>
+      </w:tr>
     </w:tbl>
     <w:p>
       <w:pPr>
@@ -54481,6 +54815,25 @@
           <w:szCs w:val="22"/>
         </w:rPr>
         <w:t xml:space="preserve">Version 1.58 puts one Scan or type box on Sell now for phones and piece items. The second find field is gone.</w:t>
+      </w:r>
+    </w:p>
+    <w:p>
+      <w:pPr>
+        <w:spacing w:after="160" w:before="0" w:line="276"/>
+        <w:jc w:val="left"/>
+      </w:pPr>
+      <w:r>
+        <w:rPr>
+          <w:rFonts w:ascii="Calibri" w:cs="Calibri" w:eastAsia="Calibri" w:hAnsi="Calibri"/>
+          <w:b w:val="false"/>
+          <w:bCs w:val="false"/>
+          <w:i w:val="false"/>
+          <w:iCs w:val="false"/>
+          <w:color w:val="000000"/>
+          <w:sz w:val="22"/>
+          <w:szCs w:val="22"/>
+        </w:rPr>
+        <w:t xml:space="preserve">Version 1.59 splits Sales into Sales, Paid, and Balance columns, with filter totals for sales value, payments, and balance so a cashier day is easy to check.</w:t>
       </w:r>
     </w:p>
     <w:p>

</xml_diff>

<commit_message>
Keep Cash and Bank Amount paid locked to the sale total.
Stop raised walk-in prices from leaving Paid behind on the till and on the invoice, while credit deposits still record only what came in today.

Co-authored-by: Cursor <cursoragent@cursor.com>
</commit_message>
<xml_diff>
--- a/docs/Abu-Twins-Shop-System-User-Guide.docx
+++ b/docs/Abu-Twins-Shop-System-User-Guide.docx
@@ -459,7 +459,7 @@
                 <w:sz w:val="20"/>
                 <w:szCs w:val="20"/>
               </w:rPr>
-              <w:t xml:space="preserve">1.59</w:t>
+              <w:t xml:space="preserve">1.60</w:t>
             </w:r>
           </w:p>
         </w:tc>
@@ -533,7 +533,7 @@
                 <w:sz w:val="20"/>
                 <w:szCs w:val="20"/>
               </w:rPr>
-              <w:t xml:space="preserve">Updated: Sales list shows Sales, Paid, Balance, and filter totals</w:t>
+              <w:t xml:space="preserve">Updated: Sell now Amount paid always matches the sale total for Cash or Bank</w:t>
             </w:r>
           </w:p>
         </w:tc>
@@ -1453,6 +1453,25 @@
           <w:szCs w:val="22"/>
         </w:rPr>
         <w:t xml:space="preserve">Sales now shows Branch, Customer, Sales, Paid, Balance, and Payment method as their own columns. Balance is paid minus sales, so money still owed shows as a negative figure. Totals for sales value, payments, and balance sit above the list and again at the foot, and they follow Today, Last 7 days, or Last 30 days.</w:t>
+      </w:r>
+    </w:p>
+    <w:p>
+      <w:pPr>
+        <w:spacing w:after="160" w:before="0" w:line="276"/>
+        <w:jc w:val="left"/>
+      </w:pPr>
+      <w:r>
+        <w:rPr>
+          <w:rFonts w:ascii="Calibri" w:cs="Calibri" w:eastAsia="Calibri" w:hAnsi="Calibri"/>
+          <w:b w:val="false"/>
+          <w:bCs w:val="false"/>
+          <w:i w:val="false"/>
+          <w:iCs w:val="false"/>
+          <w:color w:val="000000"/>
+          <w:sz w:val="22"/>
+          <w:szCs w:val="22"/>
+        </w:rPr>
+        <w:t xml:space="preserve">On Sell now, Cash or Bank always records Amount paid as the same figure as the sale total. If the cashier raises a price above the initial sell price, the paid figure moves with it. There is no lag between the line price and the money on the bill. Credit sales still type how much came in today.</w:t>
       </w:r>
     </w:p>
     <w:p>
@@ -15987,6 +16006,29 @@
           <w:szCs w:val="22"/>
         </w:rPr>
         <w:t xml:space="preserve">Bank sales require a named bank account. Money in and out shows sales into that account.</w:t>
+      </w:r>
+    </w:p>
+    <w:p>
+      <w:pPr>
+        <w:pStyle w:val="ListParagraph"/>
+        <w:numPr>
+          <w:ilvl w:val="0"/>
+          <w:numId w:val="2"/>
+        </w:numPr>
+        <w:spacing w:after="80" w:line="276"/>
+      </w:pPr>
+      <w:r>
+        <w:rPr>
+          <w:rFonts w:ascii="Calibri" w:cs="Calibri" w:eastAsia="Calibri" w:hAnsi="Calibri"/>
+          <w:b w:val="false"/>
+          <w:bCs w:val="false"/>
+          <w:i w:val="false"/>
+          <w:iCs w:val="false"/>
+          <w:color w:val="000000"/>
+          <w:sz w:val="22"/>
+          <w:szCs w:val="22"/>
+        </w:rPr>
+        <w:t xml:space="preserve">For Cash or Bank, Amount paid always equals the sale total. Raising a line price updates both figures together.</w:t>
       </w:r>
     </w:p>
     <w:p>
@@ -52197,6 +52239,159 @@
           </w:p>
         </w:tc>
       </w:tr>
+      <w:tr>
+        <w:trPr>
+          <w:trHeight w:val="320" w:hRule="atLeast"/>
+        </w:trPr>
+        <w:tc>
+          <w:tcPr>
+            <w:tcW w:type="dxa" w:w="600"/>
+            <w:tcBorders>
+              <w:top w:val="single" w:color="000000" w:sz="8"/>
+              <w:left w:val="single" w:color="000000" w:sz="8"/>
+              <w:bottom w:val="single" w:color="000000" w:sz="8"/>
+              <w:right w:val="single" w:color="000000" w:sz="8"/>
+            </w:tcBorders>
+            <w:shd w:fill="FFFFFF" w:color="FFFFFF" w:val="clear"/>
+            <w:tcMar>
+              <w:top w:type="dxa" w:w="60"/>
+              <w:left w:type="dxa" w:w="80"/>
+              <w:bottom w:type="dxa" w:w="60"/>
+              <w:right w:type="dxa" w:w="80"/>
+            </w:tcMar>
+            <w:vAlign w:val="center"/>
+          </w:tcPr>
+          <w:p>
+            <w:pPr>
+              <w:jc w:val="left"/>
+            </w:pPr>
+            <w:r>
+              <w:rPr>
+                <w:rFonts w:ascii="Calibri" w:cs="Calibri" w:eastAsia="Calibri" w:hAnsi="Calibri"/>
+                <w:b w:val="false"/>
+                <w:bCs w:val="false"/>
+                <w:i w:val="false"/>
+                <w:iCs w:val="false"/>
+                <w:color w:val="000000"/>
+                <w:sz w:val="20"/>
+                <w:szCs w:val="20"/>
+              </w:rPr>
+              <w:t xml:space="preserve">86</w:t>
+            </w:r>
+          </w:p>
+        </w:tc>
+        <w:tc>
+          <w:tcPr>
+            <w:tcW w:type="dxa" w:w="2800"/>
+            <w:tcBorders>
+              <w:top w:val="single" w:color="000000" w:sz="8"/>
+              <w:left w:val="single" w:color="000000" w:sz="8"/>
+              <w:bottom w:val="single" w:color="000000" w:sz="8"/>
+              <w:right w:val="single" w:color="000000" w:sz="8"/>
+            </w:tcBorders>
+            <w:shd w:fill="FFFFFF" w:color="FFFFFF" w:val="clear"/>
+            <w:tcMar>
+              <w:top w:type="dxa" w:w="60"/>
+              <w:left w:type="dxa" w:w="80"/>
+              <w:bottom w:type="dxa" w:w="60"/>
+              <w:right w:type="dxa" w:w="80"/>
+            </w:tcMar>
+            <w:vAlign w:val="center"/>
+          </w:tcPr>
+          <w:p>
+            <w:pPr>
+              <w:jc w:val="left"/>
+            </w:pPr>
+            <w:r>
+              <w:rPr>
+                <w:rFonts w:ascii="Calibri" w:cs="Calibri" w:eastAsia="Calibri" w:hAnsi="Calibri"/>
+                <w:b w:val="false"/>
+                <w:bCs w:val="false"/>
+                <w:i w:val="false"/>
+                <w:iCs w:val="false"/>
+                <w:color w:val="000000"/>
+                <w:sz w:val="20"/>
+                <w:szCs w:val="20"/>
+              </w:rPr>
+              <w:t xml:space="preserve">Raised price keeps Amount paid in line</w:t>
+            </w:r>
+          </w:p>
+        </w:tc>
+        <w:tc>
+          <w:tcPr>
+            <w:tcW w:type="dxa" w:w="2600"/>
+            <w:tcBorders>
+              <w:top w:val="single" w:color="000000" w:sz="8"/>
+              <w:left w:val="single" w:color="000000" w:sz="8"/>
+              <w:bottom w:val="single" w:color="000000" w:sz="8"/>
+              <w:right w:val="single" w:color="000000" w:sz="8"/>
+            </w:tcBorders>
+            <w:shd w:fill="FFFFFF" w:color="FFFFFF" w:val="clear"/>
+            <w:tcMar>
+              <w:top w:type="dxa" w:w="60"/>
+              <w:left w:type="dxa" w:w="80"/>
+              <w:bottom w:type="dxa" w:w="60"/>
+              <w:right w:type="dxa" w:w="80"/>
+            </w:tcMar>
+            <w:vAlign w:val="center"/>
+          </w:tcPr>
+          <w:p>
+            <w:pPr>
+              <w:jc w:val="left"/>
+            </w:pPr>
+            <w:r>
+              <w:rPr>
+                <w:rFonts w:ascii="Calibri" w:cs="Calibri" w:eastAsia="Calibri" w:hAnsi="Calibri"/>
+                <w:b w:val="false"/>
+                <w:bCs w:val="false"/>
+                <w:i w:val="false"/>
+                <w:iCs w:val="false"/>
+                <w:color w:val="000000"/>
+                <w:sz w:val="20"/>
+                <w:szCs w:val="20"/>
+              </w:rPr>
+              <w:t xml:space="preserve">cashier@abutwins.com</w:t>
+            </w:r>
+          </w:p>
+        </w:tc>
+        <w:tc>
+          <w:tcPr>
+            <w:tcW w:type="dxa" w:w="3360"/>
+            <w:tcBorders>
+              <w:top w:val="single" w:color="000000" w:sz="8"/>
+              <w:left w:val="single" w:color="000000" w:sz="8"/>
+              <w:bottom w:val="single" w:color="000000" w:sz="8"/>
+              <w:right w:val="single" w:color="000000" w:sz="8"/>
+            </w:tcBorders>
+            <w:shd w:fill="FFFFFF" w:color="FFFFFF" w:val="clear"/>
+            <w:tcMar>
+              <w:top w:type="dxa" w:w="60"/>
+              <w:left w:type="dxa" w:w="80"/>
+              <w:bottom w:type="dxa" w:w="60"/>
+              <w:right w:type="dxa" w:w="80"/>
+            </w:tcMar>
+            <w:vAlign w:val="center"/>
+          </w:tcPr>
+          <w:p>
+            <w:pPr>
+              <w:jc w:val="left"/>
+            </w:pPr>
+            <w:r>
+              <w:rPr>
+                <w:rFonts w:ascii="Calibri" w:cs="Calibri" w:eastAsia="Calibri" w:hAnsi="Calibri"/>
+                <w:b w:val="false"/>
+                <w:bCs w:val="false"/>
+                <w:i w:val="false"/>
+                <w:iCs w:val="false"/>
+                <w:color w:val="000000"/>
+                <w:sz w:val="20"/>
+                <w:szCs w:val="20"/>
+              </w:rPr>
+              <w:t xml:space="preserve">Add a phone at 37,500. Raise the price to 50,000. Amount paid and Sale total both show 50,000 for Cash or Bank. Complete sale. Sales list shows Sales 50,000, Paid 50,000, Balance 0.</w:t>
+            </w:r>
+          </w:p>
+        </w:tc>
+      </w:tr>
     </w:tbl>
     <w:p>
       <w:pPr>
@@ -54834,6 +55029,25 @@
           <w:szCs w:val="22"/>
         </w:rPr>
         <w:t xml:space="preserve">Version 1.59 splits Sales into Sales, Paid, and Balance columns, with filter totals for sales value, payments, and balance so a cashier day is easy to check.</w:t>
+      </w:r>
+    </w:p>
+    <w:p>
+      <w:pPr>
+        <w:spacing w:after="160" w:before="0" w:line="276"/>
+        <w:jc w:val="left"/>
+      </w:pPr>
+      <w:r>
+        <w:rPr>
+          <w:rFonts w:ascii="Calibri" w:cs="Calibri" w:eastAsia="Calibri" w:hAnsi="Calibri"/>
+          <w:b w:val="false"/>
+          <w:bCs w:val="false"/>
+          <w:i w:val="false"/>
+          <w:iCs w:val="false"/>
+          <w:color w:val="000000"/>
+          <w:sz w:val="22"/>
+          <w:szCs w:val="22"/>
+        </w:rPr>
+        <w:t xml:space="preserve">Version 1.60 locks Cash or Bank Amount paid to the sale total so a raised walk-in price cannot leave Paid behind on the invoice.</w:t>
       </w:r>
     </w:p>
     <w:p>

</xml_diff>